<commit_message>
Send now: caption with email and WhatsApp icons under each scheduled report
Co-Authored-By: Claude Sonnet 5.5 <noreply@anthropic.com>
</commit_message>
<xml_diff>
--- a/BRD.docx
+++ b/BRD.docx
@@ -5654,7 +5654,7 @@
         <w:pStyle w:val="FirstParagraph"/>
       </w:pPr>
       <w:r>
-        <w:t xml:space="preserve">Next to the switch of a</w:t>
+        <w:t xml:space="preserve">Under the name of a</w:t>
       </w:r>
       <w:r>
         <w:t xml:space="preserve"> </w:t>
@@ -5670,20 +5670,33 @@
         <w:t xml:space="preserve"> </w:t>
       </w:r>
       <w:r>
-        <w:t xml:space="preserve">there is a small email or WhatsApp icon. Clicking it</w:t>
-      </w:r>
-      <w:r>
-        <w:t xml:space="preserve"> </w:t>
-      </w:r>
-      <w:r>
-        <w:rPr>
-          <w:b/>
-          <w:bCs/>
-        </w:rPr>
-        <w:t xml:space="preserve">sends that report to this registration's contact straight away</w:t>
-      </w:r>
-      <w:r>
-        <w:t xml:space="preserve">, even when the switch is off. It is greyed out when the contact has no email or mobile number. A message says what was sent and to whom.</w:t>
+        <w:t xml:space="preserve">it says</w:t>
+      </w:r>
+      <w:r>
+        <w:t xml:space="preserve"> </w:t>
+      </w:r>
+      <w:r>
+        <w:rPr>
+          <w:b/>
+          <w:bCs/>
+        </w:rPr>
+        <w:t xml:space="preserve">Send now</w:t>
+      </w:r>
+      <w:r>
+        <w:t xml:space="preserve">, followed by an email icon and a WhatsApp icon. Clicking an icon</w:t>
+      </w:r>
+      <w:r>
+        <w:t xml:space="preserve"> </w:t>
+      </w:r>
+      <w:r>
+        <w:rPr>
+          <w:b/>
+          <w:bCs/>
+        </w:rPr>
+        <w:t xml:space="preserve">sends that report to this registration's contact by that channel straight away</w:t>
+      </w:r>
+      <w:r>
+        <w:t xml:space="preserve">, even when the switch is off. A channel the report does not support has no icon. An icon is greyed out when the contact has no email or mobile number. A message says what was sent and to whom.</w:t>
       </w:r>
     </w:p>
     <w:p>

</xml_diff>

<commit_message>
BRD: emails sent through the firm's own SMTP server show the status SMTP in Email Logs
Co-Authored-By: Claude Sonnet 5.5 <noreply@anthropic.com>
</commit_message>
<xml_diff>
--- a/BRD.docx
+++ b/BRD.docx
@@ -3902,7 +3902,33 @@
               <w:rPr>
                 <w:sz w:val="20"/>
               </w:rPr>
-              <w:t xml:space="preserve">Email Logs. It is a separate page with its own BRD, and opens inside the same app</w:t>
+              <w:t xml:space="preserve">Email Logs. It is a separate page with its own BRD, and opens inside the same app. Emails sent through the firm's own SMTP server show the status</w:t>
+            </w:r>
+            <w:r>
+              <w:rPr>
+                <w:sz w:val="20"/>
+              </w:rPr>
+              <w:t xml:space="preserve"> </w:t>
+            </w:r>
+            <w:r>
+              <w:rPr>
+                <w:b/>
+                <w:bCs/>
+                <w:sz w:val="20"/>
+              </w:rPr>
+              <w:t xml:space="preserve">SMTP</w:t>
+            </w:r>
+            <w:r>
+              <w:rPr>
+                <w:sz w:val="20"/>
+              </w:rPr>
+              <w:t xml:space="preserve"> </w:t>
+            </w:r>
+            <w:r>
+              <w:rPr>
+                <w:sz w:val="20"/>
+              </w:rPr>
+              <w:t xml:space="preserve">there (section 7.4)</w:t>
             </w:r>
           </w:p>
         </w:tc>
@@ -11360,6 +11386,66 @@
         <w:t xml:space="preserve">. Emails are now sent through the firm's server.</w:t>
       </w:r>
     </w:p>
+    <w:p>
+      <w:pPr>
+        <w:pStyle w:val="FirstParagraph"/>
+      </w:pPr>
+      <w:r>
+        <w:rPr>
+          <w:b/>
+          <w:bCs/>
+        </w:rPr>
+        <w:t xml:space="preserve">Status in Email Logs for SMTP emails.</w:t>
+      </w:r>
+      <w:r>
+        <w:t xml:space="preserve"> </w:t>
+      </w:r>
+      <w:r>
+        <w:t xml:space="preserve">An email sent through the firm's own SMTP server shows the status</w:t>
+      </w:r>
+      <w:r>
+        <w:t xml:space="preserve"> </w:t>
+      </w:r>
+      <w:r>
+        <w:rPr>
+          <w:b/>
+          <w:bCs/>
+        </w:rPr>
+        <w:t xml:space="preserve">SMTP</w:t>
+      </w:r>
+      <w:r>
+        <w:t xml:space="preserve"> </w:t>
+      </w:r>
+      <w:r>
+        <w:t xml:space="preserve">in Email Logs. Spectrum Cloud only hands the email to the firm's server. It</w:t>
+      </w:r>
+      <w:r>
+        <w:t xml:space="preserve"> </w:t>
+      </w:r>
+      <w:r>
+        <w:rPr>
+          <w:b/>
+          <w:bCs/>
+        </w:rPr>
+        <w:t xml:space="preserve">cannot see what happens after that</w:t>
+      </w:r>
+      <w:r>
+        <w:t xml:space="preserve">, so it cannot tell whether the email was delivered, bounced, failed or opened. Instead of a status it cannot check, the log says</w:t>
+      </w:r>
+      <w:r>
+        <w:t xml:space="preserve"> </w:t>
+      </w:r>
+      <w:r>
+        <w:rPr>
+          <w:b/>
+          <w:bCs/>
+        </w:rPr>
+        <w:t xml:space="preserve">SMTP</w:t>
+      </w:r>
+      <w:r>
+        <w:t xml:space="preserve">, which means "handed to the firm's own mail server". Emails sent from the system default or from the firm's own domain keep their usual statuses (Delivered, Bounced and so on).</w:t>
+      </w:r>
+    </w:p>
     <w:bookmarkEnd w:id="90"/>
     <w:bookmarkStart w:id="91" w:name="Xe19b28f785abee5be075f31de3f1a84f09de753"/>
     <w:p>
@@ -11458,6 +11544,34 @@
       </w:pPr>
       <w:r>
         <w:t xml:space="preserve">The firm's own setup is kept when the user switches back to the system default.</w:t>
+      </w:r>
+    </w:p>
+    <w:p>
+      <w:pPr>
+        <w:pStyle w:val="Compact"/>
+        <w:numPr>
+          <w:ilvl w:val="0"/>
+          <w:numId w:val="1021"/>
+        </w:numPr>
+      </w:pPr>
+      <w:r>
+        <w:t xml:space="preserve">An email sent through the firm's own SMTP server shows the status</w:t>
+      </w:r>
+      <w:r>
+        <w:t xml:space="preserve"> </w:t>
+      </w:r>
+      <w:r>
+        <w:rPr>
+          <w:b/>
+          <w:bCs/>
+        </w:rPr>
+        <w:t xml:space="preserve">SMTP</w:t>
+      </w:r>
+      <w:r>
+        <w:t xml:space="preserve"> </w:t>
+      </w:r>
+      <w:r>
+        <w:t xml:space="preserve">in Email Logs, because Spectrum Cloud cannot check what happens after it hands the email over.</w:t>
       </w:r>
     </w:p>
     <w:p>
@@ -11675,6 +11789,37 @@
       </w:pPr>
       <w:r>
         <w:t xml:space="preserve">When a firm connects its own number, the connection details and the approval status of its message templates also come from the WhatsApp provider.</w:t>
+      </w:r>
+    </w:p>
+    <w:p>
+      <w:pPr>
+        <w:pStyle w:val="BodyText"/>
+      </w:pPr>
+      <w:r>
+        <w:rPr>
+          <w:b/>
+          <w:bCs/>
+        </w:rPr>
+        <w:t xml:space="preserve">Email.</w:t>
+      </w:r>
+      <w:r>
+        <w:t xml:space="preserve"> </w:t>
+      </w:r>
+      <w:r>
+        <w:t xml:space="preserve">For the system default and for the firm's own domain, the status of each email comes from the email provider. For an email sent through the firm's own SMTP server there is no provider status, so Email Logs shows</w:t>
+      </w:r>
+      <w:r>
+        <w:t xml:space="preserve"> </w:t>
+      </w:r>
+      <w:r>
+        <w:rPr>
+          <w:b/>
+          <w:bCs/>
+        </w:rPr>
+        <w:t xml:space="preserve">SMTP</w:t>
+      </w:r>
+      <w:r>
+        <w:t xml:space="preserve">.</w:t>
       </w:r>
     </w:p>
     <w:bookmarkEnd w:id="95"/>

</xml_diff>

<commit_message>
Ask before switching WhatsApp or email; approved-template count out of 10; BRD decisions for rejected templates, one setup for all modules and confirmation
Co-Authored-By: Claude Sonnet 5.5 <noreply@anthropic.com>
</commit_message>
<xml_diff>
--- a/BRD.docx
+++ b/BRD.docx
@@ -8848,7 +8848,7 @@
     </w:p>
     <w:bookmarkEnd w:id="69"/>
     <w:bookmarkEnd w:id="70"/>
-    <w:bookmarkStart w:id="92" w:name="Xbfcdbca723139e0f8827222652cde3bd6838f23"/>
+    <w:bookmarkStart w:id="95" w:name="Xbfcdbca723139e0f8827222652cde3bd6838f23"/>
     <w:p>
       <w:pPr>
         <w:pStyle w:val="Heading2"/>
@@ -9207,7 +9207,7 @@
       </w:r>
     </w:p>
     <w:bookmarkEnd w:id="74"/>
-    <w:bookmarkStart w:id="75" w:name="X48dd68a1bab067784b68dc3cb5dc3151b4e364c"/>
+    <w:bookmarkStart w:id="78" w:name="X48dd68a1bab067784b68dc3cb5dc3151b4e364c"/>
     <w:p>
       <w:pPr>
         <w:pStyle w:val="Heading3"/>
@@ -9328,7 +9328,7 @@
         <w:t xml:space="preserve">Use system default instead</w:t>
       </w:r>
       <w:r>
-        <w:t xml:space="preserve">. A short message confirms the change.</w:t>
+        <w:t xml:space="preserve">.</w:t>
       </w:r>
     </w:p>
     <w:p>
@@ -9340,7 +9340,43 @@
         </w:numPr>
       </w:pPr>
       <w:r>
-        <w:t xml:space="preserve">A card that is not finished (not connected, not verified) cannot be switched to. Until it is finished, messages keep going from the system default.</w:t>
+        <w:rPr>
+          <w:b/>
+          <w:bCs/>
+        </w:rPr>
+        <w:t xml:space="preserve">Switching asks first</w:t>
+      </w:r>
+      <w:r>
+        <w:t xml:space="preserve">, for WhatsApp and for email, because it changes what the clients see. The bar turns into a question, for example "Switch now? Messages will go out from the system default number. Your clients will see that number as the sender.", with</w:t>
+      </w:r>
+      <w:r>
+        <w:t xml:space="preserve"> </w:t>
+      </w:r>
+      <w:r>
+        <w:rPr>
+          <w:b/>
+          <w:bCs/>
+        </w:rPr>
+        <w:t xml:space="preserve">Yes, switch</w:t>
+      </w:r>
+      <w:r>
+        <w:t xml:space="preserve"> </w:t>
+      </w:r>
+      <w:r>
+        <w:t xml:space="preserve">and</w:t>
+      </w:r>
+      <w:r>
+        <w:t xml:space="preserve"> </w:t>
+      </w:r>
+      <w:r>
+        <w:rPr>
+          <w:b/>
+          <w:bCs/>
+        </w:rPr>
+        <w:t xml:space="preserve">Cancel</w:t>
+      </w:r>
+      <w:r>
+        <w:t xml:space="preserve">. Cancel changes nothing. After Yes, a short message confirms the change.</w:t>
       </w:r>
     </w:p>
     <w:p>
@@ -9352,14 +9388,79 @@
         </w:numPr>
       </w:pPr>
       <w:r>
-        <w:rPr>
-          <w:b/>
-          <w:bCs/>
-        </w:rPr>
-        <w:t xml:space="preserve">When the setup finishes, the card is switched to automatically</w:t>
-      </w:r>
-      <w:r>
-        <w:t xml:space="preserve">, because that is why the user did it: when WhatsApp is connected, when the domain is verified, and when the mail server connects.</w:t>
+        <w:t xml:space="preserve">The automatic switch when a setup finishes (below) does not ask, because the user has just done the setup on purpose.</w:t>
+      </w:r>
+    </w:p>
+    <w:p>
+      <w:pPr>
+        <w:pStyle w:val="FirstParagraph"/>
+        <w:keepNext/>
+        <w:spacing w:before="120" w:after="40"/>
+        <w:jc w:val="center"/>
+      </w:pPr>
+      <w:r>
+        <w:drawing>
+          <wp:inline>
+            <wp:extent cx="5334000" cy="3187065"/>
+            <wp:effectExtent b="0" l="0" r="0" t="0"/>
+            <wp:docPr descr="Asking before a switch" title="" id="76" name="Picture"/>
+            <a:graphic>
+              <a:graphicData uri="http://schemas.openxmlformats.org/drawingml/2006/picture">
+                <pic:pic>
+                  <pic:nvPicPr>
+                    <pic:cNvPr descr="brd-screenshots/config-switch-confirm.png" id="77" name="Picture"/>
+                    <pic:cNvPicPr>
+                      <a:picLocks noChangeArrowheads="1" noChangeAspect="1"/>
+                    </pic:cNvPicPr>
+                  </pic:nvPicPr>
+                  <pic:blipFill>
+                    <a:blip r:embed="rId75"/>
+                    <a:stretch>
+                      <a:fillRect/>
+                    </a:stretch>
+                  </pic:blipFill>
+                  <pic:spPr bwMode="auto">
+                    <a:xfrm>
+                      <a:off x="0" y="0"/>
+                      <a:ext cx="5334000" cy="3187065"/>
+                    </a:xfrm>
+                    <a:prstGeom prst="rect">
+                      <a:avLst/>
+                    </a:prstGeom>
+                    <a:noFill/>
+                    <a:ln w="9525">
+                      <a:noFill/>
+                      <a:headEnd/>
+                      <a:tailEnd/>
+                    </a:ln>
+                    <a:ln w="9525">
+                      <a:solidFill>
+                        <a:srgbClr val="D5DBE3"/>
+                      </a:solidFill>
+                    </a:ln>
+                  </pic:spPr>
+                </pic:pic>
+              </a:graphicData>
+            </a:graphic>
+          </wp:inline>
+        </w:drawing>
+      </w:r>
+    </w:p>
+    <w:p>
+      <w:pPr>
+        <w:pStyle w:val="FirstParagraph"/>
+        <w:keepNext w:val="0"/>
+        <w:spacing w:before="40" w:after="240"/>
+        <w:jc w:val="center"/>
+      </w:pPr>
+      <w:r>
+        <w:rPr>
+          <w:rFonts w:ascii="Calibri" w:hAnsi="Calibri" w:cs="Calibri" w:eastAsia="Calibri"/>
+          <w:i/>
+          <w:color w:val="666666"/>
+          <w:sz w:val="19"/>
+        </w:rPr>
+        <w:t>Figure: Asking before a switch</w:t>
       </w:r>
     </w:p>
     <w:p>
@@ -9367,37 +9468,11 @@
         <w:pStyle w:val="Compact"/>
         <w:numPr>
           <w:ilvl w:val="0"/>
-          <w:numId w:val="1016"/>
+          <w:numId w:val="1017"/>
         </w:numPr>
       </w:pPr>
       <w:r>
-        <w:rPr>
-          <w:b/>
-          <w:bCs/>
-        </w:rPr>
-        <w:t xml:space="preserve">Disconnect</w:t>
-      </w:r>
-      <w:r>
-        <w:t xml:space="preserve"> </w:t>
-      </w:r>
-      <w:r>
-        <w:t xml:space="preserve">(WhatsApp) and</w:t>
-      </w:r>
-      <w:r>
-        <w:t xml:space="preserve"> </w:t>
-      </w:r>
-      <w:r>
-        <w:rPr>
-          <w:b/>
-          <w:bCs/>
-        </w:rPr>
-        <w:t xml:space="preserve">Start over</w:t>
-      </w:r>
-      <w:r>
-        <w:t xml:space="preserve"> </w:t>
-      </w:r>
-      <w:r>
-        <w:t xml:space="preserve">(domain) put messages back on the system default.</w:t>
+        <w:t xml:space="preserve">A card that is not finished (not connected, not verified) cannot be switched to. Until it is finished, messages keep going from the system default.</w:t>
       </w:r>
     </w:p>
     <w:p>
@@ -9405,10 +9480,67 @@
         <w:pStyle w:val="Compact"/>
         <w:numPr>
           <w:ilvl w:val="0"/>
-          <w:numId w:val="1016"/>
+          <w:numId w:val="1017"/>
         </w:numPr>
       </w:pPr>
       <w:r>
+        <w:rPr>
+          <w:b/>
+          <w:bCs/>
+        </w:rPr>
+        <w:t xml:space="preserve">When the setup finishes, the card is switched to automatically</w:t>
+      </w:r>
+      <w:r>
+        <w:t xml:space="preserve">, because that is why the user did it: when WhatsApp is connected, when the domain is verified, and when the mail server connects.</w:t>
+      </w:r>
+    </w:p>
+    <w:p>
+      <w:pPr>
+        <w:pStyle w:val="Compact"/>
+        <w:numPr>
+          <w:ilvl w:val="0"/>
+          <w:numId w:val="1017"/>
+        </w:numPr>
+      </w:pPr>
+      <w:r>
+        <w:rPr>
+          <w:b/>
+          <w:bCs/>
+        </w:rPr>
+        <w:t xml:space="preserve">Disconnect</w:t>
+      </w:r>
+      <w:r>
+        <w:t xml:space="preserve"> </w:t>
+      </w:r>
+      <w:r>
+        <w:t xml:space="preserve">(WhatsApp) and</w:t>
+      </w:r>
+      <w:r>
+        <w:t xml:space="preserve"> </w:t>
+      </w:r>
+      <w:r>
+        <w:rPr>
+          <w:b/>
+          <w:bCs/>
+        </w:rPr>
+        <w:t xml:space="preserve">Start over</w:t>
+      </w:r>
+      <w:r>
+        <w:t xml:space="preserve"> </w:t>
+      </w:r>
+      <w:r>
+        <w:t xml:space="preserve">(domain) put messages back on the system default.</w:t>
+      </w:r>
+    </w:p>
+    <w:p>
+      <w:pPr>
+        <w:pStyle w:val="Compact"/>
+        <w:numPr>
+          <w:ilvl w:val="0"/>
+          <w:numId w:val="1017"/>
+        </w:numPr>
+      </w:pPr>
+      <w:r>
         <w:t xml:space="preserve">Switching back to the system default</w:t>
       </w:r>
       <w:r>
@@ -9441,8 +9573,8 @@
         <w:t xml:space="preserve">.</w:t>
       </w:r>
     </w:p>
-    <w:bookmarkEnd w:id="75"/>
-    <w:bookmarkStart w:id="79" w:name="Xb6f687164e552578f7042809f91095c24640259"/>
+    <w:bookmarkEnd w:id="78"/>
+    <w:bookmarkStart w:id="82" w:name="Xb6f687164e552578f7042809f91095c24640259"/>
     <w:p>
       <w:pPr>
         <w:pStyle w:val="Heading3"/>
@@ -9684,7 +9816,7 @@
         <w:pStyle w:val="Compact"/>
         <w:numPr>
           <w:ilvl w:val="0"/>
-          <w:numId w:val="1017"/>
+          <w:numId w:val="1018"/>
         </w:numPr>
       </w:pPr>
       <w:r>
@@ -9709,7 +9841,7 @@
         <w:pStyle w:val="Compact"/>
         <w:numPr>
           <w:ilvl w:val="0"/>
-          <w:numId w:val="1017"/>
+          <w:numId w:val="1018"/>
         </w:numPr>
       </w:pPr>
       <w:r>
@@ -9734,7 +9866,7 @@
         <w:pStyle w:val="Compact"/>
         <w:numPr>
           <w:ilvl w:val="0"/>
-          <w:numId w:val="1017"/>
+          <w:numId w:val="1018"/>
         </w:numPr>
       </w:pPr>
       <w:r>
@@ -9817,7 +9949,7 @@
         <w:pStyle w:val="Compact"/>
         <w:numPr>
           <w:ilvl w:val="0"/>
-          <w:numId w:val="1017"/>
+          <w:numId w:val="1018"/>
         </w:numPr>
       </w:pPr>
       <w:r>
@@ -9855,20 +9987,20 @@
       <w:r>
         <w:drawing>
           <wp:inline>
-            <wp:extent cx="5334000" cy="2853690"/>
+            <wp:extent cx="5334000" cy="2944812"/>
             <wp:effectExtent b="0" l="0" r="0" t="0"/>
-            <wp:docPr descr="Connecting a WhatsApp number" title="" id="77" name="Picture"/>
+            <wp:docPr descr="Connecting a WhatsApp number" title="" id="80" name="Picture"/>
             <a:graphic>
               <a:graphicData uri="http://schemas.openxmlformats.org/drawingml/2006/picture">
                 <pic:pic>
                   <pic:nvPicPr>
-                    <pic:cNvPr descr="brd-screenshots/config-whatsapp-connected.png" id="78" name="Picture"/>
+                    <pic:cNvPr descr="brd-screenshots/config-whatsapp-connected.png" id="81" name="Picture"/>
                     <pic:cNvPicPr>
                       <a:picLocks noChangeArrowheads="1" noChangeAspect="1"/>
                     </pic:cNvPicPr>
                   </pic:nvPicPr>
                   <pic:blipFill>
-                    <a:blip r:embed="rId76"/>
+                    <a:blip r:embed="rId79"/>
                     <a:stretch>
                       <a:fillRect/>
                     </a:stretch>
@@ -9876,7 +10008,7 @@
                   <pic:spPr bwMode="auto">
                     <a:xfrm>
                       <a:off x="0" y="0"/>
-                      <a:ext cx="5334000" cy="2853690"/>
+                      <a:ext cx="5334000" cy="2944812"/>
                     </a:xfrm>
                     <a:prstGeom prst="rect">
                       <a:avLst/>
@@ -9934,7 +10066,7 @@
         <w:pStyle w:val="BodyText"/>
       </w:pPr>
       <w:r>
-        <w:t xml:space="preserve">A WhatsApp message can only go out when its template is approved. The page shows this on the connection card as</w:t>
+        <w:t xml:space="preserve">A WhatsApp message can only go out when its template is approved. The page shows this on the connection card as a count:</w:t>
       </w:r>
       <w:r>
         <w:t xml:space="preserve"> </w:t>
@@ -9947,20 +10079,20 @@
         <w:t xml:space="preserve">Waiting for approval</w:t>
       </w:r>
       <w:r>
-        <w:t xml:space="preserve">,</w:t>
-      </w:r>
-      <w:r>
-        <w:t xml:space="preserve"> </w:t>
-      </w:r>
-      <w:r>
-        <w:rPr>
-          <w:b/>
-          <w:bCs/>
-        </w:rPr>
-        <w:t xml:space="preserve">2 of 3 approved</w:t>
-      </w:r>
-      <w:r>
-        <w:t xml:space="preserve">, or</w:t>
+        <w:t xml:space="preserve">, then for example</w:t>
+      </w:r>
+      <w:r>
+        <w:t xml:space="preserve"> </w:t>
+      </w:r>
+      <w:r>
+        <w:rPr>
+          <w:b/>
+          <w:bCs/>
+        </w:rPr>
+        <w:t xml:space="preserve">7 of 10 approved</w:t>
+      </w:r>
+      <w:r>
+        <w:t xml:space="preserve">, and finally</w:t>
       </w:r>
       <w:r>
         <w:t xml:space="preserve"> </w:t>
@@ -9989,7 +10121,7 @@
         <w:t xml:space="preserve"> </w:t>
       </w:r>
       <w:r>
-        <w:t xml:space="preserve">link.</w:t>
+        <w:t xml:space="preserve">link. The same count appears on the option card (Setup) and in the strip at the top.</w:t>
       </w:r>
     </w:p>
     <w:p>
@@ -9997,7 +10129,7 @@
         <w:pStyle w:val="Compact"/>
         <w:numPr>
           <w:ilvl w:val="0"/>
-          <w:numId w:val="1018"/>
+          <w:numId w:val="1019"/>
         </w:numPr>
       </w:pPr>
       <w:r>
@@ -10038,7 +10170,7 @@
         <w:pStyle w:val="Compact"/>
         <w:numPr>
           <w:ilvl w:val="0"/>
-          <w:numId w:val="1018"/>
+          <w:numId w:val="1019"/>
         </w:numPr>
       </w:pPr>
       <w:r>
@@ -10079,27 +10211,21 @@
         <w:pStyle w:val="Compact"/>
         <w:numPr>
           <w:ilvl w:val="0"/>
-          <w:numId w:val="1018"/>
+          <w:numId w:val="1019"/>
         </w:numPr>
       </w:pPr>
       <w:r>
-        <w:t xml:space="preserve">The strip at the top, the connection card and</w:t>
-      </w:r>
-      <w:r>
-        <w:t xml:space="preserve"> </w:t>
-      </w:r>
-      <w:r>
-        <w:rPr>
-          <w:i/>
-          <w:iCs/>
-        </w:rPr>
-        <w:t xml:space="preserve">Good to know</w:t>
-      </w:r>
-      <w:r>
-        <w:t xml:space="preserve"> </w:t>
-      </w:r>
-      <w:r>
-        <w:t xml:space="preserve">all say this in plain words, for example "Until the templates are approved, messages go out from the system default number."</w:t>
+        <w:rPr>
+          <w:b/>
+          <w:bCs/>
+        </w:rPr>
+        <w:t xml:space="preserve">A rejected template is not shown separately.</w:t>
+      </w:r>
+      <w:r>
+        <w:t xml:space="preserve"> </w:t>
+      </w:r>
+      <w:r>
+        <w:t xml:space="preserve">It is simply not part of the approved count (for example 7 of 10). Its messages go from the system default number, the same as a template that is still waiting. KDK is told about rejections, so the template can be corrected and sent again. This is not shown to the firm. When the template is approved later, its messages start going from the firm's number by themselves.</w:t>
       </w:r>
     </w:p>
     <w:p>
@@ -10107,21 +10233,27 @@
         <w:pStyle w:val="Compact"/>
         <w:numPr>
           <w:ilvl w:val="0"/>
-          <w:numId w:val="1018"/>
+          <w:numId w:val="1019"/>
         </w:numPr>
       </w:pPr>
       <w:r>
-        <w:rPr>
-          <w:b/>
-          <w:bCs/>
-        </w:rPr>
-        <w:t xml:space="preserve">Send test message</w:t>
-      </w:r>
-      <w:r>
-        <w:t xml:space="preserve"> </w:t>
-      </w:r>
-      <w:r>
-        <w:t xml:space="preserve">is off until at least one template is approved.</w:t>
+        <w:t xml:space="preserve">The strip at the top, the connection card and</w:t>
+      </w:r>
+      <w:r>
+        <w:t xml:space="preserve"> </w:t>
+      </w:r>
+      <w:r>
+        <w:rPr>
+          <w:i/>
+          <w:iCs/>
+        </w:rPr>
+        <w:t xml:space="preserve">Good to know</w:t>
+      </w:r>
+      <w:r>
+        <w:t xml:space="preserve"> </w:t>
+      </w:r>
+      <w:r>
+        <w:t xml:space="preserve">all say this in plain words, for example "Until the templates are approved, messages go out from the system default number."</w:t>
       </w:r>
     </w:p>
     <w:p>
@@ -10129,10 +10261,32 @@
         <w:pStyle w:val="Compact"/>
         <w:numPr>
           <w:ilvl w:val="0"/>
-          <w:numId w:val="1018"/>
+          <w:numId w:val="1019"/>
         </w:numPr>
       </w:pPr>
       <w:r>
+        <w:rPr>
+          <w:b/>
+          <w:bCs/>
+        </w:rPr>
+        <w:t xml:space="preserve">Send test message</w:t>
+      </w:r>
+      <w:r>
+        <w:t xml:space="preserve"> </w:t>
+      </w:r>
+      <w:r>
+        <w:t xml:space="preserve">is off until at least one template is approved.</w:t>
+      </w:r>
+    </w:p>
+    <w:p>
+      <w:pPr>
+        <w:pStyle w:val="Compact"/>
+        <w:numPr>
+          <w:ilvl w:val="0"/>
+          <w:numId w:val="1019"/>
+        </w:numPr>
+      </w:pPr>
+      <w:r>
         <w:t xml:space="preserve">Because of this, one firm's WhatsApp Logs can show</w:t>
       </w:r>
       <w:r>
@@ -10168,48 +10322,8 @@
         <w:t xml:space="preserve">column and filter (section 6) make it clear which message went from which number.</w:t>
       </w:r>
     </w:p>
-    <w:p>
-      <w:pPr>
-        <w:pStyle w:val="BlockText"/>
-        <w:shd w:val="clear" w:color="auto" w:fill="F3F4F6"/>
-        <w:pBdr>
-          <w:left w:val="single" w:sz="24" w:space="8" w:color="2E75B6"/>
-        </w:pBdr>
-        <w:spacing w:before="160" w:after="200"/>
-        <w:ind w:left="115"/>
-      </w:pPr>
-      <w:r>
-        <w:rPr>
-          <w:b/>
-          <w:bCs/>
-        </w:rPr>
-        <w:t xml:space="preserve">To be decided:</w:t>
-      </w:r>
-      <w:r>
-        <w:t xml:space="preserve"> </w:t>
-      </w:r>
-      <w:r>
-        <w:t xml:space="preserve">what the user sees, and does, when WhatsApp</w:t>
-      </w:r>
-      <w:r>
-        <w:t xml:space="preserve"> </w:t>
-      </w:r>
-      <w:r>
-        <w:rPr>
-          <w:b/>
-          <w:bCs/>
-        </w:rPr>
-        <w:t xml:space="preserve">rejects</w:t>
-      </w:r>
-      <w:r>
-        <w:t xml:space="preserve"> </w:t>
-      </w:r>
-      <w:r>
-        <w:t xml:space="preserve">a template.</w:t>
-      </w:r>
-    </w:p>
-    <w:bookmarkEnd w:id="79"/>
-    <w:bookmarkStart w:id="90" w:name="X4934f0f5d6c6998fd0513ddb723aa9cbc1bb1cb"/>
+    <w:bookmarkEnd w:id="82"/>
+    <w:bookmarkStart w:id="93" w:name="X4934f0f5d6c6998fd0513ddb723aa9cbc1bb1cb"/>
     <w:p>
       <w:pPr>
         <w:pStyle w:val="Heading3"/>
@@ -10230,18 +10344,18 @@
           <wp:inline>
             <wp:extent cx="5334000" cy="3371532"/>
             <wp:effectExtent b="0" l="0" r="0" t="0"/>
-            <wp:docPr descr="Configuration, Email" title="" id="81" name="Picture"/>
+            <wp:docPr descr="Configuration, Email" title="" id="84" name="Picture"/>
             <a:graphic>
               <a:graphicData uri="http://schemas.openxmlformats.org/drawingml/2006/picture">
                 <pic:pic>
                   <pic:nvPicPr>
-                    <pic:cNvPr descr="brd-screenshots/config-email-default.png" id="82" name="Picture"/>
+                    <pic:cNvPr descr="brd-screenshots/config-email-default.png" id="85" name="Picture"/>
                     <pic:cNvPicPr>
                       <a:picLocks noChangeArrowheads="1" noChangeAspect="1"/>
                     </pic:cNvPicPr>
                   </pic:nvPicPr>
                   <pic:blipFill>
-                    <a:blip r:embed="rId80"/>
+                    <a:blip r:embed="rId83"/>
                     <a:stretch>
                       <a:fillRect/>
                     </a:stretch>
@@ -10645,7 +10759,7 @@
       <w:r>
         <w:t xml:space="preserve"> </w:t>
       </w:r>
-      <w:hyperlink r:id="rId83">
+      <w:hyperlink r:id="rId86">
         <w:r>
           <w:rPr>
             <w:rStyle w:val="Hyperlink"/>
@@ -10674,7 +10788,7 @@
         <w:pStyle w:val="Compact"/>
         <w:numPr>
           <w:ilvl w:val="0"/>
-          <w:numId w:val="1019"/>
+          <w:numId w:val="1020"/>
         </w:numPr>
       </w:pPr>
       <w:r>
@@ -10756,7 +10870,7 @@
         <w:pStyle w:val="Compact"/>
         <w:numPr>
           <w:ilvl w:val="0"/>
-          <w:numId w:val="1019"/>
+          <w:numId w:val="1020"/>
         </w:numPr>
       </w:pPr>
       <w:r>
@@ -10784,7 +10898,7 @@
         <w:pStyle w:val="Compact"/>
         <w:numPr>
           <w:ilvl w:val="0"/>
-          <w:numId w:val="1019"/>
+          <w:numId w:val="1020"/>
         </w:numPr>
       </w:pPr>
       <w:r>
@@ -10893,7 +11007,7 @@
         <w:pStyle w:val="Compact"/>
         <w:numPr>
           <w:ilvl w:val="0"/>
-          <w:numId w:val="1019"/>
+          <w:numId w:val="1020"/>
         </w:numPr>
       </w:pPr>
       <w:r>
@@ -10989,7 +11103,7 @@
         <w:pStyle w:val="Compact"/>
         <w:numPr>
           <w:ilvl w:val="0"/>
-          <w:numId w:val="1019"/>
+          <w:numId w:val="1020"/>
         </w:numPr>
       </w:pPr>
       <w:r>
@@ -11024,18 +11138,18 @@
           <wp:inline>
             <wp:extent cx="5334000" cy="4058284"/>
             <wp:effectExtent b="0" l="0" r="0" t="0"/>
-            <wp:docPr descr="Own domain: DNS records" title="" id="85" name="Picture"/>
+            <wp:docPr descr="Own domain: DNS records" title="" id="88" name="Picture"/>
             <a:graphic>
               <a:graphicData uri="http://schemas.openxmlformats.org/drawingml/2006/picture">
                 <pic:pic>
                   <pic:nvPicPr>
-                    <pic:cNvPr descr="brd-screenshots/config-email-domain.png" id="86" name="Picture"/>
+                    <pic:cNvPr descr="brd-screenshots/config-email-domain.png" id="89" name="Picture"/>
                     <pic:cNvPicPr>
                       <a:picLocks noChangeArrowheads="1" noChangeAspect="1"/>
                     </pic:cNvPicPr>
                   </pic:nvPicPr>
                   <pic:blipFill>
-                    <a:blip r:embed="rId84"/>
+                    <a:blip r:embed="rId87"/>
                     <a:stretch>
                       <a:fillRect/>
                     </a:stretch>
@@ -11108,18 +11222,18 @@
           <wp:inline>
             <wp:extent cx="5334000" cy="4620577"/>
             <wp:effectExtent b="0" l="0" r="0" t="0"/>
-            <wp:docPr descr="Own SMTP server" title="" id="88" name="Picture"/>
+            <wp:docPr descr="Own SMTP server" title="" id="91" name="Picture"/>
             <a:graphic>
               <a:graphicData uri="http://schemas.openxmlformats.org/drawingml/2006/picture">
                 <pic:pic>
                   <pic:nvPicPr>
-                    <pic:cNvPr descr="brd-screenshots/config-email-smtp.png" id="89" name="Picture"/>
+                    <pic:cNvPr descr="brd-screenshots/config-email-smtp.png" id="92" name="Picture"/>
                     <pic:cNvPicPr>
                       <a:picLocks noChangeArrowheads="1" noChangeAspect="1"/>
                     </pic:cNvPicPr>
                   </pic:nvPicPr>
                   <pic:blipFill>
-                    <a:blip r:embed="rId87"/>
+                    <a:blip r:embed="rId90"/>
                     <a:stretch>
                       <a:fillRect/>
                     </a:stretch>
@@ -11297,7 +11411,7 @@
         <w:pStyle w:val="Compact"/>
         <w:numPr>
           <w:ilvl w:val="0"/>
-          <w:numId w:val="1020"/>
+          <w:numId w:val="1021"/>
         </w:numPr>
       </w:pPr>
       <w:r>
@@ -11318,142 +11432,6 @@
       </w:r>
       <w:r>
         <w:t xml:space="preserve">and email keeps going from the system default.</w:t>
-      </w:r>
-    </w:p>
-    <w:p>
-      <w:pPr>
-        <w:pStyle w:val="Compact"/>
-        <w:numPr>
-          <w:ilvl w:val="0"/>
-          <w:numId w:val="1020"/>
-        </w:numPr>
-      </w:pPr>
-      <w:r>
-        <w:t xml:space="preserve">If it cannot connect, a note says so and the user can correct the details.</w:t>
-      </w:r>
-    </w:p>
-    <w:p>
-      <w:pPr>
-        <w:pStyle w:val="Compact"/>
-        <w:numPr>
-          <w:ilvl w:val="0"/>
-          <w:numId w:val="1020"/>
-        </w:numPr>
-      </w:pPr>
-      <w:r>
-        <w:t xml:space="preserve">When it connects, the page shows</w:t>
-      </w:r>
-      <w:r>
-        <w:t xml:space="preserve"> </w:t>
-      </w:r>
-      <w:r>
-        <w:rPr>
-          <w:b/>
-          <w:bCs/>
-        </w:rPr>
-        <w:t xml:space="preserve">Your connection</w:t>
-      </w:r>
-      <w:r>
-        <w:t xml:space="preserve">: SMTP server, Security, Username, From name and From address (the password is never shown again), with</w:t>
-      </w:r>
-      <w:r>
-        <w:t xml:space="preserve"> </w:t>
-      </w:r>
-      <w:r>
-        <w:rPr>
-          <w:b/>
-          <w:bCs/>
-        </w:rPr>
-        <w:t xml:space="preserve">Send test email</w:t>
-      </w:r>
-      <w:r>
-        <w:t xml:space="preserve"> </w:t>
-      </w:r>
-      <w:r>
-        <w:t xml:space="preserve">and</w:t>
-      </w:r>
-      <w:r>
-        <w:t xml:space="preserve"> </w:t>
-      </w:r>
-      <w:r>
-        <w:rPr>
-          <w:b/>
-          <w:bCs/>
-        </w:rPr>
-        <w:t xml:space="preserve">Edit server</w:t>
-      </w:r>
-      <w:r>
-        <w:t xml:space="preserve">. Emails are now sent through the firm's server.</w:t>
-      </w:r>
-    </w:p>
-    <w:p>
-      <w:pPr>
-        <w:pStyle w:val="FirstParagraph"/>
-      </w:pPr>
-      <w:r>
-        <w:rPr>
-          <w:b/>
-          <w:bCs/>
-        </w:rPr>
-        <w:t xml:space="preserve">Status in Email Logs for SMTP emails.</w:t>
-      </w:r>
-      <w:r>
-        <w:t xml:space="preserve"> </w:t>
-      </w:r>
-      <w:r>
-        <w:t xml:space="preserve">An email sent through the firm's own SMTP server shows the status</w:t>
-      </w:r>
-      <w:r>
-        <w:t xml:space="preserve"> </w:t>
-      </w:r>
-      <w:r>
-        <w:rPr>
-          <w:b/>
-          <w:bCs/>
-        </w:rPr>
-        <w:t xml:space="preserve">SMTP</w:t>
-      </w:r>
-      <w:r>
-        <w:t xml:space="preserve"> </w:t>
-      </w:r>
-      <w:r>
-        <w:t xml:space="preserve">in Email Logs. Spectrum Cloud only hands the email to the firm's server. It</w:t>
-      </w:r>
-      <w:r>
-        <w:t xml:space="preserve"> </w:t>
-      </w:r>
-      <w:r>
-        <w:rPr>
-          <w:b/>
-          <w:bCs/>
-        </w:rPr>
-        <w:t xml:space="preserve">cannot see what happens after that</w:t>
-      </w:r>
-      <w:r>
-        <w:t xml:space="preserve">, so it cannot tell whether the email was delivered, bounced, failed or opened. Instead of a status it cannot check, the log says</w:t>
-      </w:r>
-      <w:r>
-        <w:t xml:space="preserve"> </w:t>
-      </w:r>
-      <w:r>
-        <w:rPr>
-          <w:b/>
-          <w:bCs/>
-        </w:rPr>
-        <w:t xml:space="preserve">SMTP</w:t>
-      </w:r>
-      <w:r>
-        <w:t xml:space="preserve">, which means "handed to the firm's own mail server". Emails sent from the system default or from the firm's own domain keep their usual statuses (Delivered, Bounced and so on).</w:t>
-      </w:r>
-    </w:p>
-    <w:bookmarkEnd w:id="90"/>
-    <w:bookmarkStart w:id="91" w:name="Xe19b28f785abee5be075f31de3f1a84f09de753"/>
-    <w:p>
-      <w:pPr>
-        <w:pStyle w:val="Heading3"/>
-      </w:pPr>
-      <w:r>
-        <w:t xml:space="preserve">7.5 Rules</w:t>
       </w:r>
     </w:p>
     <w:p>
@@ -11465,33 +11443,7 @@
         </w:numPr>
       </w:pPr>
       <w:r>
-        <w:t xml:space="preserve">The choice is for</w:t>
-      </w:r>
-      <w:r>
-        <w:t xml:space="preserve"> </w:t>
-      </w:r>
-      <w:r>
-        <w:rPr>
-          <w:b/>
-          <w:bCs/>
-        </w:rPr>
-        <w:t xml:space="preserve">the whole firm</w:t>
-      </w:r>
-      <w:r>
-        <w:t xml:space="preserve">. WhatsApp and email are chosen</w:t>
-      </w:r>
-      <w:r>
-        <w:t xml:space="preserve"> </w:t>
-      </w:r>
-      <w:r>
-        <w:rPr>
-          <w:b/>
-          <w:bCs/>
-        </w:rPr>
-        <w:t xml:space="preserve">separately</w:t>
-      </w:r>
-      <w:r>
-        <w:t xml:space="preserve">.</w:t>
+        <w:t xml:space="preserve">If it cannot connect, a note says so and the user can correct the details.</w:t>
       </w:r>
     </w:p>
     <w:p>
@@ -11503,57 +11455,65 @@
         </w:numPr>
       </w:pPr>
       <w:r>
-        <w:t xml:space="preserve">Exactly</w:t>
-      </w:r>
-      <w:r>
-        <w:t xml:space="preserve"> </w:t>
-      </w:r>
-      <w:r>
-        <w:rPr>
-          <w:b/>
-          <w:bCs/>
-        </w:rPr>
-        <w:t xml:space="preserve">one</w:t>
-      </w:r>
-      <w:r>
-        <w:t xml:space="preserve"> </w:t>
-      </w:r>
-      <w:r>
-        <w:t xml:space="preserve">choice is in use for each channel.</w:t>
-      </w:r>
-    </w:p>
-    <w:p>
-      <w:pPr>
-        <w:pStyle w:val="Compact"/>
-        <w:numPr>
-          <w:ilvl w:val="0"/>
-          <w:numId w:val="1021"/>
-        </w:numPr>
-      </w:pPr>
-      <w:r>
-        <w:t xml:space="preserve">A setup that is not finished never takes over: messages keep going from the system default.</w:t>
-      </w:r>
-    </w:p>
-    <w:p>
-      <w:pPr>
-        <w:pStyle w:val="Compact"/>
-        <w:numPr>
-          <w:ilvl w:val="0"/>
-          <w:numId w:val="1021"/>
-        </w:numPr>
-      </w:pPr>
-      <w:r>
-        <w:t xml:space="preserve">The firm's own setup is kept when the user switches back to the system default.</w:t>
-      </w:r>
-    </w:p>
-    <w:p>
-      <w:pPr>
-        <w:pStyle w:val="Compact"/>
-        <w:numPr>
-          <w:ilvl w:val="0"/>
-          <w:numId w:val="1021"/>
-        </w:numPr>
-      </w:pPr>
+        <w:t xml:space="preserve">When it connects, the page shows</w:t>
+      </w:r>
+      <w:r>
+        <w:t xml:space="preserve"> </w:t>
+      </w:r>
+      <w:r>
+        <w:rPr>
+          <w:b/>
+          <w:bCs/>
+        </w:rPr>
+        <w:t xml:space="preserve">Your connection</w:t>
+      </w:r>
+      <w:r>
+        <w:t xml:space="preserve">: SMTP server, Security, Username, From name and From address (the password is never shown again), with</w:t>
+      </w:r>
+      <w:r>
+        <w:t xml:space="preserve"> </w:t>
+      </w:r>
+      <w:r>
+        <w:rPr>
+          <w:b/>
+          <w:bCs/>
+        </w:rPr>
+        <w:t xml:space="preserve">Send test email</w:t>
+      </w:r>
+      <w:r>
+        <w:t xml:space="preserve"> </w:t>
+      </w:r>
+      <w:r>
+        <w:t xml:space="preserve">and</w:t>
+      </w:r>
+      <w:r>
+        <w:t xml:space="preserve"> </w:t>
+      </w:r>
+      <w:r>
+        <w:rPr>
+          <w:b/>
+          <w:bCs/>
+        </w:rPr>
+        <w:t xml:space="preserve">Edit server</w:t>
+      </w:r>
+      <w:r>
+        <w:t xml:space="preserve">. Emails are now sent through the firm's server.</w:t>
+      </w:r>
+    </w:p>
+    <w:p>
+      <w:pPr>
+        <w:pStyle w:val="FirstParagraph"/>
+      </w:pPr>
+      <w:r>
+        <w:rPr>
+          <w:b/>
+          <w:bCs/>
+        </w:rPr>
+        <w:t xml:space="preserve">Status in Email Logs for SMTP emails.</w:t>
+      </w:r>
+      <w:r>
+        <w:t xml:space="preserve"> </w:t>
+      </w:r>
       <w:r>
         <w:t xml:space="preserve">An email sent through the firm's own SMTP server shows the status</w:t>
       </w:r>
@@ -11571,170 +11531,43 @@
         <w:t xml:space="preserve"> </w:t>
       </w:r>
       <w:r>
-        <w:t xml:space="preserve">in Email Logs, because Spectrum Cloud cannot check what happens after it hands the email over.</w:t>
-      </w:r>
-    </w:p>
-    <w:p>
-      <w:pPr>
-        <w:pStyle w:val="Compact"/>
-        <w:numPr>
-          <w:ilvl w:val="0"/>
-          <w:numId w:val="1021"/>
-        </w:numPr>
-      </w:pPr>
-      <w:r>
-        <w:t xml:space="preserve">The user must never see the name of the WhatsApp provider. The DNS values for email are shown</w:t>
-      </w:r>
-      <w:r>
-        <w:t xml:space="preserve"> </w:t>
-      </w:r>
-      <w:r>
-        <w:rPr>
-          <w:b/>
-          <w:bCs/>
-        </w:rPr>
-        <w:t xml:space="preserve">as given</w:t>
-      </w:r>
-      <w:r>
-        <w:t xml:space="preserve">, because the user has to copy them exactly.</w:t>
-      </w:r>
-    </w:p>
-    <w:p>
-      <w:pPr>
-        <w:pStyle w:val="BlockText"/>
-        <w:shd w:val="clear" w:color="auto" w:fill="F3F4F6"/>
-        <w:pBdr>
-          <w:left w:val="single" w:sz="24" w:space="8" w:color="2E75B6"/>
-        </w:pBdr>
-        <w:spacing w:before="160" w:after="200"/>
-        <w:ind w:left="115"/>
-      </w:pPr>
-      <w:r>
-        <w:rPr>
-          <w:b/>
-          <w:bCs/>
-        </w:rPr>
-        <w:t xml:space="preserve">To be decided:</w:t>
-      </w:r>
-      <w:r>
-        <w:t xml:space="preserve"> </w:t>
-      </w:r>
-      <w:r>
-        <w:t xml:space="preserve">whether a firm can later choose a different own number or domain for each module (GST, TDS, ITR), or whether one choice always covers all three. Today one choice covers all.</w:t>
-      </w:r>
-    </w:p>
-    <w:p>
-      <w:r>
-        <w:pict>
-          <v:rect style="width:0;height:1.5pt" o:hralign="center" o:hrstd="t" o:hr="t"/>
-        </w:pict>
-      </w:r>
-    </w:p>
-    <w:bookmarkEnd w:id="91"/>
-    <w:bookmarkEnd w:id="92"/>
-    <w:bookmarkStart w:id="95" w:name="Xcfe188df4835c7be7ab3f6f8cbc0d8ee2c7b3b0"/>
-    <w:p>
-      <w:pPr>
-        <w:pStyle w:val="Heading2"/>
-        <w:pBdr>
-          <w:bottom w:val="single" w:sz="6" w:space="4" w:color="C9D2DC"/>
-        </w:pBdr>
-      </w:pPr>
-      <w:r>
-        <w:t xml:space="preserve">8. Where the data comes from</w:t>
-      </w:r>
-    </w:p>
-    <w:p>
-      <w:pPr>
-        <w:pStyle w:val="FirstParagraph"/>
-      </w:pPr>
-      <w:r>
-        <w:rPr>
-          <w:b/>
-          <w:bCs/>
-        </w:rPr>
-        <w:t xml:space="preserve">From the application:</w:t>
-      </w:r>
-      <w:r>
-        <w:t xml:space="preserve"> </w:t>
-      </w:r>
-      <w:r>
-        <w:t xml:space="preserve">clients, their PAN and contacts, and the registrations of each client (GSTIN, TAN, PAN, with type or place). A newly added registration gets the defaults of its module.</w:t>
-      </w:r>
-    </w:p>
-    <w:p>
-      <w:pPr>
-        <w:pStyle w:val="BodyText"/>
-      </w:pPr>
-      <w:r>
-        <w:rPr>
-          <w:b/>
-          <w:bCs/>
-        </w:rPr>
-        <w:t xml:space="preserve">Saved by Spectrum Cloud:</w:t>
-      </w:r>
-      <w:r>
-        <w:t xml:space="preserve"> </w:t>
-      </w:r>
-      <w:r>
-        <w:t xml:space="preserve">the Email and WhatsApp switch of every report and event for each registration, the contact picked for each registration, the contacts edited or added on this page, and the defaults of each module. From the Configuration page: for WhatsApp and for email,</w:t>
-      </w:r>
-      <w:r>
-        <w:t xml:space="preserve"> </w:t>
-      </w:r>
-      <w:r>
-        <w:rPr>
-          <w:b/>
-          <w:bCs/>
-        </w:rPr>
-        <w:t xml:space="preserve">which choice is in use</w:t>
-      </w:r>
-      <w:r>
-        <w:t xml:space="preserve">, and the firm's own setup (the WhatsApp number and display name, the email domain and its status, the SMTP details with the password kept safe and never shown again, and the Reply-to email). For every WhatsApp message: the</w:t>
-      </w:r>
-      <w:r>
-        <w:t xml:space="preserve"> </w:t>
-      </w:r>
-      <w:r>
-        <w:rPr>
-          <w:b/>
-          <w:bCs/>
-        </w:rPr>
-        <w:t xml:space="preserve">name and number it was sent from</w:t>
-      </w:r>
-      <w:r>
-        <w:t xml:space="preserve">, saved at the time it is sent.</w:t>
-      </w:r>
-    </w:p>
-    <w:p>
-      <w:pPr>
-        <w:pStyle w:val="BodyText"/>
-      </w:pPr>
-      <w:r>
-        <w:rPr>
-          <w:b/>
-          <w:bCs/>
-        </w:rPr>
-        <w:t xml:space="preserve">WhatsApp.</w:t>
-      </w:r>
-      <w:r>
-        <w:t xml:space="preserve"> </w:t>
-      </w:r>
-      <w:r>
-        <w:t xml:space="preserve">We send WhatsApp through</w:t>
-      </w:r>
-      <w:r>
-        <w:t xml:space="preserve"> </w:t>
-      </w:r>
-      <w:r>
-        <w:rPr>
-          <w:b/>
-          <w:bCs/>
-        </w:rPr>
-        <w:t xml:space="preserve">Rampwin</w:t>
-      </w:r>
-      <w:r>
-        <w:t xml:space="preserve">. The status of every message and its delivery details (delivered time, read time, failure reason) are taken from Rampwin. The user must never see the name Rampwin or its codes.</w:t>
+        <w:t xml:space="preserve">in Email Logs. Spectrum Cloud only hands the email to the firm's server. It</w:t>
+      </w:r>
+      <w:r>
+        <w:t xml:space="preserve"> </w:t>
+      </w:r>
+      <w:r>
+        <w:rPr>
+          <w:b/>
+          <w:bCs/>
+        </w:rPr>
+        <w:t xml:space="preserve">cannot see what happens after that</w:t>
+      </w:r>
+      <w:r>
+        <w:t xml:space="preserve">, so it cannot tell whether the email was delivered, bounced, failed or opened. Instead of a status it cannot check, the log says</w:t>
+      </w:r>
+      <w:r>
+        <w:t xml:space="preserve"> </w:t>
+      </w:r>
+      <w:r>
+        <w:rPr>
+          <w:b/>
+          <w:bCs/>
+        </w:rPr>
+        <w:t xml:space="preserve">SMTP</w:t>
+      </w:r>
+      <w:r>
+        <w:t xml:space="preserve">, which means "handed to the firm's own mail server". Emails sent from the system default or from the firm's own domain keep their usual statuses (Delivered, Bounced and so on).</w:t>
+      </w:r>
+    </w:p>
+    <w:bookmarkEnd w:id="93"/>
+    <w:bookmarkStart w:id="94" w:name="Xe19b28f785abee5be075f31de3f1a84f09de753"/>
+    <w:p>
+      <w:pPr>
+        <w:pStyle w:val="Heading3"/>
+      </w:pPr>
+      <w:r>
+        <w:t xml:space="preserve">7.5 Rules</w:t>
       </w:r>
     </w:p>
     <w:p>
@@ -11746,12 +11579,303 @@
         </w:numPr>
       </w:pPr>
       <w:r>
+        <w:t xml:space="preserve">The choice is for</w:t>
+      </w:r>
+      <w:r>
+        <w:t xml:space="preserve"> </w:t>
+      </w:r>
+      <w:r>
+        <w:rPr>
+          <w:b/>
+          <w:bCs/>
+        </w:rPr>
+        <w:t xml:space="preserve">the whole firm</w:t>
+      </w:r>
+      <w:r>
+        <w:t xml:space="preserve">. WhatsApp and email are chosen</w:t>
+      </w:r>
+      <w:r>
+        <w:t xml:space="preserve"> </w:t>
+      </w:r>
+      <w:r>
+        <w:rPr>
+          <w:b/>
+          <w:bCs/>
+        </w:rPr>
+        <w:t xml:space="preserve">separately</w:t>
+      </w:r>
+      <w:r>
+        <w:t xml:space="preserve">.</w:t>
+      </w:r>
+    </w:p>
+    <w:p>
+      <w:pPr>
+        <w:pStyle w:val="Compact"/>
+        <w:numPr>
+          <w:ilvl w:val="0"/>
+          <w:numId w:val="1022"/>
+        </w:numPr>
+      </w:pPr>
+      <w:r>
+        <w:t xml:space="preserve">Exactly</w:t>
+      </w:r>
+      <w:r>
+        <w:t xml:space="preserve"> </w:t>
+      </w:r>
+      <w:r>
+        <w:rPr>
+          <w:b/>
+          <w:bCs/>
+        </w:rPr>
+        <w:t xml:space="preserve">one</w:t>
+      </w:r>
+      <w:r>
+        <w:t xml:space="preserve"> </w:t>
+      </w:r>
+      <w:r>
+        <w:t xml:space="preserve">choice is in use for each channel.</w:t>
+      </w:r>
+    </w:p>
+    <w:p>
+      <w:pPr>
+        <w:pStyle w:val="Compact"/>
+        <w:numPr>
+          <w:ilvl w:val="0"/>
+          <w:numId w:val="1022"/>
+        </w:numPr>
+      </w:pPr>
+      <w:r>
+        <w:t xml:space="preserve">A setup that is not finished never takes over: messages keep going from the system default.</w:t>
+      </w:r>
+    </w:p>
+    <w:p>
+      <w:pPr>
+        <w:pStyle w:val="Compact"/>
+        <w:numPr>
+          <w:ilvl w:val="0"/>
+          <w:numId w:val="1022"/>
+        </w:numPr>
+      </w:pPr>
+      <w:r>
+        <w:t xml:space="preserve">The firm's own setup is kept when the user switches back to the system default.</w:t>
+      </w:r>
+    </w:p>
+    <w:p>
+      <w:pPr>
+        <w:pStyle w:val="Compact"/>
+        <w:numPr>
+          <w:ilvl w:val="0"/>
+          <w:numId w:val="1022"/>
+        </w:numPr>
+      </w:pPr>
+      <w:r>
+        <w:t xml:space="preserve">An email sent through the firm's own SMTP server shows the status</w:t>
+      </w:r>
+      <w:r>
+        <w:t xml:space="preserve"> </w:t>
+      </w:r>
+      <w:r>
+        <w:rPr>
+          <w:b/>
+          <w:bCs/>
+        </w:rPr>
+        <w:t xml:space="preserve">SMTP</w:t>
+      </w:r>
+      <w:r>
+        <w:t xml:space="preserve"> </w:t>
+      </w:r>
+      <w:r>
+        <w:t xml:space="preserve">in Email Logs, because Spectrum Cloud cannot check what happens after it hands the email over.</w:t>
+      </w:r>
+    </w:p>
+    <w:p>
+      <w:pPr>
+        <w:pStyle w:val="Compact"/>
+        <w:numPr>
+          <w:ilvl w:val="0"/>
+          <w:numId w:val="1022"/>
+        </w:numPr>
+      </w:pPr>
+      <w:r>
+        <w:t xml:space="preserve">The user must never see the name of the WhatsApp provider. The DNS values for email are shown</w:t>
+      </w:r>
+      <w:r>
+        <w:t xml:space="preserve"> </w:t>
+      </w:r>
+      <w:r>
+        <w:rPr>
+          <w:b/>
+          <w:bCs/>
+        </w:rPr>
+        <w:t xml:space="preserve">as given</w:t>
+      </w:r>
+      <w:r>
+        <w:t xml:space="preserve">, because the user has to copy them exactly.</w:t>
+      </w:r>
+    </w:p>
+    <w:p>
+      <w:pPr>
+        <w:pStyle w:val="FirstParagraph"/>
+      </w:pPr>
+      <w:r>
+        <w:rPr>
+          <w:b/>
+          <w:bCs/>
+        </w:rPr>
+        <w:t xml:space="preserve">Decided:</w:t>
+      </w:r>
+      <w:r>
+        <w:t xml:space="preserve"> </w:t>
+      </w:r>
+      <w:r>
+        <w:t xml:space="preserve">one own number and one own domain cover</w:t>
+      </w:r>
+      <w:r>
+        <w:t xml:space="preserve"> </w:t>
+      </w:r>
+      <w:r>
+        <w:rPr>
+          <w:b/>
+          <w:bCs/>
+        </w:rPr>
+        <w:t xml:space="preserve">all three modules</w:t>
+      </w:r>
+      <w:r>
+        <w:t xml:space="preserve"> </w:t>
+      </w:r>
+      <w:r>
+        <w:t xml:space="preserve">(GST, TDS and ITR). The firm does not choose them per module. If this is ever needed, it will be added later.</w:t>
+      </w:r>
+    </w:p>
+    <w:p>
+      <w:r>
+        <w:pict>
+          <v:rect style="width:0;height:1.5pt" o:hralign="center" o:hrstd="t" o:hr="t"/>
+        </w:pict>
+      </w:r>
+    </w:p>
+    <w:bookmarkEnd w:id="94"/>
+    <w:bookmarkEnd w:id="95"/>
+    <w:bookmarkStart w:id="98" w:name="Xcfe188df4835c7be7ab3f6f8cbc0d8ee2c7b3b0"/>
+    <w:p>
+      <w:pPr>
+        <w:pStyle w:val="Heading2"/>
+        <w:pBdr>
+          <w:bottom w:val="single" w:sz="6" w:space="4" w:color="C9D2DC"/>
+        </w:pBdr>
+      </w:pPr>
+      <w:r>
+        <w:t xml:space="preserve">8. Where the data comes from</w:t>
+      </w:r>
+    </w:p>
+    <w:p>
+      <w:pPr>
+        <w:pStyle w:val="FirstParagraph"/>
+      </w:pPr>
+      <w:r>
+        <w:rPr>
+          <w:b/>
+          <w:bCs/>
+        </w:rPr>
+        <w:t xml:space="preserve">From the application:</w:t>
+      </w:r>
+      <w:r>
+        <w:t xml:space="preserve"> </w:t>
+      </w:r>
+      <w:r>
+        <w:t xml:space="preserve">clients, their PAN and contacts, and the registrations of each client (GSTIN, TAN, PAN, with type or place). A newly added registration gets the defaults of its module.</w:t>
+      </w:r>
+    </w:p>
+    <w:p>
+      <w:pPr>
+        <w:pStyle w:val="BodyText"/>
+      </w:pPr>
+      <w:r>
+        <w:rPr>
+          <w:b/>
+          <w:bCs/>
+        </w:rPr>
+        <w:t xml:space="preserve">Saved by Spectrum Cloud:</w:t>
+      </w:r>
+      <w:r>
+        <w:t xml:space="preserve"> </w:t>
+      </w:r>
+      <w:r>
+        <w:t xml:space="preserve">the Email and WhatsApp switch of every report and event for each registration, the contact picked for each registration, the contacts edited or added on this page, and the defaults of each module. From the Configuration page: for WhatsApp and for email,</w:t>
+      </w:r>
+      <w:r>
+        <w:t xml:space="preserve"> </w:t>
+      </w:r>
+      <w:r>
+        <w:rPr>
+          <w:b/>
+          <w:bCs/>
+        </w:rPr>
+        <w:t xml:space="preserve">which choice is in use</w:t>
+      </w:r>
+      <w:r>
+        <w:t xml:space="preserve">, and the firm's own setup (the WhatsApp number and display name, the email domain and its status, the SMTP details with the password kept safe and never shown again, and the Reply-to email). For every WhatsApp message: the</w:t>
+      </w:r>
+      <w:r>
+        <w:t xml:space="preserve"> </w:t>
+      </w:r>
+      <w:r>
+        <w:rPr>
+          <w:b/>
+          <w:bCs/>
+        </w:rPr>
+        <w:t xml:space="preserve">name and number it was sent from</w:t>
+      </w:r>
+      <w:r>
+        <w:t xml:space="preserve">, saved at the time it is sent.</w:t>
+      </w:r>
+    </w:p>
+    <w:p>
+      <w:pPr>
+        <w:pStyle w:val="BodyText"/>
+      </w:pPr>
+      <w:r>
+        <w:rPr>
+          <w:b/>
+          <w:bCs/>
+        </w:rPr>
+        <w:t xml:space="preserve">WhatsApp.</w:t>
+      </w:r>
+      <w:r>
+        <w:t xml:space="preserve"> </w:t>
+      </w:r>
+      <w:r>
+        <w:t xml:space="preserve">We send WhatsApp through</w:t>
+      </w:r>
+      <w:r>
+        <w:t xml:space="preserve"> </w:t>
+      </w:r>
+      <w:r>
+        <w:rPr>
+          <w:b/>
+          <w:bCs/>
+        </w:rPr>
+        <w:t xml:space="preserve">Rampwin</w:t>
+      </w:r>
+      <w:r>
+        <w:t xml:space="preserve">. The status of every message and its delivery details (delivered time, read time, failure reason) are taken from Rampwin. The user must never see the name Rampwin or its codes.</w:t>
+      </w:r>
+    </w:p>
+    <w:p>
+      <w:pPr>
+        <w:pStyle w:val="Compact"/>
+        <w:numPr>
+          <w:ilvl w:val="0"/>
+          <w:numId w:val="1023"/>
+        </w:numPr>
+      </w:pPr>
+      <w:r>
         <w:t xml:space="preserve">Rampwin API reference:</w:t>
       </w:r>
       <w:r>
         <w:t xml:space="preserve"> </w:t>
       </w:r>
-      <w:hyperlink r:id="rId93">
+      <w:hyperlink r:id="rId96">
         <w:r>
           <w:rPr>
             <w:rStyle w:val="Hyperlink"/>
@@ -11765,7 +11889,7 @@
         <w:pStyle w:val="Compact"/>
         <w:numPr>
           <w:ilvl w:val="0"/>
-          <w:numId w:val="1022"/>
+          <w:numId w:val="1023"/>
         </w:numPr>
       </w:pPr>
       <w:r>
@@ -11774,7 +11898,7 @@
       <w:r>
         <w:t xml:space="preserve"> </w:t>
       </w:r>
-      <w:hyperlink r:id="rId94">
+      <w:hyperlink r:id="rId97">
         <w:r>
           <w:rPr>
             <w:rStyle w:val="Hyperlink"/>
@@ -11822,7 +11946,7 @@
         <w:t xml:space="preserve">.</w:t>
       </w:r>
     </w:p>
-    <w:bookmarkEnd w:id="95"/>
+    <w:bookmarkEnd w:id="98"/>
     <w:sectPr>
       <w:footnotePr>
         <w:numRestart w:val="eachSect"/>
@@ -12229,6 +12353,9 @@
     <w:abstractNumId w:val="991"/>
   </w:num>
   <w:num w:numId="1017">
+    <w:abstractNumId w:val="991"/>
+  </w:num>
+  <w:num w:numId="1018">
     <w:abstractNumId w:val="99411"/>
     <w:lvlOverride w:ilvl="0">
       <w:startOverride w:val="1"/>
@@ -12258,10 +12385,10 @@
       <w:startOverride w:val="1"/>
     </w:lvlOverride>
   </w:num>
-  <w:num w:numId="1018">
+  <w:num w:numId="1019">
     <w:abstractNumId w:val="991"/>
   </w:num>
-  <w:num w:numId="1019">
+  <w:num w:numId="1020">
     <w:abstractNumId w:val="99411"/>
     <w:lvlOverride w:ilvl="0">
       <w:startOverride w:val="1"/>
@@ -12291,10 +12418,10 @@
       <w:startOverride w:val="1"/>
     </w:lvlOverride>
   </w:num>
-  <w:num w:numId="1020">
+  <w:num w:numId="1021">
     <w:abstractNumId w:val="991"/>
   </w:num>
-  <w:num w:numId="1021">
+  <w:num w:numId="1022">
     <w:abstractNumId w:val="99411"/>
     <w:lvlOverride w:ilvl="0">
       <w:startOverride w:val="1"/>
@@ -12324,7 +12451,7 @@
       <w:startOverride w:val="1"/>
     </w:lvlOverride>
   </w:num>
-  <w:num w:numId="1022">
+  <w:num w:numId="1023">
     <w:abstractNumId w:val="991"/>
   </w:num>
 </w:numbering>

</xml_diff>

<commit_message>
BRD: state the one-setup-for-all-modules rule as a plain rule
Co-Authored-By: Claude Sonnet 5.5 <noreply@anthropic.com>
</commit_message>
<xml_diff>
--- a/BRD.docx
+++ b/BRD.docx
@@ -11592,7 +11592,20 @@
         <w:t xml:space="preserve">the whole firm</w:t>
       </w:r>
       <w:r>
-        <w:t xml:space="preserve">. WhatsApp and email are chosen</w:t>
+        <w:t xml:space="preserve">. One own number and one own domain (or mail server) cover</w:t>
+      </w:r>
+      <w:r>
+        <w:t xml:space="preserve"> </w:t>
+      </w:r>
+      <w:r>
+        <w:rPr>
+          <w:b/>
+          <w:bCs/>
+        </w:rPr>
+        <w:t xml:space="preserve">all three modules</w:t>
+      </w:r>
+      <w:r>
+        <w:t xml:space="preserve">, GST, TDS and ITR. The firm does not choose them per module. WhatsApp and email are chosen</w:t>
       </w:r>
       <w:r>
         <w:t xml:space="preserve"> </w:t>
@@ -11711,40 +11724,6 @@
       </w:r>
       <w:r>
         <w:t xml:space="preserve">, because the user has to copy them exactly.</w:t>
-      </w:r>
-    </w:p>
-    <w:p>
-      <w:pPr>
-        <w:pStyle w:val="FirstParagraph"/>
-      </w:pPr>
-      <w:r>
-        <w:rPr>
-          <w:b/>
-          <w:bCs/>
-        </w:rPr>
-        <w:t xml:space="preserve">Decided:</w:t>
-      </w:r>
-      <w:r>
-        <w:t xml:space="preserve"> </w:t>
-      </w:r>
-      <w:r>
-        <w:t xml:space="preserve">one own number and one own domain cover</w:t>
-      </w:r>
-      <w:r>
-        <w:t xml:space="preserve"> </w:t>
-      </w:r>
-      <w:r>
-        <w:rPr>
-          <w:b/>
-          <w:bCs/>
-        </w:rPr>
-        <w:t xml:space="preserve">all three modules</w:t>
-      </w:r>
-      <w:r>
-        <w:t xml:space="preserve"> </w:t>
-      </w:r>
-      <w:r>
-        <w:t xml:space="preserve">(GST, TDS and ITR). The firm does not choose them per module. If this is ever needed, it will be added later.</w:t>
       </w:r>
     </w:p>
     <w:p>

</xml_diff>

<commit_message>
BRD: say what the product does, not what it does not do
Co-Authored-By: Claude Sonnet 5.5 <noreply@anthropic.com>
</commit_message>
<xml_diff>
--- a/BRD.docx
+++ b/BRD.docx
@@ -3493,7 +3493,10 @@
         <w:t xml:space="preserve">whole firm</w:t>
       </w:r>
       <w:r>
-        <w:t xml:space="preserve">, not per client. Details are in section 7.</w:t>
+        <w:t xml:space="preserve"> </w:t>
+      </w:r>
+      <w:r>
+        <w:t xml:space="preserve">and covers every client. Details are in section 7.</w:t>
       </w:r>
     </w:p>
     <w:p>
@@ -8910,7 +8913,10 @@
         <w:t xml:space="preserve">for the whole firm</w:t>
       </w:r>
       <w:r>
-        <w:t xml:space="preserve">, not for one client. Using it is</w:t>
+        <w:t xml:space="preserve"> </w:t>
+      </w:r>
+      <w:r>
+        <w:t xml:space="preserve">and covers every client. Using it is</w:t>
       </w:r>
       <w:r>
         <w:t xml:space="preserve"> </w:t>
@@ -9190,7 +9196,7 @@
         <w:pStyle w:val="FirstParagraph"/>
       </w:pPr>
       <w:r>
-        <w:t xml:space="preserve">A value the user cannot change (for example the From address of a verified domain) is shown as a</w:t>
+        <w:t xml:space="preserve">A value the user can change is a normal white box. A value that is fixed (for example the From address of a verified domain) is shown as a</w:t>
       </w:r>
       <w:r>
         <w:t xml:space="preserve"> </w:t>
@@ -9203,7 +9209,7 @@
         <w:t xml:space="preserve">grey box with a small lock</w:t>
       </w:r>
       <w:r>
-        <w:t xml:space="preserve">. A value the user can change is a normal white box.</w:t>
+        <w:t xml:space="preserve">.</w:t>
       </w:r>
     </w:p>
     <w:bookmarkEnd w:id="74"/>
@@ -9237,29 +9243,7 @@
           <w:b/>
           <w:bCs/>
         </w:rPr>
-        <w:t xml:space="preserve">Clicking a card only shows its details.</w:t>
-      </w:r>
-      <w:r>
-        <w:t xml:space="preserve"> </w:t>
-      </w:r>
-      <w:r>
-        <w:t xml:space="preserve">It does</w:t>
-      </w:r>
-      <w:r>
-        <w:t xml:space="preserve"> </w:t>
-      </w:r>
-      <w:r>
-        <w:rPr>
-          <w:b/>
-          <w:bCs/>
-        </w:rPr>
-        <w:t xml:space="preserve">not</w:t>
-      </w:r>
-      <w:r>
-        <w:t xml:space="preserve"> </w:t>
-      </w:r>
-      <w:r>
-        <w:t xml:space="preserve">change where messages go.</w:t>
+        <w:t xml:space="preserve">Clicking a card shows its details.</w:t>
       </w:r>
     </w:p>
     <w:p>
@@ -9388,7 +9372,7 @@
         </w:numPr>
       </w:pPr>
       <w:r>
-        <w:t xml:space="preserve">The automatic switch when a setup finishes (below) does not ask, because the user has just done the setup on purpose.</w:t>
+        <w:t xml:space="preserve">When a setup finishes, the card is switched to automatically (below), without a question, because the user has just done the setup on purpose.</w:t>
       </w:r>
     </w:p>
     <w:p>
@@ -9472,7 +9456,7 @@
         </w:numPr>
       </w:pPr>
       <w:r>
-        <w:t xml:space="preserve">A card that is not finished (not connected, not verified) cannot be switched to. Until it is finished, messages keep going from the system default.</w:t>
+        <w:t xml:space="preserve">A card can be switched to once its setup is finished (connected, verified). Until then, messages keep going from the system default.</w:t>
       </w:r>
     </w:p>
     <w:p>
@@ -9529,7 +9513,7 @@
         <w:t xml:space="preserve"> </w:t>
       </w:r>
       <w:r>
-        <w:t xml:space="preserve">(domain) put messages back on the system default.</w:t>
+        <w:t xml:space="preserve">(domain) put messages back on the system default and clear that setup.</w:t>
       </w:r>
     </w:p>
     <w:p>
@@ -9541,23 +9525,20 @@
         </w:numPr>
       </w:pPr>
       <w:r>
-        <w:t xml:space="preserve">Switching back to the system default</w:t>
-      </w:r>
-      <w:r>
-        <w:t xml:space="preserve"> </w:t>
-      </w:r>
-      <w:r>
-        <w:rPr>
-          <w:b/>
-          <w:bCs/>
-        </w:rPr>
-        <w:t xml:space="preserve">does not delete</w:t>
-      </w:r>
-      <w:r>
-        <w:t xml:space="preserve"> </w:t>
-      </w:r>
-      <w:r>
-        <w:t xml:space="preserve">the firm's own setup. It stays saved, and the user can switch to it again at any time. The card then shows</w:t>
+        <w:t xml:space="preserve">When the user switches back to the system default, the firm's own setup</w:t>
+      </w:r>
+      <w:r>
+        <w:t xml:space="preserve"> </w:t>
+      </w:r>
+      <w:r>
+        <w:rPr>
+          <w:b/>
+          <w:bCs/>
+        </w:rPr>
+        <w:t xml:space="preserve">stays saved</w:t>
+      </w:r>
+      <w:r>
+        <w:t xml:space="preserve">. The card shows</w:t>
       </w:r>
       <w:r>
         <w:t xml:space="preserve"> </w:t>
@@ -9570,7 +9551,7 @@
         <w:t xml:space="preserve">Not in use</w:t>
       </w:r>
       <w:r>
-        <w:t xml:space="preserve">.</w:t>
+        <w:t xml:space="preserve">, and the user can switch to it again at any time.</w:t>
       </w:r>
     </w:p>
     <w:bookmarkEnd w:id="78"/>
@@ -9858,7 +9839,7 @@
         <w:t xml:space="preserve">receives the connection details by itself</w:t>
       </w:r>
       <w:r>
-        <w:t xml:space="preserve">. The user does not copy or paste anything.</w:t>
+        <w:t xml:space="preserve">.</w:t>
       </w:r>
     </w:p>
     <w:p>
@@ -10219,13 +10200,13 @@
           <w:b/>
           <w:bCs/>
         </w:rPr>
-        <w:t xml:space="preserve">A rejected template is not shown separately.</w:t>
-      </w:r>
-      <w:r>
-        <w:t xml:space="preserve"> </w:t>
-      </w:r>
-      <w:r>
-        <w:t xml:space="preserve">It is simply not part of the approved count (for example 7 of 10). Its messages go from the system default number, the same as a template that is still waiting. KDK is told about rejections, so the template can be corrected and sent again. This is not shown to the firm. When the template is approved later, its messages start going from the firm's number by themselves.</w:t>
+        <w:t xml:space="preserve">The approved count (for example 7 of 10) is the template information the page shows.</w:t>
+      </w:r>
+      <w:r>
+        <w:t xml:space="preserve"> </w:t>
+      </w:r>
+      <w:r>
+        <w:t xml:space="preserve">A template that was rejected stays outside the count, and its messages go from the system default number, the same as a template that is still waiting. KDK is told about rejections, so the template can be corrected and sent again. When the template is approved, its messages start going from the firm's number by themselves.</w:t>
       </w:r>
     </w:p>
     <w:p>
@@ -10275,7 +10256,7 @@
         <w:t xml:space="preserve"> </w:t>
       </w:r>
       <w:r>
-        <w:t xml:space="preserve">is off until at least one template is approved.</w:t>
+        <w:t xml:space="preserve">becomes available when at least one template is approved.</w:t>
       </w:r>
     </w:p>
     <w:p>
@@ -10862,7 +10843,7 @@
         <w:t xml:space="preserve">Add domain</w:t>
       </w:r>
       <w:r>
-        <w:t xml:space="preserve">. A personal domain such as gmail.com is not accepted: "... is a personal email provider, not a domain you control."</w:t>
+        <w:t xml:space="preserve">. If the domain is a personal email provider such as gmail.com, the page says "... is a personal email provider, not a domain you control.", and asks for the firm's own domain.</w:t>
       </w:r>
     </w:p>
     <w:p>
@@ -11468,7 +11449,7 @@
         <w:t xml:space="preserve">Your connection</w:t>
       </w:r>
       <w:r>
-        <w:t xml:space="preserve">: SMTP server, Security, Username, From name and From address (the password is never shown again), with</w:t>
+        <w:t xml:space="preserve">: SMTP server, Security, Username, From name and From address (the password is kept safe and shown as hidden dots), with</w:t>
       </w:r>
       <w:r>
         <w:t xml:space="preserve"> </w:t>
@@ -11531,20 +11512,7 @@
         <w:t xml:space="preserve"> </w:t>
       </w:r>
       <w:r>
-        <w:t xml:space="preserve">in Email Logs. Spectrum Cloud only hands the email to the firm's server. It</w:t>
-      </w:r>
-      <w:r>
-        <w:t xml:space="preserve"> </w:t>
-      </w:r>
-      <w:r>
-        <w:rPr>
-          <w:b/>
-          <w:bCs/>
-        </w:rPr>
-        <w:t xml:space="preserve">cannot see what happens after that</w:t>
-      </w:r>
-      <w:r>
-        <w:t xml:space="preserve">, so it cannot tell whether the email was delivered, bounced, failed or opened. Instead of a status it cannot check, the log says</w:t>
+        <w:t xml:space="preserve">in Email Logs. It means "handed to the firm's own mail server". Spectrum Cloud hands the email over to that server and the delivery result is only known to the server, so</w:t>
       </w:r>
       <w:r>
         <w:t xml:space="preserve"> </w:t>
@@ -11557,7 +11525,10 @@
         <w:t xml:space="preserve">SMTP</w:t>
       </w:r>
       <w:r>
-        <w:t xml:space="preserve">, which means "handed to the firm's own mail server". Emails sent from the system default or from the firm's own domain keep their usual statuses (Delivered, Bounced and so on).</w:t>
+        <w:t xml:space="preserve"> </w:t>
+      </w:r>
+      <w:r>
+        <w:t xml:space="preserve">is the status shown. Emails sent from the system default or from the firm's own domain show their usual statuses (Delivered, Bounced and so on).</w:t>
       </w:r>
     </w:p>
     <w:bookmarkEnd w:id="93"/>
@@ -11605,7 +11576,7 @@
         <w:t xml:space="preserve">all three modules</w:t>
       </w:r>
       <w:r>
-        <w:t xml:space="preserve">, GST, TDS and ITR. The firm does not choose them per module. WhatsApp and email are chosen</w:t>
+        <w:t xml:space="preserve">, GST, TDS and ITR. WhatsApp and email are chosen</w:t>
       </w:r>
       <w:r>
         <w:t xml:space="preserve"> </w:t>
@@ -11658,7 +11629,7 @@
         </w:numPr>
       </w:pPr>
       <w:r>
-        <w:t xml:space="preserve">A setup that is not finished never takes over: messages keep going from the system default.</w:t>
+        <w:t xml:space="preserve">Messages keep going from the system default until a setup is finished.</w:t>
       </w:r>
     </w:p>
     <w:p>
@@ -11698,7 +11669,7 @@
         <w:t xml:space="preserve"> </w:t>
       </w:r>
       <w:r>
-        <w:t xml:space="preserve">in Email Logs, because Spectrum Cloud cannot check what happens after it hands the email over.</w:t>
+        <w:t xml:space="preserve">in Email Logs.</w:t>
       </w:r>
     </w:p>
     <w:p>
@@ -11710,7 +11681,7 @@
         </w:numPr>
       </w:pPr>
       <w:r>
-        <w:t xml:space="preserve">The user must never see the name of the WhatsApp provider. The DNS values for email are shown</w:t>
+        <w:t xml:space="preserve">Screens use plain words (WhatsApp, your connection, your number). The DNS values for email are shown</w:t>
       </w:r>
       <w:r>
         <w:t xml:space="preserve"> </w:t>
@@ -11723,7 +11694,7 @@
         <w:t xml:space="preserve">as given</w:t>
       </w:r>
       <w:r>
-        <w:t xml:space="preserve">, because the user has to copy them exactly.</w:t>
+        <w:t xml:space="preserve">, so the user can copy them exactly.</w:t>
       </w:r>
     </w:p>
     <w:p>
@@ -11837,7 +11808,7 @@
         <w:t xml:space="preserve">Rampwin</w:t>
       </w:r>
       <w:r>
-        <w:t xml:space="preserve">. The status of every message and its delivery details (delivered time, read time, failure reason) are taken from Rampwin. The user must never see the name Rampwin or its codes.</w:t>
+        <w:t xml:space="preserve">. The status of every message and its delivery details (delivered time, read time, failure reason) are taken from Rampwin. Screens use plain words, and the provider's name and codes stay internal.</w:t>
       </w:r>
     </w:p>
     <w:p>

</xml_diff>

<commit_message>
Revert "BRD: say what the product does, not what it does not do"
This reverts commit 69c5b34fe4e4dd79409662b507b7c5dcbcd02541.
</commit_message>
<xml_diff>
--- a/BRD.docx
+++ b/BRD.docx
@@ -3493,10 +3493,7 @@
         <w:t xml:space="preserve">whole firm</w:t>
       </w:r>
       <w:r>
-        <w:t xml:space="preserve"> </w:t>
-      </w:r>
-      <w:r>
-        <w:t xml:space="preserve">and covers every client. Details are in section 7.</w:t>
+        <w:t xml:space="preserve">, not per client. Details are in section 7.</w:t>
       </w:r>
     </w:p>
     <w:p>
@@ -8913,10 +8910,7 @@
         <w:t xml:space="preserve">for the whole firm</w:t>
       </w:r>
       <w:r>
-        <w:t xml:space="preserve"> </w:t>
-      </w:r>
-      <w:r>
-        <w:t xml:space="preserve">and covers every client. Using it is</w:t>
+        <w:t xml:space="preserve">, not for one client. Using it is</w:t>
       </w:r>
       <w:r>
         <w:t xml:space="preserve"> </w:t>
@@ -9196,7 +9190,7 @@
         <w:pStyle w:val="FirstParagraph"/>
       </w:pPr>
       <w:r>
-        <w:t xml:space="preserve">A value the user can change is a normal white box. A value that is fixed (for example the From address of a verified domain) is shown as a</w:t>
+        <w:t xml:space="preserve">A value the user cannot change (for example the From address of a verified domain) is shown as a</w:t>
       </w:r>
       <w:r>
         <w:t xml:space="preserve"> </w:t>
@@ -9209,7 +9203,7 @@
         <w:t xml:space="preserve">grey box with a small lock</w:t>
       </w:r>
       <w:r>
-        <w:t xml:space="preserve">.</w:t>
+        <w:t xml:space="preserve">. A value the user can change is a normal white box.</w:t>
       </w:r>
     </w:p>
     <w:bookmarkEnd w:id="74"/>
@@ -9243,7 +9237,29 @@
           <w:b/>
           <w:bCs/>
         </w:rPr>
-        <w:t xml:space="preserve">Clicking a card shows its details.</w:t>
+        <w:t xml:space="preserve">Clicking a card only shows its details.</w:t>
+      </w:r>
+      <w:r>
+        <w:t xml:space="preserve"> </w:t>
+      </w:r>
+      <w:r>
+        <w:t xml:space="preserve">It does</w:t>
+      </w:r>
+      <w:r>
+        <w:t xml:space="preserve"> </w:t>
+      </w:r>
+      <w:r>
+        <w:rPr>
+          <w:b/>
+          <w:bCs/>
+        </w:rPr>
+        <w:t xml:space="preserve">not</w:t>
+      </w:r>
+      <w:r>
+        <w:t xml:space="preserve"> </w:t>
+      </w:r>
+      <w:r>
+        <w:t xml:space="preserve">change where messages go.</w:t>
       </w:r>
     </w:p>
     <w:p>
@@ -9372,7 +9388,7 @@
         </w:numPr>
       </w:pPr>
       <w:r>
-        <w:t xml:space="preserve">When a setup finishes, the card is switched to automatically (below), without a question, because the user has just done the setup on purpose.</w:t>
+        <w:t xml:space="preserve">The automatic switch when a setup finishes (below) does not ask, because the user has just done the setup on purpose.</w:t>
       </w:r>
     </w:p>
     <w:p>
@@ -9456,7 +9472,7 @@
         </w:numPr>
       </w:pPr>
       <w:r>
-        <w:t xml:space="preserve">A card can be switched to once its setup is finished (connected, verified). Until then, messages keep going from the system default.</w:t>
+        <w:t xml:space="preserve">A card that is not finished (not connected, not verified) cannot be switched to. Until it is finished, messages keep going from the system default.</w:t>
       </w:r>
     </w:p>
     <w:p>
@@ -9513,7 +9529,7 @@
         <w:t xml:space="preserve"> </w:t>
       </w:r>
       <w:r>
-        <w:t xml:space="preserve">(domain) put messages back on the system default and clear that setup.</w:t>
+        <w:t xml:space="preserve">(domain) put messages back on the system default.</w:t>
       </w:r>
     </w:p>
     <w:p>
@@ -9525,20 +9541,23 @@
         </w:numPr>
       </w:pPr>
       <w:r>
-        <w:t xml:space="preserve">When the user switches back to the system default, the firm's own setup</w:t>
-      </w:r>
-      <w:r>
-        <w:t xml:space="preserve"> </w:t>
-      </w:r>
-      <w:r>
-        <w:rPr>
-          <w:b/>
-          <w:bCs/>
-        </w:rPr>
-        <w:t xml:space="preserve">stays saved</w:t>
-      </w:r>
-      <w:r>
-        <w:t xml:space="preserve">. The card shows</w:t>
+        <w:t xml:space="preserve">Switching back to the system default</w:t>
+      </w:r>
+      <w:r>
+        <w:t xml:space="preserve"> </w:t>
+      </w:r>
+      <w:r>
+        <w:rPr>
+          <w:b/>
+          <w:bCs/>
+        </w:rPr>
+        <w:t xml:space="preserve">does not delete</w:t>
+      </w:r>
+      <w:r>
+        <w:t xml:space="preserve"> </w:t>
+      </w:r>
+      <w:r>
+        <w:t xml:space="preserve">the firm's own setup. It stays saved, and the user can switch to it again at any time. The card then shows</w:t>
       </w:r>
       <w:r>
         <w:t xml:space="preserve"> </w:t>
@@ -9551,7 +9570,7 @@
         <w:t xml:space="preserve">Not in use</w:t>
       </w:r>
       <w:r>
-        <w:t xml:space="preserve">, and the user can switch to it again at any time.</w:t>
+        <w:t xml:space="preserve">.</w:t>
       </w:r>
     </w:p>
     <w:bookmarkEnd w:id="78"/>
@@ -9839,7 +9858,7 @@
         <w:t xml:space="preserve">receives the connection details by itself</w:t>
       </w:r>
       <w:r>
-        <w:t xml:space="preserve">.</w:t>
+        <w:t xml:space="preserve">. The user does not copy or paste anything.</w:t>
       </w:r>
     </w:p>
     <w:p>
@@ -10200,13 +10219,13 @@
           <w:b/>
           <w:bCs/>
         </w:rPr>
-        <w:t xml:space="preserve">The approved count (for example 7 of 10) is the template information the page shows.</w:t>
-      </w:r>
-      <w:r>
-        <w:t xml:space="preserve"> </w:t>
-      </w:r>
-      <w:r>
-        <w:t xml:space="preserve">A template that was rejected stays outside the count, and its messages go from the system default number, the same as a template that is still waiting. KDK is told about rejections, so the template can be corrected and sent again. When the template is approved, its messages start going from the firm's number by themselves.</w:t>
+        <w:t xml:space="preserve">A rejected template is not shown separately.</w:t>
+      </w:r>
+      <w:r>
+        <w:t xml:space="preserve"> </w:t>
+      </w:r>
+      <w:r>
+        <w:t xml:space="preserve">It is simply not part of the approved count (for example 7 of 10). Its messages go from the system default number, the same as a template that is still waiting. KDK is told about rejections, so the template can be corrected and sent again. This is not shown to the firm. When the template is approved later, its messages start going from the firm's number by themselves.</w:t>
       </w:r>
     </w:p>
     <w:p>
@@ -10256,7 +10275,7 @@
         <w:t xml:space="preserve"> </w:t>
       </w:r>
       <w:r>
-        <w:t xml:space="preserve">becomes available when at least one template is approved.</w:t>
+        <w:t xml:space="preserve">is off until at least one template is approved.</w:t>
       </w:r>
     </w:p>
     <w:p>
@@ -10843,7 +10862,7 @@
         <w:t xml:space="preserve">Add domain</w:t>
       </w:r>
       <w:r>
-        <w:t xml:space="preserve">. If the domain is a personal email provider such as gmail.com, the page says "... is a personal email provider, not a domain you control.", and asks for the firm's own domain.</w:t>
+        <w:t xml:space="preserve">. A personal domain such as gmail.com is not accepted: "... is a personal email provider, not a domain you control."</w:t>
       </w:r>
     </w:p>
     <w:p>
@@ -11449,7 +11468,7 @@
         <w:t xml:space="preserve">Your connection</w:t>
       </w:r>
       <w:r>
-        <w:t xml:space="preserve">: SMTP server, Security, Username, From name and From address (the password is kept safe and shown as hidden dots), with</w:t>
+        <w:t xml:space="preserve">: SMTP server, Security, Username, From name and From address (the password is never shown again), with</w:t>
       </w:r>
       <w:r>
         <w:t xml:space="preserve"> </w:t>
@@ -11512,7 +11531,20 @@
         <w:t xml:space="preserve"> </w:t>
       </w:r>
       <w:r>
-        <w:t xml:space="preserve">in Email Logs. It means "handed to the firm's own mail server". Spectrum Cloud hands the email over to that server and the delivery result is only known to the server, so</w:t>
+        <w:t xml:space="preserve">in Email Logs. Spectrum Cloud only hands the email to the firm's server. It</w:t>
+      </w:r>
+      <w:r>
+        <w:t xml:space="preserve"> </w:t>
+      </w:r>
+      <w:r>
+        <w:rPr>
+          <w:b/>
+          <w:bCs/>
+        </w:rPr>
+        <w:t xml:space="preserve">cannot see what happens after that</w:t>
+      </w:r>
+      <w:r>
+        <w:t xml:space="preserve">, so it cannot tell whether the email was delivered, bounced, failed or opened. Instead of a status it cannot check, the log says</w:t>
       </w:r>
       <w:r>
         <w:t xml:space="preserve"> </w:t>
@@ -11525,10 +11557,7 @@
         <w:t xml:space="preserve">SMTP</w:t>
       </w:r>
       <w:r>
-        <w:t xml:space="preserve"> </w:t>
-      </w:r>
-      <w:r>
-        <w:t xml:space="preserve">is the status shown. Emails sent from the system default or from the firm's own domain show their usual statuses (Delivered, Bounced and so on).</w:t>
+        <w:t xml:space="preserve">, which means "handed to the firm's own mail server". Emails sent from the system default or from the firm's own domain keep their usual statuses (Delivered, Bounced and so on).</w:t>
       </w:r>
     </w:p>
     <w:bookmarkEnd w:id="93"/>
@@ -11576,7 +11605,7 @@
         <w:t xml:space="preserve">all three modules</w:t>
       </w:r>
       <w:r>
-        <w:t xml:space="preserve">, GST, TDS and ITR. WhatsApp and email are chosen</w:t>
+        <w:t xml:space="preserve">, GST, TDS and ITR. The firm does not choose them per module. WhatsApp and email are chosen</w:t>
       </w:r>
       <w:r>
         <w:t xml:space="preserve"> </w:t>
@@ -11629,7 +11658,7 @@
         </w:numPr>
       </w:pPr>
       <w:r>
-        <w:t xml:space="preserve">Messages keep going from the system default until a setup is finished.</w:t>
+        <w:t xml:space="preserve">A setup that is not finished never takes over: messages keep going from the system default.</w:t>
       </w:r>
     </w:p>
     <w:p>
@@ -11669,7 +11698,7 @@
         <w:t xml:space="preserve"> </w:t>
       </w:r>
       <w:r>
-        <w:t xml:space="preserve">in Email Logs.</w:t>
+        <w:t xml:space="preserve">in Email Logs, because Spectrum Cloud cannot check what happens after it hands the email over.</w:t>
       </w:r>
     </w:p>
     <w:p>
@@ -11681,7 +11710,7 @@
         </w:numPr>
       </w:pPr>
       <w:r>
-        <w:t xml:space="preserve">Screens use plain words (WhatsApp, your connection, your number). The DNS values for email are shown</w:t>
+        <w:t xml:space="preserve">The user must never see the name of the WhatsApp provider. The DNS values for email are shown</w:t>
       </w:r>
       <w:r>
         <w:t xml:space="preserve"> </w:t>
@@ -11694,7 +11723,7 @@
         <w:t xml:space="preserve">as given</w:t>
       </w:r>
       <w:r>
-        <w:t xml:space="preserve">, so the user can copy them exactly.</w:t>
+        <w:t xml:space="preserve">, because the user has to copy them exactly.</w:t>
       </w:r>
     </w:p>
     <w:p>
@@ -11808,7 +11837,7 @@
         <w:t xml:space="preserve">Rampwin</w:t>
       </w:r>
       <w:r>
-        <w:t xml:space="preserve">. The status of every message and its delivery details (delivered time, read time, failure reason) are taken from Rampwin. Screens use plain words, and the provider's name and codes stay internal.</w:t>
+        <w:t xml:space="preserve">. The status of every message and its delivery details (delivered time, read time, failure reason) are taken from Rampwin. The user must never see the name Rampwin or its codes.</w:t>
       </w:r>
     </w:p>
     <w:p>

</xml_diff>

<commit_message>
BRD: shorter header table
Co-Authored-By: Claude Sonnet 5.5 <noreply@anthropic.com>
</commit_message>
<xml_diff>
--- a/BRD.docx
+++ b/BRD.docx
@@ -101,7 +101,7 @@
                 <w:color w:val="222222"/>
                 <w:sz w:val="20"/>
               </w:rPr>
-              <w:t>Product</w:t>
+              <w:t>Feature</w:t>
             </w:r>
           </w:p>
         </w:tc>
@@ -121,93 +121,7 @@
                 <w:color w:val="222222"/>
                 <w:sz w:val="20"/>
               </w:rPr>
-              <w:t>Spectrum Cloud</w:t>
-            </w:r>
-          </w:p>
-        </w:tc>
-      </w:tr>
-      <w:tr>
-        <w:tc>
-          <w:tcPr>
-            <w:tcW w:type="dxa" w:w="2448"/>
-            <w:shd w:val="clear" w:color="auto" w:fill="F3F4F6"/>
-            <w:vAlign w:val="center"/>
-          </w:tcPr>
-          <w:p>
-            <w:pPr>
-              <w:spacing w:before="40" w:after="40"/>
-            </w:pPr>
-            <w:r>
-              <w:rPr>
-                <w:rFonts w:ascii="Calibri" w:hAnsi="Calibri" w:cs="Calibri" w:eastAsia="Calibri"/>
-                <w:b/>
-                <w:color w:val="222222"/>
-                <w:sz w:val="20"/>
-              </w:rPr>
-              <w:t>Modules</w:t>
-            </w:r>
-          </w:p>
-        </w:tc>
-        <w:tc>
-          <w:tcPr>
-            <w:tcW w:type="dxa" w:w="7200"/>
-            <w:vAlign w:val="center"/>
-          </w:tcPr>
-          <w:p>
-            <w:pPr>
-              <w:spacing w:before="40" w:after="40"/>
-            </w:pPr>
-            <w:r>
-              <w:rPr>
-                <w:rFonts w:ascii="Calibri" w:hAnsi="Calibri" w:cs="Calibri" w:eastAsia="Calibri"/>
-                <w:b w:val="0"/>
-                <w:color w:val="222222"/>
-                <w:sz w:val="20"/>
-              </w:rPr>
-              <w:t>GST, TDS and ITR</w:t>
-            </w:r>
-          </w:p>
-        </w:tc>
-      </w:tr>
-      <w:tr>
-        <w:tc>
-          <w:tcPr>
-            <w:tcW w:type="dxa" w:w="2448"/>
-            <w:shd w:val="clear" w:color="auto" w:fill="F3F4F6"/>
-            <w:vAlign w:val="center"/>
-          </w:tcPr>
-          <w:p>
-            <w:pPr>
-              <w:spacing w:before="40" w:after="40"/>
-            </w:pPr>
-            <w:r>
-              <w:rPr>
-                <w:rFonts w:ascii="Calibri" w:hAnsi="Calibri" w:cs="Calibri" w:eastAsia="Calibri"/>
-                <w:b/>
-                <w:color w:val="222222"/>
-                <w:sz w:val="20"/>
-              </w:rPr>
-              <w:t>Feature</w:t>
-            </w:r>
-          </w:p>
-        </w:tc>
-        <w:tc>
-          <w:tcPr>
-            <w:tcW w:type="dxa" w:w="7200"/>
-            <w:vAlign w:val="center"/>
-          </w:tcPr>
-          <w:p>
-            <w:pPr>
-              <w:spacing w:before="40" w:after="40"/>
-            </w:pPr>
-            <w:r>
-              <w:rPr>
-                <w:rFonts w:ascii="Calibri" w:hAnsi="Calibri" w:cs="Calibri" w:eastAsia="Calibri"/>
-                <w:b w:val="0"/>
-                <w:color w:val="222222"/>
-                <w:sz w:val="20"/>
-              </w:rPr>
-              <w:t>Client Communications (one page for all three modules), Configuration (where WhatsApp and email are sent from) and WhatsApp Logs. Email Logs opens from the same page and has its own BRD</w:t>
+              <w:t>Client Communications, Configuration and WhatsApp Logs</w:t>
             </w:r>
           </w:p>
         </w:tc>

</xml_diff>

<commit_message>
WhatsApp logs: targeted without mobile number counts as Failed (No mobile number)
Co-Authored-By: Claude Sonnet 5.5 <noreply@anthropic.com>
</commit_message>
<xml_diff>
--- a/BRD.docx
+++ b/BRD.docx
@@ -256,7 +256,7 @@
         </w:tc>
       </w:tr>
     </w:tbl>
-    <w:bookmarkStart w:id="13" w:name="Xc8951b796c7b61cbdd4998c72efbdeed0056e13"/>
+    <w:bookmarkStart w:id="13" w:name="overview"/>
     <w:p>
       <w:pPr>
         <w:pStyle w:val="Heading2"/>
@@ -268,7 +268,7 @@
         <w:t xml:space="preserve">1. Overview</w:t>
       </w:r>
     </w:p>
-    <w:bookmarkStart w:id="9" w:name="X5f5d48bced3b98d7c149293fafcf94fc98538bd"/>
+    <w:bookmarkStart w:id="9" w:name="background"/>
     <w:p>
       <w:pPr>
         <w:pStyle w:val="Heading3"/>
@@ -373,11 +373,11 @@
         <w:t xml:space="preserve"> </w:t>
       </w:r>
       <w:r>
-        <w:t xml:space="preserve">page. Today the page covers the GST module only. TDS and ITR do not have it. WhatsApp messages have no log: the user cannot see how many clients a scheduled WhatsApp run was meant for, how many messages were sent, or what happened to them. And the firm cannot choose the WhatsApp number or the email address its messages come from: they always go from the system's own number and address.</w:t>
+        <w:t xml:space="preserve">page. Today the page covers the GST module only. TDS and ITR do not have it. WhatsApp messages have no log: the user cannot see how many clients a scheduled WhatsApp run was meant for, how many messages were sent, or what happened to them. And the firm cannot choose the WhatsApp number or the email address its messages come from: they always go from the system’s own number and address.</w:t>
       </w:r>
     </w:p>
     <w:bookmarkEnd w:id="9"/>
-    <w:bookmarkStart w:id="10" w:name="Xf7bea6559bef12c9b5a4888c4b5e638d501b08e"/>
+    <w:bookmarkStart w:id="10" w:name="what-we-are-doing"/>
     <w:p>
       <w:pPr>
         <w:pStyle w:val="Heading3"/>
@@ -578,7 +578,7 @@
       </w:r>
     </w:p>
     <w:bookmarkEnd w:id="10"/>
-    <w:bookmarkStart w:id="11" w:name="X9dbc163790b80b7da6d4870327b910ca93dfddb"/>
+    <w:bookmarkStart w:id="11" w:name="goals"/>
     <w:p>
       <w:pPr>
         <w:pStyle w:val="Heading3"/>
@@ -667,7 +667,7 @@
         <w:t xml:space="preserve">who receives them</w:t>
       </w:r>
       <w:r>
-        <w:t xml:space="preserve">: the client's main contact, or another contact of the client.</w:t>
+        <w:t xml:space="preserve">: the client’s main contact, or another contact of the client.</w:t>
       </w:r>
     </w:p>
     <w:p>
@@ -679,7 +679,7 @@
         </w:numPr>
       </w:pPr>
       <w:r>
-        <w:t xml:space="preserve">Change many registrations at once (bulk), copy settings to the client's other registrations, and set</w:t>
+        <w:t xml:space="preserve">Change many registrations at once (bulk), copy settings to the client’s other registrations, and set</w:t>
       </w:r>
       <w:r>
         <w:t xml:space="preserve"> </w:t>
@@ -773,7 +773,7 @@
       </w:r>
     </w:p>
     <w:bookmarkEnd w:id="11"/>
-    <w:bookmarkStart w:id="12" w:name="X1f4012e9c4b62781074de2916856df2f3df4c87"/>
+    <w:bookmarkStart w:id="12" w:name="scope"/>
     <w:p>
       <w:pPr>
         <w:pStyle w:val="Heading3"/>
@@ -863,7 +863,7 @@
     </w:p>
     <w:bookmarkEnd w:id="12"/>
     <w:bookmarkEnd w:id="13"/>
-    <w:bookmarkStart w:id="22" w:name="X770f27a98732016b8dbb570f1ef055be35edf30"/>
+    <w:bookmarkStart w:id="22" w:name="key-concepts"/>
     <w:p>
       <w:pPr>
         <w:pStyle w:val="Heading2"/>
@@ -883,7 +883,7 @@
         <w:t xml:space="preserve">Read this section first. The rest of the document uses these terms.</w:t>
       </w:r>
     </w:p>
-    <w:bookmarkStart w:id="14" w:name="X7f5462df8089a17e43bd0511dd9288fcdcb6a73"/>
+    <w:bookmarkStart w:id="14" w:name="client-registration-and-contact"/>
     <w:p>
       <w:pPr>
         <w:pStyle w:val="Heading3"/>
@@ -1262,7 +1262,7 @@
               <w:rPr>
                 <w:sz w:val="20"/>
               </w:rPr>
-              <w:t xml:space="preserve">The client's first contact. A registration uses it unless another contact is picked for that registration</w:t>
+              <w:t xml:space="preserve">The client’s first contact. A registration uses it unless another contact is picked for that registration</w:t>
             </w:r>
           </w:p>
         </w:tc>
@@ -1291,7 +1291,7 @@
       </w:r>
     </w:p>
     <w:bookmarkEnd w:id="14"/>
-    <w:bookmarkStart w:id="15" w:name="X83db69eb340047b14f97eaee704ef26ae6a15f6"/>
+    <w:bookmarkStart w:id="15" w:name="reports-and-events"/>
     <w:p>
       <w:pPr>
         <w:pStyle w:val="Heading3"/>
@@ -1312,6 +1312,7 @@
           <w:insideH w:val="single" w:sz="4" w:space="0" w:color="D5DBE3"/>
           <w:insideV w:val="single" w:sz="4" w:space="0" w:color="D5DBE3"/>
         </w:tblBorders>
+        <w:tblLayout w:type="fixed"/>
         <w:tblCellMar>
           <w:top w:w="70" w:type="dxa"/>
           <w:left w:w="110" w:type="dxa"/>
@@ -1687,7 +1688,34 @@
         <w:ind w:left="115"/>
       </w:pPr>
       <w:r>
-        <w:t xml:space="preserve">The names on the prototype screens (for example "Form 24Q filed", "Refund issued", "Monthly TDS summary") are</w:t>
+        <w:t xml:space="preserve">The names on the prototype screens (for example</w:t>
+      </w:r>
+      <w:r>
+        <w:t xml:space="preserve"> </w:t>
+      </w:r>
+      <w:r>
+        <w:t xml:space="preserve">“Form 24Q filed”</w:t>
+      </w:r>
+      <w:r>
+        <w:t xml:space="preserve">,</w:t>
+      </w:r>
+      <w:r>
+        <w:t xml:space="preserve"> </w:t>
+      </w:r>
+      <w:r>
+        <w:t xml:space="preserve">“Refund issued”</w:t>
+      </w:r>
+      <w:r>
+        <w:t xml:space="preserve">,</w:t>
+      </w:r>
+      <w:r>
+        <w:t xml:space="preserve"> </w:t>
+      </w:r>
+      <w:r>
+        <w:t xml:space="preserve">“Monthly TDS summary”</w:t>
+      </w:r>
+      <w:r>
+        <w:t xml:space="preserve">) are</w:t>
       </w:r>
       <w:r>
         <w:t xml:space="preserve"> </w:t>
@@ -1700,11 +1728,23 @@
         <w:t xml:space="preserve">examples only</w:t>
       </w:r>
       <w:r>
-        <w:t xml:space="preserve">. The final lists will be added by the domain team. The page must work with any list: a module with no report or event shows "No reports or events for TDS yet." and its numbers show a dash.</w:t>
+        <w:t xml:space="preserve">. The final lists will be added by the domain team. The page must work with any list: a module with no report or event shows</w:t>
+      </w:r>
+      <w:r>
+        <w:t xml:space="preserve"> </w:t>
+      </w:r>
+      <w:r>
+        <w:t xml:space="preserve">“No reports or events for TDS yet.”</w:t>
+      </w:r>
+      <w:r>
+        <w:t xml:space="preserve"> </w:t>
+      </w:r>
+      <w:r>
+        <w:t xml:space="preserve">and its numbers show a dash.</w:t>
       </w:r>
     </w:p>
     <w:bookmarkEnd w:id="15"/>
-    <w:bookmarkStart w:id="16" w:name="Xbeaeecdba64e59e9f3e2056676977dc50c1c0ae"/>
+    <w:bookmarkStart w:id="16" w:name="when-a-switch-cannot-be-turned-on"/>
     <w:p>
       <w:pPr>
         <w:pStyle w:val="Heading3"/>
@@ -1795,7 +1835,7 @@
       </w:r>
     </w:p>
     <w:bookmarkEnd w:id="16"/>
-    <w:bookmarkStart w:id="17" w:name="Xfb4f61b0767c80bea6aa56662e557e1ee69f814"/>
+    <w:bookmarkStart w:id="17" w:name="Xecbce999d6317d317bf5fed5ab142cd85f03f1b"/>
     <w:p>
       <w:pPr>
         <w:pStyle w:val="Heading3"/>
@@ -1816,6 +1856,7 @@
           <w:insideH w:val="single" w:sz="4" w:space="0" w:color="D5DBE3"/>
           <w:insideV w:val="single" w:sz="4" w:space="0" w:color="D5DBE3"/>
         </w:tblBorders>
+        <w:tblLayout w:type="fixed"/>
         <w:tblCellMar>
           <w:top w:w="70" w:type="dxa"/>
           <w:left w:w="110" w:type="dxa"/>
@@ -2125,7 +2166,7 @@
       </w:r>
     </w:p>
     <w:bookmarkEnd w:id="17"/>
-    <w:bookmarkStart w:id="18" w:name="X9227148df73941ed38024824e5129f0af39589e"/>
+    <w:bookmarkStart w:id="18" w:name="trigger-event"/>
     <w:p>
       <w:pPr>
         <w:pStyle w:val="Heading3"/>
@@ -2177,7 +2218,7 @@
       </w:r>
     </w:p>
     <w:bookmarkEnd w:id="18"/>
-    <w:bookmarkStart w:id="19" w:name="X952241f8473c12a05c070a6b2388f5153966a68"/>
+    <w:bookmarkStart w:id="19" w:name="ids-the-user-sees"/>
     <w:p>
       <w:pPr>
         <w:pStyle w:val="Heading3"/>
@@ -2206,6 +2247,7 @@
           <w:insideH w:val="single" w:sz="4" w:space="0" w:color="D5DBE3"/>
           <w:insideV w:val="single" w:sz="4" w:space="0" w:color="D5DBE3"/>
         </w:tblBorders>
+        <w:tblLayout w:type="fixed"/>
         <w:tblCellMar>
           <w:top w:w="70" w:type="dxa"/>
           <w:left w:w="110" w:type="dxa"/>
@@ -2522,7 +2564,7 @@
       </w:tr>
     </w:tbl>
     <w:bookmarkEnd w:id="19"/>
-    <w:bookmarkStart w:id="20" w:name="Xd972a2146bd3960c1f8c12e5f909eaec20daa08"/>
+    <w:bookmarkStart w:id="20" w:name="numbers-and-statuses"/>
     <w:p>
       <w:pPr>
         <w:pStyle w:val="Heading3"/>
@@ -2683,7 +2725,7 @@
               <w:rPr>
                 <w:sz w:val="20"/>
               </w:rPr>
-              <w:t xml:space="preserve">when the run started, and that have a mobile number</w:t>
+              <w:t xml:space="preserve">when the run started</w:t>
             </w:r>
           </w:p>
         </w:tc>
@@ -2944,7 +2986,7 @@
               <w:rPr>
                 <w:sz w:val="20"/>
               </w:rPr>
-              <w:t xml:space="preserve">Handed over to WhatsApp. Not yet on the client's phone</w:t>
+              <w:t xml:space="preserve">Handed over to WhatsApp. Not yet on the client’s phone</w:t>
             </w:r>
           </w:p>
         </w:tc>
@@ -2989,7 +3031,7 @@
               <w:rPr>
                 <w:sz w:val="20"/>
               </w:rPr>
-              <w:t xml:space="preserve">Reached the client's phone</w:t>
+              <w:t xml:space="preserve">Reached the client’s phone</w:t>
             </w:r>
           </w:p>
         </w:tc>
@@ -3092,8 +3134,68 @@
         <w:t xml:space="preserve">The final list of statuses follows what the provider gives us.</w:t>
       </w:r>
     </w:p>
+    <w:p>
+      <w:pPr>
+        <w:pStyle w:val="BodyText"/>
+      </w:pPr>
+      <w:r>
+        <w:rPr>
+          <w:b/>
+          <w:bCs/>
+        </w:rPr>
+        <w:t xml:space="preserve">No mobile number.</w:t>
+      </w:r>
+      <w:r>
+        <w:t xml:space="preserve"> </w:t>
+      </w:r>
+      <w:r>
+        <w:t xml:space="preserve">A registration that is targeted but whose contact has no mobile number is still counted in</w:t>
+      </w:r>
+      <w:r>
+        <w:t xml:space="preserve"> </w:t>
+      </w:r>
+      <w:r>
+        <w:rPr>
+          <w:b/>
+          <w:bCs/>
+        </w:rPr>
+        <w:t xml:space="preserve">Targeted</w:t>
+      </w:r>
+      <w:r>
+        <w:t xml:space="preserve">. Its message is not sent and is shown as</w:t>
+      </w:r>
+      <w:r>
+        <w:t xml:space="preserve"> </w:t>
+      </w:r>
+      <w:r>
+        <w:rPr>
+          <w:b/>
+          <w:bCs/>
+        </w:rPr>
+        <w:t xml:space="preserve">Failed</w:t>
+      </w:r>
+      <w:r>
+        <w:t xml:space="preserve"> </w:t>
+      </w:r>
+      <w:r>
+        <w:t xml:space="preserve">with the reason</w:t>
+      </w:r>
+      <w:r>
+        <w:t xml:space="preserve"> </w:t>
+      </w:r>
+      <w:r>
+        <w:rPr>
+          <w:b/>
+          <w:bCs/>
+        </w:rPr>
+        <w:t xml:space="preserve">No mobile number</w:t>
+      </w:r>
+      <w:r>
+        <w:t xml:space="preserve">, so the user can see who was missed and why.</w:t>
+      </w:r>
+    </w:p>
     <w:bookmarkEnd w:id="20"/>
-    <w:bookmarkStart w:id="21" w:name="X93bf6e8da3acf63325c389097799a1007e07b7f"/>
+    <w:bookmarkStart w:id="21" w:name="where-messages-are-sent-from"/>
     <w:p>
       <w:pPr>
         <w:pStyle w:val="Heading3"/>
@@ -3261,7 +3363,7 @@
               <w:rPr>
                 <w:sz w:val="20"/>
               </w:rPr>
-              <w:t xml:space="preserve">The firm's own WhatsApp number, its own email domain, or its own mail server (SMTP). The firm sets it up once on the Configuration page</w:t>
+              <w:t xml:space="preserve">The firm’s own WhatsApp number, its own email domain, or its own mail server (SMTP). The firm sets it up once on the Configuration page</w:t>
             </w:r>
           </w:p>
         </w:tc>
@@ -3419,7 +3521,7 @@
     </w:p>
     <w:bookmarkEnd w:id="21"/>
     <w:bookmarkEnd w:id="22"/>
-    <w:bookmarkStart w:id="23" w:name="X1d14353f54ef4e38aae925f34427e5f604e823c"/>
+    <w:bookmarkStart w:id="23" w:name="how-the-user-opens-the-page"/>
     <w:p>
       <w:pPr>
         <w:pStyle w:val="Heading2"/>
@@ -3541,6 +3643,7 @@
           <w:insideH w:val="single" w:sz="4" w:space="0" w:color="D5DBE3"/>
           <w:insideV w:val="single" w:sz="4" w:space="0" w:color="D5DBE3"/>
         </w:tblBorders>
+        <w:tblLayout w:type="fixed"/>
         <w:tblCellMar>
           <w:top w:w="70" w:type="dxa"/>
           <w:left w:w="110" w:type="dxa"/>
@@ -3816,7 +3919,7 @@
               <w:rPr>
                 <w:sz w:val="20"/>
               </w:rPr>
-              <w:t xml:space="preserve">Email Logs. It is a separate page with its own BRD, and opens inside the same app. Emails sent through the firm's own SMTP server show the status</w:t>
+              <w:t xml:space="preserve">Email Logs. It is a separate page with its own BRD, and opens inside the same app. Emails sent through the firm’s own SMTP server show the status</w:t>
             </w:r>
             <w:r>
               <w:rPr>
@@ -3899,7 +4002,7 @@
       </w:r>
     </w:p>
     <w:bookmarkEnd w:id="23"/>
-    <w:bookmarkStart w:id="41" w:name="X9fd9dae6aa9a8ceadb43be139b8559f1e5228b1"/>
+    <w:bookmarkStart w:id="41" w:name="the-client-communications-page"/>
     <w:p>
       <w:pPr>
         <w:pStyle w:val="Heading2"/>
@@ -3913,7 +4016,7 @@
     </w:p>
     <w:p>
       <w:pPr>
-        <w:pStyle w:val="FirstParagraph"/>
+        <w:pStyle w:val="CaptionedFigure"/>
         <w:keepNext/>
         <w:spacing w:before="120" w:after="40"/>
         <w:jc w:val="center"/>
@@ -3968,7 +4071,7 @@
     </w:p>
     <w:p>
       <w:pPr>
-        <w:pStyle w:val="FirstParagraph"/>
+        <w:pStyle w:val="CaptionedFigure"/>
         <w:keepNext w:val="0"/>
         <w:spacing w:before="40" w:after="240"/>
         <w:jc w:val="center"/>
@@ -3983,7 +4086,15 @@
         <w:t>Figure: Client Communications</w:t>
       </w:r>
     </w:p>
-    <w:bookmarkStart w:id="30" w:name="X0bdf74869b4e5fb41ef15fa2cb547e9ef354085"/>
+    <w:p>
+      <w:pPr>
+        <w:pStyle w:val="ImageCaption"/>
+      </w:pPr>
+      <w:r>
+        <w:t xml:space="preserve">Client Communications</w:t>
+      </w:r>
+    </w:p>
+    <w:bookmarkStart w:id="30" w:name="toolbar"/>
     <w:p>
       <w:pPr>
         <w:pStyle w:val="Heading3"/>
@@ -4019,7 +4130,7 @@
         <w:t xml:space="preserve"> </w:t>
       </w:r>
       <w:r>
-        <w:t xml:space="preserve">by client name, PAN, GSTIN, TAN, or the contact's name, email or mobile number.</w:t>
+        <w:t xml:space="preserve">by client name, PAN, GSTIN, TAN, or the contact’s name, email or mobile number.</w:t>
       </w:r>
     </w:p>
     <w:p>
@@ -4344,7 +4455,40 @@
         <w:spacing w:before="160"/>
       </w:pPr>
       <w:r>
-        <w:t xml:space="preserve">A filter shows only its name when nothing is picked ("Module"), and the choice when something is ("Module: TDS", or "Module: 2 selected"). A long choice is cut with "…" and shown in full when the pointer is on it. When a filter has 8 or more choices it gets a search box. A</w:t>
+        <w:t xml:space="preserve">A filter shows only its name when nothing is picked (</w:t>
+      </w:r>
+      <w:r>
+        <w:t xml:space="preserve">“Module”</w:t>
+      </w:r>
+      <w:r>
+        <w:t xml:space="preserve">), and the choice when something is (</w:t>
+      </w:r>
+      <w:r>
+        <w:t xml:space="preserve">“Module: TDS”</w:t>
+      </w:r>
+      <w:r>
+        <w:t xml:space="preserve">, or</w:t>
+      </w:r>
+      <w:r>
+        <w:t xml:space="preserve"> </w:t>
+      </w:r>
+      <w:r>
+        <w:t xml:space="preserve">“Module: 2 selected”</w:t>
+      </w:r>
+      <w:r>
+        <w:t xml:space="preserve">). A long choice is cut with</w:t>
+      </w:r>
+      <w:r>
+        <w:t xml:space="preserve"> </w:t>
+      </w:r>
+      <w:r>
+        <w:t xml:space="preserve">“…”</w:t>
+      </w:r>
+      <w:r>
+        <w:t xml:space="preserve"> </w:t>
+      </w:r>
+      <w:r>
+        <w:t xml:space="preserve">and shown in full when the pointer is on it. When a filter has 8 or more choices it gets a search box. A</w:t>
       </w:r>
       <w:r>
         <w:t xml:space="preserve"> </w:t>
@@ -4365,7 +4509,7 @@
     </w:p>
     <w:p>
       <w:pPr>
-        <w:pStyle w:val="BodyText"/>
+        <w:pStyle w:val="CaptionedFigure"/>
         <w:keepNext/>
         <w:spacing w:before="120" w:after="40"/>
         <w:jc w:val="center"/>
@@ -4420,7 +4564,7 @@
     </w:p>
     <w:p>
       <w:pPr>
-        <w:pStyle w:val="BodyText"/>
+        <w:pStyle w:val="CaptionedFigure"/>
         <w:keepNext w:val="0"/>
         <w:spacing w:before="40" w:after="240"/>
         <w:jc w:val="center"/>
@@ -4435,8 +4579,16 @@
         <w:t>Figure: Filters</w:t>
       </w:r>
     </w:p>
+    <w:p>
+      <w:pPr>
+        <w:pStyle w:val="ImageCaption"/>
+      </w:pPr>
+      <w:r>
+        <w:t xml:space="preserve">Filters</w:t>
+      </w:r>
+    </w:p>
     <w:bookmarkEnd w:id="30"/>
-    <w:bookmarkStart w:id="31" w:name="X741b0d0ee180564f71eefae3ee4636212a154dc"/>
+    <w:bookmarkStart w:id="31" w:name="table"/>
     <w:p>
       <w:pPr>
         <w:pStyle w:val="Heading3"/>
@@ -4647,7 +4799,25 @@
               <w:rPr>
                 <w:sz w:val="20"/>
               </w:rPr>
-              <w:t xml:space="preserve">A client row shows the name, with the PAN below it. A registration row shows its GSTIN, TAN or PAN, with its type or place (for example "Gujarat · Regular")</w:t>
+              <w:t xml:space="preserve">A client row shows the name, with the PAN below it. A registration row shows its GSTIN, TAN or PAN, with its type or place (for example</w:t>
+            </w:r>
+            <w:r>
+              <w:rPr>
+                <w:sz w:val="20"/>
+              </w:rPr>
+              <w:t xml:space="preserve"> </w:t>
+            </w:r>
+            <w:r>
+              <w:rPr>
+                <w:sz w:val="20"/>
+              </w:rPr>
+              <w:t xml:space="preserve">“Gujarat · Regular”</w:t>
+            </w:r>
+            <w:r>
+              <w:rPr>
+                <w:sz w:val="20"/>
+              </w:rPr>
+              <w:t xml:space="preserve">)</w:t>
             </w:r>
           </w:p>
         </w:tc>
@@ -4804,7 +4974,97 @@
               <w:rPr>
                 <w:sz w:val="20"/>
               </w:rPr>
-              <w:t xml:space="preserve">A client row shows the contact's picture (initials), with the name. With more than one contact it shows two pictures and "2 contacts", and a "+" count when there are more. A registration row shows its contact, and "no email" or "no mobile" in orange when one is missing</w:t>
+              <w:t xml:space="preserve">A client row shows the contact’s picture (initials), with the name. With more than one contact it shows two pictures and</w:t>
+            </w:r>
+            <w:r>
+              <w:rPr>
+                <w:sz w:val="20"/>
+              </w:rPr>
+              <w:t xml:space="preserve"> </w:t>
+            </w:r>
+            <w:r>
+              <w:rPr>
+                <w:sz w:val="20"/>
+              </w:rPr>
+              <w:t xml:space="preserve">“2 contacts”</w:t>
+            </w:r>
+            <w:r>
+              <w:rPr>
+                <w:sz w:val="20"/>
+              </w:rPr>
+              <w:t xml:space="preserve">, and a</w:t>
+            </w:r>
+            <w:r>
+              <w:rPr>
+                <w:sz w:val="20"/>
+              </w:rPr>
+              <w:t xml:space="preserve"> </w:t>
+            </w:r>
+            <w:r>
+              <w:rPr>
+                <w:sz w:val="20"/>
+              </w:rPr>
+              <w:t xml:space="preserve">“+”</w:t>
+            </w:r>
+            <w:r>
+              <w:rPr>
+                <w:sz w:val="20"/>
+              </w:rPr>
+              <w:t xml:space="preserve"> </w:t>
+            </w:r>
+            <w:r>
+              <w:rPr>
+                <w:sz w:val="20"/>
+              </w:rPr>
+              <w:t xml:space="preserve">count when there are more. A registration row shows its contact, and</w:t>
+            </w:r>
+            <w:r>
+              <w:rPr>
+                <w:sz w:val="20"/>
+              </w:rPr>
+              <w:t xml:space="preserve"> </w:t>
+            </w:r>
+            <w:r>
+              <w:rPr>
+                <w:sz w:val="20"/>
+              </w:rPr>
+              <w:t xml:space="preserve">“no email”</w:t>
+            </w:r>
+            <w:r>
+              <w:rPr>
+                <w:sz w:val="20"/>
+              </w:rPr>
+              <w:t xml:space="preserve"> </w:t>
+            </w:r>
+            <w:r>
+              <w:rPr>
+                <w:sz w:val="20"/>
+              </w:rPr>
+              <w:t xml:space="preserve">or</w:t>
+            </w:r>
+            <w:r>
+              <w:rPr>
+                <w:sz w:val="20"/>
+              </w:rPr>
+              <w:t xml:space="preserve"> </w:t>
+            </w:r>
+            <w:r>
+              <w:rPr>
+                <w:sz w:val="20"/>
+              </w:rPr>
+              <w:t xml:space="preserve">“no mobile”</w:t>
+            </w:r>
+            <w:r>
+              <w:rPr>
+                <w:sz w:val="20"/>
+              </w:rPr>
+              <w:t xml:space="preserve"> </w:t>
+            </w:r>
+            <w:r>
+              <w:rPr>
+                <w:sz w:val="20"/>
+              </w:rPr>
+              <w:t xml:space="preserve">in orange when one is missing</w:t>
             </w:r>
           </w:p>
         </w:tc>
@@ -4847,7 +5107,7 @@
               <w:rPr>
                 <w:sz w:val="20"/>
               </w:rPr>
-              <w:t xml:space="preserve">"</w:t>
+              <w:t xml:space="preserve">“</w:t>
             </w:r>
             <w:r>
               <w:rPr>
@@ -4893,7 +5153,13 @@
               <w:rPr>
                 <w:sz w:val="20"/>
               </w:rPr>
-              <w:t xml:space="preserve">on": how many of the registration's email messages are on. A client row adds up its registrations</w:t>
+              <w:t xml:space="preserve">on”</w:t>
+            </w:r>
+            <w:r>
+              <w:rPr>
+                <w:sz w:val="20"/>
+              </w:rPr>
+              <w:t xml:space="preserve">: how many of the registration’s email messages are on. A client row adds up its registrations</w:t>
             </w:r>
           </w:p>
         </w:tc>
@@ -5049,7 +5315,7 @@
       </w:r>
     </w:p>
     <w:bookmarkEnd w:id="31"/>
-    <w:bookmarkStart w:id="35" w:name="Xaba8d3b8a1daa8951cd1ad85215668891d3d888"/>
+    <w:bookmarkStart w:id="35" w:name="bulk-change"/>
     <w:p>
       <w:pPr>
         <w:pStyle w:val="Heading3"/>
@@ -5106,7 +5372,7 @@
     </w:p>
     <w:p>
       <w:pPr>
-        <w:pStyle w:val="BodyText"/>
+        <w:pStyle w:val="CaptionedFigure"/>
         <w:keepNext/>
         <w:spacing w:before="120" w:after="40"/>
         <w:jc w:val="center"/>
@@ -5161,7 +5427,7 @@
     </w:p>
     <w:p>
       <w:pPr>
-        <w:pStyle w:val="BodyText"/>
+        <w:pStyle w:val="CaptionedFigure"/>
         <w:keepNext w:val="0"/>
         <w:spacing w:before="40" w:after="240"/>
         <w:jc w:val="center"/>
@@ -5174,6 +5440,14 @@
           <w:sz w:val="19"/>
         </w:rPr>
         <w:t>Figure: Bulk change</w:t>
+      </w:r>
+    </w:p>
+    <w:p>
+      <w:pPr>
+        <w:pStyle w:val="ImageCaption"/>
+      </w:pPr>
+      <w:r>
+        <w:t xml:space="preserve">Bulk change</w:t>
       </w:r>
     </w:p>
     <w:p>
@@ -5249,7 +5523,16 @@
         <w:t xml:space="preserve"> </w:t>
       </w:r>
       <w:r>
-        <w:t xml:space="preserve">link. The button shows "3 events selected".</w:t>
+        <w:t xml:space="preserve">link. The button shows</w:t>
+      </w:r>
+      <w:r>
+        <w:t xml:space="preserve"> </w:t>
+      </w:r>
+      <w:r>
+        <w:t xml:space="preserve">“3 events selected”</w:t>
+      </w:r>
+      <w:r>
+        <w:t xml:space="preserve">.</w:t>
       </w:r>
     </w:p>
     <w:p>
@@ -5277,7 +5560,16 @@
         <w:t xml:space="preserve"> </w:t>
       </w:r>
       <w:r>
-        <w:t xml:space="preserve">are offered. When several modules are ticked, the group names carry the module name (for example "GST · Returns filed").</w:t>
+        <w:t xml:space="preserve">are offered. When several modules are ticked, the group names carry the module name (for example</w:t>
+      </w:r>
+      <w:r>
+        <w:t xml:space="preserve"> </w:t>
+      </w:r>
+      <w:r>
+        <w:t xml:space="preserve">“GST · Returns filed”</w:t>
+      </w:r>
+      <w:r>
+        <w:t xml:space="preserve">).</w:t>
       </w:r>
     </w:p>
     <w:p>
@@ -5326,7 +5618,13 @@
         </w:numPr>
       </w:pPr>
       <w:r>
-        <w:t xml:space="preserve">A message confirms the result, for example "3 events turned on for up to 2 registrations. 1 skipped, no contact for that channel."</w:t>
+        <w:t xml:space="preserve">A message confirms the result, for example</w:t>
+      </w:r>
+      <w:r>
+        <w:t xml:space="preserve"> </w:t>
+      </w:r>
+      <w:r>
+        <w:t xml:space="preserve">“3 events turned on for up to 2 registrations. 1 skipped, no contact for that channel.”</w:t>
       </w:r>
     </w:p>
     <w:p>
@@ -5352,7 +5650,7 @@
       </w:r>
     </w:p>
     <w:bookmarkEnd w:id="35"/>
-    <w:bookmarkStart w:id="39" w:name="X80e054374739b062e5806bd23ed2753ab8c61b7"/>
+    <w:bookmarkStart w:id="39" w:name="defaults-for-new-clients"/>
     <w:p>
       <w:pPr>
         <w:pStyle w:val="Heading3"/>
@@ -5363,7 +5661,7 @@
     </w:p>
     <w:p>
       <w:pPr>
-        <w:pStyle w:val="FirstParagraph"/>
+        <w:pStyle w:val="CaptionedFigure"/>
         <w:keepNext/>
         <w:spacing w:before="120" w:after="40"/>
         <w:jc w:val="center"/>
@@ -5418,7 +5716,7 @@
     </w:p>
     <w:p>
       <w:pPr>
-        <w:pStyle w:val="FirstParagraph"/>
+        <w:pStyle w:val="CaptionedFigure"/>
         <w:keepNext w:val="0"/>
         <w:spacing w:before="40" w:after="240"/>
         <w:jc w:val="center"/>
@@ -5431,6 +5729,14 @@
           <w:sz w:val="19"/>
         </w:rPr>
         <w:t>Figure: Defaults for new clients</w:t>
+      </w:r>
+    </w:p>
+    <w:p>
+      <w:pPr>
+        <w:pStyle w:val="ImageCaption"/>
+      </w:pPr>
+      <w:r>
+        <w:t xml:space="preserve">Defaults for new clients</w:t>
       </w:r>
     </w:p>
     <w:p>
@@ -5518,7 +5824,13 @@
         <w:t xml:space="preserve"> </w:t>
       </w:r>
       <w:r>
-        <w:t xml:space="preserve">(or TANs, PANs). A confirmation asks first: "This changes all N existing GSTINs. Their current GST settings are replaced by the defaults above."</w:t>
+        <w:t xml:space="preserve">(or TANs, PANs). A confirmation asks first:</w:t>
+      </w:r>
+      <w:r>
+        <w:t xml:space="preserve"> </w:t>
+      </w:r>
+      <w:r>
+        <w:t xml:space="preserve">“This changes all N existing GSTINs. Their current GST settings are replaced by the defaults above.”</w:t>
       </w:r>
     </w:p>
     <w:p>
@@ -5534,7 +5846,7 @@
       </w:r>
     </w:p>
     <w:bookmarkEnd w:id="39"/>
-    <w:bookmarkStart w:id="40" w:name="Xfc4e94f559e5b2235902737215338b3e2f453df"/>
+    <w:bookmarkStart w:id="40" w:name="saving"/>
     <w:p>
       <w:pPr>
         <w:pStyle w:val="Heading3"/>
@@ -5548,7 +5860,19 @@
         <w:pStyle w:val="FirstParagraph"/>
       </w:pPr>
       <w:r>
-        <w:t xml:space="preserve">Every change on the page is saved on its own, a moment after it is made, with a short "Saved" message. There is no Save button.</w:t>
+        <w:t xml:space="preserve">Every change on the page is saved on its own, a moment after it is made, with a short</w:t>
+      </w:r>
+      <w:r>
+        <w:t xml:space="preserve"> </w:t>
+      </w:r>
+      <w:r>
+        <w:t xml:space="preserve">“Saved”</w:t>
+      </w:r>
+      <w:r>
+        <w:t xml:space="preserve"> </w:t>
+      </w:r>
+      <w:r>
+        <w:t xml:space="preserve">message. There is no Save button.</w:t>
       </w:r>
     </w:p>
     <w:p>
@@ -5560,7 +5884,7 @@
     </w:p>
     <w:bookmarkEnd w:id="40"/>
     <w:bookmarkEnd w:id="41"/>
-    <w:bookmarkStart w:id="55" w:name="X376e37be42c14b064f3458fb3fbde9b41a41c1b"/>
+    <w:bookmarkStart w:id="55" w:name="a-registration-side-panel"/>
     <w:p>
       <w:pPr>
         <w:pStyle w:val="Heading2"/>
@@ -5582,7 +5906,7 @@
     </w:p>
     <w:p>
       <w:pPr>
-        <w:pStyle w:val="BodyText"/>
+        <w:pStyle w:val="CaptionedFigure"/>
         <w:keepNext/>
         <w:spacing w:before="120" w:after="40"/>
         <w:jc w:val="center"/>
@@ -5637,7 +5961,7 @@
     </w:p>
     <w:p>
       <w:pPr>
-        <w:pStyle w:val="BodyText"/>
+        <w:pStyle w:val="CaptionedFigure"/>
         <w:keepNext w:val="0"/>
         <w:spacing w:before="40" w:after="240"/>
         <w:jc w:val="center"/>
@@ -5654,13 +5978,21 @@
     </w:p>
     <w:p>
       <w:pPr>
+        <w:pStyle w:val="ImageCaption"/>
+      </w:pPr>
+      <w:r>
+        <w:t xml:space="preserve">Registration panel</w:t>
+      </w:r>
+    </w:p>
+    <w:p>
+      <w:pPr>
         <w:pStyle w:val="BodyText"/>
       </w:pPr>
       <w:r>
         <w:t xml:space="preserve">The header shows the client name, the GSTIN, TAN or PAN, its module tag and its type.</w:t>
       </w:r>
     </w:p>
-    <w:bookmarkStart w:id="48" w:name="X73148dec013d986a6e46dd2433a59c6b4077b55"/>
+    <w:bookmarkStart w:id="48" w:name="contact"/>
     <w:p>
       <w:pPr>
         <w:pStyle w:val="Heading3"/>
@@ -5671,7 +6003,7 @@
     </w:p>
     <w:p>
       <w:pPr>
-        <w:pStyle w:val="FirstParagraph"/>
+        <w:pStyle w:val="CaptionedFigure"/>
         <w:keepNext/>
         <w:spacing w:before="120" w:after="40"/>
         <w:jc w:val="center"/>
@@ -5726,7 +6058,7 @@
     </w:p>
     <w:p>
       <w:pPr>
-        <w:pStyle w:val="FirstParagraph"/>
+        <w:pStyle w:val="CaptionedFigure"/>
         <w:keepNext w:val="0"/>
         <w:spacing w:before="40" w:after="240"/>
         <w:jc w:val="center"/>
@@ -5743,10 +6075,18 @@
     </w:p>
     <w:p>
       <w:pPr>
+        <w:pStyle w:val="ImageCaption"/>
+      </w:pPr>
+      <w:r>
+        <w:t xml:space="preserve">Choosing a contact</w:t>
+      </w:r>
+    </w:p>
+    <w:p>
+      <w:pPr>
         <w:pStyle w:val="BodyText"/>
       </w:pPr>
       <w:r>
-        <w:t xml:space="preserve">A card shows the contact that receives this registration's messages: name, email and mobile number. A contact who is the client's main contact carries a</w:t>
+        <w:t xml:space="preserve">A card shows the contact that receives this registration’s messages: name, email and mobile number. A contact who is the client’s main contact carries a</w:t>
       </w:r>
       <w:r>
         <w:t xml:space="preserve"> </w:t>
@@ -5762,7 +6102,13 @@
         <w:t xml:space="preserve"> </w:t>
       </w:r>
       <w:r>
-        <w:t xml:space="preserve">label. If something is missing, it shows in orange ("No email").</w:t>
+        <w:t xml:space="preserve">label. If something is missing, it shows in orange (</w:t>
+      </w:r>
+      <w:r>
+        <w:t xml:space="preserve">“No email”</w:t>
+      </w:r>
+      <w:r>
+        <w:t xml:space="preserve">).</w:t>
       </w:r>
     </w:p>
     <w:tbl>
@@ -5924,7 +6270,7 @@
               <w:rPr>
                 <w:sz w:val="20"/>
               </w:rPr>
-              <w:t xml:space="preserve">Opens a form with the contact's name, email and mobile number, already filled in</w:t>
+              <w:t xml:space="preserve">Opens a form with the contact’s name, email and mobile number, already filled in</w:t>
             </w:r>
           </w:p>
         </w:tc>
@@ -6088,7 +6434,7 @@
           <w:b/>
           <w:bCs/>
         </w:rPr>
-        <w:t xml:space="preserve">taken from the client's contacts in the application</w:t>
+        <w:t xml:space="preserve">taken from the client’s contacts in the application</w:t>
       </w:r>
       <w:r>
         <w:t xml:space="preserve">. A contact edited or added on this page is</w:t>
@@ -6120,7 +6466,7 @@
       </w:r>
     </w:p>
     <w:bookmarkEnd w:id="48"/>
-    <w:bookmarkStart w:id="52" w:name="Xd27bbfa21e976bb2633e35d92672ff70520d159"/>
+    <w:bookmarkStart w:id="52" w:name="reports-and-events-1"/>
     <w:p>
       <w:pPr>
         <w:pStyle w:val="Heading3"/>
@@ -6267,7 +6613,7 @@
     </w:p>
     <w:p>
       <w:pPr>
-        <w:pStyle w:val="FirstParagraph"/>
+        <w:pStyle w:val="CaptionedFigure"/>
         <w:keepNext/>
         <w:spacing w:before="120" w:after="40"/>
         <w:jc w:val="center"/>
@@ -6322,7 +6668,7 @@
     </w:p>
     <w:p>
       <w:pPr>
-        <w:pStyle w:val="FirstParagraph"/>
+        <w:pStyle w:val="CaptionedFigure"/>
         <w:keepNext w:val="0"/>
         <w:spacing w:before="40" w:after="240"/>
         <w:jc w:val="center"/>
@@ -6337,8 +6683,16 @@
         <w:t>Figure: A module with no reports or events</w:t>
       </w:r>
     </w:p>
+    <w:p>
+      <w:pPr>
+        <w:pStyle w:val="ImageCaption"/>
+      </w:pPr>
+      <w:r>
+        <w:t xml:space="preserve">A module with no reports or events</w:t>
+      </w:r>
+    </w:p>
     <w:bookmarkEnd w:id="52"/>
-    <w:bookmarkStart w:id="53" w:name="X83ab0884ea2ee43152b8b5989ddf5b644b70603"/>
+    <w:bookmarkStart w:id="53" w:name="send-button"/>
     <w:p>
       <w:pPr>
         <w:pStyle w:val="Heading3"/>
@@ -6391,7 +6745,7 @@
           <w:b/>
           <w:bCs/>
         </w:rPr>
-        <w:t xml:space="preserve">sends that report to this registration's contact by that channel straight away</w:t>
+        <w:t xml:space="preserve">sends that report to this registration’s contact by that channel straight away</w:t>
       </w:r>
       <w:r>
         <w:t xml:space="preserve">, even when the switch is off. A channel the report does not support has no icon. An icon is greyed out when the contact has no email or mobile number. A message says what was sent and to whom.</w:t>
@@ -6438,13 +6792,13 @@
       </w:r>
     </w:p>
     <w:bookmarkEnd w:id="53"/>
-    <w:bookmarkStart w:id="54" w:name="X2163e7bea5c92e50173758ba412c366752e0406"/>
+    <w:bookmarkStart w:id="54" w:name="copy-to-the-clients-other-registrations"/>
     <w:p>
       <w:pPr>
         <w:pStyle w:val="Heading3"/>
       </w:pPr>
       <w:r>
-        <w:t xml:space="preserve">5.4 Copy to the client's other registrations</w:t>
+        <w:t xml:space="preserve">5.4 Copy to the client’s other registrations</w:t>
       </w:r>
     </w:p>
     <w:p>
@@ -6462,7 +6816,7 @@
           <w:b/>
           <w:bCs/>
         </w:rPr>
-        <w:t xml:space="preserve">Copy to client's other GSTINs</w:t>
+        <w:t xml:space="preserve">Copy to client’s other GSTINs</w:t>
       </w:r>
       <w:r>
         <w:t xml:space="preserve"> </w:t>
@@ -6489,7 +6843,19 @@
         <w:pStyle w:val="BodyText"/>
       </w:pPr>
       <w:r>
-        <w:t xml:space="preserve">A confirmation asks first: "This changes the other 3 GSTINs of {client}. Their GST switches are replaced by the ones on this page. Contacts stay as they are." The button is not shown when the client has no other registration of that module.</w:t>
+        <w:t xml:space="preserve">A confirmation asks first:</w:t>
+      </w:r>
+      <w:r>
+        <w:t xml:space="preserve"> </w:t>
+      </w:r>
+      <w:r>
+        <w:t xml:space="preserve">“This changes the other 3 GSTINs of {client}. Their GST switches are replaced by the ones on this page. Contacts stay as they are.”</w:t>
+      </w:r>
+      <w:r>
+        <w:t xml:space="preserve"> </w:t>
+      </w:r>
+      <w:r>
+        <w:t xml:space="preserve">The button is not shown when the client has no other registration of that module.</w:t>
       </w:r>
     </w:p>
     <w:p>
@@ -6501,7 +6867,7 @@
     </w:p>
     <w:bookmarkEnd w:id="54"/>
     <w:bookmarkEnd w:id="55"/>
-    <w:bookmarkStart w:id="70" w:name="X66913532a93dec34aabbba4ad0d237a55d74772"/>
+    <w:bookmarkStart w:id="70" w:name="whatsapp-logs"/>
     <w:p>
       <w:pPr>
         <w:pStyle w:val="Heading2"/>
@@ -6513,7 +6879,7 @@
         <w:t xml:space="preserve">6. WhatsApp Logs</w:t>
       </w:r>
     </w:p>
-    <w:bookmarkStart w:id="56" w:name="X01085a192735aac802d0e83e6ec2dfd5a573dc5"/>
+    <w:bookmarkStart w:id="56" w:name="what-it-shows"/>
     <w:p>
       <w:pPr>
         <w:pStyle w:val="Heading3"/>
@@ -6629,7 +6995,7 @@
       </w:r>
     </w:p>
     <w:bookmarkEnd w:id="56"/>
-    <w:bookmarkStart w:id="57" w:name="X99f7a6a25f3f73597f61721bdade3f1f02c2405"/>
+    <w:bookmarkStart w:id="57" w:name="toolbar-1"/>
     <w:p>
       <w:pPr>
         <w:pStyle w:val="Heading3"/>
@@ -6720,7 +7086,7 @@
         </w:numPr>
       </w:pPr>
       <w:r>
-        <w:t xml:space="preserve">Choosing a Module narrows the Trigger event choices to that module's events.</w:t>
+        <w:t xml:space="preserve">Choosing a Module narrows the Trigger event choices to that module’s events.</w:t>
       </w:r>
     </w:p>
     <w:p>
@@ -6742,7 +7108,31 @@
         <w:t xml:space="preserve"> </w:t>
       </w:r>
       <w:r>
-        <w:t xml:space="preserve">lists every number that messages have gone out from, each with its display name and, in small light text below it, the number. For example "CA Connect" with "+91 98765 00000" below, or the firm's own name and number. Choosing one or more shows only the messages (or runs) sent from them.</w:t>
+        <w:t xml:space="preserve">lists every number that messages have gone out from, each with its display name and, in small light text below it, the number. For example</w:t>
+      </w:r>
+      <w:r>
+        <w:t xml:space="preserve"> </w:t>
+      </w:r>
+      <w:r>
+        <w:t xml:space="preserve">“CA Connect”</w:t>
+      </w:r>
+      <w:r>
+        <w:t xml:space="preserve"> </w:t>
+      </w:r>
+      <w:r>
+        <w:t xml:space="preserve">with</w:t>
+      </w:r>
+      <w:r>
+        <w:t xml:space="preserve"> </w:t>
+      </w:r>
+      <w:r>
+        <w:t xml:space="preserve">“+91 98765 00000”</w:t>
+      </w:r>
+      <w:r>
+        <w:t xml:space="preserve"> </w:t>
+      </w:r>
+      <w:r>
+        <w:t xml:space="preserve">below, or the firm’s own name and number. Choosing one or more shows only the messages (or runs) sent from them.</w:t>
       </w:r>
     </w:p>
     <w:p>
@@ -6803,7 +7193,7 @@
       </w:r>
     </w:p>
     <w:bookmarkEnd w:id="57"/>
-    <w:bookmarkStart w:id="61" w:name="X6a62d82198c7e87898e0d0bed25280430290f66"/>
+    <w:bookmarkStart w:id="61" w:name="bulk-messages-tab"/>
     <w:p>
       <w:pPr>
         <w:pStyle w:val="Heading3"/>
@@ -6814,7 +7204,7 @@
     </w:p>
     <w:p>
       <w:pPr>
-        <w:pStyle w:val="FirstParagraph"/>
+        <w:pStyle w:val="CaptionedFigure"/>
         <w:keepNext/>
         <w:spacing w:before="120" w:after="40"/>
         <w:jc w:val="center"/>
@@ -6869,7 +7259,7 @@
     </w:p>
     <w:p>
       <w:pPr>
-        <w:pStyle w:val="FirstParagraph"/>
+        <w:pStyle w:val="CaptionedFigure"/>
         <w:keepNext w:val="0"/>
         <w:spacing w:before="40" w:after="240"/>
         <w:jc w:val="center"/>
@@ -6882,6 +7272,14 @@
           <w:sz w:val="19"/>
         </w:rPr>
         <w:t>Figure: Bulk messages tab</w:t>
+      </w:r>
+    </w:p>
+    <w:p>
+      <w:pPr>
+        <w:pStyle w:val="ImageCaption"/>
+      </w:pPr>
+      <w:r>
+        <w:t xml:space="preserve">Bulk messages tab</w:t>
       </w:r>
     </w:p>
     <w:p>
@@ -7444,7 +7842,7 @@
         <w:t xml:space="preserve">how many registrations it will target right now</w:t>
       </w:r>
       <w:r>
-        <w:t xml:space="preserve">: those whose WhatsApp switch for this report is on and whose contact has a mobile number. The other columns show a dash, because nothing has been sent yet.</w:t>
+        <w:t xml:space="preserve">: those whose WhatsApp switch for this report is on. The other columns show a dash, because nothing has been sent yet.</w:t>
       </w:r>
     </w:p>
     <w:p>
@@ -7538,7 +7936,7 @@
       </w:r>
     </w:p>
     <w:bookmarkEnd w:id="61"/>
-    <w:bookmarkStart w:id="65" w:name="X8edc63da622e57b5a4db9812c9f97ddae01fd12"/>
+    <w:bookmarkStart w:id="65" w:name="when-the-user-clicks-a-run-the-run-page"/>
     <w:p>
       <w:pPr>
         <w:pStyle w:val="Heading3"/>
@@ -7549,7 +7947,7 @@
     </w:p>
     <w:p>
       <w:pPr>
-        <w:pStyle w:val="FirstParagraph"/>
+        <w:pStyle w:val="CaptionedFigure"/>
         <w:keepNext/>
         <w:spacing w:before="120" w:after="40"/>
         <w:jc w:val="center"/>
@@ -7604,7 +8002,7 @@
     </w:p>
     <w:p>
       <w:pPr>
-        <w:pStyle w:val="FirstParagraph"/>
+        <w:pStyle w:val="CaptionedFigure"/>
         <w:keepNext w:val="0"/>
         <w:spacing w:before="40" w:after="240"/>
         <w:jc w:val="center"/>
@@ -7617,6 +8015,14 @@
           <w:sz w:val="19"/>
         </w:rPr>
         <w:t>Figure: Run page</w:t>
+      </w:r>
+    </w:p>
+    <w:p>
+      <w:pPr>
+        <w:pStyle w:val="ImageCaption"/>
+      </w:pPr>
+      <w:r>
+        <w:t xml:space="preserve">Run page</w:t>
       </w:r>
     </w:p>
     <w:p>
@@ -8114,7 +8520,7 @@
       </w:tr>
     </w:tbl>
     <w:bookmarkEnd w:id="65"/>
-    <w:bookmarkStart w:id="69" w:name="X3d239284318bf903e1a61fe3727324c5fccb0cd"/>
+    <w:bookmarkStart w:id="69" w:name="single-messages-tab"/>
     <w:p>
       <w:pPr>
         <w:pStyle w:val="Heading3"/>
@@ -8125,7 +8531,7 @@
     </w:p>
     <w:p>
       <w:pPr>
-        <w:pStyle w:val="FirstParagraph"/>
+        <w:pStyle w:val="CaptionedFigure"/>
         <w:keepNext/>
         <w:spacing w:before="120" w:after="40"/>
         <w:jc w:val="center"/>
@@ -8180,7 +8586,7 @@
     </w:p>
     <w:p>
       <w:pPr>
-        <w:pStyle w:val="FirstParagraph"/>
+        <w:pStyle w:val="CaptionedFigure"/>
         <w:keepNext w:val="0"/>
         <w:spacing w:before="40" w:after="240"/>
         <w:jc w:val="center"/>
@@ -8193,6 +8599,14 @@
           <w:sz w:val="19"/>
         </w:rPr>
         <w:t>Figure: Single messages tab</w:t>
+      </w:r>
+    </w:p>
+    <w:p>
+      <w:pPr>
+        <w:pStyle w:val="ImageCaption"/>
+      </w:pPr>
+      <w:r>
+        <w:t xml:space="preserve">Single messages tab</w:t>
       </w:r>
     </w:p>
     <w:p>
@@ -8500,7 +8914,7 @@
               <w:rPr>
                 <w:sz w:val="20"/>
               </w:rPr>
-              <w:t xml:space="preserve">From the domain list. The report's name when sent with the Send button</w:t>
+              <w:t xml:space="preserve">From the domain list. The report’s name when sent with the Send button</w:t>
             </w:r>
           </w:p>
         </w:tc>
@@ -8762,7 +9176,7 @@
     </w:p>
     <w:bookmarkEnd w:id="69"/>
     <w:bookmarkEnd w:id="70"/>
-    <w:bookmarkStart w:id="95" w:name="Xbfcdbca723139e0f8827222652cde3bd6838f23"/>
+    <w:bookmarkStart w:id="94" w:name="Xbf296b5d01d8d568cab4060f92b9ecc4a3fc7a6"/>
     <w:p>
       <w:pPr>
         <w:pStyle w:val="Heading2"/>
@@ -8840,7 +9254,7 @@
         <w:t xml:space="preserve">: the system default works from the first day.</w:t>
       </w:r>
     </w:p>
-    <w:bookmarkStart w:id="74" w:name="X4c3cc2dbad651b4676c333db5b72bcb392b0faf"/>
+    <w:bookmarkStart w:id="74" w:name="layout"/>
     <w:p>
       <w:pPr>
         <w:pStyle w:val="Heading3"/>
@@ -8851,7 +9265,7 @@
     </w:p>
     <w:p>
       <w:pPr>
-        <w:pStyle w:val="FirstParagraph"/>
+        <w:pStyle w:val="CaptionedFigure"/>
         <w:keepNext/>
         <w:spacing w:before="120" w:after="40"/>
         <w:jc w:val="center"/>
@@ -8906,7 +9320,7 @@
     </w:p>
     <w:p>
       <w:pPr>
-        <w:pStyle w:val="FirstParagraph"/>
+        <w:pStyle w:val="CaptionedFigure"/>
         <w:keepNext w:val="0"/>
         <w:spacing w:before="40" w:after="240"/>
         <w:jc w:val="center"/>
@@ -8919,6 +9333,14 @@
           <w:sz w:val="19"/>
         </w:rPr>
         <w:t>Figure: Configuration, WhatsApp</w:t>
+      </w:r>
+    </w:p>
+    <w:p>
+      <w:pPr>
+        <w:pStyle w:val="ImageCaption"/>
+      </w:pPr>
+      <w:r>
+        <w:t xml:space="preserve">Configuration, WhatsApp</w:t>
       </w:r>
     </w:p>
     <w:p>
@@ -9004,7 +9426,7 @@
         <w:t xml:space="preserve">Active</w:t>
       </w:r>
       <w:r>
-        <w:t xml:space="preserve">. With the firm's own setup it shows that number or address.</w:t>
+        <w:t xml:space="preserve">. With the firm’s own setup it shows that number or address.</w:t>
       </w:r>
     </w:p>
     <w:p>
@@ -9020,7 +9442,7 @@
           <w:b/>
           <w:bCs/>
         </w:rPr>
-        <w:t xml:space="preserve">How should we send ...?</w:t>
+        <w:t xml:space="preserve">How should we send …?</w:t>
       </w:r>
       <w:r>
         <w:t xml:space="preserve"> </w:t>
@@ -9121,7 +9543,7 @@
       </w:r>
     </w:p>
     <w:bookmarkEnd w:id="74"/>
-    <w:bookmarkStart w:id="78" w:name="X48dd68a1bab067784b68dc3cb5dc3151b4e364c"/>
+    <w:bookmarkStart w:id="78" w:name="Xe5ab3a5a5e0c3c7a39f4a692acf7ca7e822e4b7"/>
     <w:p>
       <w:pPr>
         <w:pStyle w:val="Heading3"/>
@@ -9261,7 +9683,16 @@
         <w:t xml:space="preserve">Switching asks first</w:t>
       </w:r>
       <w:r>
-        <w:t xml:space="preserve">, for WhatsApp and for email, because it changes what the clients see. The bar turns into a question, for example "Switch now? Messages will go out from the system default number. Your clients will see that number as the sender.", with</w:t>
+        <w:t xml:space="preserve">, for WhatsApp and for email, because it changes what the clients see. The bar turns into a question, for example</w:t>
+      </w:r>
+      <w:r>
+        <w:t xml:space="preserve"> </w:t>
+      </w:r>
+      <w:r>
+        <w:t xml:space="preserve">“Switch now? Messages will go out from the system default number. Your clients will see that number as the sender.”</w:t>
+      </w:r>
+      <w:r>
+        <w:t xml:space="preserve">, with</w:t>
       </w:r>
       <w:r>
         <w:t xml:space="preserve"> </w:t>
@@ -9359,6 +9790,104 @@
           </wp:inline>
         </w:drawing>
       </w:r>
+      <w:r>
+        <w:t xml:space="preserve"> </w:t>
+      </w:r>
+      <w:r>
+        <w:t xml:space="preserve">- A card that is not finished (not connected, not verified) cannot be switched to. Until it is finished, messages keep going from the system default.</w:t>
+      </w:r>
+      <w:r>
+        <w:t xml:space="preserve"> </w:t>
+      </w:r>
+      <w:r>
+        <w:t xml:space="preserve">-</w:t>
+      </w:r>
+      <w:r>
+        <w:t xml:space="preserve"> </w:t>
+      </w:r>
+      <w:r>
+        <w:rPr>
+          <w:b/>
+          <w:bCs/>
+        </w:rPr>
+        <w:t xml:space="preserve">When the setup finishes, the card is switched to automatically</w:t>
+      </w:r>
+      <w:r>
+        <w:t xml:space="preserve">, because that is why the user did it: when WhatsApp is connected, when the domain is verified, and when the mail server connects.</w:t>
+      </w:r>
+      <w:r>
+        <w:t xml:space="preserve"> </w:t>
+      </w:r>
+      <w:r>
+        <w:t xml:space="preserve">-</w:t>
+      </w:r>
+      <w:r>
+        <w:t xml:space="preserve"> </w:t>
+      </w:r>
+      <w:r>
+        <w:rPr>
+          <w:b/>
+          <w:bCs/>
+        </w:rPr>
+        <w:t xml:space="preserve">Disconnect</w:t>
+      </w:r>
+      <w:r>
+        <w:t xml:space="preserve"> </w:t>
+      </w:r>
+      <w:r>
+        <w:t xml:space="preserve">(WhatsApp) and</w:t>
+      </w:r>
+      <w:r>
+        <w:t xml:space="preserve"> </w:t>
+      </w:r>
+      <w:r>
+        <w:rPr>
+          <w:b/>
+          <w:bCs/>
+        </w:rPr>
+        <w:t xml:space="preserve">Start over</w:t>
+      </w:r>
+      <w:r>
+        <w:t xml:space="preserve"> </w:t>
+      </w:r>
+      <w:r>
+        <w:t xml:space="preserve">(domain) put messages back on the system default.</w:t>
+      </w:r>
+      <w:r>
+        <w:t xml:space="preserve"> </w:t>
+      </w:r>
+      <w:r>
+        <w:t xml:space="preserve">- Switching back to the system default</w:t>
+      </w:r>
+      <w:r>
+        <w:t xml:space="preserve"> </w:t>
+      </w:r>
+      <w:r>
+        <w:rPr>
+          <w:b/>
+          <w:bCs/>
+        </w:rPr>
+        <w:t xml:space="preserve">does not delete</w:t>
+      </w:r>
+      <w:r>
+        <w:t xml:space="preserve"> </w:t>
+      </w:r>
+      <w:r>
+        <w:t xml:space="preserve">the firm’s own setup. It stays saved, and the user can switch to it again at any time. The card then shows</w:t>
+      </w:r>
+      <w:r>
+        <w:t xml:space="preserve"> </w:t>
+      </w:r>
+      <w:r>
+        <w:rPr>
+          <w:b/>
+          <w:bCs/>
+        </w:rPr>
+        <w:t xml:space="preserve">Not in use</w:t>
+      </w:r>
+      <w:r>
+        <w:t xml:space="preserve">.</w:t>
+      </w:r>
     </w:p>
     <w:p>
       <w:pPr>
@@ -9377,118 +9906,8 @@
         <w:t>Figure: Asking before a switch</w:t>
       </w:r>
     </w:p>
-    <w:p>
-      <w:pPr>
-        <w:pStyle w:val="Compact"/>
-        <w:numPr>
-          <w:ilvl w:val="0"/>
-          <w:numId w:val="1017"/>
-        </w:numPr>
-      </w:pPr>
-      <w:r>
-        <w:t xml:space="preserve">A card that is not finished (not connected, not verified) cannot be switched to. Until it is finished, messages keep going from the system default.</w:t>
-      </w:r>
-    </w:p>
-    <w:p>
-      <w:pPr>
-        <w:pStyle w:val="Compact"/>
-        <w:numPr>
-          <w:ilvl w:val="0"/>
-          <w:numId w:val="1017"/>
-        </w:numPr>
-      </w:pPr>
-      <w:r>
-        <w:rPr>
-          <w:b/>
-          <w:bCs/>
-        </w:rPr>
-        <w:t xml:space="preserve">When the setup finishes, the card is switched to automatically</w:t>
-      </w:r>
-      <w:r>
-        <w:t xml:space="preserve">, because that is why the user did it: when WhatsApp is connected, when the domain is verified, and when the mail server connects.</w:t>
-      </w:r>
-    </w:p>
-    <w:p>
-      <w:pPr>
-        <w:pStyle w:val="Compact"/>
-        <w:numPr>
-          <w:ilvl w:val="0"/>
-          <w:numId w:val="1017"/>
-        </w:numPr>
-      </w:pPr>
-      <w:r>
-        <w:rPr>
-          <w:b/>
-          <w:bCs/>
-        </w:rPr>
-        <w:t xml:space="preserve">Disconnect</w:t>
-      </w:r>
-      <w:r>
-        <w:t xml:space="preserve"> </w:t>
-      </w:r>
-      <w:r>
-        <w:t xml:space="preserve">(WhatsApp) and</w:t>
-      </w:r>
-      <w:r>
-        <w:t xml:space="preserve"> </w:t>
-      </w:r>
-      <w:r>
-        <w:rPr>
-          <w:b/>
-          <w:bCs/>
-        </w:rPr>
-        <w:t xml:space="preserve">Start over</w:t>
-      </w:r>
-      <w:r>
-        <w:t xml:space="preserve"> </w:t>
-      </w:r>
-      <w:r>
-        <w:t xml:space="preserve">(domain) put messages back on the system default.</w:t>
-      </w:r>
-    </w:p>
-    <w:p>
-      <w:pPr>
-        <w:pStyle w:val="Compact"/>
-        <w:numPr>
-          <w:ilvl w:val="0"/>
-          <w:numId w:val="1017"/>
-        </w:numPr>
-      </w:pPr>
-      <w:r>
-        <w:t xml:space="preserve">Switching back to the system default</w:t>
-      </w:r>
-      <w:r>
-        <w:t xml:space="preserve"> </w:t>
-      </w:r>
-      <w:r>
-        <w:rPr>
-          <w:b/>
-          <w:bCs/>
-        </w:rPr>
-        <w:t xml:space="preserve">does not delete</w:t>
-      </w:r>
-      <w:r>
-        <w:t xml:space="preserve"> </w:t>
-      </w:r>
-      <w:r>
-        <w:t xml:space="preserve">the firm's own setup. It stays saved, and the user can switch to it again at any time. The card then shows</w:t>
-      </w:r>
-      <w:r>
-        <w:t xml:space="preserve"> </w:t>
-      </w:r>
-      <w:r>
-        <w:rPr>
-          <w:b/>
-          <w:bCs/>
-        </w:rPr>
-        <w:t xml:space="preserve">Not in use</w:t>
-      </w:r>
-      <w:r>
-        <w:t xml:space="preserve">.</w:t>
-      </w:r>
-    </w:p>
     <w:bookmarkEnd w:id="78"/>
-    <w:bookmarkStart w:id="82" w:name="Xb6f687164e552578f7042809f91095c24640259"/>
+    <w:bookmarkStart w:id="82" w:name="whatsapp"/>
     <w:p>
       <w:pPr>
         <w:pStyle w:val="Heading3"/>
@@ -9706,7 +10125,7 @@
               <w:rPr>
                 <w:sz w:val="20"/>
               </w:rPr>
-              <w:t xml:space="preserve">The firm's own WhatsApp Business number</w:t>
+              <w:t xml:space="preserve">The firm’s own WhatsApp Business number</w:t>
             </w:r>
           </w:p>
         </w:tc>
@@ -9730,7 +10149,7 @@
         <w:pStyle w:val="Compact"/>
         <w:numPr>
           <w:ilvl w:val="0"/>
-          <w:numId w:val="1018"/>
+          <w:numId w:val="1017"/>
         </w:numPr>
       </w:pPr>
       <w:r>
@@ -9755,7 +10174,7 @@
         <w:pStyle w:val="Compact"/>
         <w:numPr>
           <w:ilvl w:val="0"/>
-          <w:numId w:val="1018"/>
+          <w:numId w:val="1017"/>
         </w:numPr>
       </w:pPr>
       <w:r>
@@ -9780,7 +10199,7 @@
         <w:pStyle w:val="Compact"/>
         <w:numPr>
           <w:ilvl w:val="0"/>
-          <w:numId w:val="1018"/>
+          <w:numId w:val="1017"/>
         </w:numPr>
       </w:pPr>
       <w:r>
@@ -9863,11 +10282,11 @@
         <w:pStyle w:val="Compact"/>
         <w:numPr>
           <w:ilvl w:val="0"/>
-          <w:numId w:val="1018"/>
+          <w:numId w:val="1017"/>
         </w:numPr>
       </w:pPr>
       <w:r>
-        <w:t xml:space="preserve">The firm's number is then</w:t>
+        <w:t xml:space="preserve">The firm’s number is then</w:t>
       </w:r>
       <w:r>
         <w:t xml:space="preserve"> </w:t>
@@ -9888,12 +10307,12 @@
         <w:pStyle w:val="FirstParagraph"/>
       </w:pPr>
       <w:r>
-        <w:t xml:space="preserve">Spectrum Cloud sends the firm's message templates for approval once the number is connected.</w:t>
-      </w:r>
-    </w:p>
-    <w:p>
-      <w:pPr>
-        <w:pStyle w:val="BodyText"/>
+        <w:t xml:space="preserve">Spectrum Cloud sends the firm’s message templates for approval once the number is connected.</w:t>
+      </w:r>
+    </w:p>
+    <w:p>
+      <w:pPr>
+        <w:pStyle w:val="CaptionedFigure"/>
         <w:keepNext/>
         <w:spacing w:before="120" w:after="40"/>
         <w:jc w:val="center"/>
@@ -9948,7 +10367,7 @@
     </w:p>
     <w:p>
       <w:pPr>
-        <w:pStyle w:val="BodyText"/>
+        <w:pStyle w:val="CaptionedFigure"/>
         <w:keepNext w:val="0"/>
         <w:spacing w:before="40" w:after="240"/>
         <w:jc w:val="center"/>
@@ -9965,6 +10384,14 @@
     </w:p>
     <w:p>
       <w:pPr>
+        <w:pStyle w:val="ImageCaption"/>
+      </w:pPr>
+      <w:r>
+        <w:t xml:space="preserve">Connecting a WhatsApp number</w:t>
+      </w:r>
+    </w:p>
+    <w:p>
+      <w:pPr>
         <w:pStyle w:val="BodyText"/>
       </w:pPr>
       <w:r>
@@ -10043,7 +10470,7 @@
         <w:pStyle w:val="Compact"/>
         <w:numPr>
           <w:ilvl w:val="0"/>
-          <w:numId w:val="1019"/>
+          <w:numId w:val="1018"/>
         </w:numPr>
       </w:pPr>
       <w:r>
@@ -10073,7 +10500,7 @@
           <w:b/>
           <w:bCs/>
         </w:rPr>
-        <w:t xml:space="preserve">firm's own number</w:t>
+        <w:t xml:space="preserve">firm’s own number</w:t>
       </w:r>
       <w:r>
         <w:t xml:space="preserve">.</w:t>
@@ -10084,7 +10511,7 @@
         <w:pStyle w:val="Compact"/>
         <w:numPr>
           <w:ilvl w:val="0"/>
-          <w:numId w:val="1019"/>
+          <w:numId w:val="1018"/>
         </w:numPr>
       </w:pPr>
       <w:r>
@@ -10125,7 +10552,7 @@
         <w:pStyle w:val="Compact"/>
         <w:numPr>
           <w:ilvl w:val="0"/>
-          <w:numId w:val="1019"/>
+          <w:numId w:val="1018"/>
         </w:numPr>
       </w:pPr>
       <w:r>
@@ -10139,7 +10566,7 @@
         <w:t xml:space="preserve"> </w:t>
       </w:r>
       <w:r>
-        <w:t xml:space="preserve">It is simply not part of the approved count (for example 7 of 10). Its messages go from the system default number, the same as a template that is still waiting. KDK is told about rejections, so the template can be corrected and sent again. This is not shown to the firm. When the template is approved later, its messages start going from the firm's number by themselves.</w:t>
+        <w:t xml:space="preserve">It is simply not part of the approved count (for example 7 of 10). Its messages go from the system default number, the same as a template that is still waiting. KDK is told about rejections, so the template can be corrected and sent again. This is not shown to the firm. When the template is approved later, its messages start going from the firm’s number by themselves.</w:t>
       </w:r>
     </w:p>
     <w:p>
@@ -10147,7 +10574,7 @@
         <w:pStyle w:val="Compact"/>
         <w:numPr>
           <w:ilvl w:val="0"/>
-          <w:numId w:val="1019"/>
+          <w:numId w:val="1018"/>
         </w:numPr>
       </w:pPr>
       <w:r>
@@ -10167,7 +10594,13 @@
         <w:t xml:space="preserve"> </w:t>
       </w:r>
       <w:r>
-        <w:t xml:space="preserve">all say this in plain words, for example "Until the templates are approved, messages go out from the system default number."</w:t>
+        <w:t xml:space="preserve">all say this in plain words, for example</w:t>
+      </w:r>
+      <w:r>
+        <w:t xml:space="preserve"> </w:t>
+      </w:r>
+      <w:r>
+        <w:t xml:space="preserve">“Until the templates are approved, messages go out from the system default number.”</w:t>
       </w:r>
     </w:p>
     <w:p>
@@ -10175,7 +10608,7 @@
         <w:pStyle w:val="Compact"/>
         <w:numPr>
           <w:ilvl w:val="0"/>
-          <w:numId w:val="1019"/>
+          <w:numId w:val="1018"/>
         </w:numPr>
       </w:pPr>
       <w:r>
@@ -10197,11 +10630,11 @@
         <w:pStyle w:val="Compact"/>
         <w:numPr>
           <w:ilvl w:val="0"/>
-          <w:numId w:val="1019"/>
+          <w:numId w:val="1018"/>
         </w:numPr>
       </w:pPr>
       <w:r>
-        <w:t xml:space="preserve">Because of this, one firm's WhatsApp Logs can show</w:t>
+        <w:t xml:space="preserve">Because of this, one firm’s WhatsApp Logs can show</w:t>
       </w:r>
       <w:r>
         <w:t xml:space="preserve"> </w:t>
@@ -10237,7 +10670,7 @@
       </w:r>
     </w:p>
     <w:bookmarkEnd w:id="82"/>
-    <w:bookmarkStart w:id="93" w:name="X4934f0f5d6c6998fd0513ddb723aa9cbc1bb1cb"/>
+    <w:bookmarkStart w:id="92" w:name="email"/>
     <w:p>
       <w:pPr>
         <w:pStyle w:val="Heading3"/>
@@ -10248,7 +10681,7 @@
     </w:p>
     <w:p>
       <w:pPr>
-        <w:pStyle w:val="FirstParagraph"/>
+        <w:pStyle w:val="CaptionedFigure"/>
         <w:keepNext/>
         <w:spacing w:before="120" w:after="40"/>
         <w:jc w:val="center"/>
@@ -10303,7 +10736,7 @@
     </w:p>
     <w:p>
       <w:pPr>
-        <w:pStyle w:val="FirstParagraph"/>
+        <w:pStyle w:val="CaptionedFigure"/>
         <w:keepNext w:val="0"/>
         <w:spacing w:before="40" w:after="240"/>
         <w:jc w:val="center"/>
@@ -10316,6 +10749,14 @@
           <w:sz w:val="19"/>
         </w:rPr>
         <w:t>Figure: Configuration, Email</w:t>
+      </w:r>
+    </w:p>
+    <w:p>
+      <w:pPr>
+        <w:pStyle w:val="ImageCaption"/>
+      </w:pPr>
+      <w:r>
+        <w:t xml:space="preserve">Configuration, Email</w:t>
       </w:r>
     </w:p>
     <w:tbl>
@@ -10529,7 +10970,25 @@
               <w:rPr>
                 <w:sz w:val="20"/>
               </w:rPr>
-              <w:t xml:space="preserve">with "Not live yet", and become normal when those modules go live</w:t>
+              <w:t xml:space="preserve">with</w:t>
+            </w:r>
+            <w:r>
+              <w:rPr>
+                <w:sz w:val="20"/>
+              </w:rPr>
+              <w:t xml:space="preserve"> </w:t>
+            </w:r>
+            <w:r>
+              <w:rPr>
+                <w:sz w:val="20"/>
+              </w:rPr>
+              <w:t xml:space="preserve">“Not live yet”</w:t>
+            </w:r>
+            <w:r>
+              <w:rPr>
+                <w:sz w:val="20"/>
+              </w:rPr>
+              <w:t xml:space="preserve">, and become normal when those modules go live</w:t>
             </w:r>
           </w:p>
         </w:tc>
@@ -10652,7 +11111,7 @@
         <w:t xml:space="preserve"> </w:t>
       </w:r>
       <w:r>
-        <w:t xml:space="preserve">A client's reply goes to this address. It is a box with a</w:t>
+        <w:t xml:space="preserve">A client’s reply goes to this address. It is a box with a</w:t>
       </w:r>
       <w:r>
         <w:t xml:space="preserve"> </w:t>
@@ -10668,21 +11127,28 @@
         <w:t xml:space="preserve"> </w:t>
       </w:r>
       <w:r>
-        <w:t xml:space="preserve">button. Save is on only when the email looks like an email, and a wrong one shows "Enter a valid email, like</w:t>
-      </w:r>
-      <w:r>
-        <w:t xml:space="preserve"> </w:t>
-      </w:r>
-      <w:hyperlink r:id="rId86">
-        <w:r>
-          <w:rPr>
-            <w:rStyle w:val="Hyperlink"/>
-          </w:rPr>
-          <w:t xml:space="preserve">name@yourfirm.com</w:t>
-        </w:r>
-      </w:hyperlink>
-      <w:r>
-        <w:t xml:space="preserve">." After saving it says "Saved. Replies go to ...". It is the same field for all three cards.</w:t>
+        <w:t xml:space="preserve">button. Save is on only when the email looks like an email, and a wrong one shows</w:t>
+      </w:r>
+      <w:r>
+        <w:t xml:space="preserve"> </w:t>
+      </w:r>
+      <w:r>
+        <w:t xml:space="preserve">“Enter a valid email, like name@yourfirm.com.”</w:t>
+      </w:r>
+      <w:r>
+        <w:t xml:space="preserve"> </w:t>
+      </w:r>
+      <w:r>
+        <w:t xml:space="preserve">After saving it says</w:t>
+      </w:r>
+      <w:r>
+        <w:t xml:space="preserve"> </w:t>
+      </w:r>
+      <w:r>
+        <w:t xml:space="preserve">“Saved. Replies go to …”</w:t>
+      </w:r>
+      <w:r>
+        <w:t xml:space="preserve">. It is the same field for all three cards.</w:t>
       </w:r>
     </w:p>
     <w:p>
@@ -10702,7 +11168,7 @@
         <w:pStyle w:val="Compact"/>
         <w:numPr>
           <w:ilvl w:val="0"/>
-          <w:numId w:val="1020"/>
+          <w:numId w:val="1019"/>
         </w:numPr>
       </w:pPr>
       <w:r>
@@ -10776,7 +11242,13 @@
         <w:t xml:space="preserve">Add domain</w:t>
       </w:r>
       <w:r>
-        <w:t xml:space="preserve">. A personal domain such as gmail.com is not accepted: "... is a personal email provider, not a domain you control."</w:t>
+        <w:t xml:space="preserve">. A personal domain such as gmail.com is not accepted:</w:t>
+      </w:r>
+      <w:r>
+        <w:t xml:space="preserve"> </w:t>
+      </w:r>
+      <w:r>
+        <w:t xml:space="preserve">“… is a personal email provider, not a domain you control.”</w:t>
       </w:r>
     </w:p>
     <w:p>
@@ -10784,7 +11256,7 @@
         <w:pStyle w:val="Compact"/>
         <w:numPr>
           <w:ilvl w:val="0"/>
-          <w:numId w:val="1020"/>
+          <w:numId w:val="1019"/>
         </w:numPr>
       </w:pPr>
       <w:r>
@@ -10812,7 +11284,7 @@
         <w:pStyle w:val="Compact"/>
         <w:numPr>
           <w:ilvl w:val="0"/>
-          <w:numId w:val="1020"/>
+          <w:numId w:val="1019"/>
         </w:numPr>
       </w:pPr>
       <w:r>
@@ -10826,7 +11298,13 @@
         <w:t xml:space="preserve"> </w:t>
       </w:r>
       <w:r>
-        <w:t xml:space="preserve">has a short line ("Add these two records at the place where you manage your domain (for example GoDaddy). It can take up to a day or two to work.") and the</w:t>
+        <w:t xml:space="preserve">has a short line (</w:t>
+      </w:r>
+      <w:r>
+        <w:t xml:space="preserve">“Add these two records at the place where you manage your domain (for example GoDaddy). It can take up to a day or two to work.”</w:t>
+      </w:r>
+      <w:r>
+        <w:t xml:space="preserve">) and the</w:t>
       </w:r>
       <w:r>
         <w:t xml:space="preserve"> </w:t>
@@ -10855,7 +11333,7 @@
         <w:t xml:space="preserve"> </w:t>
       </w:r>
       <w:r>
-        <w:t xml:space="preserve">like a domain provider's form:</w:t>
+        <w:t xml:space="preserve">like a domain provider’s form:</w:t>
       </w:r>
       <w:r>
         <w:t xml:space="preserve"> </w:t>
@@ -10921,7 +11399,7 @@
         <w:pStyle w:val="Compact"/>
         <w:numPr>
           <w:ilvl w:val="0"/>
-          <w:numId w:val="1020"/>
+          <w:numId w:val="1019"/>
         </w:numPr>
       </w:pPr>
       <w:r>
@@ -11017,11 +11495,11 @@
         <w:pStyle w:val="Compact"/>
         <w:numPr>
           <w:ilvl w:val="0"/>
-          <w:numId w:val="1020"/>
+          <w:numId w:val="1019"/>
         </w:numPr>
       </w:pPr>
       <w:r>
-        <w:t xml:space="preserve">When it is verified, emails go from the firm's address, and a</w:t>
+        <w:t xml:space="preserve">When it is verified, emails go from the firm’s address, and a</w:t>
       </w:r>
       <w:r>
         <w:t xml:space="preserve"> </w:t>
@@ -11042,7 +11520,7 @@
     </w:p>
     <w:p>
       <w:pPr>
-        <w:pStyle w:val="FirstParagraph"/>
+        <w:pStyle w:val="CaptionedFigure"/>
         <w:keepNext/>
         <w:spacing w:before="120" w:after="40"/>
         <w:jc w:val="center"/>
@@ -11052,18 +11530,18 @@
           <wp:inline>
             <wp:extent cx="5334000" cy="4058284"/>
             <wp:effectExtent b="0" l="0" r="0" t="0"/>
-            <wp:docPr descr="Own domain: DNS records" title="" id="88" name="Picture"/>
+            <wp:docPr descr="Own domain: DNS records" title="" id="87" name="Picture"/>
             <a:graphic>
               <a:graphicData uri="http://schemas.openxmlformats.org/drawingml/2006/picture">
                 <pic:pic>
                   <pic:nvPicPr>
-                    <pic:cNvPr descr="brd-screenshots/config-email-domain.png" id="89" name="Picture"/>
+                    <pic:cNvPr descr="brd-screenshots/config-email-domain.png" id="88" name="Picture"/>
                     <pic:cNvPicPr>
                       <a:picLocks noChangeArrowheads="1" noChangeAspect="1"/>
                     </pic:cNvPicPr>
                   </pic:nvPicPr>
                   <pic:blipFill>
-                    <a:blip r:embed="rId87"/>
+                    <a:blip r:embed="rId86"/>
                     <a:stretch>
                       <a:fillRect/>
                     </a:stretch>
@@ -11097,7 +11575,7 @@
     </w:p>
     <w:p>
       <w:pPr>
-        <w:pStyle w:val="FirstParagraph"/>
+        <w:pStyle w:val="CaptionedFigure"/>
         <w:keepNext w:val="0"/>
         <w:spacing w:before="40" w:after="240"/>
         <w:jc w:val="center"/>
@@ -11114,6 +11592,14 @@
     </w:p>
     <w:p>
       <w:pPr>
+        <w:pStyle w:val="ImageCaption"/>
+      </w:pPr>
+      <w:r>
+        <w:t xml:space="preserve">Own domain: DNS records</w:t>
+      </w:r>
+    </w:p>
+    <w:p>
+      <w:pPr>
         <w:pStyle w:val="BodyText"/>
       </w:pPr>
       <w:r>
@@ -11126,7 +11612,7 @@
     </w:p>
     <w:p>
       <w:pPr>
-        <w:pStyle w:val="BodyText"/>
+        <w:pStyle w:val="CaptionedFigure"/>
         <w:keepNext/>
         <w:spacing w:before="120" w:after="40"/>
         <w:jc w:val="center"/>
@@ -11136,18 +11622,18 @@
           <wp:inline>
             <wp:extent cx="5334000" cy="4620577"/>
             <wp:effectExtent b="0" l="0" r="0" t="0"/>
-            <wp:docPr descr="Own SMTP server" title="" id="91" name="Picture"/>
+            <wp:docPr descr="Own SMTP server" title="" id="90" name="Picture"/>
             <a:graphic>
               <a:graphicData uri="http://schemas.openxmlformats.org/drawingml/2006/picture">
                 <pic:pic>
                   <pic:nvPicPr>
-                    <pic:cNvPr descr="brd-screenshots/config-email-smtp.png" id="92" name="Picture"/>
+                    <pic:cNvPr descr="brd-screenshots/config-email-smtp.png" id="91" name="Picture"/>
                     <pic:cNvPicPr>
                       <a:picLocks noChangeArrowheads="1" noChangeAspect="1"/>
                     </pic:cNvPicPr>
                   </pic:nvPicPr>
                   <pic:blipFill>
-                    <a:blip r:embed="rId90"/>
+                    <a:blip r:embed="rId89"/>
                     <a:stretch>
                       <a:fillRect/>
                     </a:stretch>
@@ -11181,7 +11667,7 @@
     </w:p>
     <w:p>
       <w:pPr>
-        <w:pStyle w:val="BodyText"/>
+        <w:pStyle w:val="CaptionedFigure"/>
         <w:keepNext w:val="0"/>
         <w:spacing w:before="40" w:after="240"/>
         <w:jc w:val="center"/>
@@ -11198,6 +11684,14 @@
     </w:p>
     <w:p>
       <w:pPr>
+        <w:pStyle w:val="ImageCaption"/>
+      </w:pPr>
+      <w:r>
+        <w:t xml:space="preserve">Own SMTP server</w:t>
+      </w:r>
+    </w:p>
+    <w:p>
+      <w:pPr>
         <w:pStyle w:val="BodyText"/>
       </w:pPr>
       <w:r>
@@ -11318,6 +11812,179 @@
       </w:r>
       <w:r>
         <w:t xml:space="preserve">tries the server.</w:t>
+      </w:r>
+    </w:p>
+    <w:p>
+      <w:pPr>
+        <w:pStyle w:val="Compact"/>
+        <w:numPr>
+          <w:ilvl w:val="0"/>
+          <w:numId w:val="1020"/>
+        </w:numPr>
+      </w:pPr>
+      <w:r>
+        <w:t xml:space="preserve">While it connects, the button says</w:t>
+      </w:r>
+      <w:r>
+        <w:t xml:space="preserve"> </w:t>
+      </w:r>
+      <w:r>
+        <w:rPr>
+          <w:i/>
+          <w:iCs/>
+        </w:rPr>
+        <w:t xml:space="preserve">Connecting…</w:t>
+      </w:r>
+      <w:r>
+        <w:t xml:space="preserve"> </w:t>
+      </w:r>
+      <w:r>
+        <w:t xml:space="preserve">and email keeps going from the system default.</w:t>
+      </w:r>
+    </w:p>
+    <w:p>
+      <w:pPr>
+        <w:pStyle w:val="Compact"/>
+        <w:numPr>
+          <w:ilvl w:val="0"/>
+          <w:numId w:val="1020"/>
+        </w:numPr>
+      </w:pPr>
+      <w:r>
+        <w:t xml:space="preserve">If it cannot connect, a note says so and the user can correct the details.</w:t>
+      </w:r>
+    </w:p>
+    <w:p>
+      <w:pPr>
+        <w:pStyle w:val="Compact"/>
+        <w:numPr>
+          <w:ilvl w:val="0"/>
+          <w:numId w:val="1020"/>
+        </w:numPr>
+      </w:pPr>
+      <w:r>
+        <w:t xml:space="preserve">When it connects, the page shows</w:t>
+      </w:r>
+      <w:r>
+        <w:t xml:space="preserve"> </w:t>
+      </w:r>
+      <w:r>
+        <w:rPr>
+          <w:b/>
+          <w:bCs/>
+        </w:rPr>
+        <w:t xml:space="preserve">Your connection</w:t>
+      </w:r>
+      <w:r>
+        <w:t xml:space="preserve">: SMTP server, Security, Username, From name and From address (the password is never shown again), with</w:t>
+      </w:r>
+      <w:r>
+        <w:t xml:space="preserve"> </w:t>
+      </w:r>
+      <w:r>
+        <w:rPr>
+          <w:b/>
+          <w:bCs/>
+        </w:rPr>
+        <w:t xml:space="preserve">Send test email</w:t>
+      </w:r>
+      <w:r>
+        <w:t xml:space="preserve"> </w:t>
+      </w:r>
+      <w:r>
+        <w:t xml:space="preserve">and</w:t>
+      </w:r>
+      <w:r>
+        <w:t xml:space="preserve"> </w:t>
+      </w:r>
+      <w:r>
+        <w:rPr>
+          <w:b/>
+          <w:bCs/>
+        </w:rPr>
+        <w:t xml:space="preserve">Edit server</w:t>
+      </w:r>
+      <w:r>
+        <w:t xml:space="preserve">. Emails are now sent through the firm’s server.</w:t>
+      </w:r>
+    </w:p>
+    <w:p>
+      <w:pPr>
+        <w:pStyle w:val="FirstParagraph"/>
+      </w:pPr>
+      <w:r>
+        <w:rPr>
+          <w:b/>
+          <w:bCs/>
+        </w:rPr>
+        <w:t xml:space="preserve">Status in Email Logs for SMTP emails.</w:t>
+      </w:r>
+      <w:r>
+        <w:t xml:space="preserve"> </w:t>
+      </w:r>
+      <w:r>
+        <w:t xml:space="preserve">An email sent through the firm’s own SMTP server shows the status</w:t>
+      </w:r>
+      <w:r>
+        <w:t xml:space="preserve"> </w:t>
+      </w:r>
+      <w:r>
+        <w:rPr>
+          <w:b/>
+          <w:bCs/>
+        </w:rPr>
+        <w:t xml:space="preserve">SMTP</w:t>
+      </w:r>
+      <w:r>
+        <w:t xml:space="preserve"> </w:t>
+      </w:r>
+      <w:r>
+        <w:t xml:space="preserve">in Email Logs. Spectrum Cloud only hands the email to the firm’s server. It</w:t>
+      </w:r>
+      <w:r>
+        <w:t xml:space="preserve"> </w:t>
+      </w:r>
+      <w:r>
+        <w:rPr>
+          <w:b/>
+          <w:bCs/>
+        </w:rPr>
+        <w:t xml:space="preserve">cannot see what happens after that</w:t>
+      </w:r>
+      <w:r>
+        <w:t xml:space="preserve">, so it cannot tell whether the email was delivered, bounced, failed or opened. Instead of a status it cannot check, the log says</w:t>
+      </w:r>
+      <w:r>
+        <w:t xml:space="preserve"> </w:t>
+      </w:r>
+      <w:r>
+        <w:rPr>
+          <w:b/>
+          <w:bCs/>
+        </w:rPr>
+        <w:t xml:space="preserve">SMTP</w:t>
+      </w:r>
+      <w:r>
+        <w:t xml:space="preserve">, which means</w:t>
+      </w:r>
+      <w:r>
+        <w:t xml:space="preserve"> </w:t>
+      </w:r>
+      <w:r>
+        <w:t xml:space="preserve">“handed to the firm’s own mail server”</w:t>
+      </w:r>
+      <w:r>
+        <w:t xml:space="preserve">. Emails sent from the system default or from the firm’s own domain keep their usual statuses (Delivered, Bounced and so on).</w:t>
+      </w:r>
+    </w:p>
+    <w:bookmarkEnd w:id="92"/>
+    <w:bookmarkStart w:id="93" w:name="rules"/>
+    <w:p>
+      <w:pPr>
+        <w:pStyle w:val="Heading3"/>
+      </w:pPr>
+      <w:r>
+        <w:t xml:space="preserve">7.5 Rules</w:t>
       </w:r>
     </w:p>
     <w:p>
@@ -11329,23 +11996,46 @@
         </w:numPr>
       </w:pPr>
       <w:r>
-        <w:t xml:space="preserve">While it connects, the button says</w:t>
-      </w:r>
-      <w:r>
-        <w:t xml:space="preserve"> </w:t>
-      </w:r>
-      <w:r>
-        <w:rPr>
-          <w:i/>
-          <w:iCs/>
-        </w:rPr>
-        <w:t xml:space="preserve">Connecting...</w:t>
-      </w:r>
-      <w:r>
-        <w:t xml:space="preserve"> </w:t>
-      </w:r>
-      <w:r>
-        <w:t xml:space="preserve">and email keeps going from the system default.</w:t>
+        <w:t xml:space="preserve">The choice is for</w:t>
+      </w:r>
+      <w:r>
+        <w:t xml:space="preserve"> </w:t>
+      </w:r>
+      <w:r>
+        <w:rPr>
+          <w:b/>
+          <w:bCs/>
+        </w:rPr>
+        <w:t xml:space="preserve">the whole firm</w:t>
+      </w:r>
+      <w:r>
+        <w:t xml:space="preserve">. One own number and one own domain (or mail server) cover</w:t>
+      </w:r>
+      <w:r>
+        <w:t xml:space="preserve"> </w:t>
+      </w:r>
+      <w:r>
+        <w:rPr>
+          <w:b/>
+          <w:bCs/>
+        </w:rPr>
+        <w:t xml:space="preserve">all three modules</w:t>
+      </w:r>
+      <w:r>
+        <w:t xml:space="preserve">, GST, TDS and ITR. The firm does not choose them per module. WhatsApp and email are chosen</w:t>
+      </w:r>
+      <w:r>
+        <w:t xml:space="preserve"> </w:t>
+      </w:r>
+      <w:r>
+        <w:rPr>
+          <w:b/>
+          <w:bCs/>
+        </w:rPr>
+        <w:t xml:space="preserve">separately</w:t>
+      </w:r>
+      <w:r>
+        <w:t xml:space="preserve">.</w:t>
       </w:r>
     </w:p>
     <w:p>
@@ -11357,7 +12047,23 @@
         </w:numPr>
       </w:pPr>
       <w:r>
-        <w:t xml:space="preserve">If it cannot connect, a note says so and the user can correct the details.</w:t>
+        <w:t xml:space="preserve">Exactly</w:t>
+      </w:r>
+      <w:r>
+        <w:t xml:space="preserve"> </w:t>
+      </w:r>
+      <w:r>
+        <w:rPr>
+          <w:b/>
+          <w:bCs/>
+        </w:rPr>
+        <w:t xml:space="preserve">one</w:t>
+      </w:r>
+      <w:r>
+        <w:t xml:space="preserve"> </w:t>
+      </w:r>
+      <w:r>
+        <w:t xml:space="preserve">choice is in use for each channel.</w:t>
       </w:r>
     </w:p>
     <w:p>
@@ -11369,49 +12075,93 @@
         </w:numPr>
       </w:pPr>
       <w:r>
-        <w:t xml:space="preserve">When it connects, the page shows</w:t>
-      </w:r>
-      <w:r>
-        <w:t xml:space="preserve"> </w:t>
-      </w:r>
-      <w:r>
-        <w:rPr>
-          <w:b/>
-          <w:bCs/>
-        </w:rPr>
-        <w:t xml:space="preserve">Your connection</w:t>
-      </w:r>
-      <w:r>
-        <w:t xml:space="preserve">: SMTP server, Security, Username, From name and From address (the password is never shown again), with</w:t>
-      </w:r>
-      <w:r>
-        <w:t xml:space="preserve"> </w:t>
-      </w:r>
-      <w:r>
-        <w:rPr>
-          <w:b/>
-          <w:bCs/>
-        </w:rPr>
-        <w:t xml:space="preserve">Send test email</w:t>
-      </w:r>
-      <w:r>
-        <w:t xml:space="preserve"> </w:t>
-      </w:r>
-      <w:r>
-        <w:t xml:space="preserve">and</w:t>
-      </w:r>
-      <w:r>
-        <w:t xml:space="preserve"> </w:t>
-      </w:r>
-      <w:r>
-        <w:rPr>
-          <w:b/>
-          <w:bCs/>
-        </w:rPr>
-        <w:t xml:space="preserve">Edit server</w:t>
-      </w:r>
-      <w:r>
-        <w:t xml:space="preserve">. Emails are now sent through the firm's server.</w:t>
+        <w:t xml:space="preserve">A setup that is not finished never takes over: messages keep going from the system default.</w:t>
+      </w:r>
+    </w:p>
+    <w:p>
+      <w:pPr>
+        <w:pStyle w:val="Compact"/>
+        <w:numPr>
+          <w:ilvl w:val="0"/>
+          <w:numId w:val="1021"/>
+        </w:numPr>
+      </w:pPr>
+      <w:r>
+        <w:t xml:space="preserve">The firm’s own setup is kept when the user switches back to the system default.</w:t>
+      </w:r>
+    </w:p>
+    <w:p>
+      <w:pPr>
+        <w:pStyle w:val="Compact"/>
+        <w:numPr>
+          <w:ilvl w:val="0"/>
+          <w:numId w:val="1021"/>
+        </w:numPr>
+      </w:pPr>
+      <w:r>
+        <w:t xml:space="preserve">An email sent through the firm’s own SMTP server shows the status</w:t>
+      </w:r>
+      <w:r>
+        <w:t xml:space="preserve"> </w:t>
+      </w:r>
+      <w:r>
+        <w:rPr>
+          <w:b/>
+          <w:bCs/>
+        </w:rPr>
+        <w:t xml:space="preserve">SMTP</w:t>
+      </w:r>
+      <w:r>
+        <w:t xml:space="preserve"> </w:t>
+      </w:r>
+      <w:r>
+        <w:t xml:space="preserve">in Email Logs, because Spectrum Cloud cannot check what happens after it hands the email over.</w:t>
+      </w:r>
+    </w:p>
+    <w:p>
+      <w:pPr>
+        <w:pStyle w:val="Compact"/>
+        <w:numPr>
+          <w:ilvl w:val="0"/>
+          <w:numId w:val="1021"/>
+        </w:numPr>
+      </w:pPr>
+      <w:r>
+        <w:t xml:space="preserve">The user must never see the name of the WhatsApp provider. The DNS values for email are shown</w:t>
+      </w:r>
+      <w:r>
+        <w:t xml:space="preserve"> </w:t>
+      </w:r>
+      <w:r>
+        <w:rPr>
+          <w:b/>
+          <w:bCs/>
+        </w:rPr>
+        <w:t xml:space="preserve">as given</w:t>
+      </w:r>
+      <w:r>
+        <w:t xml:space="preserve">, because the user has to copy them exactly.</w:t>
+      </w:r>
+    </w:p>
+    <w:p>
+      <w:r>
+        <w:pict>
+          <v:rect style="width:0;height:1.5pt" o:hralign="center" o:hrstd="t" o:hr="t"/>
+        </w:pict>
+      </w:r>
+    </w:p>
+    <w:bookmarkEnd w:id="93"/>
+    <w:bookmarkEnd w:id="94"/>
+    <w:bookmarkStart w:id="95" w:name="where-the-data-comes-from"/>
+    <w:p>
+      <w:pPr>
+        <w:pStyle w:val="Heading2"/>
+        <w:pBdr>
+          <w:bottom w:val="single" w:sz="6" w:space="4" w:color="C9D2DC"/>
+        </w:pBdr>
+      </w:pPr>
+      <w:r>
+        <w:t xml:space="preserve">8. Where the data comes from</w:t>
       </w:r>
     </w:p>
     <w:p>
@@ -11423,65 +12173,88 @@
           <w:b/>
           <w:bCs/>
         </w:rPr>
-        <w:t xml:space="preserve">Status in Email Logs for SMTP emails.</w:t>
-      </w:r>
-      <w:r>
-        <w:t xml:space="preserve"> </w:t>
-      </w:r>
-      <w:r>
-        <w:t xml:space="preserve">An email sent through the firm's own SMTP server shows the status</w:t>
-      </w:r>
-      <w:r>
-        <w:t xml:space="preserve"> </w:t>
-      </w:r>
-      <w:r>
-        <w:rPr>
-          <w:b/>
-          <w:bCs/>
-        </w:rPr>
-        <w:t xml:space="preserve">SMTP</w:t>
-      </w:r>
-      <w:r>
-        <w:t xml:space="preserve"> </w:t>
-      </w:r>
-      <w:r>
-        <w:t xml:space="preserve">in Email Logs. Spectrum Cloud only hands the email to the firm's server. It</w:t>
-      </w:r>
-      <w:r>
-        <w:t xml:space="preserve"> </w:t>
-      </w:r>
-      <w:r>
-        <w:rPr>
-          <w:b/>
-          <w:bCs/>
-        </w:rPr>
-        <w:t xml:space="preserve">cannot see what happens after that</w:t>
-      </w:r>
-      <w:r>
-        <w:t xml:space="preserve">, so it cannot tell whether the email was delivered, bounced, failed or opened. Instead of a status it cannot check, the log says</w:t>
-      </w:r>
-      <w:r>
-        <w:t xml:space="preserve"> </w:t>
-      </w:r>
-      <w:r>
-        <w:rPr>
-          <w:b/>
-          <w:bCs/>
-        </w:rPr>
-        <w:t xml:space="preserve">SMTP</w:t>
-      </w:r>
-      <w:r>
-        <w:t xml:space="preserve">, which means "handed to the firm's own mail server". Emails sent from the system default or from the firm's own domain keep their usual statuses (Delivered, Bounced and so on).</w:t>
-      </w:r>
-    </w:p>
-    <w:bookmarkEnd w:id="93"/>
-    <w:bookmarkStart w:id="94" w:name="Xe19b28f785abee5be075f31de3f1a84f09de753"/>
-    <w:p>
-      <w:pPr>
-        <w:pStyle w:val="Heading3"/>
-      </w:pPr>
-      <w:r>
-        <w:t xml:space="preserve">7.5 Rules</w:t>
+        <w:t xml:space="preserve">From the application:</w:t>
+      </w:r>
+      <w:r>
+        <w:t xml:space="preserve"> </w:t>
+      </w:r>
+      <w:r>
+        <w:t xml:space="preserve">clients, their PAN and contacts, and the registrations of each client (GSTIN, TAN, PAN, with type or place). A newly added registration gets the defaults of its module.</w:t>
+      </w:r>
+    </w:p>
+    <w:p>
+      <w:pPr>
+        <w:pStyle w:val="BodyText"/>
+      </w:pPr>
+      <w:r>
+        <w:rPr>
+          <w:b/>
+          <w:bCs/>
+        </w:rPr>
+        <w:t xml:space="preserve">Saved by Spectrum Cloud:</w:t>
+      </w:r>
+      <w:r>
+        <w:t xml:space="preserve"> </w:t>
+      </w:r>
+      <w:r>
+        <w:t xml:space="preserve">the Email and WhatsApp switch of every report and event for each registration, the contact picked for each registration, the contacts edited or added on this page, and the defaults of each module. From the Configuration page: for WhatsApp and for email,</w:t>
+      </w:r>
+      <w:r>
+        <w:t xml:space="preserve"> </w:t>
+      </w:r>
+      <w:r>
+        <w:rPr>
+          <w:b/>
+          <w:bCs/>
+        </w:rPr>
+        <w:t xml:space="preserve">which choice is in use</w:t>
+      </w:r>
+      <w:r>
+        <w:t xml:space="preserve">, and the firm’s own setup (the WhatsApp number and display name, the email domain and its status, the SMTP details with the password kept safe and never shown again, and the Reply-to email). For every WhatsApp message: the</w:t>
+      </w:r>
+      <w:r>
+        <w:t xml:space="preserve"> </w:t>
+      </w:r>
+      <w:r>
+        <w:rPr>
+          <w:b/>
+          <w:bCs/>
+        </w:rPr>
+        <w:t xml:space="preserve">name and number it was sent from</w:t>
+      </w:r>
+      <w:r>
+        <w:t xml:space="preserve">, saved at the time it is sent.</w:t>
+      </w:r>
+    </w:p>
+    <w:p>
+      <w:pPr>
+        <w:pStyle w:val="BodyText"/>
+      </w:pPr>
+      <w:r>
+        <w:rPr>
+          <w:b/>
+          <w:bCs/>
+        </w:rPr>
+        <w:t xml:space="preserve">WhatsApp.</w:t>
+      </w:r>
+      <w:r>
+        <w:t xml:space="preserve"> </w:t>
+      </w:r>
+      <w:r>
+        <w:t xml:space="preserve">We send WhatsApp through</w:t>
+      </w:r>
+      <w:r>
+        <w:t xml:space="preserve"> </w:t>
+      </w:r>
+      <w:r>
+        <w:rPr>
+          <w:b/>
+          <w:bCs/>
+        </w:rPr>
+        <w:t xml:space="preserve">Rampwin</w:t>
+      </w:r>
+      <w:r>
+        <w:t xml:space="preserve">. The status of every message and its delivery details (delivered time, read time, failure reason) are taken from Rampwin. The user must never see the name Rampwin or its codes.</w:t>
       </w:r>
     </w:p>
     <w:p>
@@ -11493,46 +12266,7 @@
         </w:numPr>
       </w:pPr>
       <w:r>
-        <w:t xml:space="preserve">The choice is for</w:t>
-      </w:r>
-      <w:r>
-        <w:t xml:space="preserve"> </w:t>
-      </w:r>
-      <w:r>
-        <w:rPr>
-          <w:b/>
-          <w:bCs/>
-        </w:rPr>
-        <w:t xml:space="preserve">the whole firm</w:t>
-      </w:r>
-      <w:r>
-        <w:t xml:space="preserve">. One own number and one own domain (or mail server) cover</w:t>
-      </w:r>
-      <w:r>
-        <w:t xml:space="preserve"> </w:t>
-      </w:r>
-      <w:r>
-        <w:rPr>
-          <w:b/>
-          <w:bCs/>
-        </w:rPr>
-        <w:t xml:space="preserve">all three modules</w:t>
-      </w:r>
-      <w:r>
-        <w:t xml:space="preserve">, GST, TDS and ITR. The firm does not choose them per module. WhatsApp and email are chosen</w:t>
-      </w:r>
-      <w:r>
-        <w:t xml:space="preserve"> </w:t>
-      </w:r>
-      <w:r>
-        <w:rPr>
-          <w:b/>
-          <w:bCs/>
-        </w:rPr>
-        <w:t xml:space="preserve">separately</w:t>
-      </w:r>
-      <w:r>
-        <w:t xml:space="preserve">.</w:t>
+        <w:t xml:space="preserve">Rampwin API reference: https://rampwin-api.readme.io</w:t>
       </w:r>
     </w:p>
     <w:p>
@@ -11544,59 +12278,33 @@
         </w:numPr>
       </w:pPr>
       <w:r>
-        <w:t xml:space="preserve">Exactly</w:t>
-      </w:r>
-      <w:r>
-        <w:t xml:space="preserve"> </w:t>
-      </w:r>
-      <w:r>
-        <w:rPr>
-          <w:b/>
-          <w:bCs/>
-        </w:rPr>
-        <w:t xml:space="preserve">one</w:t>
-      </w:r>
-      <w:r>
-        <w:t xml:space="preserve"> </w:t>
-      </w:r>
-      <w:r>
-        <w:t xml:space="preserve">choice is in use for each channel.</w:t>
-      </w:r>
-    </w:p>
-    <w:p>
-      <w:pPr>
-        <w:pStyle w:val="Compact"/>
-        <w:numPr>
-          <w:ilvl w:val="0"/>
-          <w:numId w:val="1022"/>
-        </w:numPr>
-      </w:pPr>
-      <w:r>
-        <w:t xml:space="preserve">A setup that is not finished never takes over: messages keep going from the system default.</w:t>
-      </w:r>
-    </w:p>
-    <w:p>
-      <w:pPr>
-        <w:pStyle w:val="Compact"/>
-        <w:numPr>
-          <w:ilvl w:val="0"/>
-          <w:numId w:val="1022"/>
-        </w:numPr>
-      </w:pPr>
-      <w:r>
-        <w:t xml:space="preserve">The firm's own setup is kept when the user switches back to the system default.</w:t>
-      </w:r>
-    </w:p>
-    <w:p>
-      <w:pPr>
-        <w:pStyle w:val="Compact"/>
-        <w:numPr>
-          <w:ilvl w:val="0"/>
-          <w:numId w:val="1022"/>
-        </w:numPr>
-      </w:pPr>
-      <w:r>
-        <w:t xml:space="preserve">An email sent through the firm's own SMTP server shows the status</w:t>
+        <w:t xml:space="preserve">Rampwin help docs: https://docs.rampwin.com</w:t>
+      </w:r>
+    </w:p>
+    <w:p>
+      <w:pPr>
+        <w:pStyle w:val="FirstParagraph"/>
+      </w:pPr>
+      <w:r>
+        <w:t xml:space="preserve">When a firm connects its own number, the connection details and the approval status of its message templates also come from the WhatsApp provider.</w:t>
+      </w:r>
+    </w:p>
+    <w:p>
+      <w:pPr>
+        <w:pStyle w:val="BodyText"/>
+      </w:pPr>
+      <w:r>
+        <w:rPr>
+          <w:b/>
+          <w:bCs/>
+        </w:rPr>
+        <w:t xml:space="preserve">Email.</w:t>
+      </w:r>
+      <w:r>
+        <w:t xml:space="preserve"> </w:t>
+      </w:r>
+      <w:r>
+        <w:t xml:space="preserve">For the system default and for the firm’s own domain, the status of each email comes from the email provider. For an email sent through the firm’s own SMTP server there is no provider status, so Email Logs shows</w:t>
       </w:r>
       <w:r>
         <w:t xml:space="preserve"> </w:t>
@@ -11609,237 +12317,10 @@
         <w:t xml:space="preserve">SMTP</w:t>
       </w:r>
       <w:r>
-        <w:t xml:space="preserve"> </w:t>
-      </w:r>
-      <w:r>
-        <w:t xml:space="preserve">in Email Logs, because Spectrum Cloud cannot check what happens after it hands the email over.</w:t>
-      </w:r>
-    </w:p>
-    <w:p>
-      <w:pPr>
-        <w:pStyle w:val="Compact"/>
-        <w:numPr>
-          <w:ilvl w:val="0"/>
-          <w:numId w:val="1022"/>
-        </w:numPr>
-      </w:pPr>
-      <w:r>
-        <w:t xml:space="preserve">The user must never see the name of the WhatsApp provider. The DNS values for email are shown</w:t>
-      </w:r>
-      <w:r>
-        <w:t xml:space="preserve"> </w:t>
-      </w:r>
-      <w:r>
-        <w:rPr>
-          <w:b/>
-          <w:bCs/>
-        </w:rPr>
-        <w:t xml:space="preserve">as given</w:t>
-      </w:r>
-      <w:r>
-        <w:t xml:space="preserve">, because the user has to copy them exactly.</w:t>
-      </w:r>
-    </w:p>
-    <w:p>
-      <w:r>
-        <w:pict>
-          <v:rect style="width:0;height:1.5pt" o:hralign="center" o:hrstd="t" o:hr="t"/>
-        </w:pict>
-      </w:r>
-    </w:p>
-    <w:bookmarkEnd w:id="94"/>
+        <w:t xml:space="preserve">.</w:t>
+      </w:r>
+    </w:p>
     <w:bookmarkEnd w:id="95"/>
-    <w:bookmarkStart w:id="98" w:name="Xcfe188df4835c7be7ab3f6f8cbc0d8ee2c7b3b0"/>
-    <w:p>
-      <w:pPr>
-        <w:pStyle w:val="Heading2"/>
-        <w:pBdr>
-          <w:bottom w:val="single" w:sz="6" w:space="4" w:color="C9D2DC"/>
-        </w:pBdr>
-      </w:pPr>
-      <w:r>
-        <w:t xml:space="preserve">8. Where the data comes from</w:t>
-      </w:r>
-    </w:p>
-    <w:p>
-      <w:pPr>
-        <w:pStyle w:val="FirstParagraph"/>
-      </w:pPr>
-      <w:r>
-        <w:rPr>
-          <w:b/>
-          <w:bCs/>
-        </w:rPr>
-        <w:t xml:space="preserve">From the application:</w:t>
-      </w:r>
-      <w:r>
-        <w:t xml:space="preserve"> </w:t>
-      </w:r>
-      <w:r>
-        <w:t xml:space="preserve">clients, their PAN and contacts, and the registrations of each client (GSTIN, TAN, PAN, with type or place). A newly added registration gets the defaults of its module.</w:t>
-      </w:r>
-    </w:p>
-    <w:p>
-      <w:pPr>
-        <w:pStyle w:val="BodyText"/>
-      </w:pPr>
-      <w:r>
-        <w:rPr>
-          <w:b/>
-          <w:bCs/>
-        </w:rPr>
-        <w:t xml:space="preserve">Saved by Spectrum Cloud:</w:t>
-      </w:r>
-      <w:r>
-        <w:t xml:space="preserve"> </w:t>
-      </w:r>
-      <w:r>
-        <w:t xml:space="preserve">the Email and WhatsApp switch of every report and event for each registration, the contact picked for each registration, the contacts edited or added on this page, and the defaults of each module. From the Configuration page: for WhatsApp and for email,</w:t>
-      </w:r>
-      <w:r>
-        <w:t xml:space="preserve"> </w:t>
-      </w:r>
-      <w:r>
-        <w:rPr>
-          <w:b/>
-          <w:bCs/>
-        </w:rPr>
-        <w:t xml:space="preserve">which choice is in use</w:t>
-      </w:r>
-      <w:r>
-        <w:t xml:space="preserve">, and the firm's own setup (the WhatsApp number and display name, the email domain and its status, the SMTP details with the password kept safe and never shown again, and the Reply-to email). For every WhatsApp message: the</w:t>
-      </w:r>
-      <w:r>
-        <w:t xml:space="preserve"> </w:t>
-      </w:r>
-      <w:r>
-        <w:rPr>
-          <w:b/>
-          <w:bCs/>
-        </w:rPr>
-        <w:t xml:space="preserve">name and number it was sent from</w:t>
-      </w:r>
-      <w:r>
-        <w:t xml:space="preserve">, saved at the time it is sent.</w:t>
-      </w:r>
-    </w:p>
-    <w:p>
-      <w:pPr>
-        <w:pStyle w:val="BodyText"/>
-      </w:pPr>
-      <w:r>
-        <w:rPr>
-          <w:b/>
-          <w:bCs/>
-        </w:rPr>
-        <w:t xml:space="preserve">WhatsApp.</w:t>
-      </w:r>
-      <w:r>
-        <w:t xml:space="preserve"> </w:t>
-      </w:r>
-      <w:r>
-        <w:t xml:space="preserve">We send WhatsApp through</w:t>
-      </w:r>
-      <w:r>
-        <w:t xml:space="preserve"> </w:t>
-      </w:r>
-      <w:r>
-        <w:rPr>
-          <w:b/>
-          <w:bCs/>
-        </w:rPr>
-        <w:t xml:space="preserve">Rampwin</w:t>
-      </w:r>
-      <w:r>
-        <w:t xml:space="preserve">. The status of every message and its delivery details (delivered time, read time, failure reason) are taken from Rampwin. The user must never see the name Rampwin or its codes.</w:t>
-      </w:r>
-    </w:p>
-    <w:p>
-      <w:pPr>
-        <w:pStyle w:val="Compact"/>
-        <w:numPr>
-          <w:ilvl w:val="0"/>
-          <w:numId w:val="1023"/>
-        </w:numPr>
-      </w:pPr>
-      <w:r>
-        <w:t xml:space="preserve">Rampwin API reference:</w:t>
-      </w:r>
-      <w:r>
-        <w:t xml:space="preserve"> </w:t>
-      </w:r>
-      <w:hyperlink r:id="rId96">
-        <w:r>
-          <w:rPr>
-            <w:rStyle w:val="Hyperlink"/>
-          </w:rPr>
-          <w:t xml:space="preserve">https://rampwin-api.readme.io</w:t>
-        </w:r>
-      </w:hyperlink>
-    </w:p>
-    <w:p>
-      <w:pPr>
-        <w:pStyle w:val="Compact"/>
-        <w:numPr>
-          <w:ilvl w:val="0"/>
-          <w:numId w:val="1023"/>
-        </w:numPr>
-      </w:pPr>
-      <w:r>
-        <w:t xml:space="preserve">Rampwin help docs:</w:t>
-      </w:r>
-      <w:r>
-        <w:t xml:space="preserve"> </w:t>
-      </w:r>
-      <w:hyperlink r:id="rId97">
-        <w:r>
-          <w:rPr>
-            <w:rStyle w:val="Hyperlink"/>
-          </w:rPr>
-          <w:t xml:space="preserve">https://docs.rampwin.com</w:t>
-        </w:r>
-      </w:hyperlink>
-    </w:p>
-    <w:p>
-      <w:pPr>
-        <w:pStyle w:val="FirstParagraph"/>
-      </w:pPr>
-      <w:r>
-        <w:t xml:space="preserve">When a firm connects its own number, the connection details and the approval status of its message templates also come from the WhatsApp provider.</w:t>
-      </w:r>
-    </w:p>
-    <w:p>
-      <w:pPr>
-        <w:pStyle w:val="BodyText"/>
-      </w:pPr>
-      <w:r>
-        <w:rPr>
-          <w:b/>
-          <w:bCs/>
-        </w:rPr>
-        <w:t xml:space="preserve">Email.</w:t>
-      </w:r>
-      <w:r>
-        <w:t xml:space="preserve"> </w:t>
-      </w:r>
-      <w:r>
-        <w:t xml:space="preserve">For the system default and for the firm's own domain, the status of each email comes from the email provider. For an email sent through the firm's own SMTP server there is no provider status, so Email Logs shows</w:t>
-      </w:r>
-      <w:r>
-        <w:t xml:space="preserve"> </w:t>
-      </w:r>
-      <w:r>
-        <w:rPr>
-          <w:b/>
-          <w:bCs/>
-        </w:rPr>
-        <w:t xml:space="preserve">SMTP</w:t>
-      </w:r>
-      <w:r>
-        <w:t xml:space="preserve">.</w:t>
-      </w:r>
-    </w:p>
-    <w:bookmarkEnd w:id="98"/>
     <w:sectPr>
       <w:footnotePr>
         <w:numRestart w:val="eachSect"/>
@@ -12246,9 +12727,6 @@
     <w:abstractNumId w:val="991"/>
   </w:num>
   <w:num w:numId="1017">
-    <w:abstractNumId w:val="991"/>
-  </w:num>
-  <w:num w:numId="1018">
     <w:abstractNumId w:val="99411"/>
     <w:lvlOverride w:ilvl="0">
       <w:startOverride w:val="1"/>
@@ -12278,10 +12756,10 @@
       <w:startOverride w:val="1"/>
     </w:lvlOverride>
   </w:num>
-  <w:num w:numId="1019">
+  <w:num w:numId="1018">
     <w:abstractNumId w:val="991"/>
   </w:num>
-  <w:num w:numId="1020">
+  <w:num w:numId="1019">
     <w:abstractNumId w:val="99411"/>
     <w:lvlOverride w:ilvl="0">
       <w:startOverride w:val="1"/>
@@ -12311,10 +12789,10 @@
       <w:startOverride w:val="1"/>
     </w:lvlOverride>
   </w:num>
-  <w:num w:numId="1021">
+  <w:num w:numId="1020">
     <w:abstractNumId w:val="991"/>
   </w:num>
-  <w:num w:numId="1022">
+  <w:num w:numId="1021">
     <w:abstractNumId w:val="99411"/>
     <w:lvlOverride w:ilvl="0">
       <w:startOverride w:val="1"/>
@@ -12344,7 +12822,7 @@
       <w:startOverride w:val="1"/>
     </w:lvlOverride>
   </w:num>
-  <w:num w:numId="1023">
+  <w:num w:numId="1022">
     <w:abstractNumId w:val="991"/>
   </w:num>
 </w:numbering>

</xml_diff>

<commit_message>
Revert "WhatsApp logs: targeted without mobile number counts as Failed (No mobile number)"
Co-Authored-By: Claude Sonnet 5.5 <noreply@anthropic.com>
</commit_message>
<xml_diff>
--- a/BRD.docx
+++ b/BRD.docx
@@ -256,7 +256,7 @@
         </w:tc>
       </w:tr>
     </w:tbl>
-    <w:bookmarkStart w:id="13" w:name="overview"/>
+    <w:bookmarkStart w:id="13" w:name="Xc8951b796c7b61cbdd4998c72efbdeed0056e13"/>
     <w:p>
       <w:pPr>
         <w:pStyle w:val="Heading2"/>
@@ -268,7 +268,7 @@
         <w:t xml:space="preserve">1. Overview</w:t>
       </w:r>
     </w:p>
-    <w:bookmarkStart w:id="9" w:name="background"/>
+    <w:bookmarkStart w:id="9" w:name="X5f5d48bced3b98d7c149293fafcf94fc98538bd"/>
     <w:p>
       <w:pPr>
         <w:pStyle w:val="Heading3"/>
@@ -373,11 +373,11 @@
         <w:t xml:space="preserve"> </w:t>
       </w:r>
       <w:r>
-        <w:t xml:space="preserve">page. Today the page covers the GST module only. TDS and ITR do not have it. WhatsApp messages have no log: the user cannot see how many clients a scheduled WhatsApp run was meant for, how many messages were sent, or what happened to them. And the firm cannot choose the WhatsApp number or the email address its messages come from: they always go from the system’s own number and address.</w:t>
+        <w:t xml:space="preserve">page. Today the page covers the GST module only. TDS and ITR do not have it. WhatsApp messages have no log: the user cannot see how many clients a scheduled WhatsApp run was meant for, how many messages were sent, or what happened to them. And the firm cannot choose the WhatsApp number or the email address its messages come from: they always go from the system's own number and address.</w:t>
       </w:r>
     </w:p>
     <w:bookmarkEnd w:id="9"/>
-    <w:bookmarkStart w:id="10" w:name="what-we-are-doing"/>
+    <w:bookmarkStart w:id="10" w:name="Xf7bea6559bef12c9b5a4888c4b5e638d501b08e"/>
     <w:p>
       <w:pPr>
         <w:pStyle w:val="Heading3"/>
@@ -578,7 +578,7 @@
       </w:r>
     </w:p>
     <w:bookmarkEnd w:id="10"/>
-    <w:bookmarkStart w:id="11" w:name="goals"/>
+    <w:bookmarkStart w:id="11" w:name="X9dbc163790b80b7da6d4870327b910ca93dfddb"/>
     <w:p>
       <w:pPr>
         <w:pStyle w:val="Heading3"/>
@@ -667,7 +667,7 @@
         <w:t xml:space="preserve">who receives them</w:t>
       </w:r>
       <w:r>
-        <w:t xml:space="preserve">: the client’s main contact, or another contact of the client.</w:t>
+        <w:t xml:space="preserve">: the client's main contact, or another contact of the client.</w:t>
       </w:r>
     </w:p>
     <w:p>
@@ -679,7 +679,7 @@
         </w:numPr>
       </w:pPr>
       <w:r>
-        <w:t xml:space="preserve">Change many registrations at once (bulk), copy settings to the client’s other registrations, and set</w:t>
+        <w:t xml:space="preserve">Change many registrations at once (bulk), copy settings to the client's other registrations, and set</w:t>
       </w:r>
       <w:r>
         <w:t xml:space="preserve"> </w:t>
@@ -773,7 +773,7 @@
       </w:r>
     </w:p>
     <w:bookmarkEnd w:id="11"/>
-    <w:bookmarkStart w:id="12" w:name="scope"/>
+    <w:bookmarkStart w:id="12" w:name="X1f4012e9c4b62781074de2916856df2f3df4c87"/>
     <w:p>
       <w:pPr>
         <w:pStyle w:val="Heading3"/>
@@ -863,7 +863,7 @@
     </w:p>
     <w:bookmarkEnd w:id="12"/>
     <w:bookmarkEnd w:id="13"/>
-    <w:bookmarkStart w:id="22" w:name="key-concepts"/>
+    <w:bookmarkStart w:id="22" w:name="X770f27a98732016b8dbb570f1ef055be35edf30"/>
     <w:p>
       <w:pPr>
         <w:pStyle w:val="Heading2"/>
@@ -883,7 +883,7 @@
         <w:t xml:space="preserve">Read this section first. The rest of the document uses these terms.</w:t>
       </w:r>
     </w:p>
-    <w:bookmarkStart w:id="14" w:name="client-registration-and-contact"/>
+    <w:bookmarkStart w:id="14" w:name="X7f5462df8089a17e43bd0511dd9288fcdcb6a73"/>
     <w:p>
       <w:pPr>
         <w:pStyle w:val="Heading3"/>
@@ -1262,7 +1262,7 @@
               <w:rPr>
                 <w:sz w:val="20"/>
               </w:rPr>
-              <w:t xml:space="preserve">The client’s first contact. A registration uses it unless another contact is picked for that registration</w:t>
+              <w:t xml:space="preserve">The client's first contact. A registration uses it unless another contact is picked for that registration</w:t>
             </w:r>
           </w:p>
         </w:tc>
@@ -1291,7 +1291,7 @@
       </w:r>
     </w:p>
     <w:bookmarkEnd w:id="14"/>
-    <w:bookmarkStart w:id="15" w:name="reports-and-events"/>
+    <w:bookmarkStart w:id="15" w:name="X83db69eb340047b14f97eaee704ef26ae6a15f6"/>
     <w:p>
       <w:pPr>
         <w:pStyle w:val="Heading3"/>
@@ -1312,7 +1312,6 @@
           <w:insideH w:val="single" w:sz="4" w:space="0" w:color="D5DBE3"/>
           <w:insideV w:val="single" w:sz="4" w:space="0" w:color="D5DBE3"/>
         </w:tblBorders>
-        <w:tblLayout w:type="fixed"/>
         <w:tblCellMar>
           <w:top w:w="70" w:type="dxa"/>
           <w:left w:w="110" w:type="dxa"/>
@@ -1688,34 +1687,7 @@
         <w:ind w:left="115"/>
       </w:pPr>
       <w:r>
-        <w:t xml:space="preserve">The names on the prototype screens (for example</w:t>
-      </w:r>
-      <w:r>
-        <w:t xml:space="preserve"> </w:t>
-      </w:r>
-      <w:r>
-        <w:t xml:space="preserve">“Form 24Q filed”</w:t>
-      </w:r>
-      <w:r>
-        <w:t xml:space="preserve">,</w:t>
-      </w:r>
-      <w:r>
-        <w:t xml:space="preserve"> </w:t>
-      </w:r>
-      <w:r>
-        <w:t xml:space="preserve">“Refund issued”</w:t>
-      </w:r>
-      <w:r>
-        <w:t xml:space="preserve">,</w:t>
-      </w:r>
-      <w:r>
-        <w:t xml:space="preserve"> </w:t>
-      </w:r>
-      <w:r>
-        <w:t xml:space="preserve">“Monthly TDS summary”</w:t>
-      </w:r>
-      <w:r>
-        <w:t xml:space="preserve">) are</w:t>
+        <w:t xml:space="preserve">The names on the prototype screens (for example "Form 24Q filed", "Refund issued", "Monthly TDS summary") are</w:t>
       </w:r>
       <w:r>
         <w:t xml:space="preserve"> </w:t>
@@ -1728,23 +1700,11 @@
         <w:t xml:space="preserve">examples only</w:t>
       </w:r>
       <w:r>
-        <w:t xml:space="preserve">. The final lists will be added by the domain team. The page must work with any list: a module with no report or event shows</w:t>
-      </w:r>
-      <w:r>
-        <w:t xml:space="preserve"> </w:t>
-      </w:r>
-      <w:r>
-        <w:t xml:space="preserve">“No reports or events for TDS yet.”</w:t>
-      </w:r>
-      <w:r>
-        <w:t xml:space="preserve"> </w:t>
-      </w:r>
-      <w:r>
-        <w:t xml:space="preserve">and its numbers show a dash.</w:t>
+        <w:t xml:space="preserve">. The final lists will be added by the domain team. The page must work with any list: a module with no report or event shows "No reports or events for TDS yet." and its numbers show a dash.</w:t>
       </w:r>
     </w:p>
     <w:bookmarkEnd w:id="15"/>
-    <w:bookmarkStart w:id="16" w:name="when-a-switch-cannot-be-turned-on"/>
+    <w:bookmarkStart w:id="16" w:name="Xbeaeecdba64e59e9f3e2056676977dc50c1c0ae"/>
     <w:p>
       <w:pPr>
         <w:pStyle w:val="Heading3"/>
@@ -1835,7 +1795,7 @@
       </w:r>
     </w:p>
     <w:bookmarkEnd w:id="16"/>
-    <w:bookmarkStart w:id="17" w:name="Xecbce999d6317d317bf5fed5ab142cd85f03f1b"/>
+    <w:bookmarkStart w:id="17" w:name="Xfb4f61b0767c80bea6aa56662e557e1ee69f814"/>
     <w:p>
       <w:pPr>
         <w:pStyle w:val="Heading3"/>
@@ -1856,7 +1816,6 @@
           <w:insideH w:val="single" w:sz="4" w:space="0" w:color="D5DBE3"/>
           <w:insideV w:val="single" w:sz="4" w:space="0" w:color="D5DBE3"/>
         </w:tblBorders>
-        <w:tblLayout w:type="fixed"/>
         <w:tblCellMar>
           <w:top w:w="70" w:type="dxa"/>
           <w:left w:w="110" w:type="dxa"/>
@@ -2166,7 +2125,7 @@
       </w:r>
     </w:p>
     <w:bookmarkEnd w:id="17"/>
-    <w:bookmarkStart w:id="18" w:name="trigger-event"/>
+    <w:bookmarkStart w:id="18" w:name="X9227148df73941ed38024824e5129f0af39589e"/>
     <w:p>
       <w:pPr>
         <w:pStyle w:val="Heading3"/>
@@ -2218,7 +2177,7 @@
       </w:r>
     </w:p>
     <w:bookmarkEnd w:id="18"/>
-    <w:bookmarkStart w:id="19" w:name="ids-the-user-sees"/>
+    <w:bookmarkStart w:id="19" w:name="X952241f8473c12a05c070a6b2388f5153966a68"/>
     <w:p>
       <w:pPr>
         <w:pStyle w:val="Heading3"/>
@@ -2247,7 +2206,6 @@
           <w:insideH w:val="single" w:sz="4" w:space="0" w:color="D5DBE3"/>
           <w:insideV w:val="single" w:sz="4" w:space="0" w:color="D5DBE3"/>
         </w:tblBorders>
-        <w:tblLayout w:type="fixed"/>
         <w:tblCellMar>
           <w:top w:w="70" w:type="dxa"/>
           <w:left w:w="110" w:type="dxa"/>
@@ -2564,7 +2522,7 @@
       </w:tr>
     </w:tbl>
     <w:bookmarkEnd w:id="19"/>
-    <w:bookmarkStart w:id="20" w:name="numbers-and-statuses"/>
+    <w:bookmarkStart w:id="20" w:name="Xd972a2146bd3960c1f8c12e5f909eaec20daa08"/>
     <w:p>
       <w:pPr>
         <w:pStyle w:val="Heading3"/>
@@ -2725,7 +2683,7 @@
               <w:rPr>
                 <w:sz w:val="20"/>
               </w:rPr>
-              <w:t xml:space="preserve">when the run started</w:t>
+              <w:t xml:space="preserve">when the run started, and that have a mobile number</w:t>
             </w:r>
           </w:p>
         </w:tc>
@@ -2986,7 +2944,7 @@
               <w:rPr>
                 <w:sz w:val="20"/>
               </w:rPr>
-              <w:t xml:space="preserve">Handed over to WhatsApp. Not yet on the client’s phone</w:t>
+              <w:t xml:space="preserve">Handed over to WhatsApp. Not yet on the client's phone</w:t>
             </w:r>
           </w:p>
         </w:tc>
@@ -3031,7 +2989,7 @@
               <w:rPr>
                 <w:sz w:val="20"/>
               </w:rPr>
-              <w:t xml:space="preserve">Reached the client’s phone</w:t>
+              <w:t xml:space="preserve">Reached the client's phone</w:t>
             </w:r>
           </w:p>
         </w:tc>
@@ -3134,68 +3092,8 @@
         <w:t xml:space="preserve">The final list of statuses follows what the provider gives us.</w:t>
       </w:r>
     </w:p>
-    <w:p>
-      <w:pPr>
-        <w:pStyle w:val="BodyText"/>
-      </w:pPr>
-      <w:r>
-        <w:rPr>
-          <w:b/>
-          <w:bCs/>
-        </w:rPr>
-        <w:t xml:space="preserve">No mobile number.</w:t>
-      </w:r>
-      <w:r>
-        <w:t xml:space="preserve"> </w:t>
-      </w:r>
-      <w:r>
-        <w:t xml:space="preserve">A registration that is targeted but whose contact has no mobile number is still counted in</w:t>
-      </w:r>
-      <w:r>
-        <w:t xml:space="preserve"> </w:t>
-      </w:r>
-      <w:r>
-        <w:rPr>
-          <w:b/>
-          <w:bCs/>
-        </w:rPr>
-        <w:t xml:space="preserve">Targeted</w:t>
-      </w:r>
-      <w:r>
-        <w:t xml:space="preserve">. Its message is not sent and is shown as</w:t>
-      </w:r>
-      <w:r>
-        <w:t xml:space="preserve"> </w:t>
-      </w:r>
-      <w:r>
-        <w:rPr>
-          <w:b/>
-          <w:bCs/>
-        </w:rPr>
-        <w:t xml:space="preserve">Failed</w:t>
-      </w:r>
-      <w:r>
-        <w:t xml:space="preserve"> </w:t>
-      </w:r>
-      <w:r>
-        <w:t xml:space="preserve">with the reason</w:t>
-      </w:r>
-      <w:r>
-        <w:t xml:space="preserve"> </w:t>
-      </w:r>
-      <w:r>
-        <w:rPr>
-          <w:b/>
-          <w:bCs/>
-        </w:rPr>
-        <w:t xml:space="preserve">No mobile number</w:t>
-      </w:r>
-      <w:r>
-        <w:t xml:space="preserve">, so the user can see who was missed and why.</w:t>
-      </w:r>
-    </w:p>
     <w:bookmarkEnd w:id="20"/>
-    <w:bookmarkStart w:id="21" w:name="where-messages-are-sent-from"/>
+    <w:bookmarkStart w:id="21" w:name="X93bf6e8da3acf63325c389097799a1007e07b7f"/>
     <w:p>
       <w:pPr>
         <w:pStyle w:val="Heading3"/>
@@ -3363,7 +3261,7 @@
               <w:rPr>
                 <w:sz w:val="20"/>
               </w:rPr>
-              <w:t xml:space="preserve">The firm’s own WhatsApp number, its own email domain, or its own mail server (SMTP). The firm sets it up once on the Configuration page</w:t>
+              <w:t xml:space="preserve">The firm's own WhatsApp number, its own email domain, or its own mail server (SMTP). The firm sets it up once on the Configuration page</w:t>
             </w:r>
           </w:p>
         </w:tc>
@@ -3521,7 +3419,7 @@
     </w:p>
     <w:bookmarkEnd w:id="21"/>
     <w:bookmarkEnd w:id="22"/>
-    <w:bookmarkStart w:id="23" w:name="how-the-user-opens-the-page"/>
+    <w:bookmarkStart w:id="23" w:name="X1d14353f54ef4e38aae925f34427e5f604e823c"/>
     <w:p>
       <w:pPr>
         <w:pStyle w:val="Heading2"/>
@@ -3643,7 +3541,6 @@
           <w:insideH w:val="single" w:sz="4" w:space="0" w:color="D5DBE3"/>
           <w:insideV w:val="single" w:sz="4" w:space="0" w:color="D5DBE3"/>
         </w:tblBorders>
-        <w:tblLayout w:type="fixed"/>
         <w:tblCellMar>
           <w:top w:w="70" w:type="dxa"/>
           <w:left w:w="110" w:type="dxa"/>
@@ -3919,7 +3816,7 @@
               <w:rPr>
                 <w:sz w:val="20"/>
               </w:rPr>
-              <w:t xml:space="preserve">Email Logs. It is a separate page with its own BRD, and opens inside the same app. Emails sent through the firm’s own SMTP server show the status</w:t>
+              <w:t xml:space="preserve">Email Logs. It is a separate page with its own BRD, and opens inside the same app. Emails sent through the firm's own SMTP server show the status</w:t>
             </w:r>
             <w:r>
               <w:rPr>
@@ -4002,7 +3899,7 @@
       </w:r>
     </w:p>
     <w:bookmarkEnd w:id="23"/>
-    <w:bookmarkStart w:id="41" w:name="the-client-communications-page"/>
+    <w:bookmarkStart w:id="41" w:name="X9fd9dae6aa9a8ceadb43be139b8559f1e5228b1"/>
     <w:p>
       <w:pPr>
         <w:pStyle w:val="Heading2"/>
@@ -4016,7 +3913,7 @@
     </w:p>
     <w:p>
       <w:pPr>
-        <w:pStyle w:val="CaptionedFigure"/>
+        <w:pStyle w:val="FirstParagraph"/>
         <w:keepNext/>
         <w:spacing w:before="120" w:after="40"/>
         <w:jc w:val="center"/>
@@ -4071,7 +3968,7 @@
     </w:p>
     <w:p>
       <w:pPr>
-        <w:pStyle w:val="CaptionedFigure"/>
+        <w:pStyle w:val="FirstParagraph"/>
         <w:keepNext w:val="0"/>
         <w:spacing w:before="40" w:after="240"/>
         <w:jc w:val="center"/>
@@ -4086,15 +3983,7 @@
         <w:t>Figure: Client Communications</w:t>
       </w:r>
     </w:p>
-    <w:p>
-      <w:pPr>
-        <w:pStyle w:val="ImageCaption"/>
-      </w:pPr>
-      <w:r>
-        <w:t xml:space="preserve">Client Communications</w:t>
-      </w:r>
-    </w:p>
-    <w:bookmarkStart w:id="30" w:name="toolbar"/>
+    <w:bookmarkStart w:id="30" w:name="X0bdf74869b4e5fb41ef15fa2cb547e9ef354085"/>
     <w:p>
       <w:pPr>
         <w:pStyle w:val="Heading3"/>
@@ -4130,7 +4019,7 @@
         <w:t xml:space="preserve"> </w:t>
       </w:r>
       <w:r>
-        <w:t xml:space="preserve">by client name, PAN, GSTIN, TAN, or the contact’s name, email or mobile number.</w:t>
+        <w:t xml:space="preserve">by client name, PAN, GSTIN, TAN, or the contact's name, email or mobile number.</w:t>
       </w:r>
     </w:p>
     <w:p>
@@ -4455,40 +4344,7 @@
         <w:spacing w:before="160"/>
       </w:pPr>
       <w:r>
-        <w:t xml:space="preserve">A filter shows only its name when nothing is picked (</w:t>
-      </w:r>
-      <w:r>
-        <w:t xml:space="preserve">“Module”</w:t>
-      </w:r>
-      <w:r>
-        <w:t xml:space="preserve">), and the choice when something is (</w:t>
-      </w:r>
-      <w:r>
-        <w:t xml:space="preserve">“Module: TDS”</w:t>
-      </w:r>
-      <w:r>
-        <w:t xml:space="preserve">, or</w:t>
-      </w:r>
-      <w:r>
-        <w:t xml:space="preserve"> </w:t>
-      </w:r>
-      <w:r>
-        <w:t xml:space="preserve">“Module: 2 selected”</w:t>
-      </w:r>
-      <w:r>
-        <w:t xml:space="preserve">). A long choice is cut with</w:t>
-      </w:r>
-      <w:r>
-        <w:t xml:space="preserve"> </w:t>
-      </w:r>
-      <w:r>
-        <w:t xml:space="preserve">“…”</w:t>
-      </w:r>
-      <w:r>
-        <w:t xml:space="preserve"> </w:t>
-      </w:r>
-      <w:r>
-        <w:t xml:space="preserve">and shown in full when the pointer is on it. When a filter has 8 or more choices it gets a search box. A</w:t>
+        <w:t xml:space="preserve">A filter shows only its name when nothing is picked ("Module"), and the choice when something is ("Module: TDS", or "Module: 2 selected"). A long choice is cut with "…" and shown in full when the pointer is on it. When a filter has 8 or more choices it gets a search box. A</w:t>
       </w:r>
       <w:r>
         <w:t xml:space="preserve"> </w:t>
@@ -4509,7 +4365,7 @@
     </w:p>
     <w:p>
       <w:pPr>
-        <w:pStyle w:val="CaptionedFigure"/>
+        <w:pStyle w:val="BodyText"/>
         <w:keepNext/>
         <w:spacing w:before="120" w:after="40"/>
         <w:jc w:val="center"/>
@@ -4564,7 +4420,7 @@
     </w:p>
     <w:p>
       <w:pPr>
-        <w:pStyle w:val="CaptionedFigure"/>
+        <w:pStyle w:val="BodyText"/>
         <w:keepNext w:val="0"/>
         <w:spacing w:before="40" w:after="240"/>
         <w:jc w:val="center"/>
@@ -4579,16 +4435,8 @@
         <w:t>Figure: Filters</w:t>
       </w:r>
     </w:p>
-    <w:p>
-      <w:pPr>
-        <w:pStyle w:val="ImageCaption"/>
-      </w:pPr>
-      <w:r>
-        <w:t xml:space="preserve">Filters</w:t>
-      </w:r>
-    </w:p>
     <w:bookmarkEnd w:id="30"/>
-    <w:bookmarkStart w:id="31" w:name="table"/>
+    <w:bookmarkStart w:id="31" w:name="X741b0d0ee180564f71eefae3ee4636212a154dc"/>
     <w:p>
       <w:pPr>
         <w:pStyle w:val="Heading3"/>
@@ -4799,25 +4647,7 @@
               <w:rPr>
                 <w:sz w:val="20"/>
               </w:rPr>
-              <w:t xml:space="preserve">A client row shows the name, with the PAN below it. A registration row shows its GSTIN, TAN or PAN, with its type or place (for example</w:t>
-            </w:r>
-            <w:r>
-              <w:rPr>
-                <w:sz w:val="20"/>
-              </w:rPr>
-              <w:t xml:space="preserve"> </w:t>
-            </w:r>
-            <w:r>
-              <w:rPr>
-                <w:sz w:val="20"/>
-              </w:rPr>
-              <w:t xml:space="preserve">“Gujarat · Regular”</w:t>
-            </w:r>
-            <w:r>
-              <w:rPr>
-                <w:sz w:val="20"/>
-              </w:rPr>
-              <w:t xml:space="preserve">)</w:t>
+              <w:t xml:space="preserve">A client row shows the name, with the PAN below it. A registration row shows its GSTIN, TAN or PAN, with its type or place (for example "Gujarat · Regular")</w:t>
             </w:r>
           </w:p>
         </w:tc>
@@ -4974,97 +4804,7 @@
               <w:rPr>
                 <w:sz w:val="20"/>
               </w:rPr>
-              <w:t xml:space="preserve">A client row shows the contact’s picture (initials), with the name. With more than one contact it shows two pictures and</w:t>
-            </w:r>
-            <w:r>
-              <w:rPr>
-                <w:sz w:val="20"/>
-              </w:rPr>
-              <w:t xml:space="preserve"> </w:t>
-            </w:r>
-            <w:r>
-              <w:rPr>
-                <w:sz w:val="20"/>
-              </w:rPr>
-              <w:t xml:space="preserve">“2 contacts”</w:t>
-            </w:r>
-            <w:r>
-              <w:rPr>
-                <w:sz w:val="20"/>
-              </w:rPr>
-              <w:t xml:space="preserve">, and a</w:t>
-            </w:r>
-            <w:r>
-              <w:rPr>
-                <w:sz w:val="20"/>
-              </w:rPr>
-              <w:t xml:space="preserve"> </w:t>
-            </w:r>
-            <w:r>
-              <w:rPr>
-                <w:sz w:val="20"/>
-              </w:rPr>
-              <w:t xml:space="preserve">“+”</w:t>
-            </w:r>
-            <w:r>
-              <w:rPr>
-                <w:sz w:val="20"/>
-              </w:rPr>
-              <w:t xml:space="preserve"> </w:t>
-            </w:r>
-            <w:r>
-              <w:rPr>
-                <w:sz w:val="20"/>
-              </w:rPr>
-              <w:t xml:space="preserve">count when there are more. A registration row shows its contact, and</w:t>
-            </w:r>
-            <w:r>
-              <w:rPr>
-                <w:sz w:val="20"/>
-              </w:rPr>
-              <w:t xml:space="preserve"> </w:t>
-            </w:r>
-            <w:r>
-              <w:rPr>
-                <w:sz w:val="20"/>
-              </w:rPr>
-              <w:t xml:space="preserve">“no email”</w:t>
-            </w:r>
-            <w:r>
-              <w:rPr>
-                <w:sz w:val="20"/>
-              </w:rPr>
-              <w:t xml:space="preserve"> </w:t>
-            </w:r>
-            <w:r>
-              <w:rPr>
-                <w:sz w:val="20"/>
-              </w:rPr>
-              <w:t xml:space="preserve">or</w:t>
-            </w:r>
-            <w:r>
-              <w:rPr>
-                <w:sz w:val="20"/>
-              </w:rPr>
-              <w:t xml:space="preserve"> </w:t>
-            </w:r>
-            <w:r>
-              <w:rPr>
-                <w:sz w:val="20"/>
-              </w:rPr>
-              <w:t xml:space="preserve">“no mobile”</w:t>
-            </w:r>
-            <w:r>
-              <w:rPr>
-                <w:sz w:val="20"/>
-              </w:rPr>
-              <w:t xml:space="preserve"> </w:t>
-            </w:r>
-            <w:r>
-              <w:rPr>
-                <w:sz w:val="20"/>
-              </w:rPr>
-              <w:t xml:space="preserve">in orange when one is missing</w:t>
+              <w:t xml:space="preserve">A client row shows the contact's picture (initials), with the name. With more than one contact it shows two pictures and "2 contacts", and a "+" count when there are more. A registration row shows its contact, and "no email" or "no mobile" in orange when one is missing</w:t>
             </w:r>
           </w:p>
         </w:tc>
@@ -5107,7 +4847,7 @@
               <w:rPr>
                 <w:sz w:val="20"/>
               </w:rPr>
-              <w:t xml:space="preserve">“</w:t>
+              <w:t xml:space="preserve">"</w:t>
             </w:r>
             <w:r>
               <w:rPr>
@@ -5153,13 +4893,7 @@
               <w:rPr>
                 <w:sz w:val="20"/>
               </w:rPr>
-              <w:t xml:space="preserve">on”</w:t>
-            </w:r>
-            <w:r>
-              <w:rPr>
-                <w:sz w:val="20"/>
-              </w:rPr>
-              <w:t xml:space="preserve">: how many of the registration’s email messages are on. A client row adds up its registrations</w:t>
+              <w:t xml:space="preserve">on": how many of the registration's email messages are on. A client row adds up its registrations</w:t>
             </w:r>
           </w:p>
         </w:tc>
@@ -5315,7 +5049,7 @@
       </w:r>
     </w:p>
     <w:bookmarkEnd w:id="31"/>
-    <w:bookmarkStart w:id="35" w:name="bulk-change"/>
+    <w:bookmarkStart w:id="35" w:name="Xaba8d3b8a1daa8951cd1ad85215668891d3d888"/>
     <w:p>
       <w:pPr>
         <w:pStyle w:val="Heading3"/>
@@ -5372,7 +5106,7 @@
     </w:p>
     <w:p>
       <w:pPr>
-        <w:pStyle w:val="CaptionedFigure"/>
+        <w:pStyle w:val="BodyText"/>
         <w:keepNext/>
         <w:spacing w:before="120" w:after="40"/>
         <w:jc w:val="center"/>
@@ -5427,7 +5161,7 @@
     </w:p>
     <w:p>
       <w:pPr>
-        <w:pStyle w:val="CaptionedFigure"/>
+        <w:pStyle w:val="BodyText"/>
         <w:keepNext w:val="0"/>
         <w:spacing w:before="40" w:after="240"/>
         <w:jc w:val="center"/>
@@ -5440,14 +5174,6 @@
           <w:sz w:val="19"/>
         </w:rPr>
         <w:t>Figure: Bulk change</w:t>
-      </w:r>
-    </w:p>
-    <w:p>
-      <w:pPr>
-        <w:pStyle w:val="ImageCaption"/>
-      </w:pPr>
-      <w:r>
-        <w:t xml:space="preserve">Bulk change</w:t>
       </w:r>
     </w:p>
     <w:p>
@@ -5523,16 +5249,7 @@
         <w:t xml:space="preserve"> </w:t>
       </w:r>
       <w:r>
-        <w:t xml:space="preserve">link. The button shows</w:t>
-      </w:r>
-      <w:r>
-        <w:t xml:space="preserve"> </w:t>
-      </w:r>
-      <w:r>
-        <w:t xml:space="preserve">“3 events selected”</w:t>
-      </w:r>
-      <w:r>
-        <w:t xml:space="preserve">.</w:t>
+        <w:t xml:space="preserve">link. The button shows "3 events selected".</w:t>
       </w:r>
     </w:p>
     <w:p>
@@ -5560,16 +5277,7 @@
         <w:t xml:space="preserve"> </w:t>
       </w:r>
       <w:r>
-        <w:t xml:space="preserve">are offered. When several modules are ticked, the group names carry the module name (for example</w:t>
-      </w:r>
-      <w:r>
-        <w:t xml:space="preserve"> </w:t>
-      </w:r>
-      <w:r>
-        <w:t xml:space="preserve">“GST · Returns filed”</w:t>
-      </w:r>
-      <w:r>
-        <w:t xml:space="preserve">).</w:t>
+        <w:t xml:space="preserve">are offered. When several modules are ticked, the group names carry the module name (for example "GST · Returns filed").</w:t>
       </w:r>
     </w:p>
     <w:p>
@@ -5618,13 +5326,7 @@
         </w:numPr>
       </w:pPr>
       <w:r>
-        <w:t xml:space="preserve">A message confirms the result, for example</w:t>
-      </w:r>
-      <w:r>
-        <w:t xml:space="preserve"> </w:t>
-      </w:r>
-      <w:r>
-        <w:t xml:space="preserve">“3 events turned on for up to 2 registrations. 1 skipped, no contact for that channel.”</w:t>
+        <w:t xml:space="preserve">A message confirms the result, for example "3 events turned on for up to 2 registrations. 1 skipped, no contact for that channel."</w:t>
       </w:r>
     </w:p>
     <w:p>
@@ -5650,7 +5352,7 @@
       </w:r>
     </w:p>
     <w:bookmarkEnd w:id="35"/>
-    <w:bookmarkStart w:id="39" w:name="defaults-for-new-clients"/>
+    <w:bookmarkStart w:id="39" w:name="X80e054374739b062e5806bd23ed2753ab8c61b7"/>
     <w:p>
       <w:pPr>
         <w:pStyle w:val="Heading3"/>
@@ -5661,7 +5363,7 @@
     </w:p>
     <w:p>
       <w:pPr>
-        <w:pStyle w:val="CaptionedFigure"/>
+        <w:pStyle w:val="FirstParagraph"/>
         <w:keepNext/>
         <w:spacing w:before="120" w:after="40"/>
         <w:jc w:val="center"/>
@@ -5716,7 +5418,7 @@
     </w:p>
     <w:p>
       <w:pPr>
-        <w:pStyle w:val="CaptionedFigure"/>
+        <w:pStyle w:val="FirstParagraph"/>
         <w:keepNext w:val="0"/>
         <w:spacing w:before="40" w:after="240"/>
         <w:jc w:val="center"/>
@@ -5729,14 +5431,6 @@
           <w:sz w:val="19"/>
         </w:rPr>
         <w:t>Figure: Defaults for new clients</w:t>
-      </w:r>
-    </w:p>
-    <w:p>
-      <w:pPr>
-        <w:pStyle w:val="ImageCaption"/>
-      </w:pPr>
-      <w:r>
-        <w:t xml:space="preserve">Defaults for new clients</w:t>
       </w:r>
     </w:p>
     <w:p>
@@ -5824,13 +5518,7 @@
         <w:t xml:space="preserve"> </w:t>
       </w:r>
       <w:r>
-        <w:t xml:space="preserve">(or TANs, PANs). A confirmation asks first:</w:t>
-      </w:r>
-      <w:r>
-        <w:t xml:space="preserve"> </w:t>
-      </w:r>
-      <w:r>
-        <w:t xml:space="preserve">“This changes all N existing GSTINs. Their current GST settings are replaced by the defaults above.”</w:t>
+        <w:t xml:space="preserve">(or TANs, PANs). A confirmation asks first: "This changes all N existing GSTINs. Their current GST settings are replaced by the defaults above."</w:t>
       </w:r>
     </w:p>
     <w:p>
@@ -5846,7 +5534,7 @@
       </w:r>
     </w:p>
     <w:bookmarkEnd w:id="39"/>
-    <w:bookmarkStart w:id="40" w:name="saving"/>
+    <w:bookmarkStart w:id="40" w:name="Xfc4e94f559e5b2235902737215338b3e2f453df"/>
     <w:p>
       <w:pPr>
         <w:pStyle w:val="Heading3"/>
@@ -5860,19 +5548,7 @@
         <w:pStyle w:val="FirstParagraph"/>
       </w:pPr>
       <w:r>
-        <w:t xml:space="preserve">Every change on the page is saved on its own, a moment after it is made, with a short</w:t>
-      </w:r>
-      <w:r>
-        <w:t xml:space="preserve"> </w:t>
-      </w:r>
-      <w:r>
-        <w:t xml:space="preserve">“Saved”</w:t>
-      </w:r>
-      <w:r>
-        <w:t xml:space="preserve"> </w:t>
-      </w:r>
-      <w:r>
-        <w:t xml:space="preserve">message. There is no Save button.</w:t>
+        <w:t xml:space="preserve">Every change on the page is saved on its own, a moment after it is made, with a short "Saved" message. There is no Save button.</w:t>
       </w:r>
     </w:p>
     <w:p>
@@ -5884,7 +5560,7 @@
     </w:p>
     <w:bookmarkEnd w:id="40"/>
     <w:bookmarkEnd w:id="41"/>
-    <w:bookmarkStart w:id="55" w:name="a-registration-side-panel"/>
+    <w:bookmarkStart w:id="55" w:name="X376e37be42c14b064f3458fb3fbde9b41a41c1b"/>
     <w:p>
       <w:pPr>
         <w:pStyle w:val="Heading2"/>
@@ -5906,7 +5582,7 @@
     </w:p>
     <w:p>
       <w:pPr>
-        <w:pStyle w:val="CaptionedFigure"/>
+        <w:pStyle w:val="BodyText"/>
         <w:keepNext/>
         <w:spacing w:before="120" w:after="40"/>
         <w:jc w:val="center"/>
@@ -5961,7 +5637,7 @@
     </w:p>
     <w:p>
       <w:pPr>
-        <w:pStyle w:val="CaptionedFigure"/>
+        <w:pStyle w:val="BodyText"/>
         <w:keepNext w:val="0"/>
         <w:spacing w:before="40" w:after="240"/>
         <w:jc w:val="center"/>
@@ -5978,21 +5654,13 @@
     </w:p>
     <w:p>
       <w:pPr>
-        <w:pStyle w:val="ImageCaption"/>
-      </w:pPr>
-      <w:r>
-        <w:t xml:space="preserve">Registration panel</w:t>
-      </w:r>
-    </w:p>
-    <w:p>
-      <w:pPr>
         <w:pStyle w:val="BodyText"/>
       </w:pPr>
       <w:r>
         <w:t xml:space="preserve">The header shows the client name, the GSTIN, TAN or PAN, its module tag and its type.</w:t>
       </w:r>
     </w:p>
-    <w:bookmarkStart w:id="48" w:name="contact"/>
+    <w:bookmarkStart w:id="48" w:name="X73148dec013d986a6e46dd2433a59c6b4077b55"/>
     <w:p>
       <w:pPr>
         <w:pStyle w:val="Heading3"/>
@@ -6003,7 +5671,7 @@
     </w:p>
     <w:p>
       <w:pPr>
-        <w:pStyle w:val="CaptionedFigure"/>
+        <w:pStyle w:val="FirstParagraph"/>
         <w:keepNext/>
         <w:spacing w:before="120" w:after="40"/>
         <w:jc w:val="center"/>
@@ -6058,7 +5726,7 @@
     </w:p>
     <w:p>
       <w:pPr>
-        <w:pStyle w:val="CaptionedFigure"/>
+        <w:pStyle w:val="FirstParagraph"/>
         <w:keepNext w:val="0"/>
         <w:spacing w:before="40" w:after="240"/>
         <w:jc w:val="center"/>
@@ -6075,18 +5743,10 @@
     </w:p>
     <w:p>
       <w:pPr>
-        <w:pStyle w:val="ImageCaption"/>
-      </w:pPr>
-      <w:r>
-        <w:t xml:space="preserve">Choosing a contact</w:t>
-      </w:r>
-    </w:p>
-    <w:p>
-      <w:pPr>
         <w:pStyle w:val="BodyText"/>
       </w:pPr>
       <w:r>
-        <w:t xml:space="preserve">A card shows the contact that receives this registration’s messages: name, email and mobile number. A contact who is the client’s main contact carries a</w:t>
+        <w:t xml:space="preserve">A card shows the contact that receives this registration's messages: name, email and mobile number. A contact who is the client's main contact carries a</w:t>
       </w:r>
       <w:r>
         <w:t xml:space="preserve"> </w:t>
@@ -6102,13 +5762,7 @@
         <w:t xml:space="preserve"> </w:t>
       </w:r>
       <w:r>
-        <w:t xml:space="preserve">label. If something is missing, it shows in orange (</w:t>
-      </w:r>
-      <w:r>
-        <w:t xml:space="preserve">“No email”</w:t>
-      </w:r>
-      <w:r>
-        <w:t xml:space="preserve">).</w:t>
+        <w:t xml:space="preserve">label. If something is missing, it shows in orange ("No email").</w:t>
       </w:r>
     </w:p>
     <w:tbl>
@@ -6270,7 +5924,7 @@
               <w:rPr>
                 <w:sz w:val="20"/>
               </w:rPr>
-              <w:t xml:space="preserve">Opens a form with the contact’s name, email and mobile number, already filled in</w:t>
+              <w:t xml:space="preserve">Opens a form with the contact's name, email and mobile number, already filled in</w:t>
             </w:r>
           </w:p>
         </w:tc>
@@ -6434,7 +6088,7 @@
           <w:b/>
           <w:bCs/>
         </w:rPr>
-        <w:t xml:space="preserve">taken from the client’s contacts in the application</w:t>
+        <w:t xml:space="preserve">taken from the client's contacts in the application</w:t>
       </w:r>
       <w:r>
         <w:t xml:space="preserve">. A contact edited or added on this page is</w:t>
@@ -6466,7 +6120,7 @@
       </w:r>
     </w:p>
     <w:bookmarkEnd w:id="48"/>
-    <w:bookmarkStart w:id="52" w:name="reports-and-events-1"/>
+    <w:bookmarkStart w:id="52" w:name="Xd27bbfa21e976bb2633e35d92672ff70520d159"/>
     <w:p>
       <w:pPr>
         <w:pStyle w:val="Heading3"/>
@@ -6613,7 +6267,7 @@
     </w:p>
     <w:p>
       <w:pPr>
-        <w:pStyle w:val="CaptionedFigure"/>
+        <w:pStyle w:val="FirstParagraph"/>
         <w:keepNext/>
         <w:spacing w:before="120" w:after="40"/>
         <w:jc w:val="center"/>
@@ -6668,7 +6322,7 @@
     </w:p>
     <w:p>
       <w:pPr>
-        <w:pStyle w:val="CaptionedFigure"/>
+        <w:pStyle w:val="FirstParagraph"/>
         <w:keepNext w:val="0"/>
         <w:spacing w:before="40" w:after="240"/>
         <w:jc w:val="center"/>
@@ -6683,16 +6337,8 @@
         <w:t>Figure: A module with no reports or events</w:t>
       </w:r>
     </w:p>
-    <w:p>
-      <w:pPr>
-        <w:pStyle w:val="ImageCaption"/>
-      </w:pPr>
-      <w:r>
-        <w:t xml:space="preserve">A module with no reports or events</w:t>
-      </w:r>
-    </w:p>
     <w:bookmarkEnd w:id="52"/>
-    <w:bookmarkStart w:id="53" w:name="send-button"/>
+    <w:bookmarkStart w:id="53" w:name="X83ab0884ea2ee43152b8b5989ddf5b644b70603"/>
     <w:p>
       <w:pPr>
         <w:pStyle w:val="Heading3"/>
@@ -6745,7 +6391,7 @@
           <w:b/>
           <w:bCs/>
         </w:rPr>
-        <w:t xml:space="preserve">sends that report to this registration’s contact by that channel straight away</w:t>
+        <w:t xml:space="preserve">sends that report to this registration's contact by that channel straight away</w:t>
       </w:r>
       <w:r>
         <w:t xml:space="preserve">, even when the switch is off. A channel the report does not support has no icon. An icon is greyed out when the contact has no email or mobile number. A message says what was sent and to whom.</w:t>
@@ -6792,13 +6438,13 @@
       </w:r>
     </w:p>
     <w:bookmarkEnd w:id="53"/>
-    <w:bookmarkStart w:id="54" w:name="copy-to-the-clients-other-registrations"/>
+    <w:bookmarkStart w:id="54" w:name="X2163e7bea5c92e50173758ba412c366752e0406"/>
     <w:p>
       <w:pPr>
         <w:pStyle w:val="Heading3"/>
       </w:pPr>
       <w:r>
-        <w:t xml:space="preserve">5.4 Copy to the client’s other registrations</w:t>
+        <w:t xml:space="preserve">5.4 Copy to the client's other registrations</w:t>
       </w:r>
     </w:p>
     <w:p>
@@ -6816,7 +6462,7 @@
           <w:b/>
           <w:bCs/>
         </w:rPr>
-        <w:t xml:space="preserve">Copy to client’s other GSTINs</w:t>
+        <w:t xml:space="preserve">Copy to client's other GSTINs</w:t>
       </w:r>
       <w:r>
         <w:t xml:space="preserve"> </w:t>
@@ -6843,19 +6489,7 @@
         <w:pStyle w:val="BodyText"/>
       </w:pPr>
       <w:r>
-        <w:t xml:space="preserve">A confirmation asks first:</w:t>
-      </w:r>
-      <w:r>
-        <w:t xml:space="preserve"> </w:t>
-      </w:r>
-      <w:r>
-        <w:t xml:space="preserve">“This changes the other 3 GSTINs of {client}. Their GST switches are replaced by the ones on this page. Contacts stay as they are.”</w:t>
-      </w:r>
-      <w:r>
-        <w:t xml:space="preserve"> </w:t>
-      </w:r>
-      <w:r>
-        <w:t xml:space="preserve">The button is not shown when the client has no other registration of that module.</w:t>
+        <w:t xml:space="preserve">A confirmation asks first: "This changes the other 3 GSTINs of {client}. Their GST switches are replaced by the ones on this page. Contacts stay as they are." The button is not shown when the client has no other registration of that module.</w:t>
       </w:r>
     </w:p>
     <w:p>
@@ -6867,7 +6501,7 @@
     </w:p>
     <w:bookmarkEnd w:id="54"/>
     <w:bookmarkEnd w:id="55"/>
-    <w:bookmarkStart w:id="70" w:name="whatsapp-logs"/>
+    <w:bookmarkStart w:id="70" w:name="X66913532a93dec34aabbba4ad0d237a55d74772"/>
     <w:p>
       <w:pPr>
         <w:pStyle w:val="Heading2"/>
@@ -6879,7 +6513,7 @@
         <w:t xml:space="preserve">6. WhatsApp Logs</w:t>
       </w:r>
     </w:p>
-    <w:bookmarkStart w:id="56" w:name="what-it-shows"/>
+    <w:bookmarkStart w:id="56" w:name="X01085a192735aac802d0e83e6ec2dfd5a573dc5"/>
     <w:p>
       <w:pPr>
         <w:pStyle w:val="Heading3"/>
@@ -6995,7 +6629,7 @@
       </w:r>
     </w:p>
     <w:bookmarkEnd w:id="56"/>
-    <w:bookmarkStart w:id="57" w:name="toolbar-1"/>
+    <w:bookmarkStart w:id="57" w:name="X99f7a6a25f3f73597f61721bdade3f1f02c2405"/>
     <w:p>
       <w:pPr>
         <w:pStyle w:val="Heading3"/>
@@ -7086,7 +6720,7 @@
         </w:numPr>
       </w:pPr>
       <w:r>
-        <w:t xml:space="preserve">Choosing a Module narrows the Trigger event choices to that module’s events.</w:t>
+        <w:t xml:space="preserve">Choosing a Module narrows the Trigger event choices to that module's events.</w:t>
       </w:r>
     </w:p>
     <w:p>
@@ -7108,31 +6742,7 @@
         <w:t xml:space="preserve"> </w:t>
       </w:r>
       <w:r>
-        <w:t xml:space="preserve">lists every number that messages have gone out from, each with its display name and, in small light text below it, the number. For example</w:t>
-      </w:r>
-      <w:r>
-        <w:t xml:space="preserve"> </w:t>
-      </w:r>
-      <w:r>
-        <w:t xml:space="preserve">“CA Connect”</w:t>
-      </w:r>
-      <w:r>
-        <w:t xml:space="preserve"> </w:t>
-      </w:r>
-      <w:r>
-        <w:t xml:space="preserve">with</w:t>
-      </w:r>
-      <w:r>
-        <w:t xml:space="preserve"> </w:t>
-      </w:r>
-      <w:r>
-        <w:t xml:space="preserve">“+91 98765 00000”</w:t>
-      </w:r>
-      <w:r>
-        <w:t xml:space="preserve"> </w:t>
-      </w:r>
-      <w:r>
-        <w:t xml:space="preserve">below, or the firm’s own name and number. Choosing one or more shows only the messages (or runs) sent from them.</w:t>
+        <w:t xml:space="preserve">lists every number that messages have gone out from, each with its display name and, in small light text below it, the number. For example "CA Connect" with "+91 98765 00000" below, or the firm's own name and number. Choosing one or more shows only the messages (or runs) sent from them.</w:t>
       </w:r>
     </w:p>
     <w:p>
@@ -7193,7 +6803,7 @@
       </w:r>
     </w:p>
     <w:bookmarkEnd w:id="57"/>
-    <w:bookmarkStart w:id="61" w:name="bulk-messages-tab"/>
+    <w:bookmarkStart w:id="61" w:name="X6a62d82198c7e87898e0d0bed25280430290f66"/>
     <w:p>
       <w:pPr>
         <w:pStyle w:val="Heading3"/>
@@ -7204,7 +6814,7 @@
     </w:p>
     <w:p>
       <w:pPr>
-        <w:pStyle w:val="CaptionedFigure"/>
+        <w:pStyle w:val="FirstParagraph"/>
         <w:keepNext/>
         <w:spacing w:before="120" w:after="40"/>
         <w:jc w:val="center"/>
@@ -7259,7 +6869,7 @@
     </w:p>
     <w:p>
       <w:pPr>
-        <w:pStyle w:val="CaptionedFigure"/>
+        <w:pStyle w:val="FirstParagraph"/>
         <w:keepNext w:val="0"/>
         <w:spacing w:before="40" w:after="240"/>
         <w:jc w:val="center"/>
@@ -7272,14 +6882,6 @@
           <w:sz w:val="19"/>
         </w:rPr>
         <w:t>Figure: Bulk messages tab</w:t>
-      </w:r>
-    </w:p>
-    <w:p>
-      <w:pPr>
-        <w:pStyle w:val="ImageCaption"/>
-      </w:pPr>
-      <w:r>
-        <w:t xml:space="preserve">Bulk messages tab</w:t>
       </w:r>
     </w:p>
     <w:p>
@@ -7842,7 +7444,7 @@
         <w:t xml:space="preserve">how many registrations it will target right now</w:t>
       </w:r>
       <w:r>
-        <w:t xml:space="preserve">: those whose WhatsApp switch for this report is on. The other columns show a dash, because nothing has been sent yet.</w:t>
+        <w:t xml:space="preserve">: those whose WhatsApp switch for this report is on and whose contact has a mobile number. The other columns show a dash, because nothing has been sent yet.</w:t>
       </w:r>
     </w:p>
     <w:p>
@@ -7936,7 +7538,7 @@
       </w:r>
     </w:p>
     <w:bookmarkEnd w:id="61"/>
-    <w:bookmarkStart w:id="65" w:name="when-the-user-clicks-a-run-the-run-page"/>
+    <w:bookmarkStart w:id="65" w:name="X8edc63da622e57b5a4db9812c9f97ddae01fd12"/>
     <w:p>
       <w:pPr>
         <w:pStyle w:val="Heading3"/>
@@ -7947,7 +7549,7 @@
     </w:p>
     <w:p>
       <w:pPr>
-        <w:pStyle w:val="CaptionedFigure"/>
+        <w:pStyle w:val="FirstParagraph"/>
         <w:keepNext/>
         <w:spacing w:before="120" w:after="40"/>
         <w:jc w:val="center"/>
@@ -8002,7 +7604,7 @@
     </w:p>
     <w:p>
       <w:pPr>
-        <w:pStyle w:val="CaptionedFigure"/>
+        <w:pStyle w:val="FirstParagraph"/>
         <w:keepNext w:val="0"/>
         <w:spacing w:before="40" w:after="240"/>
         <w:jc w:val="center"/>
@@ -8015,14 +7617,6 @@
           <w:sz w:val="19"/>
         </w:rPr>
         <w:t>Figure: Run page</w:t>
-      </w:r>
-    </w:p>
-    <w:p>
-      <w:pPr>
-        <w:pStyle w:val="ImageCaption"/>
-      </w:pPr>
-      <w:r>
-        <w:t xml:space="preserve">Run page</w:t>
       </w:r>
     </w:p>
     <w:p>
@@ -8520,7 +8114,7 @@
       </w:tr>
     </w:tbl>
     <w:bookmarkEnd w:id="65"/>
-    <w:bookmarkStart w:id="69" w:name="single-messages-tab"/>
+    <w:bookmarkStart w:id="69" w:name="X3d239284318bf903e1a61fe3727324c5fccb0cd"/>
     <w:p>
       <w:pPr>
         <w:pStyle w:val="Heading3"/>
@@ -8531,7 +8125,7 @@
     </w:p>
     <w:p>
       <w:pPr>
-        <w:pStyle w:val="CaptionedFigure"/>
+        <w:pStyle w:val="FirstParagraph"/>
         <w:keepNext/>
         <w:spacing w:before="120" w:after="40"/>
         <w:jc w:val="center"/>
@@ -8586,7 +8180,7 @@
     </w:p>
     <w:p>
       <w:pPr>
-        <w:pStyle w:val="CaptionedFigure"/>
+        <w:pStyle w:val="FirstParagraph"/>
         <w:keepNext w:val="0"/>
         <w:spacing w:before="40" w:after="240"/>
         <w:jc w:val="center"/>
@@ -8599,14 +8193,6 @@
           <w:sz w:val="19"/>
         </w:rPr>
         <w:t>Figure: Single messages tab</w:t>
-      </w:r>
-    </w:p>
-    <w:p>
-      <w:pPr>
-        <w:pStyle w:val="ImageCaption"/>
-      </w:pPr>
-      <w:r>
-        <w:t xml:space="preserve">Single messages tab</w:t>
       </w:r>
     </w:p>
     <w:p>
@@ -8914,7 +8500,7 @@
               <w:rPr>
                 <w:sz w:val="20"/>
               </w:rPr>
-              <w:t xml:space="preserve">From the domain list. The report’s name when sent with the Send button</w:t>
+              <w:t xml:space="preserve">From the domain list. The report's name when sent with the Send button</w:t>
             </w:r>
           </w:p>
         </w:tc>
@@ -9176,7 +8762,7 @@
     </w:p>
     <w:bookmarkEnd w:id="69"/>
     <w:bookmarkEnd w:id="70"/>
-    <w:bookmarkStart w:id="94" w:name="Xbf296b5d01d8d568cab4060f92b9ecc4a3fc7a6"/>
+    <w:bookmarkStart w:id="95" w:name="Xbfcdbca723139e0f8827222652cde3bd6838f23"/>
     <w:p>
       <w:pPr>
         <w:pStyle w:val="Heading2"/>
@@ -9254,7 +8840,7 @@
         <w:t xml:space="preserve">: the system default works from the first day.</w:t>
       </w:r>
     </w:p>
-    <w:bookmarkStart w:id="74" w:name="layout"/>
+    <w:bookmarkStart w:id="74" w:name="X4c3cc2dbad651b4676c333db5b72bcb392b0faf"/>
     <w:p>
       <w:pPr>
         <w:pStyle w:val="Heading3"/>
@@ -9265,7 +8851,7 @@
     </w:p>
     <w:p>
       <w:pPr>
-        <w:pStyle w:val="CaptionedFigure"/>
+        <w:pStyle w:val="FirstParagraph"/>
         <w:keepNext/>
         <w:spacing w:before="120" w:after="40"/>
         <w:jc w:val="center"/>
@@ -9320,7 +8906,7 @@
     </w:p>
     <w:p>
       <w:pPr>
-        <w:pStyle w:val="CaptionedFigure"/>
+        <w:pStyle w:val="FirstParagraph"/>
         <w:keepNext w:val="0"/>
         <w:spacing w:before="40" w:after="240"/>
         <w:jc w:val="center"/>
@@ -9333,14 +8919,6 @@
           <w:sz w:val="19"/>
         </w:rPr>
         <w:t>Figure: Configuration, WhatsApp</w:t>
-      </w:r>
-    </w:p>
-    <w:p>
-      <w:pPr>
-        <w:pStyle w:val="ImageCaption"/>
-      </w:pPr>
-      <w:r>
-        <w:t xml:space="preserve">Configuration, WhatsApp</w:t>
       </w:r>
     </w:p>
     <w:p>
@@ -9426,7 +9004,7 @@
         <w:t xml:space="preserve">Active</w:t>
       </w:r>
       <w:r>
-        <w:t xml:space="preserve">. With the firm’s own setup it shows that number or address.</w:t>
+        <w:t xml:space="preserve">. With the firm's own setup it shows that number or address.</w:t>
       </w:r>
     </w:p>
     <w:p>
@@ -9442,7 +9020,7 @@
           <w:b/>
           <w:bCs/>
         </w:rPr>
-        <w:t xml:space="preserve">How should we send …?</w:t>
+        <w:t xml:space="preserve">How should we send ...?</w:t>
       </w:r>
       <w:r>
         <w:t xml:space="preserve"> </w:t>
@@ -9543,7 +9121,7 @@
       </w:r>
     </w:p>
     <w:bookmarkEnd w:id="74"/>
-    <w:bookmarkStart w:id="78" w:name="Xe5ab3a5a5e0c3c7a39f4a692acf7ca7e822e4b7"/>
+    <w:bookmarkStart w:id="78" w:name="X48dd68a1bab067784b68dc3cb5dc3151b4e364c"/>
     <w:p>
       <w:pPr>
         <w:pStyle w:val="Heading3"/>
@@ -9683,16 +9261,7 @@
         <w:t xml:space="preserve">Switching asks first</w:t>
       </w:r>
       <w:r>
-        <w:t xml:space="preserve">, for WhatsApp and for email, because it changes what the clients see. The bar turns into a question, for example</w:t>
-      </w:r>
-      <w:r>
-        <w:t xml:space="preserve"> </w:t>
-      </w:r>
-      <w:r>
-        <w:t xml:space="preserve">“Switch now? Messages will go out from the system default number. Your clients will see that number as the sender.”</w:t>
-      </w:r>
-      <w:r>
-        <w:t xml:space="preserve">, with</w:t>
+        <w:t xml:space="preserve">, for WhatsApp and for email, because it changes what the clients see. The bar turns into a question, for example "Switch now? Messages will go out from the system default number. Your clients will see that number as the sender.", with</w:t>
       </w:r>
       <w:r>
         <w:t xml:space="preserve"> </w:t>
@@ -9790,104 +9359,6 @@
           </wp:inline>
         </w:drawing>
       </w:r>
-      <w:r>
-        <w:t xml:space="preserve"> </w:t>
-      </w:r>
-      <w:r>
-        <w:t xml:space="preserve">- A card that is not finished (not connected, not verified) cannot be switched to. Until it is finished, messages keep going from the system default.</w:t>
-      </w:r>
-      <w:r>
-        <w:t xml:space="preserve"> </w:t>
-      </w:r>
-      <w:r>
-        <w:t xml:space="preserve">-</w:t>
-      </w:r>
-      <w:r>
-        <w:t xml:space="preserve"> </w:t>
-      </w:r>
-      <w:r>
-        <w:rPr>
-          <w:b/>
-          <w:bCs/>
-        </w:rPr>
-        <w:t xml:space="preserve">When the setup finishes, the card is switched to automatically</w:t>
-      </w:r>
-      <w:r>
-        <w:t xml:space="preserve">, because that is why the user did it: when WhatsApp is connected, when the domain is verified, and when the mail server connects.</w:t>
-      </w:r>
-      <w:r>
-        <w:t xml:space="preserve"> </w:t>
-      </w:r>
-      <w:r>
-        <w:t xml:space="preserve">-</w:t>
-      </w:r>
-      <w:r>
-        <w:t xml:space="preserve"> </w:t>
-      </w:r>
-      <w:r>
-        <w:rPr>
-          <w:b/>
-          <w:bCs/>
-        </w:rPr>
-        <w:t xml:space="preserve">Disconnect</w:t>
-      </w:r>
-      <w:r>
-        <w:t xml:space="preserve"> </w:t>
-      </w:r>
-      <w:r>
-        <w:t xml:space="preserve">(WhatsApp) and</w:t>
-      </w:r>
-      <w:r>
-        <w:t xml:space="preserve"> </w:t>
-      </w:r>
-      <w:r>
-        <w:rPr>
-          <w:b/>
-          <w:bCs/>
-        </w:rPr>
-        <w:t xml:space="preserve">Start over</w:t>
-      </w:r>
-      <w:r>
-        <w:t xml:space="preserve"> </w:t>
-      </w:r>
-      <w:r>
-        <w:t xml:space="preserve">(domain) put messages back on the system default.</w:t>
-      </w:r>
-      <w:r>
-        <w:t xml:space="preserve"> </w:t>
-      </w:r>
-      <w:r>
-        <w:t xml:space="preserve">- Switching back to the system default</w:t>
-      </w:r>
-      <w:r>
-        <w:t xml:space="preserve"> </w:t>
-      </w:r>
-      <w:r>
-        <w:rPr>
-          <w:b/>
-          <w:bCs/>
-        </w:rPr>
-        <w:t xml:space="preserve">does not delete</w:t>
-      </w:r>
-      <w:r>
-        <w:t xml:space="preserve"> </w:t>
-      </w:r>
-      <w:r>
-        <w:t xml:space="preserve">the firm’s own setup. It stays saved, and the user can switch to it again at any time. The card then shows</w:t>
-      </w:r>
-      <w:r>
-        <w:t xml:space="preserve"> </w:t>
-      </w:r>
-      <w:r>
-        <w:rPr>
-          <w:b/>
-          <w:bCs/>
-        </w:rPr>
-        <w:t xml:space="preserve">Not in use</w:t>
-      </w:r>
-      <w:r>
-        <w:t xml:space="preserve">.</w:t>
-      </w:r>
     </w:p>
     <w:p>
       <w:pPr>
@@ -9906,8 +9377,118 @@
         <w:t>Figure: Asking before a switch</w:t>
       </w:r>
     </w:p>
+    <w:p>
+      <w:pPr>
+        <w:pStyle w:val="Compact"/>
+        <w:numPr>
+          <w:ilvl w:val="0"/>
+          <w:numId w:val="1017"/>
+        </w:numPr>
+      </w:pPr>
+      <w:r>
+        <w:t xml:space="preserve">A card that is not finished (not connected, not verified) cannot be switched to. Until it is finished, messages keep going from the system default.</w:t>
+      </w:r>
+    </w:p>
+    <w:p>
+      <w:pPr>
+        <w:pStyle w:val="Compact"/>
+        <w:numPr>
+          <w:ilvl w:val="0"/>
+          <w:numId w:val="1017"/>
+        </w:numPr>
+      </w:pPr>
+      <w:r>
+        <w:rPr>
+          <w:b/>
+          <w:bCs/>
+        </w:rPr>
+        <w:t xml:space="preserve">When the setup finishes, the card is switched to automatically</w:t>
+      </w:r>
+      <w:r>
+        <w:t xml:space="preserve">, because that is why the user did it: when WhatsApp is connected, when the domain is verified, and when the mail server connects.</w:t>
+      </w:r>
+    </w:p>
+    <w:p>
+      <w:pPr>
+        <w:pStyle w:val="Compact"/>
+        <w:numPr>
+          <w:ilvl w:val="0"/>
+          <w:numId w:val="1017"/>
+        </w:numPr>
+      </w:pPr>
+      <w:r>
+        <w:rPr>
+          <w:b/>
+          <w:bCs/>
+        </w:rPr>
+        <w:t xml:space="preserve">Disconnect</w:t>
+      </w:r>
+      <w:r>
+        <w:t xml:space="preserve"> </w:t>
+      </w:r>
+      <w:r>
+        <w:t xml:space="preserve">(WhatsApp) and</w:t>
+      </w:r>
+      <w:r>
+        <w:t xml:space="preserve"> </w:t>
+      </w:r>
+      <w:r>
+        <w:rPr>
+          <w:b/>
+          <w:bCs/>
+        </w:rPr>
+        <w:t xml:space="preserve">Start over</w:t>
+      </w:r>
+      <w:r>
+        <w:t xml:space="preserve"> </w:t>
+      </w:r>
+      <w:r>
+        <w:t xml:space="preserve">(domain) put messages back on the system default.</w:t>
+      </w:r>
+    </w:p>
+    <w:p>
+      <w:pPr>
+        <w:pStyle w:val="Compact"/>
+        <w:numPr>
+          <w:ilvl w:val="0"/>
+          <w:numId w:val="1017"/>
+        </w:numPr>
+      </w:pPr>
+      <w:r>
+        <w:t xml:space="preserve">Switching back to the system default</w:t>
+      </w:r>
+      <w:r>
+        <w:t xml:space="preserve"> </w:t>
+      </w:r>
+      <w:r>
+        <w:rPr>
+          <w:b/>
+          <w:bCs/>
+        </w:rPr>
+        <w:t xml:space="preserve">does not delete</w:t>
+      </w:r>
+      <w:r>
+        <w:t xml:space="preserve"> </w:t>
+      </w:r>
+      <w:r>
+        <w:t xml:space="preserve">the firm's own setup. It stays saved, and the user can switch to it again at any time. The card then shows</w:t>
+      </w:r>
+      <w:r>
+        <w:t xml:space="preserve"> </w:t>
+      </w:r>
+      <w:r>
+        <w:rPr>
+          <w:b/>
+          <w:bCs/>
+        </w:rPr>
+        <w:t xml:space="preserve">Not in use</w:t>
+      </w:r>
+      <w:r>
+        <w:t xml:space="preserve">.</w:t>
+      </w:r>
+    </w:p>
     <w:bookmarkEnd w:id="78"/>
-    <w:bookmarkStart w:id="82" w:name="whatsapp"/>
+    <w:bookmarkStart w:id="82" w:name="Xb6f687164e552578f7042809f91095c24640259"/>
     <w:p>
       <w:pPr>
         <w:pStyle w:val="Heading3"/>
@@ -10125,7 +9706,7 @@
               <w:rPr>
                 <w:sz w:val="20"/>
               </w:rPr>
-              <w:t xml:space="preserve">The firm’s own WhatsApp Business number</w:t>
+              <w:t xml:space="preserve">The firm's own WhatsApp Business number</w:t>
             </w:r>
           </w:p>
         </w:tc>
@@ -10149,7 +9730,7 @@
         <w:pStyle w:val="Compact"/>
         <w:numPr>
           <w:ilvl w:val="0"/>
-          <w:numId w:val="1017"/>
+          <w:numId w:val="1018"/>
         </w:numPr>
       </w:pPr>
       <w:r>
@@ -10174,7 +9755,7 @@
         <w:pStyle w:val="Compact"/>
         <w:numPr>
           <w:ilvl w:val="0"/>
-          <w:numId w:val="1017"/>
+          <w:numId w:val="1018"/>
         </w:numPr>
       </w:pPr>
       <w:r>
@@ -10199,7 +9780,7 @@
         <w:pStyle w:val="Compact"/>
         <w:numPr>
           <w:ilvl w:val="0"/>
-          <w:numId w:val="1017"/>
+          <w:numId w:val="1018"/>
         </w:numPr>
       </w:pPr>
       <w:r>
@@ -10282,11 +9863,11 @@
         <w:pStyle w:val="Compact"/>
         <w:numPr>
           <w:ilvl w:val="0"/>
-          <w:numId w:val="1017"/>
+          <w:numId w:val="1018"/>
         </w:numPr>
       </w:pPr>
       <w:r>
-        <w:t xml:space="preserve">The firm’s number is then</w:t>
+        <w:t xml:space="preserve">The firm's number is then</w:t>
       </w:r>
       <w:r>
         <w:t xml:space="preserve"> </w:t>
@@ -10307,12 +9888,12 @@
         <w:pStyle w:val="FirstParagraph"/>
       </w:pPr>
       <w:r>
-        <w:t xml:space="preserve">Spectrum Cloud sends the firm’s message templates for approval once the number is connected.</w:t>
-      </w:r>
-    </w:p>
-    <w:p>
-      <w:pPr>
-        <w:pStyle w:val="CaptionedFigure"/>
+        <w:t xml:space="preserve">Spectrum Cloud sends the firm's message templates for approval once the number is connected.</w:t>
+      </w:r>
+    </w:p>
+    <w:p>
+      <w:pPr>
+        <w:pStyle w:val="BodyText"/>
         <w:keepNext/>
         <w:spacing w:before="120" w:after="40"/>
         <w:jc w:val="center"/>
@@ -10367,7 +9948,7 @@
     </w:p>
     <w:p>
       <w:pPr>
-        <w:pStyle w:val="CaptionedFigure"/>
+        <w:pStyle w:val="BodyText"/>
         <w:keepNext w:val="0"/>
         <w:spacing w:before="40" w:after="240"/>
         <w:jc w:val="center"/>
@@ -10384,14 +9965,6 @@
     </w:p>
     <w:p>
       <w:pPr>
-        <w:pStyle w:val="ImageCaption"/>
-      </w:pPr>
-      <w:r>
-        <w:t xml:space="preserve">Connecting a WhatsApp number</w:t>
-      </w:r>
-    </w:p>
-    <w:p>
-      <w:pPr>
         <w:pStyle w:val="BodyText"/>
       </w:pPr>
       <w:r>
@@ -10470,7 +10043,7 @@
         <w:pStyle w:val="Compact"/>
         <w:numPr>
           <w:ilvl w:val="0"/>
-          <w:numId w:val="1018"/>
+          <w:numId w:val="1019"/>
         </w:numPr>
       </w:pPr>
       <w:r>
@@ -10500,7 +10073,7 @@
           <w:b/>
           <w:bCs/>
         </w:rPr>
-        <w:t xml:space="preserve">firm’s own number</w:t>
+        <w:t xml:space="preserve">firm's own number</w:t>
       </w:r>
       <w:r>
         <w:t xml:space="preserve">.</w:t>
@@ -10511,7 +10084,7 @@
         <w:pStyle w:val="Compact"/>
         <w:numPr>
           <w:ilvl w:val="0"/>
-          <w:numId w:val="1018"/>
+          <w:numId w:val="1019"/>
         </w:numPr>
       </w:pPr>
       <w:r>
@@ -10552,7 +10125,7 @@
         <w:pStyle w:val="Compact"/>
         <w:numPr>
           <w:ilvl w:val="0"/>
-          <w:numId w:val="1018"/>
+          <w:numId w:val="1019"/>
         </w:numPr>
       </w:pPr>
       <w:r>
@@ -10566,7 +10139,7 @@
         <w:t xml:space="preserve"> </w:t>
       </w:r>
       <w:r>
-        <w:t xml:space="preserve">It is simply not part of the approved count (for example 7 of 10). Its messages go from the system default number, the same as a template that is still waiting. KDK is told about rejections, so the template can be corrected and sent again. This is not shown to the firm. When the template is approved later, its messages start going from the firm’s number by themselves.</w:t>
+        <w:t xml:space="preserve">It is simply not part of the approved count (for example 7 of 10). Its messages go from the system default number, the same as a template that is still waiting. KDK is told about rejections, so the template can be corrected and sent again. This is not shown to the firm. When the template is approved later, its messages start going from the firm's number by themselves.</w:t>
       </w:r>
     </w:p>
     <w:p>
@@ -10574,7 +10147,7 @@
         <w:pStyle w:val="Compact"/>
         <w:numPr>
           <w:ilvl w:val="0"/>
-          <w:numId w:val="1018"/>
+          <w:numId w:val="1019"/>
         </w:numPr>
       </w:pPr>
       <w:r>
@@ -10594,13 +10167,7 @@
         <w:t xml:space="preserve"> </w:t>
       </w:r>
       <w:r>
-        <w:t xml:space="preserve">all say this in plain words, for example</w:t>
-      </w:r>
-      <w:r>
-        <w:t xml:space="preserve"> </w:t>
-      </w:r>
-      <w:r>
-        <w:t xml:space="preserve">“Until the templates are approved, messages go out from the system default number.”</w:t>
+        <w:t xml:space="preserve">all say this in plain words, for example "Until the templates are approved, messages go out from the system default number."</w:t>
       </w:r>
     </w:p>
     <w:p>
@@ -10608,7 +10175,7 @@
         <w:pStyle w:val="Compact"/>
         <w:numPr>
           <w:ilvl w:val="0"/>
-          <w:numId w:val="1018"/>
+          <w:numId w:val="1019"/>
         </w:numPr>
       </w:pPr>
       <w:r>
@@ -10630,11 +10197,11 @@
         <w:pStyle w:val="Compact"/>
         <w:numPr>
           <w:ilvl w:val="0"/>
-          <w:numId w:val="1018"/>
+          <w:numId w:val="1019"/>
         </w:numPr>
       </w:pPr>
       <w:r>
-        <w:t xml:space="preserve">Because of this, one firm’s WhatsApp Logs can show</w:t>
+        <w:t xml:space="preserve">Because of this, one firm's WhatsApp Logs can show</w:t>
       </w:r>
       <w:r>
         <w:t xml:space="preserve"> </w:t>
@@ -10670,7 +10237,7 @@
       </w:r>
     </w:p>
     <w:bookmarkEnd w:id="82"/>
-    <w:bookmarkStart w:id="92" w:name="email"/>
+    <w:bookmarkStart w:id="93" w:name="X4934f0f5d6c6998fd0513ddb723aa9cbc1bb1cb"/>
     <w:p>
       <w:pPr>
         <w:pStyle w:val="Heading3"/>
@@ -10681,7 +10248,7 @@
     </w:p>
     <w:p>
       <w:pPr>
-        <w:pStyle w:val="CaptionedFigure"/>
+        <w:pStyle w:val="FirstParagraph"/>
         <w:keepNext/>
         <w:spacing w:before="120" w:after="40"/>
         <w:jc w:val="center"/>
@@ -10736,7 +10303,7 @@
     </w:p>
     <w:p>
       <w:pPr>
-        <w:pStyle w:val="CaptionedFigure"/>
+        <w:pStyle w:val="FirstParagraph"/>
         <w:keepNext w:val="0"/>
         <w:spacing w:before="40" w:after="240"/>
         <w:jc w:val="center"/>
@@ -10749,14 +10316,6 @@
           <w:sz w:val="19"/>
         </w:rPr>
         <w:t>Figure: Configuration, Email</w:t>
-      </w:r>
-    </w:p>
-    <w:p>
-      <w:pPr>
-        <w:pStyle w:val="ImageCaption"/>
-      </w:pPr>
-      <w:r>
-        <w:t xml:space="preserve">Configuration, Email</w:t>
       </w:r>
     </w:p>
     <w:tbl>
@@ -10970,25 +10529,7 @@
               <w:rPr>
                 <w:sz w:val="20"/>
               </w:rPr>
-              <w:t xml:space="preserve">with</w:t>
-            </w:r>
-            <w:r>
-              <w:rPr>
-                <w:sz w:val="20"/>
-              </w:rPr>
-              <w:t xml:space="preserve"> </w:t>
-            </w:r>
-            <w:r>
-              <w:rPr>
-                <w:sz w:val="20"/>
-              </w:rPr>
-              <w:t xml:space="preserve">“Not live yet”</w:t>
-            </w:r>
-            <w:r>
-              <w:rPr>
-                <w:sz w:val="20"/>
-              </w:rPr>
-              <w:t xml:space="preserve">, and become normal when those modules go live</w:t>
+              <w:t xml:space="preserve">with "Not live yet", and become normal when those modules go live</w:t>
             </w:r>
           </w:p>
         </w:tc>
@@ -11111,7 +10652,7 @@
         <w:t xml:space="preserve"> </w:t>
       </w:r>
       <w:r>
-        <w:t xml:space="preserve">A client’s reply goes to this address. It is a box with a</w:t>
+        <w:t xml:space="preserve">A client's reply goes to this address. It is a box with a</w:t>
       </w:r>
       <w:r>
         <w:t xml:space="preserve"> </w:t>
@@ -11127,28 +10668,21 @@
         <w:t xml:space="preserve"> </w:t>
       </w:r>
       <w:r>
-        <w:t xml:space="preserve">button. Save is on only when the email looks like an email, and a wrong one shows</w:t>
-      </w:r>
-      <w:r>
-        <w:t xml:space="preserve"> </w:t>
-      </w:r>
-      <w:r>
-        <w:t xml:space="preserve">“Enter a valid email, like name@yourfirm.com.”</w:t>
-      </w:r>
-      <w:r>
-        <w:t xml:space="preserve"> </w:t>
-      </w:r>
-      <w:r>
-        <w:t xml:space="preserve">After saving it says</w:t>
-      </w:r>
-      <w:r>
-        <w:t xml:space="preserve"> </w:t>
-      </w:r>
-      <w:r>
-        <w:t xml:space="preserve">“Saved. Replies go to …”</w:t>
-      </w:r>
-      <w:r>
-        <w:t xml:space="preserve">. It is the same field for all three cards.</w:t>
+        <w:t xml:space="preserve">button. Save is on only when the email looks like an email, and a wrong one shows "Enter a valid email, like</w:t>
+      </w:r>
+      <w:r>
+        <w:t xml:space="preserve"> </w:t>
+      </w:r>
+      <w:hyperlink r:id="rId86">
+        <w:r>
+          <w:rPr>
+            <w:rStyle w:val="Hyperlink"/>
+          </w:rPr>
+          <w:t xml:space="preserve">name@yourfirm.com</w:t>
+        </w:r>
+      </w:hyperlink>
+      <w:r>
+        <w:t xml:space="preserve">." After saving it says "Saved. Replies go to ...". It is the same field for all three cards.</w:t>
       </w:r>
     </w:p>
     <w:p>
@@ -11168,7 +10702,7 @@
         <w:pStyle w:val="Compact"/>
         <w:numPr>
           <w:ilvl w:val="0"/>
-          <w:numId w:val="1019"/>
+          <w:numId w:val="1020"/>
         </w:numPr>
       </w:pPr>
       <w:r>
@@ -11242,13 +10776,7 @@
         <w:t xml:space="preserve">Add domain</w:t>
       </w:r>
       <w:r>
-        <w:t xml:space="preserve">. A personal domain such as gmail.com is not accepted:</w:t>
-      </w:r>
-      <w:r>
-        <w:t xml:space="preserve"> </w:t>
-      </w:r>
-      <w:r>
-        <w:t xml:space="preserve">“… is a personal email provider, not a domain you control.”</w:t>
+        <w:t xml:space="preserve">. A personal domain such as gmail.com is not accepted: "... is a personal email provider, not a domain you control."</w:t>
       </w:r>
     </w:p>
     <w:p>
@@ -11256,7 +10784,7 @@
         <w:pStyle w:val="Compact"/>
         <w:numPr>
           <w:ilvl w:val="0"/>
-          <w:numId w:val="1019"/>
+          <w:numId w:val="1020"/>
         </w:numPr>
       </w:pPr>
       <w:r>
@@ -11284,7 +10812,7 @@
         <w:pStyle w:val="Compact"/>
         <w:numPr>
           <w:ilvl w:val="0"/>
-          <w:numId w:val="1019"/>
+          <w:numId w:val="1020"/>
         </w:numPr>
       </w:pPr>
       <w:r>
@@ -11298,13 +10826,7 @@
         <w:t xml:space="preserve"> </w:t>
       </w:r>
       <w:r>
-        <w:t xml:space="preserve">has a short line (</w:t>
-      </w:r>
-      <w:r>
-        <w:t xml:space="preserve">“Add these two records at the place where you manage your domain (for example GoDaddy). It can take up to a day or two to work.”</w:t>
-      </w:r>
-      <w:r>
-        <w:t xml:space="preserve">) and the</w:t>
+        <w:t xml:space="preserve">has a short line ("Add these two records at the place where you manage your domain (for example GoDaddy). It can take up to a day or two to work.") and the</w:t>
       </w:r>
       <w:r>
         <w:t xml:space="preserve"> </w:t>
@@ -11333,7 +10855,7 @@
         <w:t xml:space="preserve"> </w:t>
       </w:r>
       <w:r>
-        <w:t xml:space="preserve">like a domain provider’s form:</w:t>
+        <w:t xml:space="preserve">like a domain provider's form:</w:t>
       </w:r>
       <w:r>
         <w:t xml:space="preserve"> </w:t>
@@ -11399,7 +10921,7 @@
         <w:pStyle w:val="Compact"/>
         <w:numPr>
           <w:ilvl w:val="0"/>
-          <w:numId w:val="1019"/>
+          <w:numId w:val="1020"/>
         </w:numPr>
       </w:pPr>
       <w:r>
@@ -11495,11 +11017,11 @@
         <w:pStyle w:val="Compact"/>
         <w:numPr>
           <w:ilvl w:val="0"/>
-          <w:numId w:val="1019"/>
+          <w:numId w:val="1020"/>
         </w:numPr>
       </w:pPr>
       <w:r>
-        <w:t xml:space="preserve">When it is verified, emails go from the firm’s address, and a</w:t>
+        <w:t xml:space="preserve">When it is verified, emails go from the firm's address, and a</w:t>
       </w:r>
       <w:r>
         <w:t xml:space="preserve"> </w:t>
@@ -11520,7 +11042,7 @@
     </w:p>
     <w:p>
       <w:pPr>
-        <w:pStyle w:val="CaptionedFigure"/>
+        <w:pStyle w:val="FirstParagraph"/>
         <w:keepNext/>
         <w:spacing w:before="120" w:after="40"/>
         <w:jc w:val="center"/>
@@ -11530,18 +11052,18 @@
           <wp:inline>
             <wp:extent cx="5334000" cy="4058284"/>
             <wp:effectExtent b="0" l="0" r="0" t="0"/>
-            <wp:docPr descr="Own domain: DNS records" title="" id="87" name="Picture"/>
+            <wp:docPr descr="Own domain: DNS records" title="" id="88" name="Picture"/>
             <a:graphic>
               <a:graphicData uri="http://schemas.openxmlformats.org/drawingml/2006/picture">
                 <pic:pic>
                   <pic:nvPicPr>
-                    <pic:cNvPr descr="brd-screenshots/config-email-domain.png" id="88" name="Picture"/>
+                    <pic:cNvPr descr="brd-screenshots/config-email-domain.png" id="89" name="Picture"/>
                     <pic:cNvPicPr>
                       <a:picLocks noChangeArrowheads="1" noChangeAspect="1"/>
                     </pic:cNvPicPr>
                   </pic:nvPicPr>
                   <pic:blipFill>
-                    <a:blip r:embed="rId86"/>
+                    <a:blip r:embed="rId87"/>
                     <a:stretch>
                       <a:fillRect/>
                     </a:stretch>
@@ -11575,7 +11097,7 @@
     </w:p>
     <w:p>
       <w:pPr>
-        <w:pStyle w:val="CaptionedFigure"/>
+        <w:pStyle w:val="FirstParagraph"/>
         <w:keepNext w:val="0"/>
         <w:spacing w:before="40" w:after="240"/>
         <w:jc w:val="center"/>
@@ -11592,14 +11114,6 @@
     </w:p>
     <w:p>
       <w:pPr>
-        <w:pStyle w:val="ImageCaption"/>
-      </w:pPr>
-      <w:r>
-        <w:t xml:space="preserve">Own domain: DNS records</w:t>
-      </w:r>
-    </w:p>
-    <w:p>
-      <w:pPr>
         <w:pStyle w:val="BodyText"/>
       </w:pPr>
       <w:r>
@@ -11612,7 +11126,7 @@
     </w:p>
     <w:p>
       <w:pPr>
-        <w:pStyle w:val="CaptionedFigure"/>
+        <w:pStyle w:val="BodyText"/>
         <w:keepNext/>
         <w:spacing w:before="120" w:after="40"/>
         <w:jc w:val="center"/>
@@ -11622,18 +11136,18 @@
           <wp:inline>
             <wp:extent cx="5334000" cy="4620577"/>
             <wp:effectExtent b="0" l="0" r="0" t="0"/>
-            <wp:docPr descr="Own SMTP server" title="" id="90" name="Picture"/>
+            <wp:docPr descr="Own SMTP server" title="" id="91" name="Picture"/>
             <a:graphic>
               <a:graphicData uri="http://schemas.openxmlformats.org/drawingml/2006/picture">
                 <pic:pic>
                   <pic:nvPicPr>
-                    <pic:cNvPr descr="brd-screenshots/config-email-smtp.png" id="91" name="Picture"/>
+                    <pic:cNvPr descr="brd-screenshots/config-email-smtp.png" id="92" name="Picture"/>
                     <pic:cNvPicPr>
                       <a:picLocks noChangeArrowheads="1" noChangeAspect="1"/>
                     </pic:cNvPicPr>
                   </pic:nvPicPr>
                   <pic:blipFill>
-                    <a:blip r:embed="rId89"/>
+                    <a:blip r:embed="rId90"/>
                     <a:stretch>
                       <a:fillRect/>
                     </a:stretch>
@@ -11667,7 +11181,7 @@
     </w:p>
     <w:p>
       <w:pPr>
-        <w:pStyle w:val="CaptionedFigure"/>
+        <w:pStyle w:val="BodyText"/>
         <w:keepNext w:val="0"/>
         <w:spacing w:before="40" w:after="240"/>
         <w:jc w:val="center"/>
@@ -11684,14 +11198,6 @@
     </w:p>
     <w:p>
       <w:pPr>
-        <w:pStyle w:val="ImageCaption"/>
-      </w:pPr>
-      <w:r>
-        <w:t xml:space="preserve">Own SMTP server</w:t>
-      </w:r>
-    </w:p>
-    <w:p>
-      <w:pPr>
         <w:pStyle w:val="BodyText"/>
       </w:pPr>
       <w:r>
@@ -11812,179 +11318,6 @@
       </w:r>
       <w:r>
         <w:t xml:space="preserve">tries the server.</w:t>
-      </w:r>
-    </w:p>
-    <w:p>
-      <w:pPr>
-        <w:pStyle w:val="Compact"/>
-        <w:numPr>
-          <w:ilvl w:val="0"/>
-          <w:numId w:val="1020"/>
-        </w:numPr>
-      </w:pPr>
-      <w:r>
-        <w:t xml:space="preserve">While it connects, the button says</w:t>
-      </w:r>
-      <w:r>
-        <w:t xml:space="preserve"> </w:t>
-      </w:r>
-      <w:r>
-        <w:rPr>
-          <w:i/>
-          <w:iCs/>
-        </w:rPr>
-        <w:t xml:space="preserve">Connecting…</w:t>
-      </w:r>
-      <w:r>
-        <w:t xml:space="preserve"> </w:t>
-      </w:r>
-      <w:r>
-        <w:t xml:space="preserve">and email keeps going from the system default.</w:t>
-      </w:r>
-    </w:p>
-    <w:p>
-      <w:pPr>
-        <w:pStyle w:val="Compact"/>
-        <w:numPr>
-          <w:ilvl w:val="0"/>
-          <w:numId w:val="1020"/>
-        </w:numPr>
-      </w:pPr>
-      <w:r>
-        <w:t xml:space="preserve">If it cannot connect, a note says so and the user can correct the details.</w:t>
-      </w:r>
-    </w:p>
-    <w:p>
-      <w:pPr>
-        <w:pStyle w:val="Compact"/>
-        <w:numPr>
-          <w:ilvl w:val="0"/>
-          <w:numId w:val="1020"/>
-        </w:numPr>
-      </w:pPr>
-      <w:r>
-        <w:t xml:space="preserve">When it connects, the page shows</w:t>
-      </w:r>
-      <w:r>
-        <w:t xml:space="preserve"> </w:t>
-      </w:r>
-      <w:r>
-        <w:rPr>
-          <w:b/>
-          <w:bCs/>
-        </w:rPr>
-        <w:t xml:space="preserve">Your connection</w:t>
-      </w:r>
-      <w:r>
-        <w:t xml:space="preserve">: SMTP server, Security, Username, From name and From address (the password is never shown again), with</w:t>
-      </w:r>
-      <w:r>
-        <w:t xml:space="preserve"> </w:t>
-      </w:r>
-      <w:r>
-        <w:rPr>
-          <w:b/>
-          <w:bCs/>
-        </w:rPr>
-        <w:t xml:space="preserve">Send test email</w:t>
-      </w:r>
-      <w:r>
-        <w:t xml:space="preserve"> </w:t>
-      </w:r>
-      <w:r>
-        <w:t xml:space="preserve">and</w:t>
-      </w:r>
-      <w:r>
-        <w:t xml:space="preserve"> </w:t>
-      </w:r>
-      <w:r>
-        <w:rPr>
-          <w:b/>
-          <w:bCs/>
-        </w:rPr>
-        <w:t xml:space="preserve">Edit server</w:t>
-      </w:r>
-      <w:r>
-        <w:t xml:space="preserve">. Emails are now sent through the firm’s server.</w:t>
-      </w:r>
-    </w:p>
-    <w:p>
-      <w:pPr>
-        <w:pStyle w:val="FirstParagraph"/>
-      </w:pPr>
-      <w:r>
-        <w:rPr>
-          <w:b/>
-          <w:bCs/>
-        </w:rPr>
-        <w:t xml:space="preserve">Status in Email Logs for SMTP emails.</w:t>
-      </w:r>
-      <w:r>
-        <w:t xml:space="preserve"> </w:t>
-      </w:r>
-      <w:r>
-        <w:t xml:space="preserve">An email sent through the firm’s own SMTP server shows the status</w:t>
-      </w:r>
-      <w:r>
-        <w:t xml:space="preserve"> </w:t>
-      </w:r>
-      <w:r>
-        <w:rPr>
-          <w:b/>
-          <w:bCs/>
-        </w:rPr>
-        <w:t xml:space="preserve">SMTP</w:t>
-      </w:r>
-      <w:r>
-        <w:t xml:space="preserve"> </w:t>
-      </w:r>
-      <w:r>
-        <w:t xml:space="preserve">in Email Logs. Spectrum Cloud only hands the email to the firm’s server. It</w:t>
-      </w:r>
-      <w:r>
-        <w:t xml:space="preserve"> </w:t>
-      </w:r>
-      <w:r>
-        <w:rPr>
-          <w:b/>
-          <w:bCs/>
-        </w:rPr>
-        <w:t xml:space="preserve">cannot see what happens after that</w:t>
-      </w:r>
-      <w:r>
-        <w:t xml:space="preserve">, so it cannot tell whether the email was delivered, bounced, failed or opened. Instead of a status it cannot check, the log says</w:t>
-      </w:r>
-      <w:r>
-        <w:t xml:space="preserve"> </w:t>
-      </w:r>
-      <w:r>
-        <w:rPr>
-          <w:b/>
-          <w:bCs/>
-        </w:rPr>
-        <w:t xml:space="preserve">SMTP</w:t>
-      </w:r>
-      <w:r>
-        <w:t xml:space="preserve">, which means</w:t>
-      </w:r>
-      <w:r>
-        <w:t xml:space="preserve"> </w:t>
-      </w:r>
-      <w:r>
-        <w:t xml:space="preserve">“handed to the firm’s own mail server”</w:t>
-      </w:r>
-      <w:r>
-        <w:t xml:space="preserve">. Emails sent from the system default or from the firm’s own domain keep their usual statuses (Delivered, Bounced and so on).</w:t>
-      </w:r>
-    </w:p>
-    <w:bookmarkEnd w:id="92"/>
-    <w:bookmarkStart w:id="93" w:name="rules"/>
-    <w:p>
-      <w:pPr>
-        <w:pStyle w:val="Heading3"/>
-      </w:pPr>
-      <w:r>
-        <w:t xml:space="preserve">7.5 Rules</w:t>
       </w:r>
     </w:p>
     <w:p>
@@ -11996,46 +11329,23 @@
         </w:numPr>
       </w:pPr>
       <w:r>
-        <w:t xml:space="preserve">The choice is for</w:t>
-      </w:r>
-      <w:r>
-        <w:t xml:space="preserve"> </w:t>
-      </w:r>
-      <w:r>
-        <w:rPr>
-          <w:b/>
-          <w:bCs/>
-        </w:rPr>
-        <w:t xml:space="preserve">the whole firm</w:t>
-      </w:r>
-      <w:r>
-        <w:t xml:space="preserve">. One own number and one own domain (or mail server) cover</w:t>
-      </w:r>
-      <w:r>
-        <w:t xml:space="preserve"> </w:t>
-      </w:r>
-      <w:r>
-        <w:rPr>
-          <w:b/>
-          <w:bCs/>
-        </w:rPr>
-        <w:t xml:space="preserve">all three modules</w:t>
-      </w:r>
-      <w:r>
-        <w:t xml:space="preserve">, GST, TDS and ITR. The firm does not choose them per module. WhatsApp and email are chosen</w:t>
-      </w:r>
-      <w:r>
-        <w:t xml:space="preserve"> </w:t>
-      </w:r>
-      <w:r>
-        <w:rPr>
-          <w:b/>
-          <w:bCs/>
-        </w:rPr>
-        <w:t xml:space="preserve">separately</w:t>
-      </w:r>
-      <w:r>
-        <w:t xml:space="preserve">.</w:t>
+        <w:t xml:space="preserve">While it connects, the button says</w:t>
+      </w:r>
+      <w:r>
+        <w:t xml:space="preserve"> </w:t>
+      </w:r>
+      <w:r>
+        <w:rPr>
+          <w:i/>
+          <w:iCs/>
+        </w:rPr>
+        <w:t xml:space="preserve">Connecting...</w:t>
+      </w:r>
+      <w:r>
+        <w:t xml:space="preserve"> </w:t>
+      </w:r>
+      <w:r>
+        <w:t xml:space="preserve">and email keeps going from the system default.</w:t>
       </w:r>
     </w:p>
     <w:p>
@@ -12047,23 +11357,7 @@
         </w:numPr>
       </w:pPr>
       <w:r>
-        <w:t xml:space="preserve">Exactly</w:t>
-      </w:r>
-      <w:r>
-        <w:t xml:space="preserve"> </w:t>
-      </w:r>
-      <w:r>
-        <w:rPr>
-          <w:b/>
-          <w:bCs/>
-        </w:rPr>
-        <w:t xml:space="preserve">one</w:t>
-      </w:r>
-      <w:r>
-        <w:t xml:space="preserve"> </w:t>
-      </w:r>
-      <w:r>
-        <w:t xml:space="preserve">choice is in use for each channel.</w:t>
+        <w:t xml:space="preserve">If it cannot connect, a note says so and the user can correct the details.</w:t>
       </w:r>
     </w:p>
     <w:p>
@@ -12075,31 +11369,67 @@
         </w:numPr>
       </w:pPr>
       <w:r>
-        <w:t xml:space="preserve">A setup that is not finished never takes over: messages keep going from the system default.</w:t>
-      </w:r>
-    </w:p>
-    <w:p>
-      <w:pPr>
-        <w:pStyle w:val="Compact"/>
-        <w:numPr>
-          <w:ilvl w:val="0"/>
-          <w:numId w:val="1021"/>
-        </w:numPr>
-      </w:pPr>
-      <w:r>
-        <w:t xml:space="preserve">The firm’s own setup is kept when the user switches back to the system default.</w:t>
-      </w:r>
-    </w:p>
-    <w:p>
-      <w:pPr>
-        <w:pStyle w:val="Compact"/>
-        <w:numPr>
-          <w:ilvl w:val="0"/>
-          <w:numId w:val="1021"/>
-        </w:numPr>
-      </w:pPr>
-      <w:r>
-        <w:t xml:space="preserve">An email sent through the firm’s own SMTP server shows the status</w:t>
+        <w:t xml:space="preserve">When it connects, the page shows</w:t>
+      </w:r>
+      <w:r>
+        <w:t xml:space="preserve"> </w:t>
+      </w:r>
+      <w:r>
+        <w:rPr>
+          <w:b/>
+          <w:bCs/>
+        </w:rPr>
+        <w:t xml:space="preserve">Your connection</w:t>
+      </w:r>
+      <w:r>
+        <w:t xml:space="preserve">: SMTP server, Security, Username, From name and From address (the password is never shown again), with</w:t>
+      </w:r>
+      <w:r>
+        <w:t xml:space="preserve"> </w:t>
+      </w:r>
+      <w:r>
+        <w:rPr>
+          <w:b/>
+          <w:bCs/>
+        </w:rPr>
+        <w:t xml:space="preserve">Send test email</w:t>
+      </w:r>
+      <w:r>
+        <w:t xml:space="preserve"> </w:t>
+      </w:r>
+      <w:r>
+        <w:t xml:space="preserve">and</w:t>
+      </w:r>
+      <w:r>
+        <w:t xml:space="preserve"> </w:t>
+      </w:r>
+      <w:r>
+        <w:rPr>
+          <w:b/>
+          <w:bCs/>
+        </w:rPr>
+        <w:t xml:space="preserve">Edit server</w:t>
+      </w:r>
+      <w:r>
+        <w:t xml:space="preserve">. Emails are now sent through the firm's server.</w:t>
+      </w:r>
+    </w:p>
+    <w:p>
+      <w:pPr>
+        <w:pStyle w:val="FirstParagraph"/>
+      </w:pPr>
+      <w:r>
+        <w:rPr>
+          <w:b/>
+          <w:bCs/>
+        </w:rPr>
+        <w:t xml:space="preserve">Status in Email Logs for SMTP emails.</w:t>
+      </w:r>
+      <w:r>
+        <w:t xml:space="preserve"> </w:t>
+      </w:r>
+      <w:r>
+        <w:t xml:space="preserve">An email sent through the firm's own SMTP server shows the status</w:t>
       </w:r>
       <w:r>
         <w:t xml:space="preserve"> </w:t>
@@ -12115,146 +11445,43 @@
         <w:t xml:space="preserve"> </w:t>
       </w:r>
       <w:r>
-        <w:t xml:space="preserve">in Email Logs, because Spectrum Cloud cannot check what happens after it hands the email over.</w:t>
-      </w:r>
-    </w:p>
-    <w:p>
-      <w:pPr>
-        <w:pStyle w:val="Compact"/>
-        <w:numPr>
-          <w:ilvl w:val="0"/>
-          <w:numId w:val="1021"/>
-        </w:numPr>
-      </w:pPr>
-      <w:r>
-        <w:t xml:space="preserve">The user must never see the name of the WhatsApp provider. The DNS values for email are shown</w:t>
-      </w:r>
-      <w:r>
-        <w:t xml:space="preserve"> </w:t>
-      </w:r>
-      <w:r>
-        <w:rPr>
-          <w:b/>
-          <w:bCs/>
-        </w:rPr>
-        <w:t xml:space="preserve">as given</w:t>
-      </w:r>
-      <w:r>
-        <w:t xml:space="preserve">, because the user has to copy them exactly.</w:t>
-      </w:r>
-    </w:p>
-    <w:p>
-      <w:r>
-        <w:pict>
-          <v:rect style="width:0;height:1.5pt" o:hralign="center" o:hrstd="t" o:hr="t"/>
-        </w:pict>
+        <w:t xml:space="preserve">in Email Logs. Spectrum Cloud only hands the email to the firm's server. It</w:t>
+      </w:r>
+      <w:r>
+        <w:t xml:space="preserve"> </w:t>
+      </w:r>
+      <w:r>
+        <w:rPr>
+          <w:b/>
+          <w:bCs/>
+        </w:rPr>
+        <w:t xml:space="preserve">cannot see what happens after that</w:t>
+      </w:r>
+      <w:r>
+        <w:t xml:space="preserve">, so it cannot tell whether the email was delivered, bounced, failed or opened. Instead of a status it cannot check, the log says</w:t>
+      </w:r>
+      <w:r>
+        <w:t xml:space="preserve"> </w:t>
+      </w:r>
+      <w:r>
+        <w:rPr>
+          <w:b/>
+          <w:bCs/>
+        </w:rPr>
+        <w:t xml:space="preserve">SMTP</w:t>
+      </w:r>
+      <w:r>
+        <w:t xml:space="preserve">, which means "handed to the firm's own mail server". Emails sent from the system default or from the firm's own domain keep their usual statuses (Delivered, Bounced and so on).</w:t>
       </w:r>
     </w:p>
     <w:bookmarkEnd w:id="93"/>
-    <w:bookmarkEnd w:id="94"/>
-    <w:bookmarkStart w:id="95" w:name="where-the-data-comes-from"/>
-    <w:p>
-      <w:pPr>
-        <w:pStyle w:val="Heading2"/>
-        <w:pBdr>
-          <w:bottom w:val="single" w:sz="6" w:space="4" w:color="C9D2DC"/>
-        </w:pBdr>
-      </w:pPr>
-      <w:r>
-        <w:t xml:space="preserve">8. Where the data comes from</w:t>
-      </w:r>
-    </w:p>
-    <w:p>
-      <w:pPr>
-        <w:pStyle w:val="FirstParagraph"/>
-      </w:pPr>
-      <w:r>
-        <w:rPr>
-          <w:b/>
-          <w:bCs/>
-        </w:rPr>
-        <w:t xml:space="preserve">From the application:</w:t>
-      </w:r>
-      <w:r>
-        <w:t xml:space="preserve"> </w:t>
-      </w:r>
-      <w:r>
-        <w:t xml:space="preserve">clients, their PAN and contacts, and the registrations of each client (GSTIN, TAN, PAN, with type or place). A newly added registration gets the defaults of its module.</w:t>
-      </w:r>
-    </w:p>
-    <w:p>
-      <w:pPr>
-        <w:pStyle w:val="BodyText"/>
-      </w:pPr>
-      <w:r>
-        <w:rPr>
-          <w:b/>
-          <w:bCs/>
-        </w:rPr>
-        <w:t xml:space="preserve">Saved by Spectrum Cloud:</w:t>
-      </w:r>
-      <w:r>
-        <w:t xml:space="preserve"> </w:t>
-      </w:r>
-      <w:r>
-        <w:t xml:space="preserve">the Email and WhatsApp switch of every report and event for each registration, the contact picked for each registration, the contacts edited or added on this page, and the defaults of each module. From the Configuration page: for WhatsApp and for email,</w:t>
-      </w:r>
-      <w:r>
-        <w:t xml:space="preserve"> </w:t>
-      </w:r>
-      <w:r>
-        <w:rPr>
-          <w:b/>
-          <w:bCs/>
-        </w:rPr>
-        <w:t xml:space="preserve">which choice is in use</w:t>
-      </w:r>
-      <w:r>
-        <w:t xml:space="preserve">, and the firm’s own setup (the WhatsApp number and display name, the email domain and its status, the SMTP details with the password kept safe and never shown again, and the Reply-to email). For every WhatsApp message: the</w:t>
-      </w:r>
-      <w:r>
-        <w:t xml:space="preserve"> </w:t>
-      </w:r>
-      <w:r>
-        <w:rPr>
-          <w:b/>
-          <w:bCs/>
-        </w:rPr>
-        <w:t xml:space="preserve">name and number it was sent from</w:t>
-      </w:r>
-      <w:r>
-        <w:t xml:space="preserve">, saved at the time it is sent.</w:t>
-      </w:r>
-    </w:p>
-    <w:p>
-      <w:pPr>
-        <w:pStyle w:val="BodyText"/>
-      </w:pPr>
-      <w:r>
-        <w:rPr>
-          <w:b/>
-          <w:bCs/>
-        </w:rPr>
-        <w:t xml:space="preserve">WhatsApp.</w:t>
-      </w:r>
-      <w:r>
-        <w:t xml:space="preserve"> </w:t>
-      </w:r>
-      <w:r>
-        <w:t xml:space="preserve">We send WhatsApp through</w:t>
-      </w:r>
-      <w:r>
-        <w:t xml:space="preserve"> </w:t>
-      </w:r>
-      <w:r>
-        <w:rPr>
-          <w:b/>
-          <w:bCs/>
-        </w:rPr>
-        <w:t xml:space="preserve">Rampwin</w:t>
-      </w:r>
-      <w:r>
-        <w:t xml:space="preserve">. The status of every message and its delivery details (delivered time, read time, failure reason) are taken from Rampwin. The user must never see the name Rampwin or its codes.</w:t>
+    <w:bookmarkStart w:id="94" w:name="Xe19b28f785abee5be075f31de3f1a84f09de753"/>
+    <w:p>
+      <w:pPr>
+        <w:pStyle w:val="Heading3"/>
+      </w:pPr>
+      <w:r>
+        <w:t xml:space="preserve">7.5 Rules</w:t>
       </w:r>
     </w:p>
     <w:p>
@@ -12266,7 +11493,46 @@
         </w:numPr>
       </w:pPr>
       <w:r>
-        <w:t xml:space="preserve">Rampwin API reference: https://rampwin-api.readme.io</w:t>
+        <w:t xml:space="preserve">The choice is for</w:t>
+      </w:r>
+      <w:r>
+        <w:t xml:space="preserve"> </w:t>
+      </w:r>
+      <w:r>
+        <w:rPr>
+          <w:b/>
+          <w:bCs/>
+        </w:rPr>
+        <w:t xml:space="preserve">the whole firm</w:t>
+      </w:r>
+      <w:r>
+        <w:t xml:space="preserve">. One own number and one own domain (or mail server) cover</w:t>
+      </w:r>
+      <w:r>
+        <w:t xml:space="preserve"> </w:t>
+      </w:r>
+      <w:r>
+        <w:rPr>
+          <w:b/>
+          <w:bCs/>
+        </w:rPr>
+        <w:t xml:space="preserve">all three modules</w:t>
+      </w:r>
+      <w:r>
+        <w:t xml:space="preserve">, GST, TDS and ITR. The firm does not choose them per module. WhatsApp and email are chosen</w:t>
+      </w:r>
+      <w:r>
+        <w:t xml:space="preserve"> </w:t>
+      </w:r>
+      <w:r>
+        <w:rPr>
+          <w:b/>
+          <w:bCs/>
+        </w:rPr>
+        <w:t xml:space="preserve">separately</w:t>
+      </w:r>
+      <w:r>
+        <w:t xml:space="preserve">.</w:t>
       </w:r>
     </w:p>
     <w:p>
@@ -12278,7 +11544,121 @@
         </w:numPr>
       </w:pPr>
       <w:r>
-        <w:t xml:space="preserve">Rampwin help docs: https://docs.rampwin.com</w:t>
+        <w:t xml:space="preserve">Exactly</w:t>
+      </w:r>
+      <w:r>
+        <w:t xml:space="preserve"> </w:t>
+      </w:r>
+      <w:r>
+        <w:rPr>
+          <w:b/>
+          <w:bCs/>
+        </w:rPr>
+        <w:t xml:space="preserve">one</w:t>
+      </w:r>
+      <w:r>
+        <w:t xml:space="preserve"> </w:t>
+      </w:r>
+      <w:r>
+        <w:t xml:space="preserve">choice is in use for each channel.</w:t>
+      </w:r>
+    </w:p>
+    <w:p>
+      <w:pPr>
+        <w:pStyle w:val="Compact"/>
+        <w:numPr>
+          <w:ilvl w:val="0"/>
+          <w:numId w:val="1022"/>
+        </w:numPr>
+      </w:pPr>
+      <w:r>
+        <w:t xml:space="preserve">A setup that is not finished never takes over: messages keep going from the system default.</w:t>
+      </w:r>
+    </w:p>
+    <w:p>
+      <w:pPr>
+        <w:pStyle w:val="Compact"/>
+        <w:numPr>
+          <w:ilvl w:val="0"/>
+          <w:numId w:val="1022"/>
+        </w:numPr>
+      </w:pPr>
+      <w:r>
+        <w:t xml:space="preserve">The firm's own setup is kept when the user switches back to the system default.</w:t>
+      </w:r>
+    </w:p>
+    <w:p>
+      <w:pPr>
+        <w:pStyle w:val="Compact"/>
+        <w:numPr>
+          <w:ilvl w:val="0"/>
+          <w:numId w:val="1022"/>
+        </w:numPr>
+      </w:pPr>
+      <w:r>
+        <w:t xml:space="preserve">An email sent through the firm's own SMTP server shows the status</w:t>
+      </w:r>
+      <w:r>
+        <w:t xml:space="preserve"> </w:t>
+      </w:r>
+      <w:r>
+        <w:rPr>
+          <w:b/>
+          <w:bCs/>
+        </w:rPr>
+        <w:t xml:space="preserve">SMTP</w:t>
+      </w:r>
+      <w:r>
+        <w:t xml:space="preserve"> </w:t>
+      </w:r>
+      <w:r>
+        <w:t xml:space="preserve">in Email Logs, because Spectrum Cloud cannot check what happens after it hands the email over.</w:t>
+      </w:r>
+    </w:p>
+    <w:p>
+      <w:pPr>
+        <w:pStyle w:val="Compact"/>
+        <w:numPr>
+          <w:ilvl w:val="0"/>
+          <w:numId w:val="1022"/>
+        </w:numPr>
+      </w:pPr>
+      <w:r>
+        <w:t xml:space="preserve">The user must never see the name of the WhatsApp provider. The DNS values for email are shown</w:t>
+      </w:r>
+      <w:r>
+        <w:t xml:space="preserve"> </w:t>
+      </w:r>
+      <w:r>
+        <w:rPr>
+          <w:b/>
+          <w:bCs/>
+        </w:rPr>
+        <w:t xml:space="preserve">as given</w:t>
+      </w:r>
+      <w:r>
+        <w:t xml:space="preserve">, because the user has to copy them exactly.</w:t>
+      </w:r>
+    </w:p>
+    <w:p>
+      <w:r>
+        <w:pict>
+          <v:rect style="width:0;height:1.5pt" o:hralign="center" o:hrstd="t" o:hr="t"/>
+        </w:pict>
+      </w:r>
+    </w:p>
+    <w:bookmarkEnd w:id="94"/>
+    <w:bookmarkEnd w:id="95"/>
+    <w:bookmarkStart w:id="98" w:name="Xcfe188df4835c7be7ab3f6f8cbc0d8ee2c7b3b0"/>
+    <w:p>
+      <w:pPr>
+        <w:pStyle w:val="Heading2"/>
+        <w:pBdr>
+          <w:bottom w:val="single" w:sz="6" w:space="4" w:color="C9D2DC"/>
+        </w:pBdr>
+      </w:pPr>
+      <w:r>
+        <w:t xml:space="preserve">8. Where the data comes from</w:t>
       </w:r>
     </w:p>
     <w:p>
@@ -12286,6 +11666,145 @@
         <w:pStyle w:val="FirstParagraph"/>
       </w:pPr>
       <w:r>
+        <w:rPr>
+          <w:b/>
+          <w:bCs/>
+        </w:rPr>
+        <w:t xml:space="preserve">From the application:</w:t>
+      </w:r>
+      <w:r>
+        <w:t xml:space="preserve"> </w:t>
+      </w:r>
+      <w:r>
+        <w:t xml:space="preserve">clients, their PAN and contacts, and the registrations of each client (GSTIN, TAN, PAN, with type or place). A newly added registration gets the defaults of its module.</w:t>
+      </w:r>
+    </w:p>
+    <w:p>
+      <w:pPr>
+        <w:pStyle w:val="BodyText"/>
+      </w:pPr>
+      <w:r>
+        <w:rPr>
+          <w:b/>
+          <w:bCs/>
+        </w:rPr>
+        <w:t xml:space="preserve">Saved by Spectrum Cloud:</w:t>
+      </w:r>
+      <w:r>
+        <w:t xml:space="preserve"> </w:t>
+      </w:r>
+      <w:r>
+        <w:t xml:space="preserve">the Email and WhatsApp switch of every report and event for each registration, the contact picked for each registration, the contacts edited or added on this page, and the defaults of each module. From the Configuration page: for WhatsApp and for email,</w:t>
+      </w:r>
+      <w:r>
+        <w:t xml:space="preserve"> </w:t>
+      </w:r>
+      <w:r>
+        <w:rPr>
+          <w:b/>
+          <w:bCs/>
+        </w:rPr>
+        <w:t xml:space="preserve">which choice is in use</w:t>
+      </w:r>
+      <w:r>
+        <w:t xml:space="preserve">, and the firm's own setup (the WhatsApp number and display name, the email domain and its status, the SMTP details with the password kept safe and never shown again, and the Reply-to email). For every WhatsApp message: the</w:t>
+      </w:r>
+      <w:r>
+        <w:t xml:space="preserve"> </w:t>
+      </w:r>
+      <w:r>
+        <w:rPr>
+          <w:b/>
+          <w:bCs/>
+        </w:rPr>
+        <w:t xml:space="preserve">name and number it was sent from</w:t>
+      </w:r>
+      <w:r>
+        <w:t xml:space="preserve">, saved at the time it is sent.</w:t>
+      </w:r>
+    </w:p>
+    <w:p>
+      <w:pPr>
+        <w:pStyle w:val="BodyText"/>
+      </w:pPr>
+      <w:r>
+        <w:rPr>
+          <w:b/>
+          <w:bCs/>
+        </w:rPr>
+        <w:t xml:space="preserve">WhatsApp.</w:t>
+      </w:r>
+      <w:r>
+        <w:t xml:space="preserve"> </w:t>
+      </w:r>
+      <w:r>
+        <w:t xml:space="preserve">We send WhatsApp through</w:t>
+      </w:r>
+      <w:r>
+        <w:t xml:space="preserve"> </w:t>
+      </w:r>
+      <w:r>
+        <w:rPr>
+          <w:b/>
+          <w:bCs/>
+        </w:rPr>
+        <w:t xml:space="preserve">Rampwin</w:t>
+      </w:r>
+      <w:r>
+        <w:t xml:space="preserve">. The status of every message and its delivery details (delivered time, read time, failure reason) are taken from Rampwin. The user must never see the name Rampwin or its codes.</w:t>
+      </w:r>
+    </w:p>
+    <w:p>
+      <w:pPr>
+        <w:pStyle w:val="Compact"/>
+        <w:numPr>
+          <w:ilvl w:val="0"/>
+          <w:numId w:val="1023"/>
+        </w:numPr>
+      </w:pPr>
+      <w:r>
+        <w:t xml:space="preserve">Rampwin API reference:</w:t>
+      </w:r>
+      <w:r>
+        <w:t xml:space="preserve"> </w:t>
+      </w:r>
+      <w:hyperlink r:id="rId96">
+        <w:r>
+          <w:rPr>
+            <w:rStyle w:val="Hyperlink"/>
+          </w:rPr>
+          <w:t xml:space="preserve">https://rampwin-api.readme.io</w:t>
+        </w:r>
+      </w:hyperlink>
+    </w:p>
+    <w:p>
+      <w:pPr>
+        <w:pStyle w:val="Compact"/>
+        <w:numPr>
+          <w:ilvl w:val="0"/>
+          <w:numId w:val="1023"/>
+        </w:numPr>
+      </w:pPr>
+      <w:r>
+        <w:t xml:space="preserve">Rampwin help docs:</w:t>
+      </w:r>
+      <w:r>
+        <w:t xml:space="preserve"> </w:t>
+      </w:r>
+      <w:hyperlink r:id="rId97">
+        <w:r>
+          <w:rPr>
+            <w:rStyle w:val="Hyperlink"/>
+          </w:rPr>
+          <w:t xml:space="preserve">https://docs.rampwin.com</w:t>
+        </w:r>
+      </w:hyperlink>
+    </w:p>
+    <w:p>
+      <w:pPr>
+        <w:pStyle w:val="FirstParagraph"/>
+      </w:pPr>
+      <w:r>
         <w:t xml:space="preserve">When a firm connects its own number, the connection details and the approval status of its message templates also come from the WhatsApp provider.</w:t>
       </w:r>
     </w:p>
@@ -12304,7 +11823,7 @@
         <w:t xml:space="preserve"> </w:t>
       </w:r>
       <w:r>
-        <w:t xml:space="preserve">For the system default and for the firm’s own domain, the status of each email comes from the email provider. For an email sent through the firm’s own SMTP server there is no provider status, so Email Logs shows</w:t>
+        <w:t xml:space="preserve">For the system default and for the firm's own domain, the status of each email comes from the email provider. For an email sent through the firm's own SMTP server there is no provider status, so Email Logs shows</w:t>
       </w:r>
       <w:r>
         <w:t xml:space="preserve"> </w:t>
@@ -12320,7 +11839,7 @@
         <w:t xml:space="preserve">.</w:t>
       </w:r>
     </w:p>
-    <w:bookmarkEnd w:id="95"/>
+    <w:bookmarkEnd w:id="98"/>
     <w:sectPr>
       <w:footnotePr>
         <w:numRestart w:val="eachSect"/>
@@ -12727,6 +12246,9 @@
     <w:abstractNumId w:val="991"/>
   </w:num>
   <w:num w:numId="1017">
+    <w:abstractNumId w:val="991"/>
+  </w:num>
+  <w:num w:numId="1018">
     <w:abstractNumId w:val="99411"/>
     <w:lvlOverride w:ilvl="0">
       <w:startOverride w:val="1"/>
@@ -12756,10 +12278,10 @@
       <w:startOverride w:val="1"/>
     </w:lvlOverride>
   </w:num>
-  <w:num w:numId="1018">
+  <w:num w:numId="1019">
     <w:abstractNumId w:val="991"/>
   </w:num>
-  <w:num w:numId="1019">
+  <w:num w:numId="1020">
     <w:abstractNumId w:val="99411"/>
     <w:lvlOverride w:ilvl="0">
       <w:startOverride w:val="1"/>
@@ -12789,10 +12311,10 @@
       <w:startOverride w:val="1"/>
     </w:lvlOverride>
   </w:num>
-  <w:num w:numId="1020">
+  <w:num w:numId="1021">
     <w:abstractNumId w:val="991"/>
   </w:num>
-  <w:num w:numId="1021">
+  <w:num w:numId="1022">
     <w:abstractNumId w:val="99411"/>
     <w:lvlOverride w:ilvl="0">
       <w:startOverride w:val="1"/>
@@ -12822,7 +12344,7 @@
       <w:startOverride w:val="1"/>
     </w:lvlOverride>
   </w:num>
-  <w:num w:numId="1022">
+  <w:num w:numId="1023">
     <w:abstractNumId w:val="991"/>
   </w:num>
 </w:numbering>

</xml_diff>

<commit_message>
BRD: system default email addresses wording
Co-Authored-By: Claude Sonnet 5.5 <noreply@anthropic.com>
</commit_message>
<xml_diff>
--- a/BRD.docx
+++ b/BRD.docx
@@ -256,7 +256,7 @@
         </w:tc>
       </w:tr>
     </w:tbl>
-    <w:bookmarkStart w:id="13" w:name="Xc8951b796c7b61cbdd4998c72efbdeed0056e13"/>
+    <w:bookmarkStart w:id="13" w:name="overview"/>
     <w:p>
       <w:pPr>
         <w:pStyle w:val="Heading2"/>
@@ -268,7 +268,7 @@
         <w:t xml:space="preserve">1. Overview</w:t>
       </w:r>
     </w:p>
-    <w:bookmarkStart w:id="9" w:name="X5f5d48bced3b98d7c149293fafcf94fc98538bd"/>
+    <w:bookmarkStart w:id="9" w:name="background"/>
     <w:p>
       <w:pPr>
         <w:pStyle w:val="Heading3"/>
@@ -373,11 +373,11 @@
         <w:t xml:space="preserve"> </w:t>
       </w:r>
       <w:r>
-        <w:t xml:space="preserve">page. Today the page covers the GST module only. TDS and ITR do not have it. WhatsApp messages have no log: the user cannot see how many clients a scheduled WhatsApp run was meant for, how many messages were sent, or what happened to them. And the firm cannot choose the WhatsApp number or the email address its messages come from: they always go from the system's own number and address.</w:t>
+        <w:t xml:space="preserve">page. Today the page covers the GST module only. TDS and ITR do not have it. WhatsApp messages have no log: the user cannot see how many clients a scheduled WhatsApp run was meant for, how many messages were sent, or what happened to them. And the firm cannot choose the WhatsApp number or the email address its messages come from: they always go from the system’s own number and address.</w:t>
       </w:r>
     </w:p>
     <w:bookmarkEnd w:id="9"/>
-    <w:bookmarkStart w:id="10" w:name="Xf7bea6559bef12c9b5a4888c4b5e638d501b08e"/>
+    <w:bookmarkStart w:id="10" w:name="what-we-are-doing"/>
     <w:p>
       <w:pPr>
         <w:pStyle w:val="Heading3"/>
@@ -578,7 +578,7 @@
       </w:r>
     </w:p>
     <w:bookmarkEnd w:id="10"/>
-    <w:bookmarkStart w:id="11" w:name="X9dbc163790b80b7da6d4870327b910ca93dfddb"/>
+    <w:bookmarkStart w:id="11" w:name="goals"/>
     <w:p>
       <w:pPr>
         <w:pStyle w:val="Heading3"/>
@@ -667,7 +667,7 @@
         <w:t xml:space="preserve">who receives them</w:t>
       </w:r>
       <w:r>
-        <w:t xml:space="preserve">: the client's main contact, or another contact of the client.</w:t>
+        <w:t xml:space="preserve">: the client’s main contact, or another contact of the client.</w:t>
       </w:r>
     </w:p>
     <w:p>
@@ -679,7 +679,7 @@
         </w:numPr>
       </w:pPr>
       <w:r>
-        <w:t xml:space="preserve">Change many registrations at once (bulk), copy settings to the client's other registrations, and set</w:t>
+        <w:t xml:space="preserve">Change many registrations at once (bulk), copy settings to the client’s other registrations, and set</w:t>
       </w:r>
       <w:r>
         <w:t xml:space="preserve"> </w:t>
@@ -773,7 +773,7 @@
       </w:r>
     </w:p>
     <w:bookmarkEnd w:id="11"/>
-    <w:bookmarkStart w:id="12" w:name="X1f4012e9c4b62781074de2916856df2f3df4c87"/>
+    <w:bookmarkStart w:id="12" w:name="scope"/>
     <w:p>
       <w:pPr>
         <w:pStyle w:val="Heading3"/>
@@ -863,7 +863,7 @@
     </w:p>
     <w:bookmarkEnd w:id="12"/>
     <w:bookmarkEnd w:id="13"/>
-    <w:bookmarkStart w:id="22" w:name="X770f27a98732016b8dbb570f1ef055be35edf30"/>
+    <w:bookmarkStart w:id="22" w:name="key-concepts"/>
     <w:p>
       <w:pPr>
         <w:pStyle w:val="Heading2"/>
@@ -883,7 +883,7 @@
         <w:t xml:space="preserve">Read this section first. The rest of the document uses these terms.</w:t>
       </w:r>
     </w:p>
-    <w:bookmarkStart w:id="14" w:name="X7f5462df8089a17e43bd0511dd9288fcdcb6a73"/>
+    <w:bookmarkStart w:id="14" w:name="client-registration-and-contact"/>
     <w:p>
       <w:pPr>
         <w:pStyle w:val="Heading3"/>
@@ -1262,7 +1262,7 @@
               <w:rPr>
                 <w:sz w:val="20"/>
               </w:rPr>
-              <w:t xml:space="preserve">The client's first contact. A registration uses it unless another contact is picked for that registration</w:t>
+              <w:t xml:space="preserve">The client’s first contact. A registration uses it unless another contact is picked for that registration</w:t>
             </w:r>
           </w:p>
         </w:tc>
@@ -1291,7 +1291,7 @@
       </w:r>
     </w:p>
     <w:bookmarkEnd w:id="14"/>
-    <w:bookmarkStart w:id="15" w:name="X83db69eb340047b14f97eaee704ef26ae6a15f6"/>
+    <w:bookmarkStart w:id="15" w:name="reports-and-events"/>
     <w:p>
       <w:pPr>
         <w:pStyle w:val="Heading3"/>
@@ -1312,6 +1312,7 @@
           <w:insideH w:val="single" w:sz="4" w:space="0" w:color="D5DBE3"/>
           <w:insideV w:val="single" w:sz="4" w:space="0" w:color="D5DBE3"/>
         </w:tblBorders>
+        <w:tblLayout w:type="fixed"/>
         <w:tblCellMar>
           <w:top w:w="70" w:type="dxa"/>
           <w:left w:w="110" w:type="dxa"/>
@@ -1687,7 +1688,34 @@
         <w:ind w:left="115"/>
       </w:pPr>
       <w:r>
-        <w:t xml:space="preserve">The names on the prototype screens (for example "Form 24Q filed", "Refund issued", "Monthly TDS summary") are</w:t>
+        <w:t xml:space="preserve">The names on the prototype screens (for example</w:t>
+      </w:r>
+      <w:r>
+        <w:t xml:space="preserve"> </w:t>
+      </w:r>
+      <w:r>
+        <w:t xml:space="preserve">“Form 24Q filed”</w:t>
+      </w:r>
+      <w:r>
+        <w:t xml:space="preserve">,</w:t>
+      </w:r>
+      <w:r>
+        <w:t xml:space="preserve"> </w:t>
+      </w:r>
+      <w:r>
+        <w:t xml:space="preserve">“Refund issued”</w:t>
+      </w:r>
+      <w:r>
+        <w:t xml:space="preserve">,</w:t>
+      </w:r>
+      <w:r>
+        <w:t xml:space="preserve"> </w:t>
+      </w:r>
+      <w:r>
+        <w:t xml:space="preserve">“Monthly TDS summary”</w:t>
+      </w:r>
+      <w:r>
+        <w:t xml:space="preserve">) are</w:t>
       </w:r>
       <w:r>
         <w:t xml:space="preserve"> </w:t>
@@ -1700,11 +1728,23 @@
         <w:t xml:space="preserve">examples only</w:t>
       </w:r>
       <w:r>
-        <w:t xml:space="preserve">. The final lists will be added by the domain team. The page must work with any list: a module with no report or event shows "No reports or events for TDS yet." and its numbers show a dash.</w:t>
+        <w:t xml:space="preserve">. The final lists will be added by the domain team. The page must work with any list: a module with no report or event shows</w:t>
+      </w:r>
+      <w:r>
+        <w:t xml:space="preserve"> </w:t>
+      </w:r>
+      <w:r>
+        <w:t xml:space="preserve">“No reports or events for TDS yet.”</w:t>
+      </w:r>
+      <w:r>
+        <w:t xml:space="preserve"> </w:t>
+      </w:r>
+      <w:r>
+        <w:t xml:space="preserve">and its numbers show a dash.</w:t>
       </w:r>
     </w:p>
     <w:bookmarkEnd w:id="15"/>
-    <w:bookmarkStart w:id="16" w:name="Xbeaeecdba64e59e9f3e2056676977dc50c1c0ae"/>
+    <w:bookmarkStart w:id="16" w:name="when-a-switch-cannot-be-turned-on"/>
     <w:p>
       <w:pPr>
         <w:pStyle w:val="Heading3"/>
@@ -1795,7 +1835,7 @@
       </w:r>
     </w:p>
     <w:bookmarkEnd w:id="16"/>
-    <w:bookmarkStart w:id="17" w:name="Xfb4f61b0767c80bea6aa56662e557e1ee69f814"/>
+    <w:bookmarkStart w:id="17" w:name="Xecbce999d6317d317bf5fed5ab142cd85f03f1b"/>
     <w:p>
       <w:pPr>
         <w:pStyle w:val="Heading3"/>
@@ -1816,6 +1856,7 @@
           <w:insideH w:val="single" w:sz="4" w:space="0" w:color="D5DBE3"/>
           <w:insideV w:val="single" w:sz="4" w:space="0" w:color="D5DBE3"/>
         </w:tblBorders>
+        <w:tblLayout w:type="fixed"/>
         <w:tblCellMar>
           <w:top w:w="70" w:type="dxa"/>
           <w:left w:w="110" w:type="dxa"/>
@@ -2125,7 +2166,7 @@
       </w:r>
     </w:p>
     <w:bookmarkEnd w:id="17"/>
-    <w:bookmarkStart w:id="18" w:name="X9227148df73941ed38024824e5129f0af39589e"/>
+    <w:bookmarkStart w:id="18" w:name="trigger-event"/>
     <w:p>
       <w:pPr>
         <w:pStyle w:val="Heading3"/>
@@ -2177,7 +2218,7 @@
       </w:r>
     </w:p>
     <w:bookmarkEnd w:id="18"/>
-    <w:bookmarkStart w:id="19" w:name="X952241f8473c12a05c070a6b2388f5153966a68"/>
+    <w:bookmarkStart w:id="19" w:name="ids-the-user-sees"/>
     <w:p>
       <w:pPr>
         <w:pStyle w:val="Heading3"/>
@@ -2206,6 +2247,7 @@
           <w:insideH w:val="single" w:sz="4" w:space="0" w:color="D5DBE3"/>
           <w:insideV w:val="single" w:sz="4" w:space="0" w:color="D5DBE3"/>
         </w:tblBorders>
+        <w:tblLayout w:type="fixed"/>
         <w:tblCellMar>
           <w:top w:w="70" w:type="dxa"/>
           <w:left w:w="110" w:type="dxa"/>
@@ -2522,7 +2564,7 @@
       </w:tr>
     </w:tbl>
     <w:bookmarkEnd w:id="19"/>
-    <w:bookmarkStart w:id="20" w:name="Xd972a2146bd3960c1f8c12e5f909eaec20daa08"/>
+    <w:bookmarkStart w:id="20" w:name="numbers-and-statuses"/>
     <w:p>
       <w:pPr>
         <w:pStyle w:val="Heading3"/>
@@ -2944,7 +2986,7 @@
               <w:rPr>
                 <w:sz w:val="20"/>
               </w:rPr>
-              <w:t xml:space="preserve">Handed over to WhatsApp. Not yet on the client's phone</w:t>
+              <w:t xml:space="preserve">Handed over to WhatsApp. Not yet on the client’s phone</w:t>
             </w:r>
           </w:p>
         </w:tc>
@@ -2989,7 +3031,7 @@
               <w:rPr>
                 <w:sz w:val="20"/>
               </w:rPr>
-              <w:t xml:space="preserve">Reached the client's phone</w:t>
+              <w:t xml:space="preserve">Reached the client’s phone</w:t>
             </w:r>
           </w:p>
         </w:tc>
@@ -3093,7 +3135,7 @@
       </w:r>
     </w:p>
     <w:bookmarkEnd w:id="20"/>
-    <w:bookmarkStart w:id="21" w:name="X93bf6e8da3acf63325c389097799a1007e07b7f"/>
+    <w:bookmarkStart w:id="21" w:name="where-messages-are-sent-from"/>
     <w:p>
       <w:pPr>
         <w:pStyle w:val="Heading3"/>
@@ -3261,7 +3303,7 @@
               <w:rPr>
                 <w:sz w:val="20"/>
               </w:rPr>
-              <w:t xml:space="preserve">The firm's own WhatsApp number, its own email domain, or its own mail server (SMTP). The firm sets it up once on the Configuration page</w:t>
+              <w:t xml:space="preserve">The firm’s own WhatsApp number, its own email domain, or its own mail server (SMTP). The firm sets it up once on the Configuration page</w:t>
             </w:r>
           </w:p>
         </w:tc>
@@ -3419,7 +3461,7 @@
     </w:p>
     <w:bookmarkEnd w:id="21"/>
     <w:bookmarkEnd w:id="22"/>
-    <w:bookmarkStart w:id="23" w:name="X1d14353f54ef4e38aae925f34427e5f604e823c"/>
+    <w:bookmarkStart w:id="23" w:name="how-the-user-opens-the-page"/>
     <w:p>
       <w:pPr>
         <w:pStyle w:val="Heading2"/>
@@ -3541,6 +3583,7 @@
           <w:insideH w:val="single" w:sz="4" w:space="0" w:color="D5DBE3"/>
           <w:insideV w:val="single" w:sz="4" w:space="0" w:color="D5DBE3"/>
         </w:tblBorders>
+        <w:tblLayout w:type="fixed"/>
         <w:tblCellMar>
           <w:top w:w="70" w:type="dxa"/>
           <w:left w:w="110" w:type="dxa"/>
@@ -3816,7 +3859,7 @@
               <w:rPr>
                 <w:sz w:val="20"/>
               </w:rPr>
-              <w:t xml:space="preserve">Email Logs. It is a separate page with its own BRD, and opens inside the same app. Emails sent through the firm's own SMTP server show the status</w:t>
+              <w:t xml:space="preserve">Email Logs. It is a separate page with its own BRD, and opens inside the same app. Emails sent through the firm’s own SMTP server show the status</w:t>
             </w:r>
             <w:r>
               <w:rPr>
@@ -3899,7 +3942,7 @@
       </w:r>
     </w:p>
     <w:bookmarkEnd w:id="23"/>
-    <w:bookmarkStart w:id="41" w:name="X9fd9dae6aa9a8ceadb43be139b8559f1e5228b1"/>
+    <w:bookmarkStart w:id="41" w:name="the-client-communications-page"/>
     <w:p>
       <w:pPr>
         <w:pStyle w:val="Heading2"/>
@@ -3913,7 +3956,7 @@
     </w:p>
     <w:p>
       <w:pPr>
-        <w:pStyle w:val="FirstParagraph"/>
+        <w:pStyle w:val="CaptionedFigure"/>
         <w:keepNext/>
         <w:spacing w:before="120" w:after="40"/>
         <w:jc w:val="center"/>
@@ -3968,7 +4011,7 @@
     </w:p>
     <w:p>
       <w:pPr>
-        <w:pStyle w:val="FirstParagraph"/>
+        <w:pStyle w:val="CaptionedFigure"/>
         <w:keepNext w:val="0"/>
         <w:spacing w:before="40" w:after="240"/>
         <w:jc w:val="center"/>
@@ -3983,7 +4026,15 @@
         <w:t>Figure: Client Communications</w:t>
       </w:r>
     </w:p>
-    <w:bookmarkStart w:id="30" w:name="X0bdf74869b4e5fb41ef15fa2cb547e9ef354085"/>
+    <w:p>
+      <w:pPr>
+        <w:pStyle w:val="ImageCaption"/>
+      </w:pPr>
+      <w:r>
+        <w:t xml:space="preserve">Client Communications</w:t>
+      </w:r>
+    </w:p>
+    <w:bookmarkStart w:id="30" w:name="toolbar"/>
     <w:p>
       <w:pPr>
         <w:pStyle w:val="Heading3"/>
@@ -4019,7 +4070,7 @@
         <w:t xml:space="preserve"> </w:t>
       </w:r>
       <w:r>
-        <w:t xml:space="preserve">by client name, PAN, GSTIN, TAN, or the contact's name, email or mobile number.</w:t>
+        <w:t xml:space="preserve">by client name, PAN, GSTIN, TAN, or the contact’s name, email or mobile number.</w:t>
       </w:r>
     </w:p>
     <w:p>
@@ -4344,7 +4395,40 @@
         <w:spacing w:before="160"/>
       </w:pPr>
       <w:r>
-        <w:t xml:space="preserve">A filter shows only its name when nothing is picked ("Module"), and the choice when something is ("Module: TDS", or "Module: 2 selected"). A long choice is cut with "…" and shown in full when the pointer is on it. When a filter has 8 or more choices it gets a search box. A</w:t>
+        <w:t xml:space="preserve">A filter shows only its name when nothing is picked (</w:t>
+      </w:r>
+      <w:r>
+        <w:t xml:space="preserve">“Module”</w:t>
+      </w:r>
+      <w:r>
+        <w:t xml:space="preserve">), and the choice when something is (</w:t>
+      </w:r>
+      <w:r>
+        <w:t xml:space="preserve">“Module: TDS”</w:t>
+      </w:r>
+      <w:r>
+        <w:t xml:space="preserve">, or</w:t>
+      </w:r>
+      <w:r>
+        <w:t xml:space="preserve"> </w:t>
+      </w:r>
+      <w:r>
+        <w:t xml:space="preserve">“Module: 2 selected”</w:t>
+      </w:r>
+      <w:r>
+        <w:t xml:space="preserve">). A long choice is cut with</w:t>
+      </w:r>
+      <w:r>
+        <w:t xml:space="preserve"> </w:t>
+      </w:r>
+      <w:r>
+        <w:t xml:space="preserve">“…”</w:t>
+      </w:r>
+      <w:r>
+        <w:t xml:space="preserve"> </w:t>
+      </w:r>
+      <w:r>
+        <w:t xml:space="preserve">and shown in full when the pointer is on it. When a filter has 8 or more choices it gets a search box. A</w:t>
       </w:r>
       <w:r>
         <w:t xml:space="preserve"> </w:t>
@@ -4365,7 +4449,7 @@
     </w:p>
     <w:p>
       <w:pPr>
-        <w:pStyle w:val="BodyText"/>
+        <w:pStyle w:val="CaptionedFigure"/>
         <w:keepNext/>
         <w:spacing w:before="120" w:after="40"/>
         <w:jc w:val="center"/>
@@ -4420,7 +4504,7 @@
     </w:p>
     <w:p>
       <w:pPr>
-        <w:pStyle w:val="BodyText"/>
+        <w:pStyle w:val="CaptionedFigure"/>
         <w:keepNext w:val="0"/>
         <w:spacing w:before="40" w:after="240"/>
         <w:jc w:val="center"/>
@@ -4435,8 +4519,16 @@
         <w:t>Figure: Filters</w:t>
       </w:r>
     </w:p>
+    <w:p>
+      <w:pPr>
+        <w:pStyle w:val="ImageCaption"/>
+      </w:pPr>
+      <w:r>
+        <w:t xml:space="preserve">Filters</w:t>
+      </w:r>
+    </w:p>
     <w:bookmarkEnd w:id="30"/>
-    <w:bookmarkStart w:id="31" w:name="X741b0d0ee180564f71eefae3ee4636212a154dc"/>
+    <w:bookmarkStart w:id="31" w:name="table"/>
     <w:p>
       <w:pPr>
         <w:pStyle w:val="Heading3"/>
@@ -4647,7 +4739,25 @@
               <w:rPr>
                 <w:sz w:val="20"/>
               </w:rPr>
-              <w:t xml:space="preserve">A client row shows the name, with the PAN below it. A registration row shows its GSTIN, TAN or PAN, with its type or place (for example "Gujarat · Regular")</w:t>
+              <w:t xml:space="preserve">A client row shows the name, with the PAN below it. A registration row shows its GSTIN, TAN or PAN, with its type or place (for example</w:t>
+            </w:r>
+            <w:r>
+              <w:rPr>
+                <w:sz w:val="20"/>
+              </w:rPr>
+              <w:t xml:space="preserve"> </w:t>
+            </w:r>
+            <w:r>
+              <w:rPr>
+                <w:sz w:val="20"/>
+              </w:rPr>
+              <w:t xml:space="preserve">“Gujarat · Regular”</w:t>
+            </w:r>
+            <w:r>
+              <w:rPr>
+                <w:sz w:val="20"/>
+              </w:rPr>
+              <w:t xml:space="preserve">)</w:t>
             </w:r>
           </w:p>
         </w:tc>
@@ -4804,7 +4914,97 @@
               <w:rPr>
                 <w:sz w:val="20"/>
               </w:rPr>
-              <w:t xml:space="preserve">A client row shows the contact's picture (initials), with the name. With more than one contact it shows two pictures and "2 contacts", and a "+" count when there are more. A registration row shows its contact, and "no email" or "no mobile" in orange when one is missing</w:t>
+              <w:t xml:space="preserve">A client row shows the contact’s picture (initials), with the name. With more than one contact it shows two pictures and</w:t>
+            </w:r>
+            <w:r>
+              <w:rPr>
+                <w:sz w:val="20"/>
+              </w:rPr>
+              <w:t xml:space="preserve"> </w:t>
+            </w:r>
+            <w:r>
+              <w:rPr>
+                <w:sz w:val="20"/>
+              </w:rPr>
+              <w:t xml:space="preserve">“2 contacts”</w:t>
+            </w:r>
+            <w:r>
+              <w:rPr>
+                <w:sz w:val="20"/>
+              </w:rPr>
+              <w:t xml:space="preserve">, and a</w:t>
+            </w:r>
+            <w:r>
+              <w:rPr>
+                <w:sz w:val="20"/>
+              </w:rPr>
+              <w:t xml:space="preserve"> </w:t>
+            </w:r>
+            <w:r>
+              <w:rPr>
+                <w:sz w:val="20"/>
+              </w:rPr>
+              <w:t xml:space="preserve">“+”</w:t>
+            </w:r>
+            <w:r>
+              <w:rPr>
+                <w:sz w:val="20"/>
+              </w:rPr>
+              <w:t xml:space="preserve"> </w:t>
+            </w:r>
+            <w:r>
+              <w:rPr>
+                <w:sz w:val="20"/>
+              </w:rPr>
+              <w:t xml:space="preserve">count when there are more. A registration row shows its contact, and</w:t>
+            </w:r>
+            <w:r>
+              <w:rPr>
+                <w:sz w:val="20"/>
+              </w:rPr>
+              <w:t xml:space="preserve"> </w:t>
+            </w:r>
+            <w:r>
+              <w:rPr>
+                <w:sz w:val="20"/>
+              </w:rPr>
+              <w:t xml:space="preserve">“no email”</w:t>
+            </w:r>
+            <w:r>
+              <w:rPr>
+                <w:sz w:val="20"/>
+              </w:rPr>
+              <w:t xml:space="preserve"> </w:t>
+            </w:r>
+            <w:r>
+              <w:rPr>
+                <w:sz w:val="20"/>
+              </w:rPr>
+              <w:t xml:space="preserve">or</w:t>
+            </w:r>
+            <w:r>
+              <w:rPr>
+                <w:sz w:val="20"/>
+              </w:rPr>
+              <w:t xml:space="preserve"> </w:t>
+            </w:r>
+            <w:r>
+              <w:rPr>
+                <w:sz w:val="20"/>
+              </w:rPr>
+              <w:t xml:space="preserve">“no mobile”</w:t>
+            </w:r>
+            <w:r>
+              <w:rPr>
+                <w:sz w:val="20"/>
+              </w:rPr>
+              <w:t xml:space="preserve"> </w:t>
+            </w:r>
+            <w:r>
+              <w:rPr>
+                <w:sz w:val="20"/>
+              </w:rPr>
+              <w:t xml:space="preserve">in orange when one is missing</w:t>
             </w:r>
           </w:p>
         </w:tc>
@@ -4847,7 +5047,7 @@
               <w:rPr>
                 <w:sz w:val="20"/>
               </w:rPr>
-              <w:t xml:space="preserve">"</w:t>
+              <w:t xml:space="preserve">“</w:t>
             </w:r>
             <w:r>
               <w:rPr>
@@ -4893,7 +5093,13 @@
               <w:rPr>
                 <w:sz w:val="20"/>
               </w:rPr>
-              <w:t xml:space="preserve">on": how many of the registration's email messages are on. A client row adds up its registrations</w:t>
+              <w:t xml:space="preserve">on”</w:t>
+            </w:r>
+            <w:r>
+              <w:rPr>
+                <w:sz w:val="20"/>
+              </w:rPr>
+              <w:t xml:space="preserve">: how many of the registration’s email messages are on. A client row adds up its registrations</w:t>
             </w:r>
           </w:p>
         </w:tc>
@@ -5049,7 +5255,7 @@
       </w:r>
     </w:p>
     <w:bookmarkEnd w:id="31"/>
-    <w:bookmarkStart w:id="35" w:name="Xaba8d3b8a1daa8951cd1ad85215668891d3d888"/>
+    <w:bookmarkStart w:id="35" w:name="bulk-change"/>
     <w:p>
       <w:pPr>
         <w:pStyle w:val="Heading3"/>
@@ -5106,7 +5312,7 @@
     </w:p>
     <w:p>
       <w:pPr>
-        <w:pStyle w:val="BodyText"/>
+        <w:pStyle w:val="CaptionedFigure"/>
         <w:keepNext/>
         <w:spacing w:before="120" w:after="40"/>
         <w:jc w:val="center"/>
@@ -5161,7 +5367,7 @@
     </w:p>
     <w:p>
       <w:pPr>
-        <w:pStyle w:val="BodyText"/>
+        <w:pStyle w:val="CaptionedFigure"/>
         <w:keepNext w:val="0"/>
         <w:spacing w:before="40" w:after="240"/>
         <w:jc w:val="center"/>
@@ -5174,6 +5380,14 @@
           <w:sz w:val="19"/>
         </w:rPr>
         <w:t>Figure: Bulk change</w:t>
+      </w:r>
+    </w:p>
+    <w:p>
+      <w:pPr>
+        <w:pStyle w:val="ImageCaption"/>
+      </w:pPr>
+      <w:r>
+        <w:t xml:space="preserve">Bulk change</w:t>
       </w:r>
     </w:p>
     <w:p>
@@ -5249,7 +5463,16 @@
         <w:t xml:space="preserve"> </w:t>
       </w:r>
       <w:r>
-        <w:t xml:space="preserve">link. The button shows "3 events selected".</w:t>
+        <w:t xml:space="preserve">link. The button shows</w:t>
+      </w:r>
+      <w:r>
+        <w:t xml:space="preserve"> </w:t>
+      </w:r>
+      <w:r>
+        <w:t xml:space="preserve">“3 events selected”</w:t>
+      </w:r>
+      <w:r>
+        <w:t xml:space="preserve">.</w:t>
       </w:r>
     </w:p>
     <w:p>
@@ -5277,7 +5500,16 @@
         <w:t xml:space="preserve"> </w:t>
       </w:r>
       <w:r>
-        <w:t xml:space="preserve">are offered. When several modules are ticked, the group names carry the module name (for example "GST · Returns filed").</w:t>
+        <w:t xml:space="preserve">are offered. When several modules are ticked, the group names carry the module name (for example</w:t>
+      </w:r>
+      <w:r>
+        <w:t xml:space="preserve"> </w:t>
+      </w:r>
+      <w:r>
+        <w:t xml:space="preserve">“GST · Returns filed”</w:t>
+      </w:r>
+      <w:r>
+        <w:t xml:space="preserve">).</w:t>
       </w:r>
     </w:p>
     <w:p>
@@ -5326,7 +5558,13 @@
         </w:numPr>
       </w:pPr>
       <w:r>
-        <w:t xml:space="preserve">A message confirms the result, for example "3 events turned on for up to 2 registrations. 1 skipped, no contact for that channel."</w:t>
+        <w:t xml:space="preserve">A message confirms the result, for example</w:t>
+      </w:r>
+      <w:r>
+        <w:t xml:space="preserve"> </w:t>
+      </w:r>
+      <w:r>
+        <w:t xml:space="preserve">“3 events turned on for up to 2 registrations. 1 skipped, no contact for that channel.”</w:t>
       </w:r>
     </w:p>
     <w:p>
@@ -5352,7 +5590,7 @@
       </w:r>
     </w:p>
     <w:bookmarkEnd w:id="35"/>
-    <w:bookmarkStart w:id="39" w:name="X80e054374739b062e5806bd23ed2753ab8c61b7"/>
+    <w:bookmarkStart w:id="39" w:name="defaults-for-new-clients"/>
     <w:p>
       <w:pPr>
         <w:pStyle w:val="Heading3"/>
@@ -5363,7 +5601,7 @@
     </w:p>
     <w:p>
       <w:pPr>
-        <w:pStyle w:val="FirstParagraph"/>
+        <w:pStyle w:val="CaptionedFigure"/>
         <w:keepNext/>
         <w:spacing w:before="120" w:after="40"/>
         <w:jc w:val="center"/>
@@ -5418,7 +5656,7 @@
     </w:p>
     <w:p>
       <w:pPr>
-        <w:pStyle w:val="FirstParagraph"/>
+        <w:pStyle w:val="CaptionedFigure"/>
         <w:keepNext w:val="0"/>
         <w:spacing w:before="40" w:after="240"/>
         <w:jc w:val="center"/>
@@ -5431,6 +5669,14 @@
           <w:sz w:val="19"/>
         </w:rPr>
         <w:t>Figure: Defaults for new clients</w:t>
+      </w:r>
+    </w:p>
+    <w:p>
+      <w:pPr>
+        <w:pStyle w:val="ImageCaption"/>
+      </w:pPr>
+      <w:r>
+        <w:t xml:space="preserve">Defaults for new clients</w:t>
       </w:r>
     </w:p>
     <w:p>
@@ -5518,7 +5764,13 @@
         <w:t xml:space="preserve"> </w:t>
       </w:r>
       <w:r>
-        <w:t xml:space="preserve">(or TANs, PANs). A confirmation asks first: "This changes all N existing GSTINs. Their current GST settings are replaced by the defaults above."</w:t>
+        <w:t xml:space="preserve">(or TANs, PANs). A confirmation asks first:</w:t>
+      </w:r>
+      <w:r>
+        <w:t xml:space="preserve"> </w:t>
+      </w:r>
+      <w:r>
+        <w:t xml:space="preserve">“This changes all N existing GSTINs. Their current GST settings are replaced by the defaults above.”</w:t>
       </w:r>
     </w:p>
     <w:p>
@@ -5534,7 +5786,7 @@
       </w:r>
     </w:p>
     <w:bookmarkEnd w:id="39"/>
-    <w:bookmarkStart w:id="40" w:name="Xfc4e94f559e5b2235902737215338b3e2f453df"/>
+    <w:bookmarkStart w:id="40" w:name="saving"/>
     <w:p>
       <w:pPr>
         <w:pStyle w:val="Heading3"/>
@@ -5548,7 +5800,19 @@
         <w:pStyle w:val="FirstParagraph"/>
       </w:pPr>
       <w:r>
-        <w:t xml:space="preserve">Every change on the page is saved on its own, a moment after it is made, with a short "Saved" message. There is no Save button.</w:t>
+        <w:t xml:space="preserve">Every change on the page is saved on its own, a moment after it is made, with a short</w:t>
+      </w:r>
+      <w:r>
+        <w:t xml:space="preserve"> </w:t>
+      </w:r>
+      <w:r>
+        <w:t xml:space="preserve">“Saved”</w:t>
+      </w:r>
+      <w:r>
+        <w:t xml:space="preserve"> </w:t>
+      </w:r>
+      <w:r>
+        <w:t xml:space="preserve">message. There is no Save button.</w:t>
       </w:r>
     </w:p>
     <w:p>
@@ -5560,7 +5824,7 @@
     </w:p>
     <w:bookmarkEnd w:id="40"/>
     <w:bookmarkEnd w:id="41"/>
-    <w:bookmarkStart w:id="55" w:name="X376e37be42c14b064f3458fb3fbde9b41a41c1b"/>
+    <w:bookmarkStart w:id="55" w:name="a-registration-side-panel"/>
     <w:p>
       <w:pPr>
         <w:pStyle w:val="Heading2"/>
@@ -5582,7 +5846,7 @@
     </w:p>
     <w:p>
       <w:pPr>
-        <w:pStyle w:val="BodyText"/>
+        <w:pStyle w:val="CaptionedFigure"/>
         <w:keepNext/>
         <w:spacing w:before="120" w:after="40"/>
         <w:jc w:val="center"/>
@@ -5637,7 +5901,7 @@
     </w:p>
     <w:p>
       <w:pPr>
-        <w:pStyle w:val="BodyText"/>
+        <w:pStyle w:val="CaptionedFigure"/>
         <w:keepNext w:val="0"/>
         <w:spacing w:before="40" w:after="240"/>
         <w:jc w:val="center"/>
@@ -5654,13 +5918,21 @@
     </w:p>
     <w:p>
       <w:pPr>
+        <w:pStyle w:val="ImageCaption"/>
+      </w:pPr>
+      <w:r>
+        <w:t xml:space="preserve">Registration panel</w:t>
+      </w:r>
+    </w:p>
+    <w:p>
+      <w:pPr>
         <w:pStyle w:val="BodyText"/>
       </w:pPr>
       <w:r>
         <w:t xml:space="preserve">The header shows the client name, the GSTIN, TAN or PAN, its module tag and its type.</w:t>
       </w:r>
     </w:p>
-    <w:bookmarkStart w:id="48" w:name="X73148dec013d986a6e46dd2433a59c6b4077b55"/>
+    <w:bookmarkStart w:id="48" w:name="contact"/>
     <w:p>
       <w:pPr>
         <w:pStyle w:val="Heading3"/>
@@ -5671,7 +5943,7 @@
     </w:p>
     <w:p>
       <w:pPr>
-        <w:pStyle w:val="FirstParagraph"/>
+        <w:pStyle w:val="CaptionedFigure"/>
         <w:keepNext/>
         <w:spacing w:before="120" w:after="40"/>
         <w:jc w:val="center"/>
@@ -5726,7 +5998,7 @@
     </w:p>
     <w:p>
       <w:pPr>
-        <w:pStyle w:val="FirstParagraph"/>
+        <w:pStyle w:val="CaptionedFigure"/>
         <w:keepNext w:val="0"/>
         <w:spacing w:before="40" w:after="240"/>
         <w:jc w:val="center"/>
@@ -5743,10 +6015,18 @@
     </w:p>
     <w:p>
       <w:pPr>
+        <w:pStyle w:val="ImageCaption"/>
+      </w:pPr>
+      <w:r>
+        <w:t xml:space="preserve">Choosing a contact</w:t>
+      </w:r>
+    </w:p>
+    <w:p>
+      <w:pPr>
         <w:pStyle w:val="BodyText"/>
       </w:pPr>
       <w:r>
-        <w:t xml:space="preserve">A card shows the contact that receives this registration's messages: name, email and mobile number. A contact who is the client's main contact carries a</w:t>
+        <w:t xml:space="preserve">A card shows the contact that receives this registration’s messages: name, email and mobile number. A contact who is the client’s main contact carries a</w:t>
       </w:r>
       <w:r>
         <w:t xml:space="preserve"> </w:t>
@@ -5762,7 +6042,13 @@
         <w:t xml:space="preserve"> </w:t>
       </w:r>
       <w:r>
-        <w:t xml:space="preserve">label. If something is missing, it shows in orange ("No email").</w:t>
+        <w:t xml:space="preserve">label. If something is missing, it shows in orange (</w:t>
+      </w:r>
+      <w:r>
+        <w:t xml:space="preserve">“No email”</w:t>
+      </w:r>
+      <w:r>
+        <w:t xml:space="preserve">).</w:t>
       </w:r>
     </w:p>
     <w:tbl>
@@ -5924,7 +6210,7 @@
               <w:rPr>
                 <w:sz w:val="20"/>
               </w:rPr>
-              <w:t xml:space="preserve">Opens a form with the contact's name, email and mobile number, already filled in</w:t>
+              <w:t xml:space="preserve">Opens a form with the contact’s name, email and mobile number, already filled in</w:t>
             </w:r>
           </w:p>
         </w:tc>
@@ -6088,7 +6374,7 @@
           <w:b/>
           <w:bCs/>
         </w:rPr>
-        <w:t xml:space="preserve">taken from the client's contacts in the application</w:t>
+        <w:t xml:space="preserve">taken from the client’s contacts in the application</w:t>
       </w:r>
       <w:r>
         <w:t xml:space="preserve">. A contact edited or added on this page is</w:t>
@@ -6120,7 +6406,7 @@
       </w:r>
     </w:p>
     <w:bookmarkEnd w:id="48"/>
-    <w:bookmarkStart w:id="52" w:name="Xd27bbfa21e976bb2633e35d92672ff70520d159"/>
+    <w:bookmarkStart w:id="52" w:name="reports-and-events-1"/>
     <w:p>
       <w:pPr>
         <w:pStyle w:val="Heading3"/>
@@ -6267,7 +6553,7 @@
     </w:p>
     <w:p>
       <w:pPr>
-        <w:pStyle w:val="FirstParagraph"/>
+        <w:pStyle w:val="CaptionedFigure"/>
         <w:keepNext/>
         <w:spacing w:before="120" w:after="40"/>
         <w:jc w:val="center"/>
@@ -6322,7 +6608,7 @@
     </w:p>
     <w:p>
       <w:pPr>
-        <w:pStyle w:val="FirstParagraph"/>
+        <w:pStyle w:val="CaptionedFigure"/>
         <w:keepNext w:val="0"/>
         <w:spacing w:before="40" w:after="240"/>
         <w:jc w:val="center"/>
@@ -6337,8 +6623,16 @@
         <w:t>Figure: A module with no reports or events</w:t>
       </w:r>
     </w:p>
+    <w:p>
+      <w:pPr>
+        <w:pStyle w:val="ImageCaption"/>
+      </w:pPr>
+      <w:r>
+        <w:t xml:space="preserve">A module with no reports or events</w:t>
+      </w:r>
+    </w:p>
     <w:bookmarkEnd w:id="52"/>
-    <w:bookmarkStart w:id="53" w:name="X83ab0884ea2ee43152b8b5989ddf5b644b70603"/>
+    <w:bookmarkStart w:id="53" w:name="send-button"/>
     <w:p>
       <w:pPr>
         <w:pStyle w:val="Heading3"/>
@@ -6391,7 +6685,7 @@
           <w:b/>
           <w:bCs/>
         </w:rPr>
-        <w:t xml:space="preserve">sends that report to this registration's contact by that channel straight away</w:t>
+        <w:t xml:space="preserve">sends that report to this registration’s contact by that channel straight away</w:t>
       </w:r>
       <w:r>
         <w:t xml:space="preserve">, even when the switch is off. A channel the report does not support has no icon. An icon is greyed out when the contact has no email or mobile number. A message says what was sent and to whom.</w:t>
@@ -6438,13 +6732,13 @@
       </w:r>
     </w:p>
     <w:bookmarkEnd w:id="53"/>
-    <w:bookmarkStart w:id="54" w:name="X2163e7bea5c92e50173758ba412c366752e0406"/>
+    <w:bookmarkStart w:id="54" w:name="copy-to-the-clients-other-registrations"/>
     <w:p>
       <w:pPr>
         <w:pStyle w:val="Heading3"/>
       </w:pPr>
       <w:r>
-        <w:t xml:space="preserve">5.4 Copy to the client's other registrations</w:t>
+        <w:t xml:space="preserve">5.4 Copy to the client’s other registrations</w:t>
       </w:r>
     </w:p>
     <w:p>
@@ -6462,7 +6756,7 @@
           <w:b/>
           <w:bCs/>
         </w:rPr>
-        <w:t xml:space="preserve">Copy to client's other GSTINs</w:t>
+        <w:t xml:space="preserve">Copy to client’s other GSTINs</w:t>
       </w:r>
       <w:r>
         <w:t xml:space="preserve"> </w:t>
@@ -6489,7 +6783,19 @@
         <w:pStyle w:val="BodyText"/>
       </w:pPr>
       <w:r>
-        <w:t xml:space="preserve">A confirmation asks first: "This changes the other 3 GSTINs of {client}. Their GST switches are replaced by the ones on this page. Contacts stay as they are." The button is not shown when the client has no other registration of that module.</w:t>
+        <w:t xml:space="preserve">A confirmation asks first:</w:t>
+      </w:r>
+      <w:r>
+        <w:t xml:space="preserve"> </w:t>
+      </w:r>
+      <w:r>
+        <w:t xml:space="preserve">“This changes the other 3 GSTINs of {client}. Their GST switches are replaced by the ones on this page. Contacts stay as they are.”</w:t>
+      </w:r>
+      <w:r>
+        <w:t xml:space="preserve"> </w:t>
+      </w:r>
+      <w:r>
+        <w:t xml:space="preserve">The button is not shown when the client has no other registration of that module.</w:t>
       </w:r>
     </w:p>
     <w:p>
@@ -6501,7 +6807,7 @@
     </w:p>
     <w:bookmarkEnd w:id="54"/>
     <w:bookmarkEnd w:id="55"/>
-    <w:bookmarkStart w:id="70" w:name="X66913532a93dec34aabbba4ad0d237a55d74772"/>
+    <w:bookmarkStart w:id="70" w:name="whatsapp-logs"/>
     <w:p>
       <w:pPr>
         <w:pStyle w:val="Heading2"/>
@@ -6513,7 +6819,7 @@
         <w:t xml:space="preserve">6. WhatsApp Logs</w:t>
       </w:r>
     </w:p>
-    <w:bookmarkStart w:id="56" w:name="X01085a192735aac802d0e83e6ec2dfd5a573dc5"/>
+    <w:bookmarkStart w:id="56" w:name="what-it-shows"/>
     <w:p>
       <w:pPr>
         <w:pStyle w:val="Heading3"/>
@@ -6629,7 +6935,7 @@
       </w:r>
     </w:p>
     <w:bookmarkEnd w:id="56"/>
-    <w:bookmarkStart w:id="57" w:name="X99f7a6a25f3f73597f61721bdade3f1f02c2405"/>
+    <w:bookmarkStart w:id="57" w:name="toolbar-1"/>
     <w:p>
       <w:pPr>
         <w:pStyle w:val="Heading3"/>
@@ -6720,7 +7026,7 @@
         </w:numPr>
       </w:pPr>
       <w:r>
-        <w:t xml:space="preserve">Choosing a Module narrows the Trigger event choices to that module's events.</w:t>
+        <w:t xml:space="preserve">Choosing a Module narrows the Trigger event choices to that module’s events.</w:t>
       </w:r>
     </w:p>
     <w:p>
@@ -6742,7 +7048,31 @@
         <w:t xml:space="preserve"> </w:t>
       </w:r>
       <w:r>
-        <w:t xml:space="preserve">lists every number that messages have gone out from, each with its display name and, in small light text below it, the number. For example "CA Connect" with "+91 98765 00000" below, or the firm's own name and number. Choosing one or more shows only the messages (or runs) sent from them.</w:t>
+        <w:t xml:space="preserve">lists every number that messages have gone out from, each with its display name and, in small light text below it, the number. For example</w:t>
+      </w:r>
+      <w:r>
+        <w:t xml:space="preserve"> </w:t>
+      </w:r>
+      <w:r>
+        <w:t xml:space="preserve">“CA Connect”</w:t>
+      </w:r>
+      <w:r>
+        <w:t xml:space="preserve"> </w:t>
+      </w:r>
+      <w:r>
+        <w:t xml:space="preserve">with</w:t>
+      </w:r>
+      <w:r>
+        <w:t xml:space="preserve"> </w:t>
+      </w:r>
+      <w:r>
+        <w:t xml:space="preserve">“+91 98765 00000”</w:t>
+      </w:r>
+      <w:r>
+        <w:t xml:space="preserve"> </w:t>
+      </w:r>
+      <w:r>
+        <w:t xml:space="preserve">below, or the firm’s own name and number. Choosing one or more shows only the messages (or runs) sent from them.</w:t>
       </w:r>
     </w:p>
     <w:p>
@@ -6803,7 +7133,7 @@
       </w:r>
     </w:p>
     <w:bookmarkEnd w:id="57"/>
-    <w:bookmarkStart w:id="61" w:name="X6a62d82198c7e87898e0d0bed25280430290f66"/>
+    <w:bookmarkStart w:id="61" w:name="bulk-messages-tab"/>
     <w:p>
       <w:pPr>
         <w:pStyle w:val="Heading3"/>
@@ -6814,7 +7144,7 @@
     </w:p>
     <w:p>
       <w:pPr>
-        <w:pStyle w:val="FirstParagraph"/>
+        <w:pStyle w:val="CaptionedFigure"/>
         <w:keepNext/>
         <w:spacing w:before="120" w:after="40"/>
         <w:jc w:val="center"/>
@@ -6869,7 +7199,7 @@
     </w:p>
     <w:p>
       <w:pPr>
-        <w:pStyle w:val="FirstParagraph"/>
+        <w:pStyle w:val="CaptionedFigure"/>
         <w:keepNext w:val="0"/>
         <w:spacing w:before="40" w:after="240"/>
         <w:jc w:val="center"/>
@@ -6882,6 +7212,14 @@
           <w:sz w:val="19"/>
         </w:rPr>
         <w:t>Figure: Bulk messages tab</w:t>
+      </w:r>
+    </w:p>
+    <w:p>
+      <w:pPr>
+        <w:pStyle w:val="ImageCaption"/>
+      </w:pPr>
+      <w:r>
+        <w:t xml:space="preserve">Bulk messages tab</w:t>
       </w:r>
     </w:p>
     <w:p>
@@ -7538,7 +7876,7 @@
       </w:r>
     </w:p>
     <w:bookmarkEnd w:id="61"/>
-    <w:bookmarkStart w:id="65" w:name="X8edc63da622e57b5a4db9812c9f97ddae01fd12"/>
+    <w:bookmarkStart w:id="65" w:name="when-the-user-clicks-a-run-the-run-page"/>
     <w:p>
       <w:pPr>
         <w:pStyle w:val="Heading3"/>
@@ -7549,7 +7887,7 @@
     </w:p>
     <w:p>
       <w:pPr>
-        <w:pStyle w:val="FirstParagraph"/>
+        <w:pStyle w:val="CaptionedFigure"/>
         <w:keepNext/>
         <w:spacing w:before="120" w:after="40"/>
         <w:jc w:val="center"/>
@@ -7604,7 +7942,7 @@
     </w:p>
     <w:p>
       <w:pPr>
-        <w:pStyle w:val="FirstParagraph"/>
+        <w:pStyle w:val="CaptionedFigure"/>
         <w:keepNext w:val="0"/>
         <w:spacing w:before="40" w:after="240"/>
         <w:jc w:val="center"/>
@@ -7617,6 +7955,14 @@
           <w:sz w:val="19"/>
         </w:rPr>
         <w:t>Figure: Run page</w:t>
+      </w:r>
+    </w:p>
+    <w:p>
+      <w:pPr>
+        <w:pStyle w:val="ImageCaption"/>
+      </w:pPr>
+      <w:r>
+        <w:t xml:space="preserve">Run page</w:t>
       </w:r>
     </w:p>
     <w:p>
@@ -8114,7 +8460,7 @@
       </w:tr>
     </w:tbl>
     <w:bookmarkEnd w:id="65"/>
-    <w:bookmarkStart w:id="69" w:name="X3d239284318bf903e1a61fe3727324c5fccb0cd"/>
+    <w:bookmarkStart w:id="69" w:name="single-messages-tab"/>
     <w:p>
       <w:pPr>
         <w:pStyle w:val="Heading3"/>
@@ -8125,7 +8471,7 @@
     </w:p>
     <w:p>
       <w:pPr>
-        <w:pStyle w:val="FirstParagraph"/>
+        <w:pStyle w:val="CaptionedFigure"/>
         <w:keepNext/>
         <w:spacing w:before="120" w:after="40"/>
         <w:jc w:val="center"/>
@@ -8180,7 +8526,7 @@
     </w:p>
     <w:p>
       <w:pPr>
-        <w:pStyle w:val="FirstParagraph"/>
+        <w:pStyle w:val="CaptionedFigure"/>
         <w:keepNext w:val="0"/>
         <w:spacing w:before="40" w:after="240"/>
         <w:jc w:val="center"/>
@@ -8193,6 +8539,14 @@
           <w:sz w:val="19"/>
         </w:rPr>
         <w:t>Figure: Single messages tab</w:t>
+      </w:r>
+    </w:p>
+    <w:p>
+      <w:pPr>
+        <w:pStyle w:val="ImageCaption"/>
+      </w:pPr>
+      <w:r>
+        <w:t xml:space="preserve">Single messages tab</w:t>
       </w:r>
     </w:p>
     <w:p>
@@ -8500,7 +8854,7 @@
               <w:rPr>
                 <w:sz w:val="20"/>
               </w:rPr>
-              <w:t xml:space="preserve">From the domain list. The report's name when sent with the Send button</w:t>
+              <w:t xml:space="preserve">From the domain list. The report’s name when sent with the Send button</w:t>
             </w:r>
           </w:p>
         </w:tc>
@@ -8762,7 +9116,7 @@
     </w:p>
     <w:bookmarkEnd w:id="69"/>
     <w:bookmarkEnd w:id="70"/>
-    <w:bookmarkStart w:id="95" w:name="Xbfcdbca723139e0f8827222652cde3bd6838f23"/>
+    <w:bookmarkStart w:id="94" w:name="Xbf296b5d01d8d568cab4060f92b9ecc4a3fc7a6"/>
     <w:p>
       <w:pPr>
         <w:pStyle w:val="Heading2"/>
@@ -8840,7 +9194,7 @@
         <w:t xml:space="preserve">: the system default works from the first day.</w:t>
       </w:r>
     </w:p>
-    <w:bookmarkStart w:id="74" w:name="X4c3cc2dbad651b4676c333db5b72bcb392b0faf"/>
+    <w:bookmarkStart w:id="74" w:name="layout"/>
     <w:p>
       <w:pPr>
         <w:pStyle w:val="Heading3"/>
@@ -8851,7 +9205,7 @@
     </w:p>
     <w:p>
       <w:pPr>
-        <w:pStyle w:val="FirstParagraph"/>
+        <w:pStyle w:val="CaptionedFigure"/>
         <w:keepNext/>
         <w:spacing w:before="120" w:after="40"/>
         <w:jc w:val="center"/>
@@ -8906,7 +9260,7 @@
     </w:p>
     <w:p>
       <w:pPr>
-        <w:pStyle w:val="FirstParagraph"/>
+        <w:pStyle w:val="CaptionedFigure"/>
         <w:keepNext w:val="0"/>
         <w:spacing w:before="40" w:after="240"/>
         <w:jc w:val="center"/>
@@ -8919,6 +9273,14 @@
           <w:sz w:val="19"/>
         </w:rPr>
         <w:t>Figure: Configuration, WhatsApp</w:t>
+      </w:r>
+    </w:p>
+    <w:p>
+      <w:pPr>
+        <w:pStyle w:val="ImageCaption"/>
+      </w:pPr>
+      <w:r>
+        <w:t xml:space="preserve">Configuration, WhatsApp</w:t>
       </w:r>
     </w:p>
     <w:p>
@@ -9004,7 +9366,7 @@
         <w:t xml:space="preserve">Active</w:t>
       </w:r>
       <w:r>
-        <w:t xml:space="preserve">. With the firm's own setup it shows that number or address.</w:t>
+        <w:t xml:space="preserve">. With the firm’s own setup it shows that number or address.</w:t>
       </w:r>
     </w:p>
     <w:p>
@@ -9020,7 +9382,7 @@
           <w:b/>
           <w:bCs/>
         </w:rPr>
-        <w:t xml:space="preserve">How should we send ...?</w:t>
+        <w:t xml:space="preserve">How should we send …?</w:t>
       </w:r>
       <w:r>
         <w:t xml:space="preserve"> </w:t>
@@ -9121,7 +9483,7 @@
       </w:r>
     </w:p>
     <w:bookmarkEnd w:id="74"/>
-    <w:bookmarkStart w:id="78" w:name="X48dd68a1bab067784b68dc3cb5dc3151b4e364c"/>
+    <w:bookmarkStart w:id="78" w:name="Xe5ab3a5a5e0c3c7a39f4a692acf7ca7e822e4b7"/>
     <w:p>
       <w:pPr>
         <w:pStyle w:val="Heading3"/>
@@ -9261,7 +9623,16 @@
         <w:t xml:space="preserve">Switching asks first</w:t>
       </w:r>
       <w:r>
-        <w:t xml:space="preserve">, for WhatsApp and for email, because it changes what the clients see. The bar turns into a question, for example "Switch now? Messages will go out from the system default number. Your clients will see that number as the sender.", with</w:t>
+        <w:t xml:space="preserve">, for WhatsApp and for email, because it changes what the clients see. The bar turns into a question, for example</w:t>
+      </w:r>
+      <w:r>
+        <w:t xml:space="preserve"> </w:t>
+      </w:r>
+      <w:r>
+        <w:t xml:space="preserve">“Switch now? Messages will go out from the system default number. Your clients will see that number as the sender.”</w:t>
+      </w:r>
+      <w:r>
+        <w:t xml:space="preserve">, with</w:t>
       </w:r>
       <w:r>
         <w:t xml:space="preserve"> </w:t>
@@ -9359,6 +9730,104 @@
           </wp:inline>
         </w:drawing>
       </w:r>
+      <w:r>
+        <w:t xml:space="preserve"> </w:t>
+      </w:r>
+      <w:r>
+        <w:t xml:space="preserve">- A card that is not finished (not connected, not verified) cannot be switched to. Until it is finished, messages keep going from the system default.</w:t>
+      </w:r>
+      <w:r>
+        <w:t xml:space="preserve"> </w:t>
+      </w:r>
+      <w:r>
+        <w:t xml:space="preserve">-</w:t>
+      </w:r>
+      <w:r>
+        <w:t xml:space="preserve"> </w:t>
+      </w:r>
+      <w:r>
+        <w:rPr>
+          <w:b/>
+          <w:bCs/>
+        </w:rPr>
+        <w:t xml:space="preserve">When the setup finishes, the card is switched to automatically</w:t>
+      </w:r>
+      <w:r>
+        <w:t xml:space="preserve">, because that is why the user did it: when WhatsApp is connected, when the domain is verified, and when the mail server connects.</w:t>
+      </w:r>
+      <w:r>
+        <w:t xml:space="preserve"> </w:t>
+      </w:r>
+      <w:r>
+        <w:t xml:space="preserve">-</w:t>
+      </w:r>
+      <w:r>
+        <w:t xml:space="preserve"> </w:t>
+      </w:r>
+      <w:r>
+        <w:rPr>
+          <w:b/>
+          <w:bCs/>
+        </w:rPr>
+        <w:t xml:space="preserve">Disconnect</w:t>
+      </w:r>
+      <w:r>
+        <w:t xml:space="preserve"> </w:t>
+      </w:r>
+      <w:r>
+        <w:t xml:space="preserve">(WhatsApp) and</w:t>
+      </w:r>
+      <w:r>
+        <w:t xml:space="preserve"> </w:t>
+      </w:r>
+      <w:r>
+        <w:rPr>
+          <w:b/>
+          <w:bCs/>
+        </w:rPr>
+        <w:t xml:space="preserve">Start over</w:t>
+      </w:r>
+      <w:r>
+        <w:t xml:space="preserve"> </w:t>
+      </w:r>
+      <w:r>
+        <w:t xml:space="preserve">(domain) put messages back on the system default.</w:t>
+      </w:r>
+      <w:r>
+        <w:t xml:space="preserve"> </w:t>
+      </w:r>
+      <w:r>
+        <w:t xml:space="preserve">- Switching back to the system default</w:t>
+      </w:r>
+      <w:r>
+        <w:t xml:space="preserve"> </w:t>
+      </w:r>
+      <w:r>
+        <w:rPr>
+          <w:b/>
+          <w:bCs/>
+        </w:rPr>
+        <w:t xml:space="preserve">does not delete</w:t>
+      </w:r>
+      <w:r>
+        <w:t xml:space="preserve"> </w:t>
+      </w:r>
+      <w:r>
+        <w:t xml:space="preserve">the firm’s own setup. It stays saved, and the user can switch to it again at any time. The card then shows</w:t>
+      </w:r>
+      <w:r>
+        <w:t xml:space="preserve"> </w:t>
+      </w:r>
+      <w:r>
+        <w:rPr>
+          <w:b/>
+          <w:bCs/>
+        </w:rPr>
+        <w:t xml:space="preserve">Not in use</w:t>
+      </w:r>
+      <w:r>
+        <w:t xml:space="preserve">.</w:t>
+      </w:r>
     </w:p>
     <w:p>
       <w:pPr>
@@ -9377,118 +9846,8 @@
         <w:t>Figure: Asking before a switch</w:t>
       </w:r>
     </w:p>
-    <w:p>
-      <w:pPr>
-        <w:pStyle w:val="Compact"/>
-        <w:numPr>
-          <w:ilvl w:val="0"/>
-          <w:numId w:val="1017"/>
-        </w:numPr>
-      </w:pPr>
-      <w:r>
-        <w:t xml:space="preserve">A card that is not finished (not connected, not verified) cannot be switched to. Until it is finished, messages keep going from the system default.</w:t>
-      </w:r>
-    </w:p>
-    <w:p>
-      <w:pPr>
-        <w:pStyle w:val="Compact"/>
-        <w:numPr>
-          <w:ilvl w:val="0"/>
-          <w:numId w:val="1017"/>
-        </w:numPr>
-      </w:pPr>
-      <w:r>
-        <w:rPr>
-          <w:b/>
-          <w:bCs/>
-        </w:rPr>
-        <w:t xml:space="preserve">When the setup finishes, the card is switched to automatically</w:t>
-      </w:r>
-      <w:r>
-        <w:t xml:space="preserve">, because that is why the user did it: when WhatsApp is connected, when the domain is verified, and when the mail server connects.</w:t>
-      </w:r>
-    </w:p>
-    <w:p>
-      <w:pPr>
-        <w:pStyle w:val="Compact"/>
-        <w:numPr>
-          <w:ilvl w:val="0"/>
-          <w:numId w:val="1017"/>
-        </w:numPr>
-      </w:pPr>
-      <w:r>
-        <w:rPr>
-          <w:b/>
-          <w:bCs/>
-        </w:rPr>
-        <w:t xml:space="preserve">Disconnect</w:t>
-      </w:r>
-      <w:r>
-        <w:t xml:space="preserve"> </w:t>
-      </w:r>
-      <w:r>
-        <w:t xml:space="preserve">(WhatsApp) and</w:t>
-      </w:r>
-      <w:r>
-        <w:t xml:space="preserve"> </w:t>
-      </w:r>
-      <w:r>
-        <w:rPr>
-          <w:b/>
-          <w:bCs/>
-        </w:rPr>
-        <w:t xml:space="preserve">Start over</w:t>
-      </w:r>
-      <w:r>
-        <w:t xml:space="preserve"> </w:t>
-      </w:r>
-      <w:r>
-        <w:t xml:space="preserve">(domain) put messages back on the system default.</w:t>
-      </w:r>
-    </w:p>
-    <w:p>
-      <w:pPr>
-        <w:pStyle w:val="Compact"/>
-        <w:numPr>
-          <w:ilvl w:val="0"/>
-          <w:numId w:val="1017"/>
-        </w:numPr>
-      </w:pPr>
-      <w:r>
-        <w:t xml:space="preserve">Switching back to the system default</w:t>
-      </w:r>
-      <w:r>
-        <w:t xml:space="preserve"> </w:t>
-      </w:r>
-      <w:r>
-        <w:rPr>
-          <w:b/>
-          <w:bCs/>
-        </w:rPr>
-        <w:t xml:space="preserve">does not delete</w:t>
-      </w:r>
-      <w:r>
-        <w:t xml:space="preserve"> </w:t>
-      </w:r>
-      <w:r>
-        <w:t xml:space="preserve">the firm's own setup. It stays saved, and the user can switch to it again at any time. The card then shows</w:t>
-      </w:r>
-      <w:r>
-        <w:t xml:space="preserve"> </w:t>
-      </w:r>
-      <w:r>
-        <w:rPr>
-          <w:b/>
-          <w:bCs/>
-        </w:rPr>
-        <w:t xml:space="preserve">Not in use</w:t>
-      </w:r>
-      <w:r>
-        <w:t xml:space="preserve">.</w:t>
-      </w:r>
-    </w:p>
     <w:bookmarkEnd w:id="78"/>
-    <w:bookmarkStart w:id="82" w:name="Xb6f687164e552578f7042809f91095c24640259"/>
+    <w:bookmarkStart w:id="82" w:name="whatsapp"/>
     <w:p>
       <w:pPr>
         <w:pStyle w:val="Heading3"/>
@@ -9706,7 +10065,7 @@
               <w:rPr>
                 <w:sz w:val="20"/>
               </w:rPr>
-              <w:t xml:space="preserve">The firm's own WhatsApp Business number</w:t>
+              <w:t xml:space="preserve">The firm’s own WhatsApp Business number</w:t>
             </w:r>
           </w:p>
         </w:tc>
@@ -9730,7 +10089,7 @@
         <w:pStyle w:val="Compact"/>
         <w:numPr>
           <w:ilvl w:val="0"/>
-          <w:numId w:val="1018"/>
+          <w:numId w:val="1017"/>
         </w:numPr>
       </w:pPr>
       <w:r>
@@ -9755,7 +10114,7 @@
         <w:pStyle w:val="Compact"/>
         <w:numPr>
           <w:ilvl w:val="0"/>
-          <w:numId w:val="1018"/>
+          <w:numId w:val="1017"/>
         </w:numPr>
       </w:pPr>
       <w:r>
@@ -9780,7 +10139,7 @@
         <w:pStyle w:val="Compact"/>
         <w:numPr>
           <w:ilvl w:val="0"/>
-          <w:numId w:val="1018"/>
+          <w:numId w:val="1017"/>
         </w:numPr>
       </w:pPr>
       <w:r>
@@ -9863,11 +10222,11 @@
         <w:pStyle w:val="Compact"/>
         <w:numPr>
           <w:ilvl w:val="0"/>
-          <w:numId w:val="1018"/>
+          <w:numId w:val="1017"/>
         </w:numPr>
       </w:pPr>
       <w:r>
-        <w:t xml:space="preserve">The firm's number is then</w:t>
+        <w:t xml:space="preserve">The firm’s number is then</w:t>
       </w:r>
       <w:r>
         <w:t xml:space="preserve"> </w:t>
@@ -9888,12 +10247,12 @@
         <w:pStyle w:val="FirstParagraph"/>
       </w:pPr>
       <w:r>
-        <w:t xml:space="preserve">Spectrum Cloud sends the firm's message templates for approval once the number is connected.</w:t>
-      </w:r>
-    </w:p>
-    <w:p>
-      <w:pPr>
-        <w:pStyle w:val="BodyText"/>
+        <w:t xml:space="preserve">Spectrum Cloud sends the firm’s message templates for approval once the number is connected.</w:t>
+      </w:r>
+    </w:p>
+    <w:p>
+      <w:pPr>
+        <w:pStyle w:val="CaptionedFigure"/>
         <w:keepNext/>
         <w:spacing w:before="120" w:after="40"/>
         <w:jc w:val="center"/>
@@ -9948,7 +10307,7 @@
     </w:p>
     <w:p>
       <w:pPr>
-        <w:pStyle w:val="BodyText"/>
+        <w:pStyle w:val="CaptionedFigure"/>
         <w:keepNext w:val="0"/>
         <w:spacing w:before="40" w:after="240"/>
         <w:jc w:val="center"/>
@@ -9965,6 +10324,14 @@
     </w:p>
     <w:p>
       <w:pPr>
+        <w:pStyle w:val="ImageCaption"/>
+      </w:pPr>
+      <w:r>
+        <w:t xml:space="preserve">Connecting a WhatsApp number</w:t>
+      </w:r>
+    </w:p>
+    <w:p>
+      <w:pPr>
         <w:pStyle w:val="BodyText"/>
       </w:pPr>
       <w:r>
@@ -10043,7 +10410,7 @@
         <w:pStyle w:val="Compact"/>
         <w:numPr>
           <w:ilvl w:val="0"/>
-          <w:numId w:val="1019"/>
+          <w:numId w:val="1018"/>
         </w:numPr>
       </w:pPr>
       <w:r>
@@ -10073,7 +10440,7 @@
           <w:b/>
           <w:bCs/>
         </w:rPr>
-        <w:t xml:space="preserve">firm's own number</w:t>
+        <w:t xml:space="preserve">firm’s own number</w:t>
       </w:r>
       <w:r>
         <w:t xml:space="preserve">.</w:t>
@@ -10084,7 +10451,7 @@
         <w:pStyle w:val="Compact"/>
         <w:numPr>
           <w:ilvl w:val="0"/>
-          <w:numId w:val="1019"/>
+          <w:numId w:val="1018"/>
         </w:numPr>
       </w:pPr>
       <w:r>
@@ -10125,7 +10492,7 @@
         <w:pStyle w:val="Compact"/>
         <w:numPr>
           <w:ilvl w:val="0"/>
-          <w:numId w:val="1019"/>
+          <w:numId w:val="1018"/>
         </w:numPr>
       </w:pPr>
       <w:r>
@@ -10139,7 +10506,7 @@
         <w:t xml:space="preserve"> </w:t>
       </w:r>
       <w:r>
-        <w:t xml:space="preserve">It is simply not part of the approved count (for example 7 of 10). Its messages go from the system default number, the same as a template that is still waiting. KDK is told about rejections, so the template can be corrected and sent again. This is not shown to the firm. When the template is approved later, its messages start going from the firm's number by themselves.</w:t>
+        <w:t xml:space="preserve">It is simply not part of the approved count (for example 7 of 10). Its messages go from the system default number, the same as a template that is still waiting. KDK is told about rejections, so the template can be corrected and sent again. This is not shown to the firm. When the template is approved later, its messages start going from the firm’s number by themselves.</w:t>
       </w:r>
     </w:p>
     <w:p>
@@ -10147,7 +10514,7 @@
         <w:pStyle w:val="Compact"/>
         <w:numPr>
           <w:ilvl w:val="0"/>
-          <w:numId w:val="1019"/>
+          <w:numId w:val="1018"/>
         </w:numPr>
       </w:pPr>
       <w:r>
@@ -10167,7 +10534,13 @@
         <w:t xml:space="preserve"> </w:t>
       </w:r>
       <w:r>
-        <w:t xml:space="preserve">all say this in plain words, for example "Until the templates are approved, messages go out from the system default number."</w:t>
+        <w:t xml:space="preserve">all say this in plain words, for example</w:t>
+      </w:r>
+      <w:r>
+        <w:t xml:space="preserve"> </w:t>
+      </w:r>
+      <w:r>
+        <w:t xml:space="preserve">“Until the templates are approved, messages go out from the system default number.”</w:t>
       </w:r>
     </w:p>
     <w:p>
@@ -10175,7 +10548,7 @@
         <w:pStyle w:val="Compact"/>
         <w:numPr>
           <w:ilvl w:val="0"/>
-          <w:numId w:val="1019"/>
+          <w:numId w:val="1018"/>
         </w:numPr>
       </w:pPr>
       <w:r>
@@ -10197,11 +10570,11 @@
         <w:pStyle w:val="Compact"/>
         <w:numPr>
           <w:ilvl w:val="0"/>
-          <w:numId w:val="1019"/>
+          <w:numId w:val="1018"/>
         </w:numPr>
       </w:pPr>
       <w:r>
-        <w:t xml:space="preserve">Because of this, one firm's WhatsApp Logs can show</w:t>
+        <w:t xml:space="preserve">Because of this, one firm’s WhatsApp Logs can show</w:t>
       </w:r>
       <w:r>
         <w:t xml:space="preserve"> </w:t>
@@ -10237,7 +10610,7 @@
       </w:r>
     </w:p>
     <w:bookmarkEnd w:id="82"/>
-    <w:bookmarkStart w:id="93" w:name="X4934f0f5d6c6998fd0513ddb723aa9cbc1bb1cb"/>
+    <w:bookmarkStart w:id="92" w:name="email"/>
     <w:p>
       <w:pPr>
         <w:pStyle w:val="Heading3"/>
@@ -10248,7 +10621,7 @@
     </w:p>
     <w:p>
       <w:pPr>
-        <w:pStyle w:val="FirstParagraph"/>
+        <w:pStyle w:val="CaptionedFigure"/>
         <w:keepNext/>
         <w:spacing w:before="120" w:after="40"/>
         <w:jc w:val="center"/>
@@ -10303,7 +10676,7 @@
     </w:p>
     <w:p>
       <w:pPr>
-        <w:pStyle w:val="FirstParagraph"/>
+        <w:pStyle w:val="CaptionedFigure"/>
         <w:keepNext w:val="0"/>
         <w:spacing w:before="40" w:after="240"/>
         <w:jc w:val="center"/>
@@ -10316,6 +10689,14 @@
           <w:sz w:val="19"/>
         </w:rPr>
         <w:t>Figure: Configuration, Email</w:t>
+      </w:r>
+    </w:p>
+    <w:p>
+      <w:pPr>
+        <w:pStyle w:val="ImageCaption"/>
+      </w:pPr>
+      <w:r>
+        <w:t xml:space="preserve">Configuration, Email</w:t>
       </w:r>
     </w:p>
     <w:tbl>
@@ -10452,7 +10833,7 @@
               <w:rPr>
                 <w:sz w:val="20"/>
               </w:rPr>
-              <w:t xml:space="preserve">. Today only GST sends email:</w:t>
+              <w:t xml:space="preserve">:</w:t>
             </w:r>
             <w:r>
               <w:rPr>
@@ -10471,7 +10852,19 @@
               <w:rPr>
                 <w:sz w:val="20"/>
               </w:rPr>
-              <w:t xml:space="preserve">. The TDS and ITR addresses (</w:t>
+              <w:t xml:space="preserve"> </w:t>
+            </w:r>
+            <w:r>
+              <w:rPr>
+                <w:sz w:val="20"/>
+              </w:rPr>
+              <w:t xml:space="preserve">(GST),</w:t>
+            </w:r>
+            <w:r>
+              <w:rPr>
+                <w:sz w:val="20"/>
+              </w:rPr>
+              <w:t xml:space="preserve"> </w:t>
             </w:r>
             <w:r>
               <w:rPr>
@@ -10484,16 +10877,22 @@
               <w:rPr>
                 <w:sz w:val="20"/>
               </w:rPr>
-              <w:t xml:space="preserve">,</w:t>
-            </w:r>
-            <w:r>
-              <w:rPr>
-                <w:sz w:val="20"/>
-              </w:rPr>
               <w:t xml:space="preserve"> </w:t>
             </w:r>
             <w:r>
               <w:rPr>
+                <w:sz w:val="20"/>
+              </w:rPr>
+              <w:t xml:space="preserve">(TDS) and</w:t>
+            </w:r>
+            <w:r>
+              <w:rPr>
+                <w:sz w:val="20"/>
+              </w:rPr>
+              <w:t xml:space="preserve"> </w:t>
+            </w:r>
+            <w:r>
+              <w:rPr>
                 <w:rStyle w:val="VerbatimChar"/>
                 <w:sz w:val="20"/>
               </w:rPr>
@@ -10503,7 +10902,13 @@
               <w:rPr>
                 <w:sz w:val="20"/>
               </w:rPr>
-              <w:t xml:space="preserve">) are listed</w:t>
+              <w:t xml:space="preserve"> </w:t>
+            </w:r>
+            <w:r>
+              <w:rPr>
+                <w:sz w:val="20"/>
+              </w:rPr>
+              <w:t xml:space="preserve">(ITR). An address of a module that</w:t>
             </w:r>
             <w:r>
               <w:rPr>
@@ -10517,6 +10922,58 @@
                 <w:bCs/>
                 <w:sz w:val="20"/>
               </w:rPr>
+              <w:t xml:space="preserve">sends email today</w:t>
+            </w:r>
+            <w:r>
+              <w:rPr>
+                <w:sz w:val="20"/>
+              </w:rPr>
+              <w:t xml:space="preserve"> </w:t>
+            </w:r>
+            <w:r>
+              <w:rPr>
+                <w:sz w:val="20"/>
+              </w:rPr>
+              <w:t xml:space="preserve">is shown as normal. An address of a module that</w:t>
+            </w:r>
+            <w:r>
+              <w:rPr>
+                <w:sz w:val="20"/>
+              </w:rPr>
+              <w:t xml:space="preserve"> </w:t>
+            </w:r>
+            <w:r>
+              <w:rPr>
+                <w:b/>
+                <w:bCs/>
+                <w:sz w:val="20"/>
+              </w:rPr>
+              <w:t xml:space="preserve">does not send email yet</w:t>
+            </w:r>
+            <w:r>
+              <w:rPr>
+                <w:sz w:val="20"/>
+              </w:rPr>
+              <w:t xml:space="preserve"> </w:t>
+            </w:r>
+            <w:r>
+              <w:rPr>
+                <w:sz w:val="20"/>
+              </w:rPr>
+              <w:t xml:space="preserve">is shown</w:t>
+            </w:r>
+            <w:r>
+              <w:rPr>
+                <w:sz w:val="20"/>
+              </w:rPr>
+              <w:t xml:space="preserve"> </w:t>
+            </w:r>
+            <w:r>
+              <w:rPr>
+                <w:b/>
+                <w:bCs/>
+                <w:sz w:val="20"/>
+              </w:rPr>
               <w:t xml:space="preserve">greyed out</w:t>
             </w:r>
             <w:r>
@@ -10529,7 +10986,25 @@
               <w:rPr>
                 <w:sz w:val="20"/>
               </w:rPr>
-              <w:t xml:space="preserve">with "Not live yet", and become normal when those modules go live</w:t>
+              <w:t xml:space="preserve">with</w:t>
+            </w:r>
+            <w:r>
+              <w:rPr>
+                <w:sz w:val="20"/>
+              </w:rPr>
+              <w:t xml:space="preserve"> </w:t>
+            </w:r>
+            <w:r>
+              <w:rPr>
+                <w:sz w:val="20"/>
+              </w:rPr>
+              <w:t xml:space="preserve">“Not live yet”</w:t>
+            </w:r>
+            <w:r>
+              <w:rPr>
+                <w:sz w:val="20"/>
+              </w:rPr>
+              <w:t xml:space="preserve">, and becomes normal when that module starts sending email</w:t>
             </w:r>
           </w:p>
         </w:tc>
@@ -10652,7 +11127,7 @@
         <w:t xml:space="preserve"> </w:t>
       </w:r>
       <w:r>
-        <w:t xml:space="preserve">A client's reply goes to this address. It is a box with a</w:t>
+        <w:t xml:space="preserve">A client’s reply goes to this address. It is a box with a</w:t>
       </w:r>
       <w:r>
         <w:t xml:space="preserve"> </w:t>
@@ -10668,21 +11143,28 @@
         <w:t xml:space="preserve"> </w:t>
       </w:r>
       <w:r>
-        <w:t xml:space="preserve">button. Save is on only when the email looks like an email, and a wrong one shows "Enter a valid email, like</w:t>
-      </w:r>
-      <w:r>
-        <w:t xml:space="preserve"> </w:t>
-      </w:r>
-      <w:hyperlink r:id="rId86">
-        <w:r>
-          <w:rPr>
-            <w:rStyle w:val="Hyperlink"/>
-          </w:rPr>
-          <w:t xml:space="preserve">name@yourfirm.com</w:t>
-        </w:r>
-      </w:hyperlink>
-      <w:r>
-        <w:t xml:space="preserve">." After saving it says "Saved. Replies go to ...". It is the same field for all three cards.</w:t>
+        <w:t xml:space="preserve">button. Save is on only when the email looks like an email, and a wrong one shows</w:t>
+      </w:r>
+      <w:r>
+        <w:t xml:space="preserve"> </w:t>
+      </w:r>
+      <w:r>
+        <w:t xml:space="preserve">“Enter a valid email, like name@yourfirm.com.”</w:t>
+      </w:r>
+      <w:r>
+        <w:t xml:space="preserve"> </w:t>
+      </w:r>
+      <w:r>
+        <w:t xml:space="preserve">After saving it says</w:t>
+      </w:r>
+      <w:r>
+        <w:t xml:space="preserve"> </w:t>
+      </w:r>
+      <w:r>
+        <w:t xml:space="preserve">“Saved. Replies go to …”</w:t>
+      </w:r>
+      <w:r>
+        <w:t xml:space="preserve">. It is the same field for all three cards.</w:t>
       </w:r>
     </w:p>
     <w:p>
@@ -10702,7 +11184,7 @@
         <w:pStyle w:val="Compact"/>
         <w:numPr>
           <w:ilvl w:val="0"/>
-          <w:numId w:val="1020"/>
+          <w:numId w:val="1019"/>
         </w:numPr>
       </w:pPr>
       <w:r>
@@ -10776,7 +11258,13 @@
         <w:t xml:space="preserve">Add domain</w:t>
       </w:r>
       <w:r>
-        <w:t xml:space="preserve">. A personal domain such as gmail.com is not accepted: "... is a personal email provider, not a domain you control."</w:t>
+        <w:t xml:space="preserve">. A personal domain such as gmail.com is not accepted:</w:t>
+      </w:r>
+      <w:r>
+        <w:t xml:space="preserve"> </w:t>
+      </w:r>
+      <w:r>
+        <w:t xml:space="preserve">“… is a personal email provider, not a domain you control.”</w:t>
       </w:r>
     </w:p>
     <w:p>
@@ -10784,7 +11272,7 @@
         <w:pStyle w:val="Compact"/>
         <w:numPr>
           <w:ilvl w:val="0"/>
-          <w:numId w:val="1020"/>
+          <w:numId w:val="1019"/>
         </w:numPr>
       </w:pPr>
       <w:r>
@@ -10812,7 +11300,7 @@
         <w:pStyle w:val="Compact"/>
         <w:numPr>
           <w:ilvl w:val="0"/>
-          <w:numId w:val="1020"/>
+          <w:numId w:val="1019"/>
         </w:numPr>
       </w:pPr>
       <w:r>
@@ -10826,7 +11314,13 @@
         <w:t xml:space="preserve"> </w:t>
       </w:r>
       <w:r>
-        <w:t xml:space="preserve">has a short line ("Add these two records at the place where you manage your domain (for example GoDaddy). It can take up to a day or two to work.") and the</w:t>
+        <w:t xml:space="preserve">has a short line (</w:t>
+      </w:r>
+      <w:r>
+        <w:t xml:space="preserve">“Add these two records at the place where you manage your domain (for example GoDaddy). It can take up to a day or two to work.”</w:t>
+      </w:r>
+      <w:r>
+        <w:t xml:space="preserve">) and the</w:t>
       </w:r>
       <w:r>
         <w:t xml:space="preserve"> </w:t>
@@ -10855,7 +11349,7 @@
         <w:t xml:space="preserve"> </w:t>
       </w:r>
       <w:r>
-        <w:t xml:space="preserve">like a domain provider's form:</w:t>
+        <w:t xml:space="preserve">like a domain provider’s form:</w:t>
       </w:r>
       <w:r>
         <w:t xml:space="preserve"> </w:t>
@@ -10921,7 +11415,7 @@
         <w:pStyle w:val="Compact"/>
         <w:numPr>
           <w:ilvl w:val="0"/>
-          <w:numId w:val="1020"/>
+          <w:numId w:val="1019"/>
         </w:numPr>
       </w:pPr>
       <w:r>
@@ -11017,11 +11511,11 @@
         <w:pStyle w:val="Compact"/>
         <w:numPr>
           <w:ilvl w:val="0"/>
-          <w:numId w:val="1020"/>
+          <w:numId w:val="1019"/>
         </w:numPr>
       </w:pPr>
       <w:r>
-        <w:t xml:space="preserve">When it is verified, emails go from the firm's address, and a</w:t>
+        <w:t xml:space="preserve">When it is verified, emails go from the firm’s address, and a</w:t>
       </w:r>
       <w:r>
         <w:t xml:space="preserve"> </w:t>
@@ -11042,7 +11536,7 @@
     </w:p>
     <w:p>
       <w:pPr>
-        <w:pStyle w:val="FirstParagraph"/>
+        <w:pStyle w:val="CaptionedFigure"/>
         <w:keepNext/>
         <w:spacing w:before="120" w:after="40"/>
         <w:jc w:val="center"/>
@@ -11052,18 +11546,18 @@
           <wp:inline>
             <wp:extent cx="5334000" cy="4058284"/>
             <wp:effectExtent b="0" l="0" r="0" t="0"/>
-            <wp:docPr descr="Own domain: DNS records" title="" id="88" name="Picture"/>
+            <wp:docPr descr="Own domain: DNS records" title="" id="87" name="Picture"/>
             <a:graphic>
               <a:graphicData uri="http://schemas.openxmlformats.org/drawingml/2006/picture">
                 <pic:pic>
                   <pic:nvPicPr>
-                    <pic:cNvPr descr="brd-screenshots/config-email-domain.png" id="89" name="Picture"/>
+                    <pic:cNvPr descr="brd-screenshots/config-email-domain.png" id="88" name="Picture"/>
                     <pic:cNvPicPr>
                       <a:picLocks noChangeArrowheads="1" noChangeAspect="1"/>
                     </pic:cNvPicPr>
                   </pic:nvPicPr>
                   <pic:blipFill>
-                    <a:blip r:embed="rId87"/>
+                    <a:blip r:embed="rId86"/>
                     <a:stretch>
                       <a:fillRect/>
                     </a:stretch>
@@ -11097,7 +11591,7 @@
     </w:p>
     <w:p>
       <w:pPr>
-        <w:pStyle w:val="FirstParagraph"/>
+        <w:pStyle w:val="CaptionedFigure"/>
         <w:keepNext w:val="0"/>
         <w:spacing w:before="40" w:after="240"/>
         <w:jc w:val="center"/>
@@ -11114,6 +11608,14 @@
     </w:p>
     <w:p>
       <w:pPr>
+        <w:pStyle w:val="ImageCaption"/>
+      </w:pPr>
+      <w:r>
+        <w:t xml:space="preserve">Own domain: DNS records</w:t>
+      </w:r>
+    </w:p>
+    <w:p>
+      <w:pPr>
         <w:pStyle w:val="BodyText"/>
       </w:pPr>
       <w:r>
@@ -11126,7 +11628,7 @@
     </w:p>
     <w:p>
       <w:pPr>
-        <w:pStyle w:val="BodyText"/>
+        <w:pStyle w:val="CaptionedFigure"/>
         <w:keepNext/>
         <w:spacing w:before="120" w:after="40"/>
         <w:jc w:val="center"/>
@@ -11136,18 +11638,18 @@
           <wp:inline>
             <wp:extent cx="5334000" cy="4620577"/>
             <wp:effectExtent b="0" l="0" r="0" t="0"/>
-            <wp:docPr descr="Own SMTP server" title="" id="91" name="Picture"/>
+            <wp:docPr descr="Own SMTP server" title="" id="90" name="Picture"/>
             <a:graphic>
               <a:graphicData uri="http://schemas.openxmlformats.org/drawingml/2006/picture">
                 <pic:pic>
                   <pic:nvPicPr>
-                    <pic:cNvPr descr="brd-screenshots/config-email-smtp.png" id="92" name="Picture"/>
+                    <pic:cNvPr descr="brd-screenshots/config-email-smtp.png" id="91" name="Picture"/>
                     <pic:cNvPicPr>
                       <a:picLocks noChangeArrowheads="1" noChangeAspect="1"/>
                     </pic:cNvPicPr>
                   </pic:nvPicPr>
                   <pic:blipFill>
-                    <a:blip r:embed="rId90"/>
+                    <a:blip r:embed="rId89"/>
                     <a:stretch>
                       <a:fillRect/>
                     </a:stretch>
@@ -11181,7 +11683,7 @@
     </w:p>
     <w:p>
       <w:pPr>
-        <w:pStyle w:val="BodyText"/>
+        <w:pStyle w:val="CaptionedFigure"/>
         <w:keepNext w:val="0"/>
         <w:spacing w:before="40" w:after="240"/>
         <w:jc w:val="center"/>
@@ -11198,6 +11700,14 @@
     </w:p>
     <w:p>
       <w:pPr>
+        <w:pStyle w:val="ImageCaption"/>
+      </w:pPr>
+      <w:r>
+        <w:t xml:space="preserve">Own SMTP server</w:t>
+      </w:r>
+    </w:p>
+    <w:p>
+      <w:pPr>
         <w:pStyle w:val="BodyText"/>
       </w:pPr>
       <w:r>
@@ -11318,6 +11828,179 @@
       </w:r>
       <w:r>
         <w:t xml:space="preserve">tries the server.</w:t>
+      </w:r>
+    </w:p>
+    <w:p>
+      <w:pPr>
+        <w:pStyle w:val="Compact"/>
+        <w:numPr>
+          <w:ilvl w:val="0"/>
+          <w:numId w:val="1020"/>
+        </w:numPr>
+      </w:pPr>
+      <w:r>
+        <w:t xml:space="preserve">While it connects, the button says</w:t>
+      </w:r>
+      <w:r>
+        <w:t xml:space="preserve"> </w:t>
+      </w:r>
+      <w:r>
+        <w:rPr>
+          <w:i/>
+          <w:iCs/>
+        </w:rPr>
+        <w:t xml:space="preserve">Connecting…</w:t>
+      </w:r>
+      <w:r>
+        <w:t xml:space="preserve"> </w:t>
+      </w:r>
+      <w:r>
+        <w:t xml:space="preserve">and email keeps going from the system default.</w:t>
+      </w:r>
+    </w:p>
+    <w:p>
+      <w:pPr>
+        <w:pStyle w:val="Compact"/>
+        <w:numPr>
+          <w:ilvl w:val="0"/>
+          <w:numId w:val="1020"/>
+        </w:numPr>
+      </w:pPr>
+      <w:r>
+        <w:t xml:space="preserve">If it cannot connect, a note says so and the user can correct the details.</w:t>
+      </w:r>
+    </w:p>
+    <w:p>
+      <w:pPr>
+        <w:pStyle w:val="Compact"/>
+        <w:numPr>
+          <w:ilvl w:val="0"/>
+          <w:numId w:val="1020"/>
+        </w:numPr>
+      </w:pPr>
+      <w:r>
+        <w:t xml:space="preserve">When it connects, the page shows</w:t>
+      </w:r>
+      <w:r>
+        <w:t xml:space="preserve"> </w:t>
+      </w:r>
+      <w:r>
+        <w:rPr>
+          <w:b/>
+          <w:bCs/>
+        </w:rPr>
+        <w:t xml:space="preserve">Your connection</w:t>
+      </w:r>
+      <w:r>
+        <w:t xml:space="preserve">: SMTP server, Security, Username, From name and From address (the password is never shown again), with</w:t>
+      </w:r>
+      <w:r>
+        <w:t xml:space="preserve"> </w:t>
+      </w:r>
+      <w:r>
+        <w:rPr>
+          <w:b/>
+          <w:bCs/>
+        </w:rPr>
+        <w:t xml:space="preserve">Send test email</w:t>
+      </w:r>
+      <w:r>
+        <w:t xml:space="preserve"> </w:t>
+      </w:r>
+      <w:r>
+        <w:t xml:space="preserve">and</w:t>
+      </w:r>
+      <w:r>
+        <w:t xml:space="preserve"> </w:t>
+      </w:r>
+      <w:r>
+        <w:rPr>
+          <w:b/>
+          <w:bCs/>
+        </w:rPr>
+        <w:t xml:space="preserve">Edit server</w:t>
+      </w:r>
+      <w:r>
+        <w:t xml:space="preserve">. Emails are now sent through the firm’s server.</w:t>
+      </w:r>
+    </w:p>
+    <w:p>
+      <w:pPr>
+        <w:pStyle w:val="FirstParagraph"/>
+      </w:pPr>
+      <w:r>
+        <w:rPr>
+          <w:b/>
+          <w:bCs/>
+        </w:rPr>
+        <w:t xml:space="preserve">Status in Email Logs for SMTP emails.</w:t>
+      </w:r>
+      <w:r>
+        <w:t xml:space="preserve"> </w:t>
+      </w:r>
+      <w:r>
+        <w:t xml:space="preserve">An email sent through the firm’s own SMTP server shows the status</w:t>
+      </w:r>
+      <w:r>
+        <w:t xml:space="preserve"> </w:t>
+      </w:r>
+      <w:r>
+        <w:rPr>
+          <w:b/>
+          <w:bCs/>
+        </w:rPr>
+        <w:t xml:space="preserve">SMTP</w:t>
+      </w:r>
+      <w:r>
+        <w:t xml:space="preserve"> </w:t>
+      </w:r>
+      <w:r>
+        <w:t xml:space="preserve">in Email Logs. Spectrum Cloud only hands the email to the firm’s server. It</w:t>
+      </w:r>
+      <w:r>
+        <w:t xml:space="preserve"> </w:t>
+      </w:r>
+      <w:r>
+        <w:rPr>
+          <w:b/>
+          <w:bCs/>
+        </w:rPr>
+        <w:t xml:space="preserve">cannot see what happens after that</w:t>
+      </w:r>
+      <w:r>
+        <w:t xml:space="preserve">, so it cannot tell whether the email was delivered, bounced, failed or opened. Instead of a status it cannot check, the log says</w:t>
+      </w:r>
+      <w:r>
+        <w:t xml:space="preserve"> </w:t>
+      </w:r>
+      <w:r>
+        <w:rPr>
+          <w:b/>
+          <w:bCs/>
+        </w:rPr>
+        <w:t xml:space="preserve">SMTP</w:t>
+      </w:r>
+      <w:r>
+        <w:t xml:space="preserve">, which means</w:t>
+      </w:r>
+      <w:r>
+        <w:t xml:space="preserve"> </w:t>
+      </w:r>
+      <w:r>
+        <w:t xml:space="preserve">“handed to the firm’s own mail server”</w:t>
+      </w:r>
+      <w:r>
+        <w:t xml:space="preserve">. Emails sent from the system default or from the firm’s own domain keep their usual statuses (Delivered, Bounced and so on).</w:t>
+      </w:r>
+    </w:p>
+    <w:bookmarkEnd w:id="92"/>
+    <w:bookmarkStart w:id="93" w:name="rules"/>
+    <w:p>
+      <w:pPr>
+        <w:pStyle w:val="Heading3"/>
+      </w:pPr>
+      <w:r>
+        <w:t xml:space="preserve">7.5 Rules</w:t>
       </w:r>
     </w:p>
     <w:p>
@@ -11329,23 +12012,46 @@
         </w:numPr>
       </w:pPr>
       <w:r>
-        <w:t xml:space="preserve">While it connects, the button says</w:t>
-      </w:r>
-      <w:r>
-        <w:t xml:space="preserve"> </w:t>
-      </w:r>
-      <w:r>
-        <w:rPr>
-          <w:i/>
-          <w:iCs/>
-        </w:rPr>
-        <w:t xml:space="preserve">Connecting...</w:t>
-      </w:r>
-      <w:r>
-        <w:t xml:space="preserve"> </w:t>
-      </w:r>
-      <w:r>
-        <w:t xml:space="preserve">and email keeps going from the system default.</w:t>
+        <w:t xml:space="preserve">The choice is for</w:t>
+      </w:r>
+      <w:r>
+        <w:t xml:space="preserve"> </w:t>
+      </w:r>
+      <w:r>
+        <w:rPr>
+          <w:b/>
+          <w:bCs/>
+        </w:rPr>
+        <w:t xml:space="preserve">the whole firm</w:t>
+      </w:r>
+      <w:r>
+        <w:t xml:space="preserve">. One own number and one own domain (or mail server) cover</w:t>
+      </w:r>
+      <w:r>
+        <w:t xml:space="preserve"> </w:t>
+      </w:r>
+      <w:r>
+        <w:rPr>
+          <w:b/>
+          <w:bCs/>
+        </w:rPr>
+        <w:t xml:space="preserve">all three modules</w:t>
+      </w:r>
+      <w:r>
+        <w:t xml:space="preserve">, GST, TDS and ITR. The firm does not choose them per module. WhatsApp and email are chosen</w:t>
+      </w:r>
+      <w:r>
+        <w:t xml:space="preserve"> </w:t>
+      </w:r>
+      <w:r>
+        <w:rPr>
+          <w:b/>
+          <w:bCs/>
+        </w:rPr>
+        <w:t xml:space="preserve">separately</w:t>
+      </w:r>
+      <w:r>
+        <w:t xml:space="preserve">.</w:t>
       </w:r>
     </w:p>
     <w:p>
@@ -11357,7 +12063,23 @@
         </w:numPr>
       </w:pPr>
       <w:r>
-        <w:t xml:space="preserve">If it cannot connect, a note says so and the user can correct the details.</w:t>
+        <w:t xml:space="preserve">Exactly</w:t>
+      </w:r>
+      <w:r>
+        <w:t xml:space="preserve"> </w:t>
+      </w:r>
+      <w:r>
+        <w:rPr>
+          <w:b/>
+          <w:bCs/>
+        </w:rPr>
+        <w:t xml:space="preserve">one</w:t>
+      </w:r>
+      <w:r>
+        <w:t xml:space="preserve"> </w:t>
+      </w:r>
+      <w:r>
+        <w:t xml:space="preserve">choice is in use for each channel.</w:t>
       </w:r>
     </w:p>
     <w:p>
@@ -11369,49 +12091,93 @@
         </w:numPr>
       </w:pPr>
       <w:r>
-        <w:t xml:space="preserve">When it connects, the page shows</w:t>
-      </w:r>
-      <w:r>
-        <w:t xml:space="preserve"> </w:t>
-      </w:r>
-      <w:r>
-        <w:rPr>
-          <w:b/>
-          <w:bCs/>
-        </w:rPr>
-        <w:t xml:space="preserve">Your connection</w:t>
-      </w:r>
-      <w:r>
-        <w:t xml:space="preserve">: SMTP server, Security, Username, From name and From address (the password is never shown again), with</w:t>
-      </w:r>
-      <w:r>
-        <w:t xml:space="preserve"> </w:t>
-      </w:r>
-      <w:r>
-        <w:rPr>
-          <w:b/>
-          <w:bCs/>
-        </w:rPr>
-        <w:t xml:space="preserve">Send test email</w:t>
-      </w:r>
-      <w:r>
-        <w:t xml:space="preserve"> </w:t>
-      </w:r>
-      <w:r>
-        <w:t xml:space="preserve">and</w:t>
-      </w:r>
-      <w:r>
-        <w:t xml:space="preserve"> </w:t>
-      </w:r>
-      <w:r>
-        <w:rPr>
-          <w:b/>
-          <w:bCs/>
-        </w:rPr>
-        <w:t xml:space="preserve">Edit server</w:t>
-      </w:r>
-      <w:r>
-        <w:t xml:space="preserve">. Emails are now sent through the firm's server.</w:t>
+        <w:t xml:space="preserve">A setup that is not finished never takes over: messages keep going from the system default.</w:t>
+      </w:r>
+    </w:p>
+    <w:p>
+      <w:pPr>
+        <w:pStyle w:val="Compact"/>
+        <w:numPr>
+          <w:ilvl w:val="0"/>
+          <w:numId w:val="1021"/>
+        </w:numPr>
+      </w:pPr>
+      <w:r>
+        <w:t xml:space="preserve">The firm’s own setup is kept when the user switches back to the system default.</w:t>
+      </w:r>
+    </w:p>
+    <w:p>
+      <w:pPr>
+        <w:pStyle w:val="Compact"/>
+        <w:numPr>
+          <w:ilvl w:val="0"/>
+          <w:numId w:val="1021"/>
+        </w:numPr>
+      </w:pPr>
+      <w:r>
+        <w:t xml:space="preserve">An email sent through the firm’s own SMTP server shows the status</w:t>
+      </w:r>
+      <w:r>
+        <w:t xml:space="preserve"> </w:t>
+      </w:r>
+      <w:r>
+        <w:rPr>
+          <w:b/>
+          <w:bCs/>
+        </w:rPr>
+        <w:t xml:space="preserve">SMTP</w:t>
+      </w:r>
+      <w:r>
+        <w:t xml:space="preserve"> </w:t>
+      </w:r>
+      <w:r>
+        <w:t xml:space="preserve">in Email Logs, because Spectrum Cloud cannot check what happens after it hands the email over.</w:t>
+      </w:r>
+    </w:p>
+    <w:p>
+      <w:pPr>
+        <w:pStyle w:val="Compact"/>
+        <w:numPr>
+          <w:ilvl w:val="0"/>
+          <w:numId w:val="1021"/>
+        </w:numPr>
+      </w:pPr>
+      <w:r>
+        <w:t xml:space="preserve">The user must never see the name of the WhatsApp provider. The DNS values for email are shown</w:t>
+      </w:r>
+      <w:r>
+        <w:t xml:space="preserve"> </w:t>
+      </w:r>
+      <w:r>
+        <w:rPr>
+          <w:b/>
+          <w:bCs/>
+        </w:rPr>
+        <w:t xml:space="preserve">as given</w:t>
+      </w:r>
+      <w:r>
+        <w:t xml:space="preserve">, because the user has to copy them exactly.</w:t>
+      </w:r>
+    </w:p>
+    <w:p>
+      <w:r>
+        <w:pict>
+          <v:rect style="width:0;height:1.5pt" o:hralign="center" o:hrstd="t" o:hr="t"/>
+        </w:pict>
+      </w:r>
+    </w:p>
+    <w:bookmarkEnd w:id="93"/>
+    <w:bookmarkEnd w:id="94"/>
+    <w:bookmarkStart w:id="95" w:name="where-the-data-comes-from"/>
+    <w:p>
+      <w:pPr>
+        <w:pStyle w:val="Heading2"/>
+        <w:pBdr>
+          <w:bottom w:val="single" w:sz="6" w:space="4" w:color="C9D2DC"/>
+        </w:pBdr>
+      </w:pPr>
+      <w:r>
+        <w:t xml:space="preserve">8. Where the data comes from</w:t>
       </w:r>
     </w:p>
     <w:p>
@@ -11423,65 +12189,88 @@
           <w:b/>
           <w:bCs/>
         </w:rPr>
-        <w:t xml:space="preserve">Status in Email Logs for SMTP emails.</w:t>
-      </w:r>
-      <w:r>
-        <w:t xml:space="preserve"> </w:t>
-      </w:r>
-      <w:r>
-        <w:t xml:space="preserve">An email sent through the firm's own SMTP server shows the status</w:t>
-      </w:r>
-      <w:r>
-        <w:t xml:space="preserve"> </w:t>
-      </w:r>
-      <w:r>
-        <w:rPr>
-          <w:b/>
-          <w:bCs/>
-        </w:rPr>
-        <w:t xml:space="preserve">SMTP</w:t>
-      </w:r>
-      <w:r>
-        <w:t xml:space="preserve"> </w:t>
-      </w:r>
-      <w:r>
-        <w:t xml:space="preserve">in Email Logs. Spectrum Cloud only hands the email to the firm's server. It</w:t>
-      </w:r>
-      <w:r>
-        <w:t xml:space="preserve"> </w:t>
-      </w:r>
-      <w:r>
-        <w:rPr>
-          <w:b/>
-          <w:bCs/>
-        </w:rPr>
-        <w:t xml:space="preserve">cannot see what happens after that</w:t>
-      </w:r>
-      <w:r>
-        <w:t xml:space="preserve">, so it cannot tell whether the email was delivered, bounced, failed or opened. Instead of a status it cannot check, the log says</w:t>
-      </w:r>
-      <w:r>
-        <w:t xml:space="preserve"> </w:t>
-      </w:r>
-      <w:r>
-        <w:rPr>
-          <w:b/>
-          <w:bCs/>
-        </w:rPr>
-        <w:t xml:space="preserve">SMTP</w:t>
-      </w:r>
-      <w:r>
-        <w:t xml:space="preserve">, which means "handed to the firm's own mail server". Emails sent from the system default or from the firm's own domain keep their usual statuses (Delivered, Bounced and so on).</w:t>
-      </w:r>
-    </w:p>
-    <w:bookmarkEnd w:id="93"/>
-    <w:bookmarkStart w:id="94" w:name="Xe19b28f785abee5be075f31de3f1a84f09de753"/>
-    <w:p>
-      <w:pPr>
-        <w:pStyle w:val="Heading3"/>
-      </w:pPr>
-      <w:r>
-        <w:t xml:space="preserve">7.5 Rules</w:t>
+        <w:t xml:space="preserve">From the application:</w:t>
+      </w:r>
+      <w:r>
+        <w:t xml:space="preserve"> </w:t>
+      </w:r>
+      <w:r>
+        <w:t xml:space="preserve">clients, their PAN and contacts, and the registrations of each client (GSTIN, TAN, PAN, with type or place). A newly added registration gets the defaults of its module.</w:t>
+      </w:r>
+    </w:p>
+    <w:p>
+      <w:pPr>
+        <w:pStyle w:val="BodyText"/>
+      </w:pPr>
+      <w:r>
+        <w:rPr>
+          <w:b/>
+          <w:bCs/>
+        </w:rPr>
+        <w:t xml:space="preserve">Saved by Spectrum Cloud:</w:t>
+      </w:r>
+      <w:r>
+        <w:t xml:space="preserve"> </w:t>
+      </w:r>
+      <w:r>
+        <w:t xml:space="preserve">the Email and WhatsApp switch of every report and event for each registration, the contact picked for each registration, the contacts edited or added on this page, and the defaults of each module. From the Configuration page: for WhatsApp and for email,</w:t>
+      </w:r>
+      <w:r>
+        <w:t xml:space="preserve"> </w:t>
+      </w:r>
+      <w:r>
+        <w:rPr>
+          <w:b/>
+          <w:bCs/>
+        </w:rPr>
+        <w:t xml:space="preserve">which choice is in use</w:t>
+      </w:r>
+      <w:r>
+        <w:t xml:space="preserve">, and the firm’s own setup (the WhatsApp number and display name, the email domain and its status, the SMTP details with the password kept safe and never shown again, and the Reply-to email). For every WhatsApp message: the</w:t>
+      </w:r>
+      <w:r>
+        <w:t xml:space="preserve"> </w:t>
+      </w:r>
+      <w:r>
+        <w:rPr>
+          <w:b/>
+          <w:bCs/>
+        </w:rPr>
+        <w:t xml:space="preserve">name and number it was sent from</w:t>
+      </w:r>
+      <w:r>
+        <w:t xml:space="preserve">, saved at the time it is sent.</w:t>
+      </w:r>
+    </w:p>
+    <w:p>
+      <w:pPr>
+        <w:pStyle w:val="BodyText"/>
+      </w:pPr>
+      <w:r>
+        <w:rPr>
+          <w:b/>
+          <w:bCs/>
+        </w:rPr>
+        <w:t xml:space="preserve">WhatsApp.</w:t>
+      </w:r>
+      <w:r>
+        <w:t xml:space="preserve"> </w:t>
+      </w:r>
+      <w:r>
+        <w:t xml:space="preserve">We send WhatsApp through</w:t>
+      </w:r>
+      <w:r>
+        <w:t xml:space="preserve"> </w:t>
+      </w:r>
+      <w:r>
+        <w:rPr>
+          <w:b/>
+          <w:bCs/>
+        </w:rPr>
+        <w:t xml:space="preserve">Rampwin</w:t>
+      </w:r>
+      <w:r>
+        <w:t xml:space="preserve">. The status of every message and its delivery details (delivered time, read time, failure reason) are taken from Rampwin. The user must never see the name Rampwin or its codes.</w:t>
       </w:r>
     </w:p>
     <w:p>
@@ -11493,46 +12282,7 @@
         </w:numPr>
       </w:pPr>
       <w:r>
-        <w:t xml:space="preserve">The choice is for</w:t>
-      </w:r>
-      <w:r>
-        <w:t xml:space="preserve"> </w:t>
-      </w:r>
-      <w:r>
-        <w:rPr>
-          <w:b/>
-          <w:bCs/>
-        </w:rPr>
-        <w:t xml:space="preserve">the whole firm</w:t>
-      </w:r>
-      <w:r>
-        <w:t xml:space="preserve">. One own number and one own domain (or mail server) cover</w:t>
-      </w:r>
-      <w:r>
-        <w:t xml:space="preserve"> </w:t>
-      </w:r>
-      <w:r>
-        <w:rPr>
-          <w:b/>
-          <w:bCs/>
-        </w:rPr>
-        <w:t xml:space="preserve">all three modules</w:t>
-      </w:r>
-      <w:r>
-        <w:t xml:space="preserve">, GST, TDS and ITR. The firm does not choose them per module. WhatsApp and email are chosen</w:t>
-      </w:r>
-      <w:r>
-        <w:t xml:space="preserve"> </w:t>
-      </w:r>
-      <w:r>
-        <w:rPr>
-          <w:b/>
-          <w:bCs/>
-        </w:rPr>
-        <w:t xml:space="preserve">separately</w:t>
-      </w:r>
-      <w:r>
-        <w:t xml:space="preserve">.</w:t>
+        <w:t xml:space="preserve">Rampwin API reference: https://rampwin-api.readme.io</w:t>
       </w:r>
     </w:p>
     <w:p>
@@ -11544,59 +12294,33 @@
         </w:numPr>
       </w:pPr>
       <w:r>
-        <w:t xml:space="preserve">Exactly</w:t>
-      </w:r>
-      <w:r>
-        <w:t xml:space="preserve"> </w:t>
-      </w:r>
-      <w:r>
-        <w:rPr>
-          <w:b/>
-          <w:bCs/>
-        </w:rPr>
-        <w:t xml:space="preserve">one</w:t>
-      </w:r>
-      <w:r>
-        <w:t xml:space="preserve"> </w:t>
-      </w:r>
-      <w:r>
-        <w:t xml:space="preserve">choice is in use for each channel.</w:t>
-      </w:r>
-    </w:p>
-    <w:p>
-      <w:pPr>
-        <w:pStyle w:val="Compact"/>
-        <w:numPr>
-          <w:ilvl w:val="0"/>
-          <w:numId w:val="1022"/>
-        </w:numPr>
-      </w:pPr>
-      <w:r>
-        <w:t xml:space="preserve">A setup that is not finished never takes over: messages keep going from the system default.</w:t>
-      </w:r>
-    </w:p>
-    <w:p>
-      <w:pPr>
-        <w:pStyle w:val="Compact"/>
-        <w:numPr>
-          <w:ilvl w:val="0"/>
-          <w:numId w:val="1022"/>
-        </w:numPr>
-      </w:pPr>
-      <w:r>
-        <w:t xml:space="preserve">The firm's own setup is kept when the user switches back to the system default.</w:t>
-      </w:r>
-    </w:p>
-    <w:p>
-      <w:pPr>
-        <w:pStyle w:val="Compact"/>
-        <w:numPr>
-          <w:ilvl w:val="0"/>
-          <w:numId w:val="1022"/>
-        </w:numPr>
-      </w:pPr>
-      <w:r>
-        <w:t xml:space="preserve">An email sent through the firm's own SMTP server shows the status</w:t>
+        <w:t xml:space="preserve">Rampwin help docs: https://docs.rampwin.com</w:t>
+      </w:r>
+    </w:p>
+    <w:p>
+      <w:pPr>
+        <w:pStyle w:val="FirstParagraph"/>
+      </w:pPr>
+      <w:r>
+        <w:t xml:space="preserve">When a firm connects its own number, the connection details and the approval status of its message templates also come from the WhatsApp provider.</w:t>
+      </w:r>
+    </w:p>
+    <w:p>
+      <w:pPr>
+        <w:pStyle w:val="BodyText"/>
+      </w:pPr>
+      <w:r>
+        <w:rPr>
+          <w:b/>
+          <w:bCs/>
+        </w:rPr>
+        <w:t xml:space="preserve">Email.</w:t>
+      </w:r>
+      <w:r>
+        <w:t xml:space="preserve"> </w:t>
+      </w:r>
+      <w:r>
+        <w:t xml:space="preserve">For the system default and for the firm’s own domain, the status of each email comes from the email provider. For an email sent through the firm’s own SMTP server there is no provider status, so Email Logs shows</w:t>
       </w:r>
       <w:r>
         <w:t xml:space="preserve"> </w:t>
@@ -11609,237 +12333,10 @@
         <w:t xml:space="preserve">SMTP</w:t>
       </w:r>
       <w:r>
-        <w:t xml:space="preserve"> </w:t>
-      </w:r>
-      <w:r>
-        <w:t xml:space="preserve">in Email Logs, because Spectrum Cloud cannot check what happens after it hands the email over.</w:t>
-      </w:r>
-    </w:p>
-    <w:p>
-      <w:pPr>
-        <w:pStyle w:val="Compact"/>
-        <w:numPr>
-          <w:ilvl w:val="0"/>
-          <w:numId w:val="1022"/>
-        </w:numPr>
-      </w:pPr>
-      <w:r>
-        <w:t xml:space="preserve">The user must never see the name of the WhatsApp provider. The DNS values for email are shown</w:t>
-      </w:r>
-      <w:r>
-        <w:t xml:space="preserve"> </w:t>
-      </w:r>
-      <w:r>
-        <w:rPr>
-          <w:b/>
-          <w:bCs/>
-        </w:rPr>
-        <w:t xml:space="preserve">as given</w:t>
-      </w:r>
-      <w:r>
-        <w:t xml:space="preserve">, because the user has to copy them exactly.</w:t>
-      </w:r>
-    </w:p>
-    <w:p>
-      <w:r>
-        <w:pict>
-          <v:rect style="width:0;height:1.5pt" o:hralign="center" o:hrstd="t" o:hr="t"/>
-        </w:pict>
-      </w:r>
-    </w:p>
-    <w:bookmarkEnd w:id="94"/>
+        <w:t xml:space="preserve">.</w:t>
+      </w:r>
+    </w:p>
     <w:bookmarkEnd w:id="95"/>
-    <w:bookmarkStart w:id="98" w:name="Xcfe188df4835c7be7ab3f6f8cbc0d8ee2c7b3b0"/>
-    <w:p>
-      <w:pPr>
-        <w:pStyle w:val="Heading2"/>
-        <w:pBdr>
-          <w:bottom w:val="single" w:sz="6" w:space="4" w:color="C9D2DC"/>
-        </w:pBdr>
-      </w:pPr>
-      <w:r>
-        <w:t xml:space="preserve">8. Where the data comes from</w:t>
-      </w:r>
-    </w:p>
-    <w:p>
-      <w:pPr>
-        <w:pStyle w:val="FirstParagraph"/>
-      </w:pPr>
-      <w:r>
-        <w:rPr>
-          <w:b/>
-          <w:bCs/>
-        </w:rPr>
-        <w:t xml:space="preserve">From the application:</w:t>
-      </w:r>
-      <w:r>
-        <w:t xml:space="preserve"> </w:t>
-      </w:r>
-      <w:r>
-        <w:t xml:space="preserve">clients, their PAN and contacts, and the registrations of each client (GSTIN, TAN, PAN, with type or place). A newly added registration gets the defaults of its module.</w:t>
-      </w:r>
-    </w:p>
-    <w:p>
-      <w:pPr>
-        <w:pStyle w:val="BodyText"/>
-      </w:pPr>
-      <w:r>
-        <w:rPr>
-          <w:b/>
-          <w:bCs/>
-        </w:rPr>
-        <w:t xml:space="preserve">Saved by Spectrum Cloud:</w:t>
-      </w:r>
-      <w:r>
-        <w:t xml:space="preserve"> </w:t>
-      </w:r>
-      <w:r>
-        <w:t xml:space="preserve">the Email and WhatsApp switch of every report and event for each registration, the contact picked for each registration, the contacts edited or added on this page, and the defaults of each module. From the Configuration page: for WhatsApp and for email,</w:t>
-      </w:r>
-      <w:r>
-        <w:t xml:space="preserve"> </w:t>
-      </w:r>
-      <w:r>
-        <w:rPr>
-          <w:b/>
-          <w:bCs/>
-        </w:rPr>
-        <w:t xml:space="preserve">which choice is in use</w:t>
-      </w:r>
-      <w:r>
-        <w:t xml:space="preserve">, and the firm's own setup (the WhatsApp number and display name, the email domain and its status, the SMTP details with the password kept safe and never shown again, and the Reply-to email). For every WhatsApp message: the</w:t>
-      </w:r>
-      <w:r>
-        <w:t xml:space="preserve"> </w:t>
-      </w:r>
-      <w:r>
-        <w:rPr>
-          <w:b/>
-          <w:bCs/>
-        </w:rPr>
-        <w:t xml:space="preserve">name and number it was sent from</w:t>
-      </w:r>
-      <w:r>
-        <w:t xml:space="preserve">, saved at the time it is sent.</w:t>
-      </w:r>
-    </w:p>
-    <w:p>
-      <w:pPr>
-        <w:pStyle w:val="BodyText"/>
-      </w:pPr>
-      <w:r>
-        <w:rPr>
-          <w:b/>
-          <w:bCs/>
-        </w:rPr>
-        <w:t xml:space="preserve">WhatsApp.</w:t>
-      </w:r>
-      <w:r>
-        <w:t xml:space="preserve"> </w:t>
-      </w:r>
-      <w:r>
-        <w:t xml:space="preserve">We send WhatsApp through</w:t>
-      </w:r>
-      <w:r>
-        <w:t xml:space="preserve"> </w:t>
-      </w:r>
-      <w:r>
-        <w:rPr>
-          <w:b/>
-          <w:bCs/>
-        </w:rPr>
-        <w:t xml:space="preserve">Rampwin</w:t>
-      </w:r>
-      <w:r>
-        <w:t xml:space="preserve">. The status of every message and its delivery details (delivered time, read time, failure reason) are taken from Rampwin. The user must never see the name Rampwin or its codes.</w:t>
-      </w:r>
-    </w:p>
-    <w:p>
-      <w:pPr>
-        <w:pStyle w:val="Compact"/>
-        <w:numPr>
-          <w:ilvl w:val="0"/>
-          <w:numId w:val="1023"/>
-        </w:numPr>
-      </w:pPr>
-      <w:r>
-        <w:t xml:space="preserve">Rampwin API reference:</w:t>
-      </w:r>
-      <w:r>
-        <w:t xml:space="preserve"> </w:t>
-      </w:r>
-      <w:hyperlink r:id="rId96">
-        <w:r>
-          <w:rPr>
-            <w:rStyle w:val="Hyperlink"/>
-          </w:rPr>
-          <w:t xml:space="preserve">https://rampwin-api.readme.io</w:t>
-        </w:r>
-      </w:hyperlink>
-    </w:p>
-    <w:p>
-      <w:pPr>
-        <w:pStyle w:val="Compact"/>
-        <w:numPr>
-          <w:ilvl w:val="0"/>
-          <w:numId w:val="1023"/>
-        </w:numPr>
-      </w:pPr>
-      <w:r>
-        <w:t xml:space="preserve">Rampwin help docs:</w:t>
-      </w:r>
-      <w:r>
-        <w:t xml:space="preserve"> </w:t>
-      </w:r>
-      <w:hyperlink r:id="rId97">
-        <w:r>
-          <w:rPr>
-            <w:rStyle w:val="Hyperlink"/>
-          </w:rPr>
-          <w:t xml:space="preserve">https://docs.rampwin.com</w:t>
-        </w:r>
-      </w:hyperlink>
-    </w:p>
-    <w:p>
-      <w:pPr>
-        <w:pStyle w:val="FirstParagraph"/>
-      </w:pPr>
-      <w:r>
-        <w:t xml:space="preserve">When a firm connects its own number, the connection details and the approval status of its message templates also come from the WhatsApp provider.</w:t>
-      </w:r>
-    </w:p>
-    <w:p>
-      <w:pPr>
-        <w:pStyle w:val="BodyText"/>
-      </w:pPr>
-      <w:r>
-        <w:rPr>
-          <w:b/>
-          <w:bCs/>
-        </w:rPr>
-        <w:t xml:space="preserve">Email.</w:t>
-      </w:r>
-      <w:r>
-        <w:t xml:space="preserve"> </w:t>
-      </w:r>
-      <w:r>
-        <w:t xml:space="preserve">For the system default and for the firm's own domain, the status of each email comes from the email provider. For an email sent through the firm's own SMTP server there is no provider status, so Email Logs shows</w:t>
-      </w:r>
-      <w:r>
-        <w:t xml:space="preserve"> </w:t>
-      </w:r>
-      <w:r>
-        <w:rPr>
-          <w:b/>
-          <w:bCs/>
-        </w:rPr>
-        <w:t xml:space="preserve">SMTP</w:t>
-      </w:r>
-      <w:r>
-        <w:t xml:space="preserve">.</w:t>
-      </w:r>
-    </w:p>
-    <w:bookmarkEnd w:id="98"/>
     <w:sectPr>
       <w:footnotePr>
         <w:numRestart w:val="eachSect"/>
@@ -12246,9 +12743,6 @@
     <w:abstractNumId w:val="991"/>
   </w:num>
   <w:num w:numId="1017">
-    <w:abstractNumId w:val="991"/>
-  </w:num>
-  <w:num w:numId="1018">
     <w:abstractNumId w:val="99411"/>
     <w:lvlOverride w:ilvl="0">
       <w:startOverride w:val="1"/>
@@ -12278,10 +12772,10 @@
       <w:startOverride w:val="1"/>
     </w:lvlOverride>
   </w:num>
-  <w:num w:numId="1019">
+  <w:num w:numId="1018">
     <w:abstractNumId w:val="991"/>
   </w:num>
-  <w:num w:numId="1020">
+  <w:num w:numId="1019">
     <w:abstractNumId w:val="99411"/>
     <w:lvlOverride w:ilvl="0">
       <w:startOverride w:val="1"/>
@@ -12311,10 +12805,10 @@
       <w:startOverride w:val="1"/>
     </w:lvlOverride>
   </w:num>
-  <w:num w:numId="1021">
+  <w:num w:numId="1020">
     <w:abstractNumId w:val="991"/>
   </w:num>
-  <w:num w:numId="1022">
+  <w:num w:numId="1021">
     <w:abstractNumId w:val="99411"/>
     <w:lvlOverride w:ilvl="0">
       <w:startOverride w:val="1"/>
@@ -12344,7 +12838,7 @@
       <w:startOverride w:val="1"/>
     </w:lvlOverride>
   </w:num>
-  <w:num w:numId="1023">
+  <w:num w:numId="1022">
     <w:abstractNumId w:val="991"/>
   </w:num>
 </w:numbering>

</xml_diff>